<commit_message>
Add maker credit: TenAI (www.tenai.kr) in app, help, manual, README, manifest
Co-Authored-By: Claude Fable 5.1 <noreply@anthropic.com>
</commit_message>
<xml_diff>
--- a/docs/manual/RuninqVic_사용설명서.docx
+++ b/docs/manual/RuninqVic_사용설명서.docx
@@ -204,6 +204,7 @@
     </w:p>
     <w:p>
       <w:pPr>
+        <w:spacing w:after="600"/>
         <w:jc w:val="center"/>
       </w:pPr>
       <w:r>
@@ -342,6 +343,61 @@
         </w:rPr>
         <w:t>프로그램</w:t>
       </w:r>
+    </w:p>
+    <w:p>
+      <w:pPr>
+        <w:jc w:val="center"/>
+      </w:pPr>
+      <w:r>
+        <w:rPr>
+          <w:color w:val="666666"/>
+          <w:sz w:val="22"/>
+          <w:szCs w:val="22"/>
+        </w:rPr>
+        <w:t>제작</w:t>
+      </w:r>
+      <w:r>
+        <w:rPr>
+          <w:color w:val="666666"/>
+          <w:sz w:val="22"/>
+          <w:szCs w:val="22"/>
+        </w:rPr>
+        <w:t xml:space="preserve">  </w:t>
+      </w:r>
+      <w:r>
+        <w:rPr>
+          <w:b/>
+          <w:bCs/>
+          <w:sz w:val="26"/>
+          <w:szCs w:val="26"/>
+        </w:rPr>
+        <w:t>텐에이아이</w:t>
+      </w:r>
+      <w:r>
+        <w:rPr>
+          <w:b/>
+          <w:bCs/>
+          <w:sz w:val="26"/>
+          <w:szCs w:val="26"/>
+        </w:rPr>
+        <w:t xml:space="preserve"> (TenAI)</w:t>
+      </w:r>
+    </w:p>
+    <w:p>
+      <w:pPr>
+        <w:jc w:val="center"/>
+      </w:pPr>
+      <w:hyperlink r:id="rId8" w:history="1">
+        <w:r>
+          <w:rPr>
+            <w:color w:val="1A73E8"/>
+            <w:sz w:val="22"/>
+            <w:szCs w:val="22"/>
+            <w:u w:val="single"/>
+          </w:rPr>
+          <w:t>www.tenai.kr</w:t>
+        </w:r>
+      </w:hyperlink>
     </w:p>
     <w:p>
       <w:r>
@@ -367,7 +423,7 @@
     <w:sdt>
       <w:sdtPr>
         <w:alias w:val="목차"/>
-        <w:id w:val="-1597236286"/>
+        <w:id w:val="-587380248"/>
       </w:sdtPr>
       <w:sdtEndPr/>
       <w:sdtContent>
@@ -395,7 +451,7 @@
           <w:r>
             <w:fldChar w:fldCharType="separate"/>
           </w:r>
-          <w:hyperlink w:anchor="_Toc240520665" w:history="1">
+          <w:hyperlink w:anchor="_Toc240521821" w:history="1">
             <w:r>
               <w:rPr>
                 <w:rStyle w:val="a5"/>
@@ -419,7 +475,7 @@
               <w:rPr>
                 <w:noProof/>
               </w:rPr>
-              <w:instrText xml:space="preserve"> PAGEREF _Toc240520665 \h </w:instrText>
+              <w:instrText xml:space="preserve"> PAGEREF _Toc240521821 \h </w:instrText>
             </w:r>
             <w:r>
               <w:rPr>
@@ -462,7 +518,7 @@
               <w14:ligatures w14:val="standardContextual"/>
             </w:rPr>
           </w:pPr>
-          <w:hyperlink w:anchor="_Toc240520666" w:history="1">
+          <w:hyperlink w:anchor="_Toc240521822" w:history="1">
             <w:r>
               <w:rPr>
                 <w:rStyle w:val="a5"/>
@@ -486,7 +542,7 @@
               <w:rPr>
                 <w:noProof/>
               </w:rPr>
-              <w:instrText xml:space="preserve"> PAGEREF _Toc240520666 \h </w:instrText>
+              <w:instrText xml:space="preserve"> PAGEREF _Toc240521822 \h </w:instrText>
             </w:r>
             <w:r>
               <w:rPr>
@@ -529,7 +585,7 @@
               <w14:ligatures w14:val="standardContextual"/>
             </w:rPr>
           </w:pPr>
-          <w:hyperlink w:anchor="_Toc240520667" w:history="1">
+          <w:hyperlink w:anchor="_Toc240521823" w:history="1">
             <w:r>
               <w:rPr>
                 <w:rStyle w:val="a5"/>
@@ -553,7 +609,7 @@
               <w:rPr>
                 <w:noProof/>
               </w:rPr>
-              <w:instrText xml:space="preserve"> PAGEREF _Toc240520667 \h </w:instrText>
+              <w:instrText xml:space="preserve"> PAGEREF _Toc240521823 \h </w:instrText>
             </w:r>
             <w:r>
               <w:rPr>
@@ -596,7 +652,7 @@
               <w14:ligatures w14:val="standardContextual"/>
             </w:rPr>
           </w:pPr>
-          <w:hyperlink w:anchor="_Toc240520668" w:history="1">
+          <w:hyperlink w:anchor="_Toc240521824" w:history="1">
             <w:r>
               <w:rPr>
                 <w:rStyle w:val="a5"/>
@@ -620,7 +676,7 @@
               <w:rPr>
                 <w:noProof/>
               </w:rPr>
-              <w:instrText xml:space="preserve"> PAGEREF _Toc240520668 \h </w:instrText>
+              <w:instrText xml:space="preserve"> PAGEREF _Toc240521824 \h </w:instrText>
             </w:r>
             <w:r>
               <w:rPr>
@@ -662,7 +718,7 @@
               <w14:ligatures w14:val="standardContextual"/>
             </w:rPr>
           </w:pPr>
-          <w:hyperlink w:anchor="_Toc240520669" w:history="1">
+          <w:hyperlink w:anchor="_Toc240521825" w:history="1">
             <w:r>
               <w:rPr>
                 <w:rStyle w:val="a5"/>
@@ -686,7 +742,7 @@
               <w:rPr>
                 <w:noProof/>
               </w:rPr>
-              <w:instrText xml:space="preserve"> PAGEREF _Toc240520669 \h </w:instrText>
+              <w:instrText xml:space="preserve"> PAGEREF _Toc240521825 \h </w:instrText>
             </w:r>
             <w:r>
               <w:rPr>
@@ -729,7 +785,7 @@
               <w14:ligatures w14:val="standardContextual"/>
             </w:rPr>
           </w:pPr>
-          <w:hyperlink w:anchor="_Toc240520670" w:history="1">
+          <w:hyperlink w:anchor="_Toc240521826" w:history="1">
             <w:r>
               <w:rPr>
                 <w:rStyle w:val="a5"/>
@@ -753,7 +809,7 @@
               <w:rPr>
                 <w:noProof/>
               </w:rPr>
-              <w:instrText xml:space="preserve"> PAGEREF _Toc240520670 \h </w:instrText>
+              <w:instrText xml:space="preserve"> PAGEREF _Toc240521826 \h </w:instrText>
             </w:r>
             <w:r>
               <w:rPr>
@@ -796,7 +852,7 @@
               <w14:ligatures w14:val="standardContextual"/>
             </w:rPr>
           </w:pPr>
-          <w:hyperlink w:anchor="_Toc240520671" w:history="1">
+          <w:hyperlink w:anchor="_Toc240521827" w:history="1">
             <w:r>
               <w:rPr>
                 <w:rStyle w:val="a5"/>
@@ -820,7 +876,7 @@
               <w:rPr>
                 <w:noProof/>
               </w:rPr>
-              <w:instrText xml:space="preserve"> PAGEREF _Toc240520671 \h </w:instrText>
+              <w:instrText xml:space="preserve"> PAGEREF _Toc240521827 \h </w:instrText>
             </w:r>
             <w:r>
               <w:rPr>
@@ -863,7 +919,7 @@
               <w14:ligatures w14:val="standardContextual"/>
             </w:rPr>
           </w:pPr>
-          <w:hyperlink w:anchor="_Toc240520672" w:history="1">
+          <w:hyperlink w:anchor="_Toc240521828" w:history="1">
             <w:r>
               <w:rPr>
                 <w:rStyle w:val="a5"/>
@@ -887,7 +943,7 @@
               <w:rPr>
                 <w:noProof/>
               </w:rPr>
-              <w:instrText xml:space="preserve"> PAGEREF _Toc240520672 \h </w:instrText>
+              <w:instrText xml:space="preserve"> PAGEREF _Toc240521828 \h </w:instrText>
             </w:r>
             <w:r>
               <w:rPr>
@@ -930,7 +986,7 @@
               <w14:ligatures w14:val="standardContextual"/>
             </w:rPr>
           </w:pPr>
-          <w:hyperlink w:anchor="_Toc240520673" w:history="1">
+          <w:hyperlink w:anchor="_Toc240521829" w:history="1">
             <w:r>
               <w:rPr>
                 <w:rStyle w:val="a5"/>
@@ -954,7 +1010,7 @@
               <w:rPr>
                 <w:noProof/>
               </w:rPr>
-              <w:instrText xml:space="preserve"> PAGEREF _Toc240520673 \h </w:instrText>
+              <w:instrText xml:space="preserve"> PAGEREF _Toc240521829 \h </w:instrText>
             </w:r>
             <w:r>
               <w:rPr>
@@ -996,7 +1052,7 @@
               <w14:ligatures w14:val="standardContextual"/>
             </w:rPr>
           </w:pPr>
-          <w:hyperlink w:anchor="_Toc240520674" w:history="1">
+          <w:hyperlink w:anchor="_Toc240521830" w:history="1">
             <w:r>
               <w:rPr>
                 <w:rStyle w:val="a5"/>
@@ -1020,7 +1076,7 @@
               <w:rPr>
                 <w:noProof/>
               </w:rPr>
-              <w:instrText xml:space="preserve"> PAGEREF _Toc240520674 \h </w:instrText>
+              <w:instrText xml:space="preserve"> PAGEREF _Toc240521830 \h </w:instrText>
             </w:r>
             <w:r>
               <w:rPr>
@@ -1062,7 +1118,7 @@
               <w14:ligatures w14:val="standardContextual"/>
             </w:rPr>
           </w:pPr>
-          <w:hyperlink w:anchor="_Toc240520675" w:history="1">
+          <w:hyperlink w:anchor="_Toc240521831" w:history="1">
             <w:r>
               <w:rPr>
                 <w:rStyle w:val="a5"/>
@@ -1086,7 +1142,7 @@
               <w:rPr>
                 <w:noProof/>
               </w:rPr>
-              <w:instrText xml:space="preserve"> PAGEREF _Toc240520675 \h </w:instrText>
+              <w:instrText xml:space="preserve"> PAGEREF _Toc240521831 \h </w:instrText>
             </w:r>
             <w:r>
               <w:rPr>
@@ -1129,7 +1185,7 @@
               <w14:ligatures w14:val="standardContextual"/>
             </w:rPr>
           </w:pPr>
-          <w:hyperlink w:anchor="_Toc240520676" w:history="1">
+          <w:hyperlink w:anchor="_Toc240521832" w:history="1">
             <w:r>
               <w:rPr>
                 <w:rStyle w:val="a5"/>
@@ -1153,7 +1209,7 @@
               <w:rPr>
                 <w:noProof/>
               </w:rPr>
-              <w:instrText xml:space="preserve"> PAGEREF _Toc240520676 \h </w:instrText>
+              <w:instrText xml:space="preserve"> PAGEREF _Toc240521832 \h </w:instrText>
             </w:r>
             <w:r>
               <w:rPr>
@@ -1196,7 +1252,7 @@
               <w14:ligatures w14:val="standardContextual"/>
             </w:rPr>
           </w:pPr>
-          <w:hyperlink w:anchor="_Toc240520677" w:history="1">
+          <w:hyperlink w:anchor="_Toc240521833" w:history="1">
             <w:r>
               <w:rPr>
                 <w:rStyle w:val="a5"/>
@@ -1220,7 +1276,7 @@
               <w:rPr>
                 <w:noProof/>
               </w:rPr>
-              <w:instrText xml:space="preserve"> PAGEREF _Toc240520677 \h </w:instrText>
+              <w:instrText xml:space="preserve"> PAGEREF _Toc240521833 \h </w:instrText>
             </w:r>
             <w:r>
               <w:rPr>
@@ -1263,7 +1319,7 @@
               <w14:ligatures w14:val="standardContextual"/>
             </w:rPr>
           </w:pPr>
-          <w:hyperlink w:anchor="_Toc240520678" w:history="1">
+          <w:hyperlink w:anchor="_Toc240521834" w:history="1">
             <w:r>
               <w:rPr>
                 <w:rStyle w:val="a5"/>
@@ -1287,7 +1343,7 @@
               <w:rPr>
                 <w:noProof/>
               </w:rPr>
-              <w:instrText xml:space="preserve"> PAGEREF _Toc240520678 \h </w:instrText>
+              <w:instrText xml:space="preserve"> PAGEREF _Toc240521834 \h </w:instrText>
             </w:r>
             <w:r>
               <w:rPr>
@@ -1330,7 +1386,7 @@
               <w14:ligatures w14:val="standardContextual"/>
             </w:rPr>
           </w:pPr>
-          <w:hyperlink w:anchor="_Toc240520679" w:history="1">
+          <w:hyperlink w:anchor="_Toc240521835" w:history="1">
             <w:r>
               <w:rPr>
                 <w:rStyle w:val="a5"/>
@@ -1354,7 +1410,7 @@
               <w:rPr>
                 <w:noProof/>
               </w:rPr>
-              <w:instrText xml:space="preserve"> PAGEREF _Toc240520679 \h </w:instrText>
+              <w:instrText xml:space="preserve"> PAGEREF _Toc240521835 \h </w:instrText>
             </w:r>
             <w:r>
               <w:rPr>
@@ -1396,7 +1452,7 @@
               <w14:ligatures w14:val="standardContextual"/>
             </w:rPr>
           </w:pPr>
-          <w:hyperlink w:anchor="_Toc240520680" w:history="1">
+          <w:hyperlink w:anchor="_Toc240521836" w:history="1">
             <w:r>
               <w:rPr>
                 <w:rStyle w:val="a5"/>
@@ -1420,7 +1476,7 @@
               <w:rPr>
                 <w:noProof/>
               </w:rPr>
-              <w:instrText xml:space="preserve"> PAGEREF _Toc240520680 \h </w:instrText>
+              <w:instrText xml:space="preserve"> PAGEREF _Toc240521836 \h </w:instrText>
             </w:r>
             <w:r>
               <w:rPr>
@@ -1463,7 +1519,7 @@
               <w14:ligatures w14:val="standardContextual"/>
             </w:rPr>
           </w:pPr>
-          <w:hyperlink w:anchor="_Toc240520681" w:history="1">
+          <w:hyperlink w:anchor="_Toc240521837" w:history="1">
             <w:r>
               <w:rPr>
                 <w:rStyle w:val="a5"/>
@@ -1487,7 +1543,7 @@
               <w:rPr>
                 <w:noProof/>
               </w:rPr>
-              <w:instrText xml:space="preserve"> PAGEREF _Toc240520681 \h </w:instrText>
+              <w:instrText xml:space="preserve"> PAGEREF _Toc240521837 \h </w:instrText>
             </w:r>
             <w:r>
               <w:rPr>
@@ -1530,7 +1586,7 @@
               <w14:ligatures w14:val="standardContextual"/>
             </w:rPr>
           </w:pPr>
-          <w:hyperlink w:anchor="_Toc240520682" w:history="1">
+          <w:hyperlink w:anchor="_Toc240521838" w:history="1">
             <w:r>
               <w:rPr>
                 <w:rStyle w:val="a5"/>
@@ -1554,7 +1610,7 @@
               <w:rPr>
                 <w:noProof/>
               </w:rPr>
-              <w:instrText xml:space="preserve"> PAGEREF _Toc240520682 \h </w:instrText>
+              <w:instrText xml:space="preserve"> PAGEREF _Toc240521838 \h </w:instrText>
             </w:r>
             <w:r>
               <w:rPr>
@@ -1597,7 +1653,7 @@
               <w14:ligatures w14:val="standardContextual"/>
             </w:rPr>
           </w:pPr>
-          <w:hyperlink w:anchor="_Toc240520683" w:history="1">
+          <w:hyperlink w:anchor="_Toc240521839" w:history="1">
             <w:r>
               <w:rPr>
                 <w:rStyle w:val="a5"/>
@@ -1621,7 +1677,7 @@
               <w:rPr>
                 <w:noProof/>
               </w:rPr>
-              <w:instrText xml:space="preserve"> PAGEREF _Toc240520683 \h </w:instrText>
+              <w:instrText xml:space="preserve"> PAGEREF _Toc240521839 \h </w:instrText>
             </w:r>
             <w:r>
               <w:rPr>
@@ -1664,7 +1720,7 @@
               <w14:ligatures w14:val="standardContextual"/>
             </w:rPr>
           </w:pPr>
-          <w:hyperlink w:anchor="_Toc240520684" w:history="1">
+          <w:hyperlink w:anchor="_Toc240521840" w:history="1">
             <w:r>
               <w:rPr>
                 <w:rStyle w:val="a5"/>
@@ -1688,7 +1744,7 @@
               <w:rPr>
                 <w:noProof/>
               </w:rPr>
-              <w:instrText xml:space="preserve"> PAGEREF _Toc240520684 \h </w:instrText>
+              <w:instrText xml:space="preserve"> PAGEREF _Toc240521840 \h </w:instrText>
             </w:r>
             <w:r>
               <w:rPr>
@@ -1731,7 +1787,7 @@
               <w14:ligatures w14:val="standardContextual"/>
             </w:rPr>
           </w:pPr>
-          <w:hyperlink w:anchor="_Toc240520685" w:history="1">
+          <w:hyperlink w:anchor="_Toc240521841" w:history="1">
             <w:r>
               <w:rPr>
                 <w:rStyle w:val="a5"/>
@@ -1755,7 +1811,7 @@
               <w:rPr>
                 <w:noProof/>
               </w:rPr>
-              <w:instrText xml:space="preserve"> PAGEREF _Toc240520685 \h </w:instrText>
+              <w:instrText xml:space="preserve"> PAGEREF _Toc240521841 \h </w:instrText>
             </w:r>
             <w:r>
               <w:rPr>
@@ -1798,7 +1854,7 @@
               <w14:ligatures w14:val="standardContextual"/>
             </w:rPr>
           </w:pPr>
-          <w:hyperlink w:anchor="_Toc240520686" w:history="1">
+          <w:hyperlink w:anchor="_Toc240521842" w:history="1">
             <w:r>
               <w:rPr>
                 <w:rStyle w:val="a5"/>
@@ -1822,7 +1878,7 @@
               <w:rPr>
                 <w:noProof/>
               </w:rPr>
-              <w:instrText xml:space="preserve"> PAGEREF _Toc240520686 \h </w:instrText>
+              <w:instrText xml:space="preserve"> PAGEREF _Toc240521842 \h </w:instrText>
             </w:r>
             <w:r>
               <w:rPr>
@@ -1864,7 +1920,7 @@
               <w14:ligatures w14:val="standardContextual"/>
             </w:rPr>
           </w:pPr>
-          <w:hyperlink w:anchor="_Toc240520687" w:history="1">
+          <w:hyperlink w:anchor="_Toc240521843" w:history="1">
             <w:r>
               <w:rPr>
                 <w:rStyle w:val="a5"/>
@@ -1888,7 +1944,7 @@
               <w:rPr>
                 <w:noProof/>
               </w:rPr>
-              <w:instrText xml:space="preserve"> PAGEREF _Toc240520687 \h </w:instrText>
+              <w:instrText xml:space="preserve"> PAGEREF _Toc240521843 \h </w:instrText>
             </w:r>
             <w:r>
               <w:rPr>
@@ -1930,7 +1986,7 @@
               <w14:ligatures w14:val="standardContextual"/>
             </w:rPr>
           </w:pPr>
-          <w:hyperlink w:anchor="_Toc240520688" w:history="1">
+          <w:hyperlink w:anchor="_Toc240521844" w:history="1">
             <w:r>
               <w:rPr>
                 <w:rStyle w:val="a5"/>
@@ -1954,7 +2010,7 @@
               <w:rPr>
                 <w:noProof/>
               </w:rPr>
-              <w:instrText xml:space="preserve"> PAGEREF _Toc240520688 \h </w:instrText>
+              <w:instrText xml:space="preserve"> PAGEREF _Toc240521844 \h </w:instrText>
             </w:r>
             <w:r>
               <w:rPr>
@@ -1997,7 +2053,7 @@
               <w14:ligatures w14:val="standardContextual"/>
             </w:rPr>
           </w:pPr>
-          <w:hyperlink w:anchor="_Toc240520689" w:history="1">
+          <w:hyperlink w:anchor="_Toc240521845" w:history="1">
             <w:r>
               <w:rPr>
                 <w:rStyle w:val="a5"/>
@@ -2021,7 +2077,7 @@
               <w:rPr>
                 <w:noProof/>
               </w:rPr>
-              <w:instrText xml:space="preserve"> PAGEREF _Toc240520689 \h </w:instrText>
+              <w:instrText xml:space="preserve"> PAGEREF _Toc240521845 \h </w:instrText>
             </w:r>
             <w:r>
               <w:rPr>
@@ -2063,7 +2119,7 @@
               <w14:ligatures w14:val="standardContextual"/>
             </w:rPr>
           </w:pPr>
-          <w:hyperlink w:anchor="_Toc240520690" w:history="1">
+          <w:hyperlink w:anchor="_Toc240521846" w:history="1">
             <w:r>
               <w:rPr>
                 <w:rStyle w:val="a5"/>
@@ -2087,7 +2143,7 @@
               <w:rPr>
                 <w:noProof/>
               </w:rPr>
-              <w:instrText xml:space="preserve"> PAGEREF _Toc240520690 \h </w:instrText>
+              <w:instrText xml:space="preserve"> PAGEREF _Toc240521846 \h </w:instrText>
             </w:r>
             <w:r>
               <w:rPr>
@@ -2130,7 +2186,7 @@
               <w14:ligatures w14:val="standardContextual"/>
             </w:rPr>
           </w:pPr>
-          <w:hyperlink w:anchor="_Toc240520691" w:history="1">
+          <w:hyperlink w:anchor="_Toc240521847" w:history="1">
             <w:r>
               <w:rPr>
                 <w:rStyle w:val="a5"/>
@@ -2154,7 +2210,7 @@
               <w:rPr>
                 <w:noProof/>
               </w:rPr>
-              <w:instrText xml:space="preserve"> PAGEREF _Toc240520691 \h </w:instrText>
+              <w:instrText xml:space="preserve"> PAGEREF _Toc240521847 \h </w:instrText>
             </w:r>
             <w:r>
               <w:rPr>
@@ -2197,7 +2253,7 @@
               <w14:ligatures w14:val="standardContextual"/>
             </w:rPr>
           </w:pPr>
-          <w:hyperlink w:anchor="_Toc240520692" w:history="1">
+          <w:hyperlink w:anchor="_Toc240521848" w:history="1">
             <w:r>
               <w:rPr>
                 <w:rStyle w:val="a5"/>
@@ -2221,7 +2277,7 @@
               <w:rPr>
                 <w:noProof/>
               </w:rPr>
-              <w:instrText xml:space="preserve"> PAGEREF _Toc240520692 \h </w:instrText>
+              <w:instrText xml:space="preserve"> PAGEREF _Toc240521848 \h </w:instrText>
             </w:r>
             <w:r>
               <w:rPr>
@@ -2264,7 +2320,7 @@
               <w14:ligatures w14:val="standardContextual"/>
             </w:rPr>
           </w:pPr>
-          <w:hyperlink w:anchor="_Toc240520693" w:history="1">
+          <w:hyperlink w:anchor="_Toc240521849" w:history="1">
             <w:r>
               <w:rPr>
                 <w:rStyle w:val="a5"/>
@@ -2288,7 +2344,7 @@
               <w:rPr>
                 <w:noProof/>
               </w:rPr>
-              <w:instrText xml:space="preserve"> PAGEREF _Toc240520693 \h </w:instrText>
+              <w:instrText xml:space="preserve"> PAGEREF _Toc240521849 \h </w:instrText>
             </w:r>
             <w:r>
               <w:rPr>
@@ -2330,7 +2386,7 @@
               <w14:ligatures w14:val="standardContextual"/>
             </w:rPr>
           </w:pPr>
-          <w:hyperlink w:anchor="_Toc240520694" w:history="1">
+          <w:hyperlink w:anchor="_Toc240521850" w:history="1">
             <w:r>
               <w:rPr>
                 <w:rStyle w:val="a5"/>
@@ -2354,7 +2410,7 @@
               <w:rPr>
                 <w:noProof/>
               </w:rPr>
-              <w:instrText xml:space="preserve"> PAGEREF _Toc240520694 \h </w:instrText>
+              <w:instrText xml:space="preserve"> PAGEREF _Toc240521850 \h </w:instrText>
             </w:r>
             <w:r>
               <w:rPr>
@@ -2397,7 +2453,7 @@
               <w14:ligatures w14:val="standardContextual"/>
             </w:rPr>
           </w:pPr>
-          <w:hyperlink w:anchor="_Toc240520695" w:history="1">
+          <w:hyperlink w:anchor="_Toc240521851" w:history="1">
             <w:r>
               <w:rPr>
                 <w:rStyle w:val="a5"/>
@@ -2421,7 +2477,7 @@
               <w:rPr>
                 <w:noProof/>
               </w:rPr>
-              <w:instrText xml:space="preserve"> PAGEREF _Toc240520695 \h </w:instrText>
+              <w:instrText xml:space="preserve"> PAGEREF _Toc240521851 \h </w:instrText>
             </w:r>
             <w:r>
               <w:rPr>
@@ -2464,7 +2520,7 @@
               <w14:ligatures w14:val="standardContextual"/>
             </w:rPr>
           </w:pPr>
-          <w:hyperlink w:anchor="_Toc240520696" w:history="1">
+          <w:hyperlink w:anchor="_Toc240521852" w:history="1">
             <w:r>
               <w:rPr>
                 <w:rStyle w:val="a5"/>
@@ -2488,7 +2544,7 @@
               <w:rPr>
                 <w:noProof/>
               </w:rPr>
-              <w:instrText xml:space="preserve"> PAGEREF _Toc240520696 \h </w:instrText>
+              <w:instrText xml:space="preserve"> PAGEREF _Toc240521852 \h </w:instrText>
             </w:r>
             <w:r>
               <w:rPr>
@@ -2530,7 +2586,7 @@
               <w14:ligatures w14:val="standardContextual"/>
             </w:rPr>
           </w:pPr>
-          <w:hyperlink w:anchor="_Toc240520697" w:history="1">
+          <w:hyperlink w:anchor="_Toc240521853" w:history="1">
             <w:r>
               <w:rPr>
                 <w:rStyle w:val="a5"/>
@@ -2554,7 +2610,7 @@
               <w:rPr>
                 <w:noProof/>
               </w:rPr>
-              <w:instrText xml:space="preserve"> PAGEREF _Toc240520697 \h </w:instrText>
+              <w:instrText xml:space="preserve"> PAGEREF _Toc240521853 \h </w:instrText>
             </w:r>
             <w:r>
               <w:rPr>
@@ -2596,7 +2652,7 @@
               <w14:ligatures w14:val="standardContextual"/>
             </w:rPr>
           </w:pPr>
-          <w:hyperlink w:anchor="_Toc240520698" w:history="1">
+          <w:hyperlink w:anchor="_Toc240521854" w:history="1">
             <w:r>
               <w:rPr>
                 <w:rStyle w:val="a5"/>
@@ -2620,7 +2676,7 @@
               <w:rPr>
                 <w:noProof/>
               </w:rPr>
-              <w:instrText xml:space="preserve"> PAGEREF _Toc240520698 \h </w:instrText>
+              <w:instrText xml:space="preserve"> PAGEREF _Toc240521854 \h </w:instrText>
             </w:r>
             <w:r>
               <w:rPr>
@@ -2663,7 +2719,7 @@
               <w14:ligatures w14:val="standardContextual"/>
             </w:rPr>
           </w:pPr>
-          <w:hyperlink w:anchor="_Toc240520699" w:history="1">
+          <w:hyperlink w:anchor="_Toc240521855" w:history="1">
             <w:r>
               <w:rPr>
                 <w:rStyle w:val="a5"/>
@@ -2687,7 +2743,7 @@
               <w:rPr>
                 <w:noProof/>
               </w:rPr>
-              <w:instrText xml:space="preserve"> PAGEREF _Toc240520699 \h </w:instrText>
+              <w:instrText xml:space="preserve"> PAGEREF _Toc240521855 \h </w:instrText>
             </w:r>
             <w:r>
               <w:rPr>
@@ -2730,7 +2786,7 @@
               <w14:ligatures w14:val="standardContextual"/>
             </w:rPr>
           </w:pPr>
-          <w:hyperlink w:anchor="_Toc240520700" w:history="1">
+          <w:hyperlink w:anchor="_Toc240521856" w:history="1">
             <w:r>
               <w:rPr>
                 <w:rStyle w:val="a5"/>
@@ -2754,7 +2810,7 @@
               <w:rPr>
                 <w:noProof/>
               </w:rPr>
-              <w:instrText xml:space="preserve"> PAGEREF _Toc240520700 \h </w:instrText>
+              <w:instrText xml:space="preserve"> PAGEREF _Toc240521856 \h </w:instrText>
             </w:r>
             <w:r>
               <w:rPr>
@@ -2797,7 +2853,7 @@
               <w14:ligatures w14:val="standardContextual"/>
             </w:rPr>
           </w:pPr>
-          <w:hyperlink w:anchor="_Toc240520701" w:history="1">
+          <w:hyperlink w:anchor="_Toc240521857" w:history="1">
             <w:r>
               <w:rPr>
                 <w:rStyle w:val="a5"/>
@@ -2821,7 +2877,7 @@
               <w:rPr>
                 <w:noProof/>
               </w:rPr>
-              <w:instrText xml:space="preserve"> PAGEREF _Toc240520701 \h </w:instrText>
+              <w:instrText xml:space="preserve"> PAGEREF _Toc240521857 \h </w:instrText>
             </w:r>
             <w:r>
               <w:rPr>
@@ -2863,7 +2919,7 @@
               <w14:ligatures w14:val="standardContextual"/>
             </w:rPr>
           </w:pPr>
-          <w:hyperlink w:anchor="_Toc240520702" w:history="1">
+          <w:hyperlink w:anchor="_Toc240521858" w:history="1">
             <w:r>
               <w:rPr>
                 <w:rStyle w:val="a5"/>
@@ -2887,7 +2943,7 @@
               <w:rPr>
                 <w:noProof/>
               </w:rPr>
-              <w:instrText xml:space="preserve"> PAGEREF _Toc240520702 \h </w:instrText>
+              <w:instrText xml:space="preserve"> PAGEREF _Toc240521858 \h </w:instrText>
             </w:r>
             <w:r>
               <w:rPr>
@@ -2929,7 +2985,7 @@
               <w14:ligatures w14:val="standardContextual"/>
             </w:rPr>
           </w:pPr>
-          <w:hyperlink w:anchor="_Toc240520703" w:history="1">
+          <w:hyperlink w:anchor="_Toc240521859" w:history="1">
             <w:r>
               <w:rPr>
                 <w:rStyle w:val="a5"/>
@@ -2953,7 +3009,7 @@
               <w:rPr>
                 <w:noProof/>
               </w:rPr>
-              <w:instrText xml:space="preserve"> PAGEREF _Toc240520703 \h </w:instrText>
+              <w:instrText xml:space="preserve"> PAGEREF _Toc240521859 \h </w:instrText>
             </w:r>
             <w:r>
               <w:rPr>
@@ -2995,7 +3051,7 @@
               <w14:ligatures w14:val="standardContextual"/>
             </w:rPr>
           </w:pPr>
-          <w:hyperlink w:anchor="_Toc240520704" w:history="1">
+          <w:hyperlink w:anchor="_Toc240521860" w:history="1">
             <w:r>
               <w:rPr>
                 <w:rStyle w:val="a5"/>
@@ -3019,7 +3075,7 @@
               <w:rPr>
                 <w:noProof/>
               </w:rPr>
-              <w:instrText xml:space="preserve"> PAGEREF _Toc240520704 \h </w:instrText>
+              <w:instrText xml:space="preserve"> PAGEREF _Toc240521860 \h </w:instrText>
             </w:r>
             <w:r>
               <w:rPr>
@@ -3061,7 +3117,7 @@
               <w14:ligatures w14:val="standardContextual"/>
             </w:rPr>
           </w:pPr>
-          <w:hyperlink w:anchor="_Toc240520705" w:history="1">
+          <w:hyperlink w:anchor="_Toc240521861" w:history="1">
             <w:r>
               <w:rPr>
                 <w:rStyle w:val="a5"/>
@@ -3085,7 +3141,7 @@
               <w:rPr>
                 <w:noProof/>
               </w:rPr>
-              <w:instrText xml:space="preserve"> PAGEREF _Toc240520705 \h </w:instrText>
+              <w:instrText xml:space="preserve"> PAGEREF _Toc240521861 \h </w:instrText>
             </w:r>
             <w:r>
               <w:rPr>
@@ -3128,7 +3184,7 @@
               <w14:ligatures w14:val="standardContextual"/>
             </w:rPr>
           </w:pPr>
-          <w:hyperlink w:anchor="_Toc240520706" w:history="1">
+          <w:hyperlink w:anchor="_Toc240521862" w:history="1">
             <w:r>
               <w:rPr>
                 <w:rStyle w:val="a5"/>
@@ -3152,7 +3208,7 @@
               <w:rPr>
                 <w:noProof/>
               </w:rPr>
-              <w:instrText xml:space="preserve"> PAGEREF _Toc240520706 \h </w:instrText>
+              <w:instrText xml:space="preserve"> PAGEREF _Toc240521862 \h </w:instrText>
             </w:r>
             <w:r>
               <w:rPr>
@@ -3195,7 +3251,7 @@
               <w14:ligatures w14:val="standardContextual"/>
             </w:rPr>
           </w:pPr>
-          <w:hyperlink w:anchor="_Toc240520707" w:history="1">
+          <w:hyperlink w:anchor="_Toc240521863" w:history="1">
             <w:r>
               <w:rPr>
                 <w:rStyle w:val="a5"/>
@@ -3219,7 +3275,7 @@
               <w:rPr>
                 <w:noProof/>
               </w:rPr>
-              <w:instrText xml:space="preserve"> PAGEREF _Toc240520707 \h </w:instrText>
+              <w:instrText xml:space="preserve"> PAGEREF _Toc240521863 \h </w:instrText>
             </w:r>
             <w:r>
               <w:rPr>
@@ -3262,7 +3318,7 @@
               <w14:ligatures w14:val="standardContextual"/>
             </w:rPr>
           </w:pPr>
-          <w:hyperlink w:anchor="_Toc240520708" w:history="1">
+          <w:hyperlink w:anchor="_Toc240521864" w:history="1">
             <w:r>
               <w:rPr>
                 <w:rStyle w:val="a5"/>
@@ -3286,7 +3342,7 @@
               <w:rPr>
                 <w:noProof/>
               </w:rPr>
-              <w:instrText xml:space="preserve"> PAGEREF _Toc240520708 \h </w:instrText>
+              <w:instrText xml:space="preserve"> PAGEREF _Toc240521864 \h </w:instrText>
             </w:r>
             <w:r>
               <w:rPr>
@@ -3329,7 +3385,7 @@
               <w14:ligatures w14:val="standardContextual"/>
             </w:rPr>
           </w:pPr>
-          <w:hyperlink w:anchor="_Toc240520709" w:history="1">
+          <w:hyperlink w:anchor="_Toc240521865" w:history="1">
             <w:r>
               <w:rPr>
                 <w:rStyle w:val="a5"/>
@@ -3353,7 +3409,7 @@
               <w:rPr>
                 <w:noProof/>
               </w:rPr>
-              <w:instrText xml:space="preserve"> PAGEREF _Toc240520709 \h </w:instrText>
+              <w:instrText xml:space="preserve"> PAGEREF _Toc240521865 \h </w:instrText>
             </w:r>
             <w:r>
               <w:rPr>
@@ -3392,7 +3448,7 @@
         <w:pStyle w:val="1"/>
         <w:pageBreakBefore/>
       </w:pPr>
-      <w:bookmarkStart w:id="0" w:name="_Toc240520665"/>
+      <w:bookmarkStart w:id="0" w:name="_Toc240521821"/>
       <w:r>
         <w:lastRenderedPageBreak/>
         <w:t xml:space="preserve">1. </w:t>
@@ -3406,7 +3462,7 @@
       <w:pPr>
         <w:pStyle w:val="2"/>
       </w:pPr>
-      <w:bookmarkStart w:id="1" w:name="_Toc240520666"/>
+      <w:bookmarkStart w:id="1" w:name="_Toc240521822"/>
       <w:r>
         <w:t>1.1 RuninqVic</w:t>
       </w:r>
@@ -3435,6 +3491,30 @@
         <w:t xml:space="preserve"> </w:t>
       </w:r>
       <w:r>
+        <w:t>텐에이아이</w:t>
+      </w:r>
+      <w:r>
+        <w:t>(TenAI, www.tenai.kr)</w:t>
+      </w:r>
+      <w:r>
+        <w:t>가</w:t>
+      </w:r>
+      <w:r>
+        <w:t xml:space="preserve"> </w:t>
+      </w:r>
+      <w:r>
+        <w:t>만든</w:t>
+      </w:r>
+      <w:r>
+        <w:t xml:space="preserve"> </w:t>
+      </w:r>
+      <w:r>
+        <w:t>프로그램으로</w:t>
+      </w:r>
+      <w:r>
+        <w:t xml:space="preserve">, </w:t>
+      </w:r>
+      <w:r>
         <w:t>사진</w:t>
       </w:r>
       <w:r>
@@ -3786,7 +3866,7 @@
       <w:pPr>
         <w:pStyle w:val="2"/>
       </w:pPr>
-      <w:bookmarkStart w:id="2" w:name="_Toc240520667"/>
+      <w:bookmarkStart w:id="2" w:name="_Toc240521823"/>
       <w:r>
         <w:t xml:space="preserve">1.2 </w:t>
       </w:r>
@@ -6406,7 +6486,7 @@
       <w:pPr>
         <w:pStyle w:val="2"/>
       </w:pPr>
-      <w:bookmarkStart w:id="3" w:name="_Toc240520668"/>
+      <w:bookmarkStart w:id="3" w:name="_Toc240521824"/>
       <w:r>
         <w:t xml:space="preserve">1.3 </w:t>
       </w:r>
@@ -6638,7 +6718,7 @@
         <w:pStyle w:val="1"/>
         <w:pageBreakBefore/>
       </w:pPr>
-      <w:bookmarkStart w:id="4" w:name="_Toc240520669"/>
+      <w:bookmarkStart w:id="4" w:name="_Toc240521825"/>
       <w:r>
         <w:lastRenderedPageBreak/>
         <w:t xml:space="preserve">2. </w:t>
@@ -6652,7 +6732,7 @@
       <w:pPr>
         <w:pStyle w:val="2"/>
       </w:pPr>
-      <w:bookmarkStart w:id="5" w:name="_Toc240520670"/>
+      <w:bookmarkStart w:id="5" w:name="_Toc240521826"/>
       <w:r>
         <w:t xml:space="preserve">2.1 </w:t>
       </w:r>
@@ -7630,7 +7710,7 @@
       <w:pPr>
         <w:pStyle w:val="2"/>
       </w:pPr>
-      <w:bookmarkStart w:id="6" w:name="_Toc240520671"/>
+      <w:bookmarkStart w:id="6" w:name="_Toc240521827"/>
       <w:r>
         <w:t xml:space="preserve">2.2 </w:t>
       </w:r>
@@ -7984,7 +8064,7 @@
         </w:rPr>
         <w:lastRenderedPageBreak/>
         <w:drawing>
-          <wp:inline distT="0" distB="0" distL="0" distR="0" wp14:anchorId="086DD006" wp14:editId="77D22F59">
+          <wp:inline distT="0" distB="0" distL="0" distR="0" wp14:anchorId="1C4A75B4" wp14:editId="6F9228EB">
             <wp:extent cx="5943600" cy="3638550"/>
             <wp:effectExtent l="0" t="0" r="0" b="0"/>
             <wp:docPr id="1" name="그림 1"/>
@@ -8001,7 +8081,7 @@
                     </pic:cNvPicPr>
                   </pic:nvPicPr>
                   <pic:blipFill>
-                    <a:blip r:embed="rId8"/>
+                    <a:blip r:embed="rId9"/>
                     <a:srcRect/>
                     <a:stretch>
                       <a:fillRect/>
@@ -8103,7 +8183,7 @@
       <w:pPr>
         <w:pStyle w:val="2"/>
       </w:pPr>
-      <w:bookmarkStart w:id="7" w:name="_Toc240520672"/>
+      <w:bookmarkStart w:id="7" w:name="_Toc240521828"/>
       <w:r>
         <w:t xml:space="preserve">2.3 </w:t>
       </w:r>
@@ -8128,10 +8208,10 @@
           <w:noProof/>
         </w:rPr>
         <w:drawing>
-          <wp:inline distT="0" distB="0" distL="0" distR="0" wp14:anchorId="556F59E0" wp14:editId="2BD7B99F">
+          <wp:inline distT="0" distB="0" distL="0" distR="0" wp14:anchorId="5538B7DB" wp14:editId="7BF22964">
             <wp:extent cx="5943600" cy="3638550"/>
             <wp:effectExtent l="0" t="0" r="0" b="0"/>
-            <wp:docPr id="1940157974" name="그림 1940157974"/>
+            <wp:docPr id="12438281" name="그림 12438281"/>
             <wp:cNvGraphicFramePr>
               <a:graphicFrameLocks xmlns:a="http://schemas.openxmlformats.org/drawingml/2006/main" noChangeAspect="1"/>
             </wp:cNvGraphicFramePr>
@@ -8145,7 +8225,7 @@
                     </pic:cNvPicPr>
                   </pic:nvPicPr>
                   <pic:blipFill>
-                    <a:blip r:embed="rId9"/>
+                    <a:blip r:embed="rId10"/>
                     <a:srcRect/>
                     <a:stretch>
                       <a:fillRect/>
@@ -9561,7 +9641,7 @@
       <w:pPr>
         <w:pStyle w:val="2"/>
       </w:pPr>
-      <w:bookmarkStart w:id="8" w:name="_Toc240520673"/>
+      <w:bookmarkStart w:id="8" w:name="_Toc240521829"/>
       <w:r>
         <w:t xml:space="preserve">2.4 </w:t>
       </w:r>
@@ -9587,10 +9667,10 @@
         </w:rPr>
         <w:lastRenderedPageBreak/>
         <w:drawing>
-          <wp:inline distT="0" distB="0" distL="0" distR="0" wp14:anchorId="0DF8DB09" wp14:editId="1EF7ACAE">
+          <wp:inline distT="0" distB="0" distL="0" distR="0" wp14:anchorId="142AE38E" wp14:editId="4C688CBC">
             <wp:extent cx="5943600" cy="12858750"/>
             <wp:effectExtent l="0" t="0" r="0" b="0"/>
-            <wp:docPr id="1138187883" name="그림 1138187883"/>
+            <wp:docPr id="729457913" name="그림 729457913"/>
             <wp:cNvGraphicFramePr>
               <a:graphicFrameLocks xmlns:a="http://schemas.openxmlformats.org/drawingml/2006/main" noChangeAspect="1"/>
             </wp:cNvGraphicFramePr>
@@ -9604,7 +9684,7 @@
                     </pic:cNvPicPr>
                   </pic:nvPicPr>
                   <pic:blipFill>
-                    <a:blip r:embed="rId10"/>
+                    <a:blip r:embed="rId11"/>
                     <a:srcRect/>
                     <a:stretch>
                       <a:fillRect/>
@@ -12256,7 +12336,7 @@
         <w:pStyle w:val="1"/>
         <w:pageBreakBefore/>
       </w:pPr>
-      <w:bookmarkStart w:id="9" w:name="_Toc240520674"/>
+      <w:bookmarkStart w:id="9" w:name="_Toc240521830"/>
       <w:r>
         <w:lastRenderedPageBreak/>
         <w:t>3. 5</w:t>
@@ -12960,7 +13040,7 @@
         <w:pStyle w:val="1"/>
         <w:pageBreakBefore/>
       </w:pPr>
-      <w:bookmarkStart w:id="10" w:name="_Toc240520675"/>
+      <w:bookmarkStart w:id="10" w:name="_Toc240521831"/>
       <w:r>
         <w:lastRenderedPageBreak/>
         <w:t xml:space="preserve">4. </w:t>
@@ -13039,7 +13119,7 @@
       <w:pPr>
         <w:pStyle w:val="2"/>
       </w:pPr>
-      <w:bookmarkStart w:id="11" w:name="_Toc240520676"/>
+      <w:bookmarkStart w:id="11" w:name="_Toc240521832"/>
       <w:r>
         <w:t xml:space="preserve">4.1 ① </w:t>
       </w:r>
@@ -13761,7 +13841,7 @@
       <w:pPr>
         <w:pStyle w:val="2"/>
       </w:pPr>
-      <w:bookmarkStart w:id="12" w:name="_Toc240520677"/>
+      <w:bookmarkStart w:id="12" w:name="_Toc240521833"/>
       <w:r>
         <w:t xml:space="preserve">4.2 ② </w:t>
       </w:r>
@@ -14188,7 +14268,7 @@
       <w:pPr>
         <w:pStyle w:val="2"/>
       </w:pPr>
-      <w:bookmarkStart w:id="13" w:name="_Toc240520678"/>
+      <w:bookmarkStart w:id="13" w:name="_Toc240521834"/>
       <w:r>
         <w:t xml:space="preserve">4.3 ③ </w:t>
       </w:r>
@@ -15789,7 +15869,7 @@
       <w:pPr>
         <w:pStyle w:val="2"/>
       </w:pPr>
-      <w:bookmarkStart w:id="14" w:name="_Toc240520679"/>
+      <w:bookmarkStart w:id="14" w:name="_Toc240521835"/>
       <w:r>
         <w:t xml:space="preserve">4.4 ④ </w:t>
       </w:r>
@@ -16296,7 +16376,7 @@
         <w:pStyle w:val="1"/>
         <w:pageBreakBefore/>
       </w:pPr>
-      <w:bookmarkStart w:id="15" w:name="_Toc240520680"/>
+      <w:bookmarkStart w:id="15" w:name="_Toc240521836"/>
       <w:r>
         <w:lastRenderedPageBreak/>
         <w:t xml:space="preserve">5. </w:t>
@@ -16322,7 +16402,7 @@
       <w:pPr>
         <w:pStyle w:val="2"/>
       </w:pPr>
-      <w:bookmarkStart w:id="16" w:name="_Toc240520681"/>
+      <w:bookmarkStart w:id="16" w:name="_Toc240521837"/>
       <w:r>
         <w:t xml:space="preserve">5.1 </w:t>
       </w:r>
@@ -16631,7 +16711,7 @@
       <w:pPr>
         <w:pStyle w:val="2"/>
       </w:pPr>
-      <w:bookmarkStart w:id="17" w:name="_Toc240520682"/>
+      <w:bookmarkStart w:id="17" w:name="_Toc240521838"/>
       <w:r>
         <w:t xml:space="preserve">5.2 </w:t>
       </w:r>
@@ -17160,7 +17240,7 @@
       <w:pPr>
         <w:pStyle w:val="2"/>
       </w:pPr>
-      <w:bookmarkStart w:id="18" w:name="_Toc240520683"/>
+      <w:bookmarkStart w:id="18" w:name="_Toc240521839"/>
       <w:r>
         <w:t xml:space="preserve">5.3 </w:t>
       </w:r>
@@ -17431,7 +17511,7 @@
       <w:pPr>
         <w:pStyle w:val="2"/>
       </w:pPr>
-      <w:bookmarkStart w:id="19" w:name="_Toc240520684"/>
+      <w:bookmarkStart w:id="19" w:name="_Toc240521840"/>
       <w:r>
         <w:t xml:space="preserve">5.4 </w:t>
       </w:r>
@@ -17641,7 +17721,7 @@
       <w:pPr>
         <w:pStyle w:val="2"/>
       </w:pPr>
-      <w:bookmarkStart w:id="20" w:name="_Toc240520685"/>
+      <w:bookmarkStart w:id="20" w:name="_Toc240521841"/>
       <w:r>
         <w:t xml:space="preserve">5.5 </w:t>
       </w:r>
@@ -17864,7 +17944,7 @@
       <w:pPr>
         <w:pStyle w:val="2"/>
       </w:pPr>
-      <w:bookmarkStart w:id="21" w:name="_Toc240520686"/>
+      <w:bookmarkStart w:id="21" w:name="_Toc240521842"/>
       <w:r>
         <w:t xml:space="preserve">5.6 </w:t>
       </w:r>
@@ -17985,7 +18065,7 @@
         <w:pStyle w:val="1"/>
         <w:pageBreakBefore/>
       </w:pPr>
-      <w:bookmarkStart w:id="22" w:name="_Toc240520687"/>
+      <w:bookmarkStart w:id="22" w:name="_Toc240521843"/>
       <w:r>
         <w:lastRenderedPageBreak/>
         <w:t xml:space="preserve">6. </w:t>
@@ -19834,7 +19914,7 @@
         <w:pStyle w:val="1"/>
         <w:pageBreakBefore/>
       </w:pPr>
-      <w:bookmarkStart w:id="23" w:name="_Toc240520688"/>
+      <w:bookmarkStart w:id="23" w:name="_Toc240521844"/>
       <w:r>
         <w:lastRenderedPageBreak/>
         <w:t xml:space="preserve">7. </w:t>
@@ -19854,10 +19934,10 @@
           <w:noProof/>
         </w:rPr>
         <w:drawing>
-          <wp:inline distT="0" distB="0" distL="0" distR="0" wp14:anchorId="1EA862D5" wp14:editId="3CE45421">
+          <wp:inline distT="0" distB="0" distL="0" distR="0" wp14:anchorId="61EBF371" wp14:editId="33E72C83">
             <wp:extent cx="5943600" cy="3638550"/>
             <wp:effectExtent l="0" t="0" r="0" b="0"/>
-            <wp:docPr id="2123774412" name="그림 2123774412"/>
+            <wp:docPr id="1214455543" name="그림 1214455543"/>
             <wp:cNvGraphicFramePr>
               <a:graphicFrameLocks xmlns:a="http://schemas.openxmlformats.org/drawingml/2006/main" noChangeAspect="1"/>
             </wp:cNvGraphicFramePr>
@@ -19871,7 +19951,7 @@
                     </pic:cNvPicPr>
                   </pic:nvPicPr>
                   <pic:blipFill>
-                    <a:blip r:embed="rId11"/>
+                    <a:blip r:embed="rId12"/>
                     <a:srcRect/>
                     <a:stretch>
                       <a:fillRect/>
@@ -22663,7 +22743,7 @@
       <w:pPr>
         <w:pStyle w:val="2"/>
       </w:pPr>
-      <w:bookmarkStart w:id="24" w:name="_Toc240520689"/>
+      <w:bookmarkStart w:id="24" w:name="_Toc240521845"/>
       <w:r>
         <w:t xml:space="preserve">7.1 </w:t>
       </w:r>
@@ -22694,10 +22774,10 @@
           <w:noProof/>
         </w:rPr>
         <w:drawing>
-          <wp:inline distT="0" distB="0" distL="0" distR="0" wp14:anchorId="1E7C4C28" wp14:editId="21827007">
+          <wp:inline distT="0" distB="0" distL="0" distR="0" wp14:anchorId="46A37E19" wp14:editId="09295D20">
             <wp:extent cx="5943600" cy="3638550"/>
             <wp:effectExtent l="0" t="0" r="0" b="0"/>
-            <wp:docPr id="1197067454" name="그림 1197067454"/>
+            <wp:docPr id="733197553" name="그림 733197553"/>
             <wp:cNvGraphicFramePr>
               <a:graphicFrameLocks xmlns:a="http://schemas.openxmlformats.org/drawingml/2006/main" noChangeAspect="1"/>
             </wp:cNvGraphicFramePr>
@@ -22711,7 +22791,7 @@
                     </pic:cNvPicPr>
                   </pic:nvPicPr>
                   <pic:blipFill>
-                    <a:blip r:embed="rId12"/>
+                    <a:blip r:embed="rId13"/>
                     <a:srcRect/>
                     <a:stretch>
                       <a:fillRect/>
@@ -24772,7 +24852,7 @@
         <w:pStyle w:val="1"/>
         <w:pageBreakBefore/>
       </w:pPr>
-      <w:bookmarkStart w:id="25" w:name="_Toc240520690"/>
+      <w:bookmarkStart w:id="25" w:name="_Toc240521846"/>
       <w:r>
         <w:lastRenderedPageBreak/>
         <w:t xml:space="preserve">8. </w:t>
@@ -24792,10 +24872,10 @@
           <w:noProof/>
         </w:rPr>
         <w:drawing>
-          <wp:inline distT="0" distB="0" distL="0" distR="0" wp14:anchorId="241079B0" wp14:editId="271910CF">
+          <wp:inline distT="0" distB="0" distL="0" distR="0" wp14:anchorId="12E65883" wp14:editId="29DE62CC">
             <wp:extent cx="5943600" cy="3638550"/>
             <wp:effectExtent l="0" t="0" r="0" b="0"/>
-            <wp:docPr id="1377062083" name="그림 1377062083"/>
+            <wp:docPr id="491212306" name="그림 491212306"/>
             <wp:cNvGraphicFramePr>
               <a:graphicFrameLocks xmlns:a="http://schemas.openxmlformats.org/drawingml/2006/main" noChangeAspect="1"/>
             </wp:cNvGraphicFramePr>
@@ -24809,7 +24889,7 @@
                     </pic:cNvPicPr>
                   </pic:nvPicPr>
                   <pic:blipFill>
-                    <a:blip r:embed="rId13"/>
+                    <a:blip r:embed="rId14"/>
                     <a:srcRect/>
                     <a:stretch>
                       <a:fillRect/>
@@ -24891,7 +24971,7 @@
       <w:pPr>
         <w:pStyle w:val="2"/>
       </w:pPr>
-      <w:bookmarkStart w:id="26" w:name="_Toc240520691"/>
+      <w:bookmarkStart w:id="26" w:name="_Toc240521847"/>
       <w:r>
         <w:t xml:space="preserve">8.1 </w:t>
       </w:r>
@@ -25979,7 +26059,7 @@
       <w:pPr>
         <w:pStyle w:val="2"/>
       </w:pPr>
-      <w:bookmarkStart w:id="27" w:name="_Toc240520692"/>
+      <w:bookmarkStart w:id="27" w:name="_Toc240521848"/>
       <w:r>
         <w:t xml:space="preserve">8.2 </w:t>
       </w:r>
@@ -27232,7 +27312,7 @@
       <w:pPr>
         <w:pStyle w:val="2"/>
       </w:pPr>
-      <w:bookmarkStart w:id="28" w:name="_Toc240520693"/>
+      <w:bookmarkStart w:id="28" w:name="_Toc240521849"/>
       <w:r>
         <w:t xml:space="preserve">8.3 </w:t>
       </w:r>
@@ -27485,7 +27565,7 @@
         <w:pStyle w:val="1"/>
         <w:pageBreakBefore/>
       </w:pPr>
-      <w:bookmarkStart w:id="29" w:name="_Toc240520694"/>
+      <w:bookmarkStart w:id="29" w:name="_Toc240521850"/>
       <w:r>
         <w:lastRenderedPageBreak/>
         <w:t xml:space="preserve">9. </w:t>
@@ -27505,10 +27585,10 @@
           <w:noProof/>
         </w:rPr>
         <w:drawing>
-          <wp:inline distT="0" distB="0" distL="0" distR="0" wp14:anchorId="07A68DB3" wp14:editId="1B96BDDB">
+          <wp:inline distT="0" distB="0" distL="0" distR="0" wp14:anchorId="5380F158" wp14:editId="14B79084">
             <wp:extent cx="5943600" cy="3638550"/>
             <wp:effectExtent l="0" t="0" r="0" b="0"/>
-            <wp:docPr id="1145480112" name="그림 1145480112"/>
+            <wp:docPr id="855503342" name="그림 855503342"/>
             <wp:cNvGraphicFramePr>
               <a:graphicFrameLocks xmlns:a="http://schemas.openxmlformats.org/drawingml/2006/main" noChangeAspect="1"/>
             </wp:cNvGraphicFramePr>
@@ -27522,7 +27602,7 @@
                     </pic:cNvPicPr>
                   </pic:nvPicPr>
                   <pic:blipFill>
-                    <a:blip r:embed="rId14"/>
+                    <a:blip r:embed="rId15"/>
                     <a:srcRect/>
                     <a:stretch>
                       <a:fillRect/>
@@ -27604,7 +27684,7 @@
       <w:pPr>
         <w:pStyle w:val="2"/>
       </w:pPr>
-      <w:bookmarkStart w:id="30" w:name="_Toc240520695"/>
+      <w:bookmarkStart w:id="30" w:name="_Toc240521851"/>
       <w:r>
         <w:t xml:space="preserve">9.1 </w:t>
       </w:r>
@@ -28980,7 +29060,7 @@
       <w:pPr>
         <w:pStyle w:val="2"/>
       </w:pPr>
-      <w:bookmarkStart w:id="31" w:name="_Toc240520696"/>
+      <w:bookmarkStart w:id="31" w:name="_Toc240521852"/>
       <w:r>
         <w:t xml:space="preserve">9.2 </w:t>
       </w:r>
@@ -29149,7 +29229,7 @@
         <w:pStyle w:val="1"/>
         <w:pageBreakBefore/>
       </w:pPr>
-      <w:bookmarkStart w:id="32" w:name="_Toc240520697"/>
+      <w:bookmarkStart w:id="32" w:name="_Toc240521853"/>
       <w:r>
         <w:lastRenderedPageBreak/>
         <w:t xml:space="preserve">10. </w:t>
@@ -29175,10 +29255,10 @@
           <w:noProof/>
         </w:rPr>
         <w:drawing>
-          <wp:inline distT="0" distB="0" distL="0" distR="0" wp14:anchorId="00FE4C62" wp14:editId="36C50C91">
+          <wp:inline distT="0" distB="0" distL="0" distR="0" wp14:anchorId="612FDFBC" wp14:editId="04A70997">
             <wp:extent cx="5943600" cy="3638550"/>
             <wp:effectExtent l="0" t="0" r="0" b="0"/>
-            <wp:docPr id="379768974" name="그림 379768974"/>
+            <wp:docPr id="1736073647" name="그림 1736073647"/>
             <wp:cNvGraphicFramePr>
               <a:graphicFrameLocks xmlns:a="http://schemas.openxmlformats.org/drawingml/2006/main" noChangeAspect="1"/>
             </wp:cNvGraphicFramePr>
@@ -29192,7 +29272,7 @@
                     </pic:cNvPicPr>
                   </pic:nvPicPr>
                   <pic:blipFill>
-                    <a:blip r:embed="rId15"/>
+                    <a:blip r:embed="rId16"/>
                     <a:srcRect/>
                     <a:stretch>
                       <a:fillRect/>
@@ -30814,7 +30894,7 @@
         <w:pStyle w:val="1"/>
         <w:pageBreakBefore/>
       </w:pPr>
-      <w:bookmarkStart w:id="33" w:name="_Toc240520698"/>
+      <w:bookmarkStart w:id="33" w:name="_Toc240521854"/>
       <w:r>
         <w:lastRenderedPageBreak/>
         <w:t xml:space="preserve">11. </w:t>
@@ -30840,10 +30920,10 @@
           <w:noProof/>
         </w:rPr>
         <w:drawing>
-          <wp:inline distT="0" distB="0" distL="0" distR="0" wp14:anchorId="407FDCA9" wp14:editId="0441175D">
+          <wp:inline distT="0" distB="0" distL="0" distR="0" wp14:anchorId="1727949D" wp14:editId="647D0BB2">
             <wp:extent cx="5943600" cy="3638550"/>
             <wp:effectExtent l="0" t="0" r="0" b="0"/>
-            <wp:docPr id="466232753" name="그림 466232753"/>
+            <wp:docPr id="457056649" name="그림 457056649"/>
             <wp:cNvGraphicFramePr>
               <a:graphicFrameLocks xmlns:a="http://schemas.openxmlformats.org/drawingml/2006/main" noChangeAspect="1"/>
             </wp:cNvGraphicFramePr>
@@ -30857,7 +30937,7 @@
                     </pic:cNvPicPr>
                   </pic:nvPicPr>
                   <pic:blipFill>
-                    <a:blip r:embed="rId16"/>
+                    <a:blip r:embed="rId17"/>
                     <a:srcRect/>
                     <a:stretch>
                       <a:fillRect/>
@@ -30959,7 +31039,7 @@
       <w:pPr>
         <w:pStyle w:val="2"/>
       </w:pPr>
-      <w:bookmarkStart w:id="34" w:name="_Toc240520699"/>
+      <w:bookmarkStart w:id="34" w:name="_Toc240521855"/>
       <w:r>
         <w:t xml:space="preserve">11.1 </w:t>
       </w:r>
@@ -32258,7 +32338,7 @@
       <w:pPr>
         <w:pStyle w:val="2"/>
       </w:pPr>
-      <w:bookmarkStart w:id="35" w:name="_Toc240520700"/>
+      <w:bookmarkStart w:id="35" w:name="_Toc240521856"/>
       <w:r>
         <w:t xml:space="preserve">11.2 </w:t>
       </w:r>
@@ -32699,7 +32779,7 @@
       <w:pPr>
         <w:pStyle w:val="2"/>
       </w:pPr>
-      <w:bookmarkStart w:id="36" w:name="_Toc240520701"/>
+      <w:bookmarkStart w:id="36" w:name="_Toc240521857"/>
       <w:r>
         <w:t xml:space="preserve">11.3 </w:t>
       </w:r>
@@ -33240,7 +33320,7 @@
         <w:pStyle w:val="1"/>
         <w:pageBreakBefore/>
       </w:pPr>
-      <w:bookmarkStart w:id="37" w:name="_Toc240520702"/>
+      <w:bookmarkStart w:id="37" w:name="_Toc240521858"/>
       <w:r>
         <w:lastRenderedPageBreak/>
         <w:t xml:space="preserve">12. </w:t>
@@ -34698,7 +34778,7 @@
         <w:pStyle w:val="1"/>
         <w:pageBreakBefore/>
       </w:pPr>
-      <w:bookmarkStart w:id="38" w:name="_Toc240520703"/>
+      <w:bookmarkStart w:id="38" w:name="_Toc240521859"/>
       <w:r>
         <w:lastRenderedPageBreak/>
         <w:t xml:space="preserve">13. </w:t>
@@ -35525,7 +35605,7 @@
         <w:pStyle w:val="1"/>
         <w:pageBreakBefore/>
       </w:pPr>
-      <w:bookmarkStart w:id="39" w:name="_Toc240520704"/>
+      <w:bookmarkStart w:id="39" w:name="_Toc240521860"/>
       <w:r>
         <w:lastRenderedPageBreak/>
         <w:t xml:space="preserve">14. </w:t>
@@ -38238,7 +38318,7 @@
         <w:pStyle w:val="1"/>
         <w:pageBreakBefore/>
       </w:pPr>
-      <w:bookmarkStart w:id="40" w:name="_Toc240520705"/>
+      <w:bookmarkStart w:id="40" w:name="_Toc240521861"/>
       <w:r>
         <w:lastRenderedPageBreak/>
         <w:t>부록</w:t>
@@ -38249,7 +38329,7 @@
       <w:pPr>
         <w:pStyle w:val="2"/>
       </w:pPr>
-      <w:bookmarkStart w:id="41" w:name="_Toc240520706"/>
+      <w:bookmarkStart w:id="41" w:name="_Toc240521862"/>
       <w:r>
         <w:t xml:space="preserve">A. </w:t>
       </w:r>
@@ -38830,7 +38910,7 @@
       <w:pPr>
         <w:pStyle w:val="2"/>
       </w:pPr>
-      <w:bookmarkStart w:id="42" w:name="_Toc240520707"/>
+      <w:bookmarkStart w:id="42" w:name="_Toc240521863"/>
       <w:r>
         <w:t xml:space="preserve">B. </w:t>
       </w:r>
@@ -39065,7 +39145,7 @@
       <w:pPr>
         <w:pStyle w:val="2"/>
       </w:pPr>
-      <w:bookmarkStart w:id="43" w:name="_Toc240520708"/>
+      <w:bookmarkStart w:id="43" w:name="_Toc240521864"/>
       <w:r>
         <w:t xml:space="preserve">C. </w:t>
       </w:r>
@@ -40140,7 +40220,7 @@
       <w:pPr>
         <w:pStyle w:val="2"/>
       </w:pPr>
-      <w:bookmarkStart w:id="44" w:name="_Toc240520709"/>
+      <w:bookmarkStart w:id="44" w:name="_Toc240521865"/>
       <w:r>
         <w:t xml:space="preserve">D. </w:t>
       </w:r>
@@ -40352,9 +40432,31 @@
         <w:t>: https://github.com/SamulChung/RuninqVic</w:t>
       </w:r>
     </w:p>
+    <w:p>
+      <w:pPr>
+        <w:pStyle w:val="a4"/>
+        <w:numPr>
+          <w:ilvl w:val="0"/>
+          <w:numId w:val="2"/>
+        </w:numPr>
+        <w:spacing w:after="80" w:line="300" w:lineRule="auto"/>
+      </w:pPr>
+      <w:r>
+        <w:t>제작</w:t>
+      </w:r>
+      <w:r>
+        <w:t xml:space="preserve">: </w:t>
+      </w:r>
+      <w:r>
+        <w:t>텐에이아이</w:t>
+      </w:r>
+      <w:r>
+        <w:t xml:space="preserve"> (TenAI) · https://www.tenai.kr</w:t>
+      </w:r>
+    </w:p>
     <w:sectPr>
-      <w:headerReference w:type="default" r:id="rId17"/>
-      <w:footerReference w:type="default" r:id="rId18"/>
+      <w:headerReference w:type="default" r:id="rId18"/>
+      <w:footerReference w:type="default" r:id="rId19"/>
       <w:pgSz w:w="11906" w:h="16838"/>
       <w:pgMar w:top="1300" w:right="1273" w:bottom="1200" w:left="1273" w:header="708" w:footer="708" w:gutter="0"/>
       <w:cols w:space="720"/>
@@ -40484,7 +40586,39 @@
         <w:sz w:val="16"/>
         <w:szCs w:val="16"/>
       </w:rPr>
-      <w:t xml:space="preserve"> v1.2</w:t>
+      <w:t xml:space="preserve"> v1.2  ·  </w:t>
+    </w:r>
+    <w:r>
+      <w:rPr>
+        <w:color w:val="666666"/>
+        <w:sz w:val="16"/>
+        <w:szCs w:val="16"/>
+      </w:rPr>
+      <w:t>제작</w:t>
+    </w:r>
+    <w:r>
+      <w:rPr>
+        <w:color w:val="666666"/>
+        <w:sz w:val="16"/>
+        <w:szCs w:val="16"/>
+      </w:rPr>
+      <w:t xml:space="preserve">: </w:t>
+    </w:r>
+    <w:r>
+      <w:rPr>
+        <w:color w:val="666666"/>
+        <w:sz w:val="16"/>
+        <w:szCs w:val="16"/>
+      </w:rPr>
+      <w:t>텐에이아이</w:t>
+    </w:r>
+    <w:r>
+      <w:rPr>
+        <w:color w:val="666666"/>
+        <w:sz w:val="16"/>
+        <w:szCs w:val="16"/>
+      </w:rPr>
+      <w:t xml:space="preserve"> www.tenai.kr</w:t>
     </w:r>
   </w:p>
 </w:hdr>
@@ -40493,118 +40627,10 @@
 <file path=word/numbering.xml><?xml version="1.0" encoding="utf-8"?>
 <w:numbering xmlns:wpc="http://schemas.microsoft.com/office/word/2010/wordprocessingCanvas" xmlns:cx="http://schemas.microsoft.com/office/drawing/2014/chartex" xmlns:cx1="http://schemas.microsoft.com/office/drawing/2015/9/8/chartex" xmlns:cx2="http://schemas.microsoft.com/office/drawing/2015/10/21/chartex" xmlns:cx3="http://schemas.microsoft.com/office/drawing/2016/5/9/chartex" xmlns:cx4="http://schemas.microsoft.com/office/drawing/2016/5/10/chartex" xmlns:cx5="http://schemas.microsoft.com/office/drawing/2016/5/11/chartex" xmlns:cx6="http://schemas.microsoft.com/office/drawing/2016/5/12/chartex" xmlns:cx7="http://schemas.microsoft.com/office/drawing/2016/5/13/chartex" xmlns:cx8="http://schemas.microsoft.com/office/drawing/2016/5/14/chartex" xmlns:mc="http://schemas.openxmlformats.org/markup-compatibility/2006" xmlns:aink="http://schemas.microsoft.com/office/drawing/2016/ink" xmlns:am3d="http://schemas.microsoft.com/office/drawing/2017/model3d" xmlns:o="urn:schemas-microsoft-com:office:office" xmlns:oel="http://schemas.microsoft.com/office/2019/extlst" xmlns:r="http://schemas.openxmlformats.org/officeDocument/2006/relationships" xmlns:m="http://schemas.openxmlformats.org/officeDocument/2006/math" xmlns:v="urn:schemas-microsoft-com:vml" xmlns:wp14="http://schemas.microsoft.com/office/word/2010/wordprocessingDrawing" xmlns:wp="http://schemas.openxmlformats.org/drawingml/2006/wordprocessingDrawing" xmlns:w10="urn:schemas-microsoft-com:office:word" xmlns:w="http://schemas.openxmlformats.org/wordprocessingml/2006/main" xmlns:w14="http://schemas.microsoft.com/office/word/2010/wordml" xmlns:w15="http://schemas.microsoft.com/office/word/2012/wordml" xmlns:w16cex="http://schemas.microsoft.com/office/word/2018/wordml/cex" xmlns:w16cid="http://schemas.microsoft.com/office/word/2016/wordml/cid" xmlns:w16="http://schemas.microsoft.com/office/word/2018/wordml" xmlns:w16du="http://schemas.microsoft.com/office/word/2023/wordml/word16du" xmlns:w16sdtdh="http://schemas.microsoft.com/office/word/2020/wordml/sdtdatahash" xmlns:w16sdtfl="http://schemas.microsoft.com/office/word/2024/wordml/sdtformatlock" xmlns:w16se="http://schemas.microsoft.com/office/word/2015/wordml/symex" xmlns:wpg="http://schemas.microsoft.com/office/word/2010/wordprocessingGroup" xmlns:wpi="http://schemas.microsoft.com/office/word/2010/wordprocessingInk" xmlns:wne="http://schemas.microsoft.com/office/word/2006/wordml" xmlns:wps="http://schemas.microsoft.com/office/word/2010/wordprocessingShape" mc:Ignorable="w14 w15 w16se w16cid w16 w16cex w16sdtdh w16sdtfl w16du wp14">
   <w:abstractNum w:abstractNumId="0" w15:restartNumberingAfterBreak="0">
-    <w:nsid w:val="1C1A48F9"/>
+    <w:nsid w:val="2B826673"/>
     <w:multiLevelType w:val="hybridMultilevel"/>
-    <w:tmpl w:val="6E38FA52"/>
-    <w:lvl w:ilvl="0" w:tplc="C5B655A0">
-      <w:start w:val="1"/>
-      <w:numFmt w:val="decimal"/>
-      <w:lvlText w:val="%1."/>
-      <w:lvlJc w:val="left"/>
-      <w:pPr>
-        <w:ind w:left="480" w:hanging="300"/>
-      </w:pPr>
-    </w:lvl>
-    <w:lvl w:ilvl="1" w:tplc="52B8D54C">
-      <w:numFmt w:val="decimal"/>
-      <w:lvlText w:val=""/>
-      <w:lvlJc w:val="left"/>
-    </w:lvl>
-    <w:lvl w:ilvl="2" w:tplc="459E4504">
-      <w:numFmt w:val="decimal"/>
-      <w:lvlText w:val=""/>
-      <w:lvlJc w:val="left"/>
-    </w:lvl>
-    <w:lvl w:ilvl="3" w:tplc="0D524BEC">
-      <w:numFmt w:val="decimal"/>
-      <w:lvlText w:val=""/>
-      <w:lvlJc w:val="left"/>
-    </w:lvl>
-    <w:lvl w:ilvl="4" w:tplc="015ED2C8">
-      <w:numFmt w:val="decimal"/>
-      <w:lvlText w:val=""/>
-      <w:lvlJc w:val="left"/>
-    </w:lvl>
-    <w:lvl w:ilvl="5" w:tplc="00F632C0">
-      <w:numFmt w:val="decimal"/>
-      <w:lvlText w:val=""/>
-      <w:lvlJc w:val="left"/>
-    </w:lvl>
-    <w:lvl w:ilvl="6" w:tplc="65422550">
-      <w:numFmt w:val="decimal"/>
-      <w:lvlText w:val=""/>
-      <w:lvlJc w:val="left"/>
-    </w:lvl>
-    <w:lvl w:ilvl="7" w:tplc="C6AC5FD0">
-      <w:numFmt w:val="decimal"/>
-      <w:lvlText w:val=""/>
-      <w:lvlJc w:val="left"/>
-    </w:lvl>
-    <w:lvl w:ilvl="8" w:tplc="3684BAAC">
-      <w:numFmt w:val="decimal"/>
-      <w:lvlText w:val=""/>
-      <w:lvlJc w:val="left"/>
-    </w:lvl>
-  </w:abstractNum>
-  <w:abstractNum w:abstractNumId="1" w15:restartNumberingAfterBreak="0">
-    <w:nsid w:val="555861DD"/>
-    <w:multiLevelType w:val="hybridMultilevel"/>
-    <w:tmpl w:val="42704A6A"/>
-    <w:lvl w:ilvl="0" w:tplc="41920608">
-      <w:start w:val="1"/>
-      <w:numFmt w:val="bullet"/>
-      <w:lvlText w:val="•"/>
-      <w:lvlJc w:val="left"/>
-      <w:pPr>
-        <w:ind w:left="480" w:hanging="260"/>
-      </w:pPr>
-    </w:lvl>
-    <w:lvl w:ilvl="1" w:tplc="B802A696">
-      <w:numFmt w:val="decimal"/>
-      <w:lvlText w:val=""/>
-      <w:lvlJc w:val="left"/>
-    </w:lvl>
-    <w:lvl w:ilvl="2" w:tplc="45E4B4D6">
-      <w:numFmt w:val="decimal"/>
-      <w:lvlText w:val=""/>
-      <w:lvlJc w:val="left"/>
-    </w:lvl>
-    <w:lvl w:ilvl="3" w:tplc="2C4CDC9E">
-      <w:numFmt w:val="decimal"/>
-      <w:lvlText w:val=""/>
-      <w:lvlJc w:val="left"/>
-    </w:lvl>
-    <w:lvl w:ilvl="4" w:tplc="1898C56E">
-      <w:numFmt w:val="decimal"/>
-      <w:lvlText w:val=""/>
-      <w:lvlJc w:val="left"/>
-    </w:lvl>
-    <w:lvl w:ilvl="5" w:tplc="A9BE77E6">
-      <w:numFmt w:val="decimal"/>
-      <w:lvlText w:val=""/>
-      <w:lvlJc w:val="left"/>
-    </w:lvl>
-    <w:lvl w:ilvl="6" w:tplc="478C258A">
-      <w:numFmt w:val="decimal"/>
-      <w:lvlText w:val=""/>
-      <w:lvlJc w:val="left"/>
-    </w:lvl>
-    <w:lvl w:ilvl="7" w:tplc="AAA4FA7C">
-      <w:numFmt w:val="decimal"/>
-      <w:lvlText w:val=""/>
-      <w:lvlJc w:val="left"/>
-    </w:lvl>
-    <w:lvl w:ilvl="8" w:tplc="1CD68318">
-      <w:numFmt w:val="decimal"/>
-      <w:lvlText w:val=""/>
-      <w:lvlJc w:val="left"/>
-    </w:lvl>
-  </w:abstractNum>
-  <w:abstractNum w:abstractNumId="2" w15:restartNumberingAfterBreak="0">
-    <w:nsid w:val="7A8C1731"/>
-    <w:multiLevelType w:val="hybridMultilevel"/>
-    <w:tmpl w:val="8022FF92"/>
-    <w:lvl w:ilvl="0" w:tplc="3F8EB938">
+    <w:tmpl w:val="9DC07E9A"/>
+    <w:lvl w:ilvl="0" w:tplc="3D8A2484">
       <w:start w:val="1"/>
       <w:numFmt w:val="bullet"/>
       <w:lvlText w:val="●"/>
@@ -40613,7 +40639,7 @@
         <w:ind w:left="720" w:hanging="360"/>
       </w:pPr>
     </w:lvl>
-    <w:lvl w:ilvl="1" w:tplc="0CC8C49A">
+    <w:lvl w:ilvl="1" w:tplc="2E502D24">
       <w:start w:val="1"/>
       <w:numFmt w:val="bullet"/>
       <w:lvlText w:val="○"/>
@@ -40622,7 +40648,7 @@
         <w:ind w:left="1440" w:hanging="360"/>
       </w:pPr>
     </w:lvl>
-    <w:lvl w:ilvl="2" w:tplc="FC6A2AEC">
+    <w:lvl w:ilvl="2" w:tplc="26B4346C">
       <w:start w:val="1"/>
       <w:numFmt w:val="bullet"/>
       <w:lvlText w:val="■"/>
@@ -40631,7 +40657,7 @@
         <w:ind w:left="2160" w:hanging="360"/>
       </w:pPr>
     </w:lvl>
-    <w:lvl w:ilvl="3" w:tplc="FB964F04">
+    <w:lvl w:ilvl="3" w:tplc="788C120C">
       <w:start w:val="1"/>
       <w:numFmt w:val="bullet"/>
       <w:lvlText w:val="●"/>
@@ -40640,7 +40666,7 @@
         <w:ind w:left="2880" w:hanging="360"/>
       </w:pPr>
     </w:lvl>
-    <w:lvl w:ilvl="4" w:tplc="B058CDFC">
+    <w:lvl w:ilvl="4" w:tplc="C8389F10">
       <w:start w:val="1"/>
       <w:numFmt w:val="bullet"/>
       <w:lvlText w:val="○"/>
@@ -40649,7 +40675,7 @@
         <w:ind w:left="3600" w:hanging="360"/>
       </w:pPr>
     </w:lvl>
-    <w:lvl w:ilvl="5" w:tplc="B45E200C">
+    <w:lvl w:ilvl="5" w:tplc="B6741D5A">
       <w:start w:val="1"/>
       <w:numFmt w:val="bullet"/>
       <w:lvlText w:val="■"/>
@@ -40658,7 +40684,7 @@
         <w:ind w:left="4320" w:hanging="360"/>
       </w:pPr>
     </w:lvl>
-    <w:lvl w:ilvl="6" w:tplc="DDEEA8AE">
+    <w:lvl w:ilvl="6" w:tplc="89B8F192">
       <w:start w:val="1"/>
       <w:numFmt w:val="bullet"/>
       <w:lvlText w:val="●"/>
@@ -40667,7 +40693,7 @@
         <w:ind w:left="5040" w:hanging="360"/>
       </w:pPr>
     </w:lvl>
-    <w:lvl w:ilvl="7" w:tplc="9C40E36E">
+    <w:lvl w:ilvl="7" w:tplc="1A9E9CDE">
       <w:start w:val="1"/>
       <w:numFmt w:val="bullet"/>
       <w:lvlText w:val="●"/>
@@ -40676,7 +40702,7 @@
         <w:ind w:left="5760" w:hanging="360"/>
       </w:pPr>
     </w:lvl>
-    <w:lvl w:ilvl="8" w:tplc="9A8EC5A2">
+    <w:lvl w:ilvl="8" w:tplc="899CA27A">
       <w:start w:val="1"/>
       <w:numFmt w:val="bullet"/>
       <w:lvlText w:val="●"/>
@@ -40686,26 +40712,134 @@
       </w:pPr>
     </w:lvl>
   </w:abstractNum>
-  <w:num w:numId="1" w16cid:durableId="219170676">
+  <w:abstractNum w:abstractNumId="1" w15:restartNumberingAfterBreak="0">
+    <w:nsid w:val="400F4B50"/>
+    <w:multiLevelType w:val="hybridMultilevel"/>
+    <w:tmpl w:val="054EDD22"/>
+    <w:lvl w:ilvl="0" w:tplc="2328F87E">
+      <w:start w:val="1"/>
+      <w:numFmt w:val="decimal"/>
+      <w:lvlText w:val="%1."/>
+      <w:lvlJc w:val="left"/>
+      <w:pPr>
+        <w:ind w:left="480" w:hanging="300"/>
+      </w:pPr>
+    </w:lvl>
+    <w:lvl w:ilvl="1" w:tplc="C2CA5AB8">
+      <w:numFmt w:val="decimal"/>
+      <w:lvlText w:val=""/>
+      <w:lvlJc w:val="left"/>
+    </w:lvl>
+    <w:lvl w:ilvl="2" w:tplc="AA703B50">
+      <w:numFmt w:val="decimal"/>
+      <w:lvlText w:val=""/>
+      <w:lvlJc w:val="left"/>
+    </w:lvl>
+    <w:lvl w:ilvl="3" w:tplc="D47E6474">
+      <w:numFmt w:val="decimal"/>
+      <w:lvlText w:val=""/>
+      <w:lvlJc w:val="left"/>
+    </w:lvl>
+    <w:lvl w:ilvl="4" w:tplc="3872C25C">
+      <w:numFmt w:val="decimal"/>
+      <w:lvlText w:val=""/>
+      <w:lvlJc w:val="left"/>
+    </w:lvl>
+    <w:lvl w:ilvl="5" w:tplc="D47AD5D4">
+      <w:numFmt w:val="decimal"/>
+      <w:lvlText w:val=""/>
+      <w:lvlJc w:val="left"/>
+    </w:lvl>
+    <w:lvl w:ilvl="6" w:tplc="AE825CF6">
+      <w:numFmt w:val="decimal"/>
+      <w:lvlText w:val=""/>
+      <w:lvlJc w:val="left"/>
+    </w:lvl>
+    <w:lvl w:ilvl="7" w:tplc="B8AAD5B2">
+      <w:numFmt w:val="decimal"/>
+      <w:lvlText w:val=""/>
+      <w:lvlJc w:val="left"/>
+    </w:lvl>
+    <w:lvl w:ilvl="8" w:tplc="B4EE7C3E">
+      <w:numFmt w:val="decimal"/>
+      <w:lvlText w:val=""/>
+      <w:lvlJc w:val="left"/>
+    </w:lvl>
+  </w:abstractNum>
+  <w:abstractNum w:abstractNumId="2" w15:restartNumberingAfterBreak="0">
+    <w:nsid w:val="607B26F5"/>
+    <w:multiLevelType w:val="hybridMultilevel"/>
+    <w:tmpl w:val="80501E1A"/>
+    <w:lvl w:ilvl="0" w:tplc="1C9AC8EA">
+      <w:start w:val="1"/>
+      <w:numFmt w:val="bullet"/>
+      <w:lvlText w:val="•"/>
+      <w:lvlJc w:val="left"/>
+      <w:pPr>
+        <w:ind w:left="480" w:hanging="260"/>
+      </w:pPr>
+    </w:lvl>
+    <w:lvl w:ilvl="1" w:tplc="75804238">
+      <w:numFmt w:val="decimal"/>
+      <w:lvlText w:val=""/>
+      <w:lvlJc w:val="left"/>
+    </w:lvl>
+    <w:lvl w:ilvl="2" w:tplc="D456907E">
+      <w:numFmt w:val="decimal"/>
+      <w:lvlText w:val=""/>
+      <w:lvlJc w:val="left"/>
+    </w:lvl>
+    <w:lvl w:ilvl="3" w:tplc="D7B4B60E">
+      <w:numFmt w:val="decimal"/>
+      <w:lvlText w:val=""/>
+      <w:lvlJc w:val="left"/>
+    </w:lvl>
+    <w:lvl w:ilvl="4" w:tplc="ED628318">
+      <w:numFmt w:val="decimal"/>
+      <w:lvlText w:val=""/>
+      <w:lvlJc w:val="left"/>
+    </w:lvl>
+    <w:lvl w:ilvl="5" w:tplc="A176BC80">
+      <w:numFmt w:val="decimal"/>
+      <w:lvlText w:val=""/>
+      <w:lvlJc w:val="left"/>
+    </w:lvl>
+    <w:lvl w:ilvl="6" w:tplc="F01E562C">
+      <w:numFmt w:val="decimal"/>
+      <w:lvlText w:val=""/>
+      <w:lvlJc w:val="left"/>
+    </w:lvl>
+    <w:lvl w:ilvl="7" w:tplc="56E2A1C2">
+      <w:numFmt w:val="decimal"/>
+      <w:lvlText w:val=""/>
+      <w:lvlJc w:val="left"/>
+    </w:lvl>
+    <w:lvl w:ilvl="8" w:tplc="1D5811D6">
+      <w:numFmt w:val="decimal"/>
+      <w:lvlText w:val=""/>
+      <w:lvlJc w:val="left"/>
+    </w:lvl>
+  </w:abstractNum>
+  <w:num w:numId="1" w16cid:durableId="610673665">
+    <w:abstractNumId w:val="0"/>
+    <w:lvlOverride w:ilvl="0">
+      <w:startOverride w:val="1"/>
+    </w:lvlOverride>
+  </w:num>
+  <w:num w:numId="2" w16cid:durableId="455803151">
     <w:abstractNumId w:val="2"/>
     <w:lvlOverride w:ilvl="0">
       <w:startOverride w:val="1"/>
     </w:lvlOverride>
   </w:num>
-  <w:num w:numId="2" w16cid:durableId="713121844">
+  <w:num w:numId="3" w16cid:durableId="1815827837">
     <w:abstractNumId w:val="1"/>
     <w:lvlOverride w:ilvl="0">
       <w:startOverride w:val="1"/>
     </w:lvlOverride>
   </w:num>
-  <w:num w:numId="3" w16cid:durableId="1754545390">
-    <w:abstractNumId w:val="0"/>
-    <w:lvlOverride w:ilvl="0">
-      <w:startOverride w:val="1"/>
-    </w:lvlOverride>
-  </w:num>
-  <w:num w:numId="4" w16cid:durableId="1162234614">
-    <w:abstractNumId w:val="0"/>
+  <w:num w:numId="4" w16cid:durableId="598489056">
+    <w:abstractNumId w:val="1"/>
     <w:lvlOverride w:ilvl="0">
       <w:startOverride w:val="1"/>
     </w:lvlOverride>
@@ -41329,7 +41463,7 @@
     <w:autoRedefine/>
     <w:uiPriority w:val="39"/>
     <w:unhideWhenUsed/>
-    <w:rsid w:val="00FE3A49"/>
+    <w:rsid w:val="00CF2829"/>
   </w:style>
   <w:style w:type="paragraph" w:styleId="20">
     <w:name w:val="toc 2"/>
@@ -41338,7 +41472,7 @@
     <w:autoRedefine/>
     <w:uiPriority w:val="39"/>
     <w:unhideWhenUsed/>
-    <w:rsid w:val="00FE3A49"/>
+    <w:rsid w:val="00CF2829"/>
     <w:pPr>
       <w:ind w:leftChars="200" w:left="425"/>
     </w:pPr>
@@ -41349,7 +41483,7 @@
     <w:link w:val="Char1"/>
     <w:uiPriority w:val="99"/>
     <w:unhideWhenUsed/>
-    <w:rsid w:val="00FE3A49"/>
+    <w:rsid w:val="00CF2829"/>
     <w:pPr>
       <w:tabs>
         <w:tab w:val="center" w:pos="4513"/>
@@ -41363,7 +41497,7 @@
     <w:basedOn w:val="a0"/>
     <w:link w:val="aa"/>
     <w:uiPriority w:val="99"/>
-    <w:rsid w:val="00FE3A49"/>
+    <w:rsid w:val="00CF2829"/>
   </w:style>
   <w:style w:type="paragraph" w:styleId="ab">
     <w:name w:val="footer"/>
@@ -41371,7 +41505,7 @@
     <w:link w:val="Char2"/>
     <w:uiPriority w:val="99"/>
     <w:unhideWhenUsed/>
-    <w:rsid w:val="00FE3A49"/>
+    <w:rsid w:val="00CF2829"/>
     <w:pPr>
       <w:tabs>
         <w:tab w:val="center" w:pos="4513"/>
@@ -41385,7 +41519,7 @@
     <w:basedOn w:val="a0"/>
     <w:link w:val="ab"/>
     <w:uiPriority w:val="99"/>
-    <w:rsid w:val="00FE3A49"/>
+    <w:rsid w:val="00CF2829"/>
   </w:style>
 </w:styles>
 </file>

</xml_diff>

<commit_message>
v1.3: filmstrip video trimmer with drag handles, set-in/out from preview (I/O keys), nudge buttons, quick lengths, segment play
Co-Authored-By: Claude Fable 5.1 <noreply@anthropic.com>
</commit_message>
<xml_diff>
--- a/docs/manual/RuninqVic_사용설명서.docx
+++ b/docs/manual/RuninqVic_사용설명서.docx
@@ -142,7 +142,7 @@
           <w:sz w:val="22"/>
           <w:szCs w:val="22"/>
         </w:rPr>
-        <w:t xml:space="preserve"> 1.2 · 2026</w:t>
+        <w:t xml:space="preserve"> 1.3 · 2026</w:t>
       </w:r>
       <w:r>
         <w:rPr>
@@ -355,7 +355,7 @@
             <w:noProof/>
           </w:rPr>
           <w:drawing>
-            <wp:inline distT="0" distB="0" distL="0" distR="0" wp14:anchorId="4CE171E6" wp14:editId="7FDB7565">
+            <wp:inline distT="0" distB="0" distL="0" distR="0" wp14:anchorId="4AC73B12" wp14:editId="58320D23">
               <wp:extent cx="1905000" cy="762000"/>
               <wp:effectExtent l="0" t="0" r="0" b="0"/>
               <wp:docPr id="1" name="그림 1">
@@ -496,7 +496,7 @@
     <w:sdt>
       <w:sdtPr>
         <w:alias w:val="목차"/>
-        <w:id w:val="875589703"/>
+        <w:id w:val="530929780"/>
       </w:sdtPr>
       <w:sdtEndPr/>
       <w:sdtContent>
@@ -524,7 +524,7 @@
           <w:r>
             <w:fldChar w:fldCharType="separate"/>
           </w:r>
-          <w:hyperlink w:anchor="_Toc240522177" w:history="1">
+          <w:hyperlink w:anchor="_Toc240524505" w:history="1">
             <w:r>
               <w:rPr>
                 <w:rStyle w:val="a5"/>
@@ -548,7 +548,7 @@
               <w:rPr>
                 <w:noProof/>
               </w:rPr>
-              <w:instrText xml:space="preserve"> PAGEREF _Toc240522177 \h </w:instrText>
+              <w:instrText xml:space="preserve"> PAGEREF _Toc240524505 \h </w:instrText>
             </w:r>
             <w:r>
               <w:rPr>
@@ -591,7 +591,7 @@
               <w14:ligatures w14:val="standardContextual"/>
             </w:rPr>
           </w:pPr>
-          <w:hyperlink w:anchor="_Toc240522178" w:history="1">
+          <w:hyperlink w:anchor="_Toc240524506" w:history="1">
             <w:r>
               <w:rPr>
                 <w:rStyle w:val="a5"/>
@@ -615,7 +615,7 @@
               <w:rPr>
                 <w:noProof/>
               </w:rPr>
-              <w:instrText xml:space="preserve"> PAGEREF _Toc240522178 \h </w:instrText>
+              <w:instrText xml:space="preserve"> PAGEREF _Toc240524506 \h </w:instrText>
             </w:r>
             <w:r>
               <w:rPr>
@@ -658,7 +658,7 @@
               <w14:ligatures w14:val="standardContextual"/>
             </w:rPr>
           </w:pPr>
-          <w:hyperlink w:anchor="_Toc240522179" w:history="1">
+          <w:hyperlink w:anchor="_Toc240524507" w:history="1">
             <w:r>
               <w:rPr>
                 <w:rStyle w:val="a5"/>
@@ -682,7 +682,7 @@
               <w:rPr>
                 <w:noProof/>
               </w:rPr>
-              <w:instrText xml:space="preserve"> PAGEREF _Toc240522179 \h </w:instrText>
+              <w:instrText xml:space="preserve"> PAGEREF _Toc240524507 \h </w:instrText>
             </w:r>
             <w:r>
               <w:rPr>
@@ -725,7 +725,7 @@
               <w14:ligatures w14:val="standardContextual"/>
             </w:rPr>
           </w:pPr>
-          <w:hyperlink w:anchor="_Toc240522180" w:history="1">
+          <w:hyperlink w:anchor="_Toc240524508" w:history="1">
             <w:r>
               <w:rPr>
                 <w:rStyle w:val="a5"/>
@@ -749,7 +749,7 @@
               <w:rPr>
                 <w:noProof/>
               </w:rPr>
-              <w:instrText xml:space="preserve"> PAGEREF _Toc240522180 \h </w:instrText>
+              <w:instrText xml:space="preserve"> PAGEREF _Toc240524508 \h </w:instrText>
             </w:r>
             <w:r>
               <w:rPr>
@@ -791,7 +791,7 @@
               <w14:ligatures w14:val="standardContextual"/>
             </w:rPr>
           </w:pPr>
-          <w:hyperlink w:anchor="_Toc240522181" w:history="1">
+          <w:hyperlink w:anchor="_Toc240524509" w:history="1">
             <w:r>
               <w:rPr>
                 <w:rStyle w:val="a5"/>
@@ -815,7 +815,7 @@
               <w:rPr>
                 <w:noProof/>
               </w:rPr>
-              <w:instrText xml:space="preserve"> PAGEREF _Toc240522181 \h </w:instrText>
+              <w:instrText xml:space="preserve"> PAGEREF _Toc240524509 \h </w:instrText>
             </w:r>
             <w:r>
               <w:rPr>
@@ -858,7 +858,7 @@
               <w14:ligatures w14:val="standardContextual"/>
             </w:rPr>
           </w:pPr>
-          <w:hyperlink w:anchor="_Toc240522182" w:history="1">
+          <w:hyperlink w:anchor="_Toc240524510" w:history="1">
             <w:r>
               <w:rPr>
                 <w:rStyle w:val="a5"/>
@@ -882,7 +882,7 @@
               <w:rPr>
                 <w:noProof/>
               </w:rPr>
-              <w:instrText xml:space="preserve"> PAGEREF _Toc240522182 \h </w:instrText>
+              <w:instrText xml:space="preserve"> PAGEREF _Toc240524510 \h </w:instrText>
             </w:r>
             <w:r>
               <w:rPr>
@@ -925,7 +925,7 @@
               <w14:ligatures w14:val="standardContextual"/>
             </w:rPr>
           </w:pPr>
-          <w:hyperlink w:anchor="_Toc240522183" w:history="1">
+          <w:hyperlink w:anchor="_Toc240524511" w:history="1">
             <w:r>
               <w:rPr>
                 <w:rStyle w:val="a5"/>
@@ -949,7 +949,7 @@
               <w:rPr>
                 <w:noProof/>
               </w:rPr>
-              <w:instrText xml:space="preserve"> PAGEREF _Toc240522183 \h </w:instrText>
+              <w:instrText xml:space="preserve"> PAGEREF _Toc240524511 \h </w:instrText>
             </w:r>
             <w:r>
               <w:rPr>
@@ -992,7 +992,7 @@
               <w14:ligatures w14:val="standardContextual"/>
             </w:rPr>
           </w:pPr>
-          <w:hyperlink w:anchor="_Toc240522184" w:history="1">
+          <w:hyperlink w:anchor="_Toc240524512" w:history="1">
             <w:r>
               <w:rPr>
                 <w:rStyle w:val="a5"/>
@@ -1016,7 +1016,7 @@
               <w:rPr>
                 <w:noProof/>
               </w:rPr>
-              <w:instrText xml:space="preserve"> PAGEREF _Toc240522184 \h </w:instrText>
+              <w:instrText xml:space="preserve"> PAGEREF _Toc240524512 \h </w:instrText>
             </w:r>
             <w:r>
               <w:rPr>
@@ -1059,7 +1059,7 @@
               <w14:ligatures w14:val="standardContextual"/>
             </w:rPr>
           </w:pPr>
-          <w:hyperlink w:anchor="_Toc240522185" w:history="1">
+          <w:hyperlink w:anchor="_Toc240524513" w:history="1">
             <w:r>
               <w:rPr>
                 <w:rStyle w:val="a5"/>
@@ -1083,7 +1083,7 @@
               <w:rPr>
                 <w:noProof/>
               </w:rPr>
-              <w:instrText xml:space="preserve"> PAGEREF _Toc240522185 \h </w:instrText>
+              <w:instrText xml:space="preserve"> PAGEREF _Toc240524513 \h </w:instrText>
             </w:r>
             <w:r>
               <w:rPr>
@@ -1125,7 +1125,7 @@
               <w14:ligatures w14:val="standardContextual"/>
             </w:rPr>
           </w:pPr>
-          <w:hyperlink w:anchor="_Toc240522186" w:history="1">
+          <w:hyperlink w:anchor="_Toc240524514" w:history="1">
             <w:r>
               <w:rPr>
                 <w:rStyle w:val="a5"/>
@@ -1149,7 +1149,7 @@
               <w:rPr>
                 <w:noProof/>
               </w:rPr>
-              <w:instrText xml:space="preserve"> PAGEREF _Toc240522186 \h </w:instrText>
+              <w:instrText xml:space="preserve"> PAGEREF _Toc240524514 \h </w:instrText>
             </w:r>
             <w:r>
               <w:rPr>
@@ -1191,7 +1191,7 @@
               <w14:ligatures w14:val="standardContextual"/>
             </w:rPr>
           </w:pPr>
-          <w:hyperlink w:anchor="_Toc240522187" w:history="1">
+          <w:hyperlink w:anchor="_Toc240524515" w:history="1">
             <w:r>
               <w:rPr>
                 <w:rStyle w:val="a5"/>
@@ -1215,7 +1215,7 @@
               <w:rPr>
                 <w:noProof/>
               </w:rPr>
-              <w:instrText xml:space="preserve"> PAGEREF _Toc240522187 \h </w:instrText>
+              <w:instrText xml:space="preserve"> PAGEREF _Toc240524515 \h </w:instrText>
             </w:r>
             <w:r>
               <w:rPr>
@@ -1258,7 +1258,7 @@
               <w14:ligatures w14:val="standardContextual"/>
             </w:rPr>
           </w:pPr>
-          <w:hyperlink w:anchor="_Toc240522188" w:history="1">
+          <w:hyperlink w:anchor="_Toc240524516" w:history="1">
             <w:r>
               <w:rPr>
                 <w:rStyle w:val="a5"/>
@@ -1282,7 +1282,7 @@
               <w:rPr>
                 <w:noProof/>
               </w:rPr>
-              <w:instrText xml:space="preserve"> PAGEREF _Toc240522188 \h </w:instrText>
+              <w:instrText xml:space="preserve"> PAGEREF _Toc240524516 \h </w:instrText>
             </w:r>
             <w:r>
               <w:rPr>
@@ -1325,7 +1325,7 @@
               <w14:ligatures w14:val="standardContextual"/>
             </w:rPr>
           </w:pPr>
-          <w:hyperlink w:anchor="_Toc240522189" w:history="1">
+          <w:hyperlink w:anchor="_Toc240524517" w:history="1">
             <w:r>
               <w:rPr>
                 <w:rStyle w:val="a5"/>
@@ -1349,7 +1349,7 @@
               <w:rPr>
                 <w:noProof/>
               </w:rPr>
-              <w:instrText xml:space="preserve"> PAGEREF _Toc240522189 \h </w:instrText>
+              <w:instrText xml:space="preserve"> PAGEREF _Toc240524517 \h </w:instrText>
             </w:r>
             <w:r>
               <w:rPr>
@@ -1392,7 +1392,7 @@
               <w14:ligatures w14:val="standardContextual"/>
             </w:rPr>
           </w:pPr>
-          <w:hyperlink w:anchor="_Toc240522190" w:history="1">
+          <w:hyperlink w:anchor="_Toc240524518" w:history="1">
             <w:r>
               <w:rPr>
                 <w:rStyle w:val="a5"/>
@@ -1416,7 +1416,7 @@
               <w:rPr>
                 <w:noProof/>
               </w:rPr>
-              <w:instrText xml:space="preserve"> PAGEREF _Toc240522190 \h </w:instrText>
+              <w:instrText xml:space="preserve"> PAGEREF _Toc240524518 \h </w:instrText>
             </w:r>
             <w:r>
               <w:rPr>
@@ -1459,7 +1459,7 @@
               <w14:ligatures w14:val="standardContextual"/>
             </w:rPr>
           </w:pPr>
-          <w:hyperlink w:anchor="_Toc240522191" w:history="1">
+          <w:hyperlink w:anchor="_Toc240524519" w:history="1">
             <w:r>
               <w:rPr>
                 <w:rStyle w:val="a5"/>
@@ -1483,7 +1483,7 @@
               <w:rPr>
                 <w:noProof/>
               </w:rPr>
-              <w:instrText xml:space="preserve"> PAGEREF _Toc240522191 \h </w:instrText>
+              <w:instrText xml:space="preserve"> PAGEREF _Toc240524519 \h </w:instrText>
             </w:r>
             <w:r>
               <w:rPr>
@@ -1525,7 +1525,7 @@
               <w14:ligatures w14:val="standardContextual"/>
             </w:rPr>
           </w:pPr>
-          <w:hyperlink w:anchor="_Toc240522192" w:history="1">
+          <w:hyperlink w:anchor="_Toc240524520" w:history="1">
             <w:r>
               <w:rPr>
                 <w:rStyle w:val="a5"/>
@@ -1549,7 +1549,7 @@
               <w:rPr>
                 <w:noProof/>
               </w:rPr>
-              <w:instrText xml:space="preserve"> PAGEREF _Toc240522192 \h </w:instrText>
+              <w:instrText xml:space="preserve"> PAGEREF _Toc240524520 \h </w:instrText>
             </w:r>
             <w:r>
               <w:rPr>
@@ -1592,7 +1592,7 @@
               <w14:ligatures w14:val="standardContextual"/>
             </w:rPr>
           </w:pPr>
-          <w:hyperlink w:anchor="_Toc240522193" w:history="1">
+          <w:hyperlink w:anchor="_Toc240524521" w:history="1">
             <w:r>
               <w:rPr>
                 <w:rStyle w:val="a5"/>
@@ -1616,7 +1616,7 @@
               <w:rPr>
                 <w:noProof/>
               </w:rPr>
-              <w:instrText xml:space="preserve"> PAGEREF _Toc240522193 \h </w:instrText>
+              <w:instrText xml:space="preserve"> PAGEREF _Toc240524521 \h </w:instrText>
             </w:r>
             <w:r>
               <w:rPr>
@@ -1659,7 +1659,7 @@
               <w14:ligatures w14:val="standardContextual"/>
             </w:rPr>
           </w:pPr>
-          <w:hyperlink w:anchor="_Toc240522194" w:history="1">
+          <w:hyperlink w:anchor="_Toc240524522" w:history="1">
             <w:r>
               <w:rPr>
                 <w:rStyle w:val="a5"/>
@@ -1683,7 +1683,7 @@
               <w:rPr>
                 <w:noProof/>
               </w:rPr>
-              <w:instrText xml:space="preserve"> PAGEREF _Toc240522194 \h </w:instrText>
+              <w:instrText xml:space="preserve"> PAGEREF _Toc240524522 \h </w:instrText>
             </w:r>
             <w:r>
               <w:rPr>
@@ -1726,7 +1726,7 @@
               <w14:ligatures w14:val="standardContextual"/>
             </w:rPr>
           </w:pPr>
-          <w:hyperlink w:anchor="_Toc240522195" w:history="1">
+          <w:hyperlink w:anchor="_Toc240524523" w:history="1">
             <w:r>
               <w:rPr>
                 <w:rStyle w:val="a5"/>
@@ -1750,7 +1750,7 @@
               <w:rPr>
                 <w:noProof/>
               </w:rPr>
-              <w:instrText xml:space="preserve"> PAGEREF _Toc240522195 \h </w:instrText>
+              <w:instrText xml:space="preserve"> PAGEREF _Toc240524523 \h </w:instrText>
             </w:r>
             <w:r>
               <w:rPr>
@@ -1793,7 +1793,7 @@
               <w14:ligatures w14:val="standardContextual"/>
             </w:rPr>
           </w:pPr>
-          <w:hyperlink w:anchor="_Toc240522196" w:history="1">
+          <w:hyperlink w:anchor="_Toc240524524" w:history="1">
             <w:r>
               <w:rPr>
                 <w:rStyle w:val="a5"/>
@@ -1817,7 +1817,7 @@
               <w:rPr>
                 <w:noProof/>
               </w:rPr>
-              <w:instrText xml:space="preserve"> PAGEREF _Toc240522196 \h </w:instrText>
+              <w:instrText xml:space="preserve"> PAGEREF _Toc240524524 \h </w:instrText>
             </w:r>
             <w:r>
               <w:rPr>
@@ -1860,7 +1860,7 @@
               <w14:ligatures w14:val="standardContextual"/>
             </w:rPr>
           </w:pPr>
-          <w:hyperlink w:anchor="_Toc240522197" w:history="1">
+          <w:hyperlink w:anchor="_Toc240524525" w:history="1">
             <w:r>
               <w:rPr>
                 <w:rStyle w:val="a5"/>
@@ -1884,7 +1884,7 @@
               <w:rPr>
                 <w:noProof/>
               </w:rPr>
-              <w:instrText xml:space="preserve"> PAGEREF _Toc240522197 \h </w:instrText>
+              <w:instrText xml:space="preserve"> PAGEREF _Toc240524525 \h </w:instrText>
             </w:r>
             <w:r>
               <w:rPr>
@@ -1927,7 +1927,7 @@
               <w14:ligatures w14:val="standardContextual"/>
             </w:rPr>
           </w:pPr>
-          <w:hyperlink w:anchor="_Toc240522198" w:history="1">
+          <w:hyperlink w:anchor="_Toc240524526" w:history="1">
             <w:r>
               <w:rPr>
                 <w:rStyle w:val="a5"/>
@@ -1951,7 +1951,7 @@
               <w:rPr>
                 <w:noProof/>
               </w:rPr>
-              <w:instrText xml:space="preserve"> PAGEREF _Toc240522198 \h </w:instrText>
+              <w:instrText xml:space="preserve"> PAGEREF _Toc240524526 \h </w:instrText>
             </w:r>
             <w:r>
               <w:rPr>
@@ -1993,7 +1993,7 @@
               <w14:ligatures w14:val="standardContextual"/>
             </w:rPr>
           </w:pPr>
-          <w:hyperlink w:anchor="_Toc240522199" w:history="1">
+          <w:hyperlink w:anchor="_Toc240524527" w:history="1">
             <w:r>
               <w:rPr>
                 <w:rStyle w:val="a5"/>
@@ -2017,7 +2017,7 @@
               <w:rPr>
                 <w:noProof/>
               </w:rPr>
-              <w:instrText xml:space="preserve"> PAGEREF _Toc240522199 \h </w:instrText>
+              <w:instrText xml:space="preserve"> PAGEREF _Toc240524527 \h </w:instrText>
             </w:r>
             <w:r>
               <w:rPr>
@@ -2059,7 +2059,7 @@
               <w14:ligatures w14:val="standardContextual"/>
             </w:rPr>
           </w:pPr>
-          <w:hyperlink w:anchor="_Toc240522200" w:history="1">
+          <w:hyperlink w:anchor="_Toc240524528" w:history="1">
             <w:r>
               <w:rPr>
                 <w:rStyle w:val="a5"/>
@@ -2083,7 +2083,7 @@
               <w:rPr>
                 <w:noProof/>
               </w:rPr>
-              <w:instrText xml:space="preserve"> PAGEREF _Toc240522200 \h </w:instrText>
+              <w:instrText xml:space="preserve"> PAGEREF _Toc240524528 \h </w:instrText>
             </w:r>
             <w:r>
               <w:rPr>
@@ -2126,7 +2126,7 @@
               <w14:ligatures w14:val="standardContextual"/>
             </w:rPr>
           </w:pPr>
-          <w:hyperlink w:anchor="_Toc240522201" w:history="1">
+          <w:hyperlink w:anchor="_Toc240524529" w:history="1">
             <w:r>
               <w:rPr>
                 <w:rStyle w:val="a5"/>
@@ -2150,7 +2150,7 @@
               <w:rPr>
                 <w:noProof/>
               </w:rPr>
-              <w:instrText xml:space="preserve"> PAGEREF _Toc240522201 \h </w:instrText>
+              <w:instrText xml:space="preserve"> PAGEREF _Toc240524529 \h </w:instrText>
             </w:r>
             <w:r>
               <w:rPr>
@@ -2192,7 +2192,7 @@
               <w14:ligatures w14:val="standardContextual"/>
             </w:rPr>
           </w:pPr>
-          <w:hyperlink w:anchor="_Toc240522202" w:history="1">
+          <w:hyperlink w:anchor="_Toc240524530" w:history="1">
             <w:r>
               <w:rPr>
                 <w:rStyle w:val="a5"/>
@@ -2216,7 +2216,7 @@
               <w:rPr>
                 <w:noProof/>
               </w:rPr>
-              <w:instrText xml:space="preserve"> PAGEREF _Toc240522202 \h </w:instrText>
+              <w:instrText xml:space="preserve"> PAGEREF _Toc240524530 \h </w:instrText>
             </w:r>
             <w:r>
               <w:rPr>
@@ -2259,7 +2259,7 @@
               <w14:ligatures w14:val="standardContextual"/>
             </w:rPr>
           </w:pPr>
-          <w:hyperlink w:anchor="_Toc240522203" w:history="1">
+          <w:hyperlink w:anchor="_Toc240524531" w:history="1">
             <w:r>
               <w:rPr>
                 <w:rStyle w:val="a5"/>
@@ -2283,7 +2283,7 @@
               <w:rPr>
                 <w:noProof/>
               </w:rPr>
-              <w:instrText xml:space="preserve"> PAGEREF _Toc240522203 \h </w:instrText>
+              <w:instrText xml:space="preserve"> PAGEREF _Toc240524531 \h </w:instrText>
             </w:r>
             <w:r>
               <w:rPr>
@@ -2326,7 +2326,7 @@
               <w14:ligatures w14:val="standardContextual"/>
             </w:rPr>
           </w:pPr>
-          <w:hyperlink w:anchor="_Toc240522204" w:history="1">
+          <w:hyperlink w:anchor="_Toc240524532" w:history="1">
             <w:r>
               <w:rPr>
                 <w:rStyle w:val="a5"/>
@@ -2350,7 +2350,7 @@
               <w:rPr>
                 <w:noProof/>
               </w:rPr>
-              <w:instrText xml:space="preserve"> PAGEREF _Toc240522204 \h </w:instrText>
+              <w:instrText xml:space="preserve"> PAGEREF _Toc240524532 \h </w:instrText>
             </w:r>
             <w:r>
               <w:rPr>
@@ -2393,7 +2393,7 @@
               <w14:ligatures w14:val="standardContextual"/>
             </w:rPr>
           </w:pPr>
-          <w:hyperlink w:anchor="_Toc240522205" w:history="1">
+          <w:hyperlink w:anchor="_Toc240524533" w:history="1">
             <w:r>
               <w:rPr>
                 <w:rStyle w:val="a5"/>
@@ -2417,7 +2417,7 @@
               <w:rPr>
                 <w:noProof/>
               </w:rPr>
-              <w:instrText xml:space="preserve"> PAGEREF _Toc240522205 \h </w:instrText>
+              <w:instrText xml:space="preserve"> PAGEREF _Toc240524533 \h </w:instrText>
             </w:r>
             <w:r>
               <w:rPr>
@@ -2459,7 +2459,7 @@
               <w14:ligatures w14:val="standardContextual"/>
             </w:rPr>
           </w:pPr>
-          <w:hyperlink w:anchor="_Toc240522206" w:history="1">
+          <w:hyperlink w:anchor="_Toc240524534" w:history="1">
             <w:r>
               <w:rPr>
                 <w:rStyle w:val="a5"/>
@@ -2483,7 +2483,7 @@
               <w:rPr>
                 <w:noProof/>
               </w:rPr>
-              <w:instrText xml:space="preserve"> PAGEREF _Toc240522206 \h </w:instrText>
+              <w:instrText xml:space="preserve"> PAGEREF _Toc240524534 \h </w:instrText>
             </w:r>
             <w:r>
               <w:rPr>
@@ -2526,7 +2526,7 @@
               <w14:ligatures w14:val="standardContextual"/>
             </w:rPr>
           </w:pPr>
-          <w:hyperlink w:anchor="_Toc240522207" w:history="1">
+          <w:hyperlink w:anchor="_Toc240524535" w:history="1">
             <w:r>
               <w:rPr>
                 <w:rStyle w:val="a5"/>
@@ -2550,7 +2550,7 @@
               <w:rPr>
                 <w:noProof/>
               </w:rPr>
-              <w:instrText xml:space="preserve"> PAGEREF _Toc240522207 \h </w:instrText>
+              <w:instrText xml:space="preserve"> PAGEREF _Toc240524535 \h </w:instrText>
             </w:r>
             <w:r>
               <w:rPr>
@@ -2593,7 +2593,7 @@
               <w14:ligatures w14:val="standardContextual"/>
             </w:rPr>
           </w:pPr>
-          <w:hyperlink w:anchor="_Toc240522208" w:history="1">
+          <w:hyperlink w:anchor="_Toc240524536" w:history="1">
             <w:r>
               <w:rPr>
                 <w:rStyle w:val="a5"/>
@@ -2617,7 +2617,7 @@
               <w:rPr>
                 <w:noProof/>
               </w:rPr>
-              <w:instrText xml:space="preserve"> PAGEREF _Toc240522208 \h </w:instrText>
+              <w:instrText xml:space="preserve"> PAGEREF _Toc240524536 \h </w:instrText>
             </w:r>
             <w:r>
               <w:rPr>
@@ -2659,7 +2659,7 @@
               <w14:ligatures w14:val="standardContextual"/>
             </w:rPr>
           </w:pPr>
-          <w:hyperlink w:anchor="_Toc240522209" w:history="1">
+          <w:hyperlink w:anchor="_Toc240524537" w:history="1">
             <w:r>
               <w:rPr>
                 <w:rStyle w:val="a5"/>
@@ -2683,7 +2683,7 @@
               <w:rPr>
                 <w:noProof/>
               </w:rPr>
-              <w:instrText xml:space="preserve"> PAGEREF _Toc240522209 \h </w:instrText>
+              <w:instrText xml:space="preserve"> PAGEREF _Toc240524537 \h </w:instrText>
             </w:r>
             <w:r>
               <w:rPr>
@@ -2725,7 +2725,7 @@
               <w14:ligatures w14:val="standardContextual"/>
             </w:rPr>
           </w:pPr>
-          <w:hyperlink w:anchor="_Toc240522210" w:history="1">
+          <w:hyperlink w:anchor="_Toc240524538" w:history="1">
             <w:r>
               <w:rPr>
                 <w:rStyle w:val="a5"/>
@@ -2749,7 +2749,7 @@
               <w:rPr>
                 <w:noProof/>
               </w:rPr>
-              <w:instrText xml:space="preserve"> PAGEREF _Toc240522210 \h </w:instrText>
+              <w:instrText xml:space="preserve"> PAGEREF _Toc240524538 \h </w:instrText>
             </w:r>
             <w:r>
               <w:rPr>
@@ -2792,7 +2792,7 @@
               <w14:ligatures w14:val="standardContextual"/>
             </w:rPr>
           </w:pPr>
-          <w:hyperlink w:anchor="_Toc240522211" w:history="1">
+          <w:hyperlink w:anchor="_Toc240524539" w:history="1">
             <w:r>
               <w:rPr>
                 <w:rStyle w:val="a5"/>
@@ -2816,7 +2816,7 @@
               <w:rPr>
                 <w:noProof/>
               </w:rPr>
-              <w:instrText xml:space="preserve"> PAGEREF _Toc240522211 \h </w:instrText>
+              <w:instrText xml:space="preserve"> PAGEREF _Toc240524539 \h </w:instrText>
             </w:r>
             <w:r>
               <w:rPr>
@@ -2859,7 +2859,7 @@
               <w14:ligatures w14:val="standardContextual"/>
             </w:rPr>
           </w:pPr>
-          <w:hyperlink w:anchor="_Toc240522212" w:history="1">
+          <w:hyperlink w:anchor="_Toc240524540" w:history="1">
             <w:r>
               <w:rPr>
                 <w:rStyle w:val="a5"/>
@@ -2883,7 +2883,7 @@
               <w:rPr>
                 <w:noProof/>
               </w:rPr>
-              <w:instrText xml:space="preserve"> PAGEREF _Toc240522212 \h </w:instrText>
+              <w:instrText xml:space="preserve"> PAGEREF _Toc240524540 \h </w:instrText>
             </w:r>
             <w:r>
               <w:rPr>
@@ -2926,7 +2926,7 @@
               <w14:ligatures w14:val="standardContextual"/>
             </w:rPr>
           </w:pPr>
-          <w:hyperlink w:anchor="_Toc240522213" w:history="1">
+          <w:hyperlink w:anchor="_Toc240524541" w:history="1">
             <w:r>
               <w:rPr>
                 <w:rStyle w:val="a5"/>
@@ -2950,7 +2950,7 @@
               <w:rPr>
                 <w:noProof/>
               </w:rPr>
-              <w:instrText xml:space="preserve"> PAGEREF _Toc240522213 \h </w:instrText>
+              <w:instrText xml:space="preserve"> PAGEREF _Toc240524541 \h </w:instrText>
             </w:r>
             <w:r>
               <w:rPr>
@@ -2992,7 +2992,7 @@
               <w14:ligatures w14:val="standardContextual"/>
             </w:rPr>
           </w:pPr>
-          <w:hyperlink w:anchor="_Toc240522214" w:history="1">
+          <w:hyperlink w:anchor="_Toc240524542" w:history="1">
             <w:r>
               <w:rPr>
                 <w:rStyle w:val="a5"/>
@@ -3016,7 +3016,7 @@
               <w:rPr>
                 <w:noProof/>
               </w:rPr>
-              <w:instrText xml:space="preserve"> PAGEREF _Toc240522214 \h </w:instrText>
+              <w:instrText xml:space="preserve"> PAGEREF _Toc240524542 \h </w:instrText>
             </w:r>
             <w:r>
               <w:rPr>
@@ -3058,7 +3058,7 @@
               <w14:ligatures w14:val="standardContextual"/>
             </w:rPr>
           </w:pPr>
-          <w:hyperlink w:anchor="_Toc240522215" w:history="1">
+          <w:hyperlink w:anchor="_Toc240524543" w:history="1">
             <w:r>
               <w:rPr>
                 <w:rStyle w:val="a5"/>
@@ -3082,7 +3082,7 @@
               <w:rPr>
                 <w:noProof/>
               </w:rPr>
-              <w:instrText xml:space="preserve"> PAGEREF _Toc240522215 \h </w:instrText>
+              <w:instrText xml:space="preserve"> PAGEREF _Toc240524543 \h </w:instrText>
             </w:r>
             <w:r>
               <w:rPr>
@@ -3124,7 +3124,7 @@
               <w14:ligatures w14:val="standardContextual"/>
             </w:rPr>
           </w:pPr>
-          <w:hyperlink w:anchor="_Toc240522216" w:history="1">
+          <w:hyperlink w:anchor="_Toc240524544" w:history="1">
             <w:r>
               <w:rPr>
                 <w:rStyle w:val="a5"/>
@@ -3148,7 +3148,7 @@
               <w:rPr>
                 <w:noProof/>
               </w:rPr>
-              <w:instrText xml:space="preserve"> PAGEREF _Toc240522216 \h </w:instrText>
+              <w:instrText xml:space="preserve"> PAGEREF _Toc240524544 \h </w:instrText>
             </w:r>
             <w:r>
               <w:rPr>
@@ -3190,7 +3190,7 @@
               <w14:ligatures w14:val="standardContextual"/>
             </w:rPr>
           </w:pPr>
-          <w:hyperlink w:anchor="_Toc240522217" w:history="1">
+          <w:hyperlink w:anchor="_Toc240524545" w:history="1">
             <w:r>
               <w:rPr>
                 <w:rStyle w:val="a5"/>
@@ -3214,7 +3214,7 @@
               <w:rPr>
                 <w:noProof/>
               </w:rPr>
-              <w:instrText xml:space="preserve"> PAGEREF _Toc240522217 \h </w:instrText>
+              <w:instrText xml:space="preserve"> PAGEREF _Toc240524545 \h </w:instrText>
             </w:r>
             <w:r>
               <w:rPr>
@@ -3257,7 +3257,7 @@
               <w14:ligatures w14:val="standardContextual"/>
             </w:rPr>
           </w:pPr>
-          <w:hyperlink w:anchor="_Toc240522218" w:history="1">
+          <w:hyperlink w:anchor="_Toc240524546" w:history="1">
             <w:r>
               <w:rPr>
                 <w:rStyle w:val="a5"/>
@@ -3281,7 +3281,7 @@
               <w:rPr>
                 <w:noProof/>
               </w:rPr>
-              <w:instrText xml:space="preserve"> PAGEREF _Toc240522218 \h </w:instrText>
+              <w:instrText xml:space="preserve"> PAGEREF _Toc240524546 \h </w:instrText>
             </w:r>
             <w:r>
               <w:rPr>
@@ -3324,7 +3324,7 @@
               <w14:ligatures w14:val="standardContextual"/>
             </w:rPr>
           </w:pPr>
-          <w:hyperlink w:anchor="_Toc240522219" w:history="1">
+          <w:hyperlink w:anchor="_Toc240524547" w:history="1">
             <w:r>
               <w:rPr>
                 <w:rStyle w:val="a5"/>
@@ -3348,7 +3348,7 @@
               <w:rPr>
                 <w:noProof/>
               </w:rPr>
-              <w:instrText xml:space="preserve"> PAGEREF _Toc240522219 \h </w:instrText>
+              <w:instrText xml:space="preserve"> PAGEREF _Toc240524547 \h </w:instrText>
             </w:r>
             <w:r>
               <w:rPr>
@@ -3391,7 +3391,7 @@
               <w14:ligatures w14:val="standardContextual"/>
             </w:rPr>
           </w:pPr>
-          <w:hyperlink w:anchor="_Toc240522220" w:history="1">
+          <w:hyperlink w:anchor="_Toc240524548" w:history="1">
             <w:r>
               <w:rPr>
                 <w:rStyle w:val="a5"/>
@@ -3415,7 +3415,7 @@
               <w:rPr>
                 <w:noProof/>
               </w:rPr>
-              <w:instrText xml:space="preserve"> PAGEREF _Toc240522220 \h </w:instrText>
+              <w:instrText xml:space="preserve"> PAGEREF _Toc240524548 \h </w:instrText>
             </w:r>
             <w:r>
               <w:rPr>
@@ -3458,7 +3458,7 @@
               <w14:ligatures w14:val="standardContextual"/>
             </w:rPr>
           </w:pPr>
-          <w:hyperlink w:anchor="_Toc240522221" w:history="1">
+          <w:hyperlink w:anchor="_Toc240524549" w:history="1">
             <w:r>
               <w:rPr>
                 <w:rStyle w:val="a5"/>
@@ -3482,7 +3482,7 @@
               <w:rPr>
                 <w:noProof/>
               </w:rPr>
-              <w:instrText xml:space="preserve"> PAGEREF _Toc240522221 \h </w:instrText>
+              <w:instrText xml:space="preserve"> PAGEREF _Toc240524549 \h </w:instrText>
             </w:r>
             <w:r>
               <w:rPr>
@@ -3521,7 +3521,7 @@
         <w:pStyle w:val="1"/>
         <w:pageBreakBefore/>
       </w:pPr>
-      <w:bookmarkStart w:id="0" w:name="_Toc240522177"/>
+      <w:bookmarkStart w:id="0" w:name="_Toc240524505"/>
       <w:r>
         <w:lastRenderedPageBreak/>
         <w:t xml:space="preserve">1. </w:t>
@@ -3535,7 +3535,7 @@
       <w:pPr>
         <w:pStyle w:val="2"/>
       </w:pPr>
-      <w:bookmarkStart w:id="1" w:name="_Toc240522178"/>
+      <w:bookmarkStart w:id="1" w:name="_Toc240524506"/>
       <w:r>
         <w:t>1.1 RuninqVic</w:t>
       </w:r>
@@ -3945,7 +3945,7 @@
       <w:pPr>
         <w:pStyle w:val="2"/>
       </w:pPr>
-      <w:bookmarkStart w:id="2" w:name="_Toc240522179"/>
+      <w:bookmarkStart w:id="2" w:name="_Toc240524507"/>
       <w:r>
         <w:t xml:space="preserve">1.2 </w:t>
       </w:r>
@@ -6565,7 +6565,7 @@
       <w:pPr>
         <w:pStyle w:val="2"/>
       </w:pPr>
-      <w:bookmarkStart w:id="3" w:name="_Toc240522180"/>
+      <w:bookmarkStart w:id="3" w:name="_Toc240524508"/>
       <w:r>
         <w:t xml:space="preserve">1.3 </w:t>
       </w:r>
@@ -6797,7 +6797,7 @@
         <w:pStyle w:val="1"/>
         <w:pageBreakBefore/>
       </w:pPr>
-      <w:bookmarkStart w:id="4" w:name="_Toc240522181"/>
+      <w:bookmarkStart w:id="4" w:name="_Toc240524509"/>
       <w:r>
         <w:lastRenderedPageBreak/>
         <w:t xml:space="preserve">2. </w:t>
@@ -6811,7 +6811,7 @@
       <w:pPr>
         <w:pStyle w:val="2"/>
       </w:pPr>
-      <w:bookmarkStart w:id="5" w:name="_Toc240522182"/>
+      <w:bookmarkStart w:id="5" w:name="_Toc240524510"/>
       <w:r>
         <w:t xml:space="preserve">2.1 </w:t>
       </w:r>
@@ -7789,7 +7789,7 @@
       <w:pPr>
         <w:pStyle w:val="2"/>
       </w:pPr>
-      <w:bookmarkStart w:id="6" w:name="_Toc240522183"/>
+      <w:bookmarkStart w:id="6" w:name="_Toc240524511"/>
       <w:r>
         <w:t xml:space="preserve">2.2 </w:t>
       </w:r>
@@ -8143,10 +8143,10 @@
         </w:rPr>
         <w:lastRenderedPageBreak/>
         <w:drawing>
-          <wp:inline distT="0" distB="0" distL="0" distR="0" wp14:anchorId="213392AA" wp14:editId="528E37AF">
+          <wp:inline distT="0" distB="0" distL="0" distR="0" wp14:anchorId="132ECB43" wp14:editId="05389120">
             <wp:extent cx="5943600" cy="3638550"/>
             <wp:effectExtent l="0" t="0" r="0" b="0"/>
-            <wp:docPr id="2140304898" name="그림 2140304898"/>
+            <wp:docPr id="381735802" name="그림 381735802"/>
             <wp:cNvGraphicFramePr>
               <a:graphicFrameLocks xmlns:a="http://schemas.openxmlformats.org/drawingml/2006/main" noChangeAspect="1"/>
             </wp:cNvGraphicFramePr>
@@ -8262,7 +8262,7 @@
       <w:pPr>
         <w:pStyle w:val="2"/>
       </w:pPr>
-      <w:bookmarkStart w:id="7" w:name="_Toc240522184"/>
+      <w:bookmarkStart w:id="7" w:name="_Toc240524512"/>
       <w:r>
         <w:t xml:space="preserve">2.3 </w:t>
       </w:r>
@@ -8287,10 +8287,10 @@
           <w:noProof/>
         </w:rPr>
         <w:drawing>
-          <wp:inline distT="0" distB="0" distL="0" distR="0" wp14:anchorId="34FB09B2" wp14:editId="1DAFB254">
+          <wp:inline distT="0" distB="0" distL="0" distR="0" wp14:anchorId="66242C8C" wp14:editId="14CDF258">
             <wp:extent cx="5943600" cy="3638550"/>
             <wp:effectExtent l="0" t="0" r="0" b="0"/>
-            <wp:docPr id="1610098088" name="그림 1610098088"/>
+            <wp:docPr id="1771831892" name="그림 1771831892"/>
             <wp:cNvGraphicFramePr>
               <a:graphicFrameLocks xmlns:a="http://schemas.openxmlformats.org/drawingml/2006/main" noChangeAspect="1"/>
             </wp:cNvGraphicFramePr>
@@ -9720,7 +9720,7 @@
       <w:pPr>
         <w:pStyle w:val="2"/>
       </w:pPr>
-      <w:bookmarkStart w:id="8" w:name="_Toc240522185"/>
+      <w:bookmarkStart w:id="8" w:name="_Toc240524513"/>
       <w:r>
         <w:t xml:space="preserve">2.4 </w:t>
       </w:r>
@@ -9746,10 +9746,10 @@
         </w:rPr>
         <w:lastRenderedPageBreak/>
         <w:drawing>
-          <wp:inline distT="0" distB="0" distL="0" distR="0" wp14:anchorId="785910FC" wp14:editId="0BED96E6">
+          <wp:inline distT="0" distB="0" distL="0" distR="0" wp14:anchorId="3BD6DAA2" wp14:editId="3C8E4953">
             <wp:extent cx="5943600" cy="12858750"/>
             <wp:effectExtent l="0" t="0" r="0" b="0"/>
-            <wp:docPr id="1708175291" name="그림 1708175291"/>
+            <wp:docPr id="410919590" name="그림 410919590"/>
             <wp:cNvGraphicFramePr>
               <a:graphicFrameLocks xmlns:a="http://schemas.openxmlformats.org/drawingml/2006/main" noChangeAspect="1"/>
             </wp:cNvGraphicFramePr>
@@ -12415,7 +12415,7 @@
         <w:pStyle w:val="1"/>
         <w:pageBreakBefore/>
       </w:pPr>
-      <w:bookmarkStart w:id="9" w:name="_Toc240522186"/>
+      <w:bookmarkStart w:id="9" w:name="_Toc240524514"/>
       <w:r>
         <w:lastRenderedPageBreak/>
         <w:t>3. 5</w:t>
@@ -13119,7 +13119,7 @@
         <w:pStyle w:val="1"/>
         <w:pageBreakBefore/>
       </w:pPr>
-      <w:bookmarkStart w:id="10" w:name="_Toc240522187"/>
+      <w:bookmarkStart w:id="10" w:name="_Toc240524515"/>
       <w:r>
         <w:lastRenderedPageBreak/>
         <w:t xml:space="preserve">4. </w:t>
@@ -13198,7 +13198,7 @@
       <w:pPr>
         <w:pStyle w:val="2"/>
       </w:pPr>
-      <w:bookmarkStart w:id="11" w:name="_Toc240522188"/>
+      <w:bookmarkStart w:id="11" w:name="_Toc240524516"/>
       <w:r>
         <w:t xml:space="preserve">4.1 ① </w:t>
       </w:r>
@@ -13920,7 +13920,7 @@
       <w:pPr>
         <w:pStyle w:val="2"/>
       </w:pPr>
-      <w:bookmarkStart w:id="12" w:name="_Toc240522189"/>
+      <w:bookmarkStart w:id="12" w:name="_Toc240524517"/>
       <w:r>
         <w:t xml:space="preserve">4.2 ② </w:t>
       </w:r>
@@ -14347,7 +14347,7 @@
       <w:pPr>
         <w:pStyle w:val="2"/>
       </w:pPr>
-      <w:bookmarkStart w:id="13" w:name="_Toc240522190"/>
+      <w:bookmarkStart w:id="13" w:name="_Toc240524518"/>
       <w:r>
         <w:t xml:space="preserve">4.3 ③ </w:t>
       </w:r>
@@ -15948,7 +15948,7 @@
       <w:pPr>
         <w:pStyle w:val="2"/>
       </w:pPr>
-      <w:bookmarkStart w:id="14" w:name="_Toc240522191"/>
+      <w:bookmarkStart w:id="14" w:name="_Toc240524519"/>
       <w:r>
         <w:t xml:space="preserve">4.4 ④ </w:t>
       </w:r>
@@ -16455,7 +16455,7 @@
         <w:pStyle w:val="1"/>
         <w:pageBreakBefore/>
       </w:pPr>
-      <w:bookmarkStart w:id="15" w:name="_Toc240522192"/>
+      <w:bookmarkStart w:id="15" w:name="_Toc240524520"/>
       <w:r>
         <w:lastRenderedPageBreak/>
         <w:t xml:space="preserve">5. </w:t>
@@ -16481,7 +16481,7 @@
       <w:pPr>
         <w:pStyle w:val="2"/>
       </w:pPr>
-      <w:bookmarkStart w:id="16" w:name="_Toc240522193"/>
+      <w:bookmarkStart w:id="16" w:name="_Toc240524521"/>
       <w:r>
         <w:t xml:space="preserve">5.1 </w:t>
       </w:r>
@@ -16790,7 +16790,7 @@
       <w:pPr>
         <w:pStyle w:val="2"/>
       </w:pPr>
-      <w:bookmarkStart w:id="17" w:name="_Toc240522194"/>
+      <w:bookmarkStart w:id="17" w:name="_Toc240524522"/>
       <w:r>
         <w:t xml:space="preserve">5.2 </w:t>
       </w:r>
@@ -17319,7 +17319,7 @@
       <w:pPr>
         <w:pStyle w:val="2"/>
       </w:pPr>
-      <w:bookmarkStart w:id="18" w:name="_Toc240522195"/>
+      <w:bookmarkStart w:id="18" w:name="_Toc240524523"/>
       <w:r>
         <w:t xml:space="preserve">5.3 </w:t>
       </w:r>
@@ -17590,7 +17590,7 @@
       <w:pPr>
         <w:pStyle w:val="2"/>
       </w:pPr>
-      <w:bookmarkStart w:id="19" w:name="_Toc240522196"/>
+      <w:bookmarkStart w:id="19" w:name="_Toc240524524"/>
       <w:r>
         <w:t xml:space="preserve">5.4 </w:t>
       </w:r>
@@ -17800,7 +17800,7 @@
       <w:pPr>
         <w:pStyle w:val="2"/>
       </w:pPr>
-      <w:bookmarkStart w:id="20" w:name="_Toc240522197"/>
+      <w:bookmarkStart w:id="20" w:name="_Toc240524525"/>
       <w:r>
         <w:t xml:space="preserve">5.5 </w:t>
       </w:r>
@@ -18023,7 +18023,7 @@
       <w:pPr>
         <w:pStyle w:val="2"/>
       </w:pPr>
-      <w:bookmarkStart w:id="21" w:name="_Toc240522198"/>
+      <w:bookmarkStart w:id="21" w:name="_Toc240524526"/>
       <w:r>
         <w:t xml:space="preserve">5.6 </w:t>
       </w:r>
@@ -18144,7 +18144,7 @@
         <w:pStyle w:val="1"/>
         <w:pageBreakBefore/>
       </w:pPr>
-      <w:bookmarkStart w:id="22" w:name="_Toc240522199"/>
+      <w:bookmarkStart w:id="22" w:name="_Toc240524527"/>
       <w:r>
         <w:lastRenderedPageBreak/>
         <w:t xml:space="preserve">6. </w:t>
@@ -19993,7 +19993,7 @@
         <w:pStyle w:val="1"/>
         <w:pageBreakBefore/>
       </w:pPr>
-      <w:bookmarkStart w:id="23" w:name="_Toc240522200"/>
+      <w:bookmarkStart w:id="23" w:name="_Toc240524528"/>
       <w:r>
         <w:lastRenderedPageBreak/>
         <w:t xml:space="preserve">7. </w:t>
@@ -20013,10 +20013,10 @@
           <w:noProof/>
         </w:rPr>
         <w:drawing>
-          <wp:inline distT="0" distB="0" distL="0" distR="0" wp14:anchorId="34C2B911" wp14:editId="2D428DE7">
+          <wp:inline distT="0" distB="0" distL="0" distR="0" wp14:anchorId="399FD224" wp14:editId="434D7284">
             <wp:extent cx="5943600" cy="3638550"/>
             <wp:effectExtent l="0" t="0" r="0" b="0"/>
-            <wp:docPr id="1494322473" name="그림 1494322473"/>
+            <wp:docPr id="666149872" name="그림 666149872"/>
             <wp:cNvGraphicFramePr>
               <a:graphicFrameLocks xmlns:a="http://schemas.openxmlformats.org/drawingml/2006/main" noChangeAspect="1"/>
             </wp:cNvGraphicFramePr>
@@ -22822,7 +22822,7 @@
       <w:pPr>
         <w:pStyle w:val="2"/>
       </w:pPr>
-      <w:bookmarkStart w:id="24" w:name="_Toc240522201"/>
+      <w:bookmarkStart w:id="24" w:name="_Toc240524529"/>
       <w:r>
         <w:t xml:space="preserve">7.1 </w:t>
       </w:r>
@@ -22853,10 +22853,10 @@
           <w:noProof/>
         </w:rPr>
         <w:drawing>
-          <wp:inline distT="0" distB="0" distL="0" distR="0" wp14:anchorId="6D4AB0C1" wp14:editId="656BD425">
+          <wp:inline distT="0" distB="0" distL="0" distR="0" wp14:anchorId="0D2EF7B7" wp14:editId="5DE1DF13">
             <wp:extent cx="5943600" cy="3638550"/>
             <wp:effectExtent l="0" t="0" r="0" b="0"/>
-            <wp:docPr id="2087236213" name="그림 2087236213"/>
+            <wp:docPr id="2054405098" name="그림 2054405098"/>
             <wp:cNvGraphicFramePr>
               <a:graphicFrameLocks xmlns:a="http://schemas.openxmlformats.org/drawingml/2006/main" noChangeAspect="1"/>
             </wp:cNvGraphicFramePr>
@@ -23101,7 +23101,7 @@
         <w:t xml:space="preserve"> </w:t>
       </w:r>
       <w:r>
-        <w:t>선택하면</w:t>
+        <w:t>누르면</w:t>
       </w:r>
       <w:r>
         <w:t xml:space="preserve"> </w:t>
@@ -23113,7 +23113,13 @@
         <w:t xml:space="preserve"> </w:t>
       </w:r>
       <w:r>
-        <w:t>탭</w:t>
+        <w:t>탭이</w:t>
+      </w:r>
+      <w:r>
+        <w:t xml:space="preserve"> </w:t>
+      </w:r>
+      <w:r>
+        <w:t>열리고</w:t>
       </w:r>
       <w:r>
         <w:t xml:space="preserve"> </w:t>
@@ -23134,6 +23140,12 @@
         <w:t>구간</w:t>
       </w:r>
       <w:r>
+        <w:t xml:space="preserve"> </w:t>
+      </w:r>
+      <w:r>
+        <w:t>자르기</w:t>
+      </w:r>
+      <w:r>
         <w:t xml:space="preserve">" </w:t>
       </w:r>
       <w:r>
@@ -23149,18 +23161,42 @@
         <w:t xml:space="preserve">. </w:t>
       </w:r>
       <w:r>
-        <w:t>여기서</w:t>
-      </w:r>
-      <w:r>
-        <w:t xml:space="preserve"> </w:t>
-      </w:r>
-      <w:r>
         <w:t>동영상의</w:t>
       </w:r>
       <w:r>
         <w:t xml:space="preserve"> </w:t>
       </w:r>
       <w:r>
+        <w:t>장면들이</w:t>
+      </w:r>
+      <w:r>
+        <w:t xml:space="preserve"> </w:t>
+      </w:r>
+      <w:r>
+        <w:t>띠</w:t>
+      </w:r>
+      <w:r>
+        <w:t>(</w:t>
+      </w:r>
+      <w:r>
+        <w:t>필름스트립</w:t>
+      </w:r>
+      <w:r>
+        <w:t>)</w:t>
+      </w:r>
+      <w:r>
+        <w:t>로</w:t>
+      </w:r>
+      <w:r>
+        <w:t xml:space="preserve"> </w:t>
+      </w:r>
+      <w:r>
+        <w:t>보이므로</w:t>
+      </w:r>
+      <w:r>
+        <w:t xml:space="preserve"> </w:t>
+      </w:r>
+      <w:r>
         <w:t>어느</w:t>
       </w:r>
       <w:r>
@@ -23173,19 +23209,230 @@
         <w:t xml:space="preserve"> </w:t>
       </w:r>
       <w:r>
-        <w:t>얼마나</w:t>
-      </w:r>
-      <w:r>
-        <w:t xml:space="preserve"> </w:t>
-      </w:r>
-      <w:r>
         <w:t>쓸지</w:t>
       </w:r>
       <w:r>
         <w:t xml:space="preserve"> </w:t>
       </w:r>
       <w:r>
-        <w:t>정합니다</w:t>
+        <w:t>눈으로</w:t>
+      </w:r>
+      <w:r>
+        <w:t xml:space="preserve"> </w:t>
+      </w:r>
+      <w:r>
+        <w:t>보며</w:t>
+      </w:r>
+      <w:r>
+        <w:t xml:space="preserve"> </w:t>
+      </w:r>
+      <w:r>
+        <w:t>고를</w:t>
+      </w:r>
+      <w:r>
+        <w:t xml:space="preserve"> </w:t>
+      </w:r>
+      <w:r>
+        <w:t>수</w:t>
+      </w:r>
+      <w:r>
+        <w:t xml:space="preserve"> </w:t>
+      </w:r>
+      <w:r>
+        <w:t>있습니다</w:t>
+      </w:r>
+      <w:r>
+        <w:t>.</w:t>
+      </w:r>
+    </w:p>
+    <w:p>
+      <w:pPr>
+        <w:pBdr>
+          <w:left w:val="single" w:sz="18" w:space="8" w:color="E8562A"/>
+        </w:pBdr>
+        <w:shd w:val="clear" w:color="auto" w:fill="FFF4EE"/>
+        <w:spacing w:before="80" w:after="160" w:line="320" w:lineRule="auto"/>
+        <w:ind w:left="200"/>
+      </w:pPr>
+      <w:r>
+        <w:rPr>
+          <w:b/>
+          <w:bCs/>
+          <w:color w:val="E8562A"/>
+        </w:rPr>
+        <w:t xml:space="preserve">TIP  </w:t>
+      </w:r>
+      <w:r>
+        <w:t>가장</w:t>
+      </w:r>
+      <w:r>
+        <w:t xml:space="preserve"> </w:t>
+      </w:r>
+      <w:r>
+        <w:t>쉬운</w:t>
+      </w:r>
+      <w:r>
+        <w:t xml:space="preserve"> </w:t>
+      </w:r>
+      <w:r>
+        <w:t>방법</w:t>
+      </w:r>
+      <w:r>
+        <w:t xml:space="preserve">: </w:t>
+      </w:r>
+      <w:r>
+        <w:t>미리보기를</w:t>
+      </w:r>
+      <w:r>
+        <w:t xml:space="preserve"> </w:t>
+      </w:r>
+      <w:r>
+        <w:t>재생하거나</w:t>
+      </w:r>
+      <w:r>
+        <w:t xml:space="preserve"> </w:t>
+      </w:r>
+      <w:r>
+        <w:t>탐색</w:t>
+      </w:r>
+      <w:r>
+        <w:t xml:space="preserve"> </w:t>
+      </w:r>
+      <w:r>
+        <w:t>막대를</w:t>
+      </w:r>
+      <w:r>
+        <w:t xml:space="preserve"> </w:t>
+      </w:r>
+      <w:r>
+        <w:t>움직여</w:t>
+      </w:r>
+      <w:r>
+        <w:t xml:space="preserve"> </w:t>
+      </w:r>
+      <w:r>
+        <w:t>원하는</w:t>
+      </w:r>
+      <w:r>
+        <w:t xml:space="preserve"> </w:t>
+      </w:r>
+      <w:r>
+        <w:t>장면에서</w:t>
+      </w:r>
+      <w:r>
+        <w:t xml:space="preserve"> </w:t>
+      </w:r>
+      <w:r>
+        <w:t>멈춘</w:t>
+      </w:r>
+      <w:r>
+        <w:t xml:space="preserve"> </w:t>
+      </w:r>
+      <w:r>
+        <w:t>뒤</w:t>
+      </w:r>
+      <w:r>
+        <w:t xml:space="preserve"> [⏵ </w:t>
+      </w:r>
+      <w:r>
+        <w:t>여기서부터</w:t>
+      </w:r>
+      <w:r>
+        <w:t>]</w:t>
+      </w:r>
+      <w:r>
+        <w:t>를</w:t>
+      </w:r>
+      <w:r>
+        <w:t xml:space="preserve"> </w:t>
+      </w:r>
+      <w:r>
+        <w:t>누르고</w:t>
+      </w:r>
+      <w:r>
+        <w:t xml:space="preserve">, </w:t>
+      </w:r>
+      <w:r>
+        <w:t>다시</w:t>
+      </w:r>
+      <w:r>
+        <w:t xml:space="preserve"> </w:t>
+      </w:r>
+      <w:r>
+        <w:t>끝낼</w:t>
+      </w:r>
+      <w:r>
+        <w:t xml:space="preserve"> </w:t>
+      </w:r>
+      <w:r>
+        <w:t>장면에서</w:t>
+      </w:r>
+      <w:r>
+        <w:t xml:space="preserve"> </w:t>
+      </w:r>
+      <w:r>
+        <w:t>멈춘</w:t>
+      </w:r>
+      <w:r>
+        <w:t xml:space="preserve"> </w:t>
+      </w:r>
+      <w:r>
+        <w:t>뒤</w:t>
+      </w:r>
+      <w:r>
+        <w:t xml:space="preserve"> [⏴ </w:t>
+      </w:r>
+      <w:r>
+        <w:t>여기까지</w:t>
+      </w:r>
+      <w:r>
+        <w:t>]</w:t>
+      </w:r>
+      <w:r>
+        <w:t>를</w:t>
+      </w:r>
+      <w:r>
+        <w:t xml:space="preserve"> </w:t>
+      </w:r>
+      <w:r>
+        <w:t>누릅니다</w:t>
+      </w:r>
+      <w:r>
+        <w:t xml:space="preserve">. </w:t>
+      </w:r>
+      <w:r>
+        <w:t>키보드</w:t>
+      </w:r>
+      <w:r>
+        <w:t xml:space="preserve"> I </w:t>
+      </w:r>
+      <w:r>
+        <w:t>키와</w:t>
+      </w:r>
+      <w:r>
+        <w:t xml:space="preserve"> O </w:t>
+      </w:r>
+      <w:r>
+        <w:t>키도</w:t>
+      </w:r>
+      <w:r>
+        <w:t xml:space="preserve"> </w:t>
+      </w:r>
+      <w:r>
+        <w:lastRenderedPageBreak/>
+        <w:t>같은</w:t>
+      </w:r>
+      <w:r>
+        <w:t xml:space="preserve"> </w:t>
+      </w:r>
+      <w:r>
+        <w:t>역할을</w:t>
+      </w:r>
+      <w:r>
+        <w:t xml:space="preserve"> </w:t>
+      </w:r>
+      <w:r>
+        <w:t>합니다</w:t>
       </w:r>
       <w:r>
         <w:t>.</w:t>
@@ -23301,21 +23548,21 @@
                 <w:sz w:val="19"/>
                 <w:szCs w:val="19"/>
               </w:rPr>
-              <w:t>구간</w:t>
-            </w:r>
-            <w:r>
-              <w:rPr>
-                <w:sz w:val="19"/>
-                <w:szCs w:val="19"/>
-              </w:rPr>
-              <w:t xml:space="preserve"> </w:t>
-            </w:r>
-            <w:r>
-              <w:rPr>
-                <w:sz w:val="19"/>
-                <w:szCs w:val="19"/>
-              </w:rPr>
-              <w:t>막대</w:t>
+              <w:t>필름스트립</w:t>
+            </w:r>
+            <w:r>
+              <w:rPr>
+                <w:sz w:val="19"/>
+                <w:szCs w:val="19"/>
+              </w:rPr>
+              <w:t xml:space="preserve"> </w:t>
+            </w:r>
+            <w:r>
+              <w:rPr>
+                <w:sz w:val="19"/>
+                <w:szCs w:val="19"/>
+              </w:rPr>
+              <w:t>손잡이</w:t>
             </w:r>
           </w:p>
         </w:tc>
@@ -23338,21 +23585,35 @@
                 <w:sz w:val="19"/>
                 <w:szCs w:val="19"/>
               </w:rPr>
-              <w:t>주황색</w:t>
-            </w:r>
-            <w:r>
-              <w:rPr>
-                <w:sz w:val="19"/>
-                <w:szCs w:val="19"/>
-              </w:rPr>
-              <w:t xml:space="preserve"> </w:t>
-            </w:r>
-            <w:r>
-              <w:rPr>
-                <w:sz w:val="19"/>
-                <w:szCs w:val="19"/>
-              </w:rPr>
-              <w:t>부분이</w:t>
+              <w:t>주황</w:t>
+            </w:r>
+            <w:r>
+              <w:rPr>
+                <w:sz w:val="19"/>
+                <w:szCs w:val="19"/>
+              </w:rPr>
+              <w:t xml:space="preserve"> </w:t>
+            </w:r>
+            <w:r>
+              <w:rPr>
+                <w:sz w:val="19"/>
+                <w:szCs w:val="19"/>
+              </w:rPr>
+              <w:t>테두리</w:t>
+            </w:r>
+            <w:r>
+              <w:rPr>
+                <w:sz w:val="19"/>
+                <w:szCs w:val="19"/>
+              </w:rPr>
+              <w:t xml:space="preserve"> </w:t>
+            </w:r>
+            <w:r>
+              <w:rPr>
+                <w:sz w:val="19"/>
+                <w:szCs w:val="19"/>
+              </w:rPr>
+              <w:t>안이</w:t>
             </w:r>
             <w:r>
               <w:rPr>
@@ -23394,7 +23655,49 @@
                 <w:sz w:val="19"/>
                 <w:szCs w:val="19"/>
               </w:rPr>
-              <w:t>구간입니다</w:t>
+              <w:t>구간이고</w:t>
+            </w:r>
+            <w:r>
+              <w:rPr>
+                <w:sz w:val="19"/>
+                <w:szCs w:val="19"/>
+              </w:rPr>
+              <w:t xml:space="preserve">, </w:t>
+            </w:r>
+            <w:r>
+              <w:rPr>
+                <w:sz w:val="19"/>
+                <w:szCs w:val="19"/>
+              </w:rPr>
+              <w:t>바깥은</w:t>
+            </w:r>
+            <w:r>
+              <w:rPr>
+                <w:sz w:val="19"/>
+                <w:szCs w:val="19"/>
+              </w:rPr>
+              <w:t xml:space="preserve"> </w:t>
+            </w:r>
+            <w:r>
+              <w:rPr>
+                <w:sz w:val="19"/>
+                <w:szCs w:val="19"/>
+              </w:rPr>
+              <w:t>어둡게</w:t>
+            </w:r>
+            <w:r>
+              <w:rPr>
+                <w:sz w:val="19"/>
+                <w:szCs w:val="19"/>
+              </w:rPr>
+              <w:t xml:space="preserve"> </w:t>
+            </w:r>
+            <w:r>
+              <w:rPr>
+                <w:sz w:val="19"/>
+                <w:szCs w:val="19"/>
+              </w:rPr>
+              <w:t>표시됩니다</w:t>
             </w:r>
             <w:r>
               <w:rPr>
@@ -23457,20 +23760,6 @@
                 <w:sz w:val="19"/>
                 <w:szCs w:val="19"/>
               </w:rPr>
-              <w:t xml:space="preserve"> </w:t>
-            </w:r>
-            <w:r>
-              <w:rPr>
-                <w:sz w:val="19"/>
-                <w:szCs w:val="19"/>
-              </w:rPr>
-              <w:t>지점</w:t>
-            </w:r>
-            <w:r>
-              <w:rPr>
-                <w:sz w:val="19"/>
-                <w:szCs w:val="19"/>
-              </w:rPr>
               <w:t xml:space="preserve">, </w:t>
             </w:r>
             <w:r>
@@ -23520,35 +23809,119 @@
                 <w:sz w:val="19"/>
                 <w:szCs w:val="19"/>
               </w:rPr>
-              <w:t>끝</w:t>
-            </w:r>
-            <w:r>
-              <w:rPr>
-                <w:sz w:val="19"/>
-                <w:szCs w:val="19"/>
-              </w:rPr>
-              <w:t xml:space="preserve"> </w:t>
-            </w:r>
-            <w:r>
-              <w:rPr>
-                <w:sz w:val="19"/>
-                <w:szCs w:val="19"/>
-              </w:rPr>
-              <w:t>지점이</w:t>
-            </w:r>
-            <w:r>
-              <w:rPr>
-                <w:sz w:val="19"/>
-                <w:szCs w:val="19"/>
-              </w:rPr>
-              <w:t xml:space="preserve"> </w:t>
-            </w:r>
-            <w:r>
-              <w:rPr>
-                <w:sz w:val="19"/>
-                <w:szCs w:val="19"/>
-              </w:rPr>
-              <w:t>바뀝니다</w:t>
+              <w:t>끝이</w:t>
+            </w:r>
+            <w:r>
+              <w:rPr>
+                <w:sz w:val="19"/>
+                <w:szCs w:val="19"/>
+              </w:rPr>
+              <w:t xml:space="preserve"> </w:t>
+            </w:r>
+            <w:r>
+              <w:rPr>
+                <w:sz w:val="19"/>
+                <w:szCs w:val="19"/>
+              </w:rPr>
+              <w:t>바뀌며</w:t>
+            </w:r>
+            <w:r>
+              <w:rPr>
+                <w:sz w:val="19"/>
+                <w:szCs w:val="19"/>
+              </w:rPr>
+              <w:t xml:space="preserve">, </w:t>
+            </w:r>
+            <w:r>
+              <w:rPr>
+                <w:sz w:val="19"/>
+                <w:szCs w:val="19"/>
+              </w:rPr>
+              <w:t>끄는</w:t>
+            </w:r>
+            <w:r>
+              <w:rPr>
+                <w:sz w:val="19"/>
+                <w:szCs w:val="19"/>
+              </w:rPr>
+              <w:t xml:space="preserve"> </w:t>
+            </w:r>
+            <w:r>
+              <w:rPr>
+                <w:sz w:val="19"/>
+                <w:szCs w:val="19"/>
+              </w:rPr>
+              <w:t>동안</w:t>
+            </w:r>
+            <w:r>
+              <w:rPr>
+                <w:sz w:val="19"/>
+                <w:szCs w:val="19"/>
+              </w:rPr>
+              <w:t xml:space="preserve"> </w:t>
+            </w:r>
+            <w:r>
+              <w:rPr>
+                <w:sz w:val="19"/>
+                <w:szCs w:val="19"/>
+              </w:rPr>
+              <w:t>미리보기가</w:t>
+            </w:r>
+            <w:r>
+              <w:rPr>
+                <w:sz w:val="19"/>
+                <w:szCs w:val="19"/>
+              </w:rPr>
+              <w:t xml:space="preserve"> </w:t>
+            </w:r>
+            <w:r>
+              <w:rPr>
+                <w:sz w:val="19"/>
+                <w:szCs w:val="19"/>
+              </w:rPr>
+              <w:t>그</w:t>
+            </w:r>
+            <w:r>
+              <w:rPr>
+                <w:sz w:val="19"/>
+                <w:szCs w:val="19"/>
+              </w:rPr>
+              <w:t xml:space="preserve"> </w:t>
+            </w:r>
+            <w:r>
+              <w:rPr>
+                <w:sz w:val="19"/>
+                <w:szCs w:val="19"/>
+              </w:rPr>
+              <w:t>장면을</w:t>
+            </w:r>
+            <w:r>
+              <w:rPr>
+                <w:sz w:val="19"/>
+                <w:szCs w:val="19"/>
+              </w:rPr>
+              <w:t xml:space="preserve"> </w:t>
+            </w:r>
+            <w:r>
+              <w:rPr>
+                <w:sz w:val="19"/>
+                <w:szCs w:val="19"/>
+              </w:rPr>
+              <w:t>보여</w:t>
+            </w:r>
+            <w:r>
+              <w:rPr>
+                <w:sz w:val="19"/>
+                <w:szCs w:val="19"/>
+              </w:rPr>
+              <w:t xml:space="preserve"> </w:t>
+            </w:r>
+            <w:r>
+              <w:rPr>
+                <w:sz w:val="19"/>
+                <w:szCs w:val="19"/>
+              </w:rPr>
+              <w:t>줍니다</w:t>
             </w:r>
             <w:r>
               <w:rPr>
@@ -23562,57 +23935,161 @@
                 <w:sz w:val="19"/>
                 <w:szCs w:val="19"/>
               </w:rPr>
-              <w:t>손잡이를</w:t>
-            </w:r>
-            <w:r>
-              <w:rPr>
-                <w:sz w:val="19"/>
-                <w:szCs w:val="19"/>
-              </w:rPr>
-              <w:t xml:space="preserve"> </w:t>
-            </w:r>
-            <w:r>
-              <w:rPr>
-                <w:sz w:val="19"/>
-                <w:szCs w:val="19"/>
-              </w:rPr>
-              <w:t>움직이는</w:t>
-            </w:r>
-            <w:r>
-              <w:rPr>
-                <w:sz w:val="19"/>
-                <w:szCs w:val="19"/>
-              </w:rPr>
-              <w:t xml:space="preserve"> </w:t>
-            </w:r>
-            <w:r>
-              <w:rPr>
-                <w:sz w:val="19"/>
-                <w:szCs w:val="19"/>
-              </w:rPr>
-              <w:t>동안</w:t>
-            </w:r>
-            <w:r>
-              <w:rPr>
-                <w:sz w:val="19"/>
-                <w:szCs w:val="19"/>
-              </w:rPr>
-              <w:t xml:space="preserve"> </w:t>
-            </w:r>
-            <w:r>
-              <w:rPr>
-                <w:sz w:val="19"/>
-                <w:szCs w:val="19"/>
-              </w:rPr>
-              <w:t>미리보기</w:t>
-            </w:r>
-            <w:r>
-              <w:rPr>
-                <w:sz w:val="19"/>
-                <w:szCs w:val="19"/>
-              </w:rPr>
-              <w:lastRenderedPageBreak/>
-              <w:t>가</w:t>
+              <w:t>손잡이</w:t>
+            </w:r>
+            <w:r>
+              <w:rPr>
+                <w:sz w:val="19"/>
+                <w:szCs w:val="19"/>
+              </w:rPr>
+              <w:t xml:space="preserve"> </w:t>
+            </w:r>
+            <w:r>
+              <w:rPr>
+                <w:sz w:val="19"/>
+                <w:szCs w:val="19"/>
+              </w:rPr>
+              <w:t>아래에</w:t>
+            </w:r>
+            <w:r>
+              <w:rPr>
+                <w:sz w:val="19"/>
+                <w:szCs w:val="19"/>
+              </w:rPr>
+              <w:t xml:space="preserve"> </w:t>
+            </w:r>
+            <w:r>
+              <w:rPr>
+                <w:sz w:val="19"/>
+                <w:szCs w:val="19"/>
+              </w:rPr>
+              <w:t>초</w:t>
+            </w:r>
+            <w:r>
+              <w:rPr>
+                <w:sz w:val="19"/>
+                <w:szCs w:val="19"/>
+              </w:rPr>
+              <w:t xml:space="preserve"> </w:t>
+            </w:r>
+            <w:r>
+              <w:rPr>
+                <w:sz w:val="19"/>
+                <w:szCs w:val="19"/>
+              </w:rPr>
+              <w:t>단위</w:t>
+            </w:r>
+            <w:r>
+              <w:rPr>
+                <w:sz w:val="19"/>
+                <w:szCs w:val="19"/>
+              </w:rPr>
+              <w:t xml:space="preserve"> </w:t>
+            </w:r>
+            <w:r>
+              <w:rPr>
+                <w:sz w:val="19"/>
+                <w:szCs w:val="19"/>
+              </w:rPr>
+              <w:t>시각이</w:t>
+            </w:r>
+            <w:r>
+              <w:rPr>
+                <w:sz w:val="19"/>
+                <w:szCs w:val="19"/>
+              </w:rPr>
+              <w:t xml:space="preserve"> </w:t>
+            </w:r>
+            <w:r>
+              <w:rPr>
+                <w:sz w:val="19"/>
+                <w:szCs w:val="19"/>
+              </w:rPr>
+              <w:t>표시됩니다</w:t>
+            </w:r>
+            <w:r>
+              <w:rPr>
+                <w:sz w:val="19"/>
+                <w:szCs w:val="19"/>
+              </w:rPr>
+              <w:t xml:space="preserve">. </w:t>
+            </w:r>
+            <w:r>
+              <w:rPr>
+                <w:sz w:val="19"/>
+                <w:szCs w:val="19"/>
+              </w:rPr>
+              <w:t>띠의</w:t>
+            </w:r>
+            <w:r>
+              <w:rPr>
+                <w:sz w:val="19"/>
+                <w:szCs w:val="19"/>
+              </w:rPr>
+              <w:t xml:space="preserve"> </w:t>
+            </w:r>
+            <w:r>
+              <w:rPr>
+                <w:sz w:val="19"/>
+                <w:szCs w:val="19"/>
+              </w:rPr>
+              <w:t>빈</w:t>
+            </w:r>
+            <w:r>
+              <w:rPr>
+                <w:sz w:val="19"/>
+                <w:szCs w:val="19"/>
+              </w:rPr>
+              <w:t xml:space="preserve"> </w:t>
+            </w:r>
+            <w:r>
+              <w:rPr>
+                <w:sz w:val="19"/>
+                <w:szCs w:val="19"/>
+              </w:rPr>
+              <w:t>곳을</w:t>
+            </w:r>
+            <w:r>
+              <w:rPr>
+                <w:sz w:val="19"/>
+                <w:szCs w:val="19"/>
+              </w:rPr>
+              <w:t xml:space="preserve"> </w:t>
+            </w:r>
+            <w:r>
+              <w:rPr>
+                <w:sz w:val="19"/>
+                <w:szCs w:val="19"/>
+              </w:rPr>
+              <w:t>누르면</w:t>
+            </w:r>
+            <w:r>
+              <w:rPr>
+                <w:sz w:val="19"/>
+                <w:szCs w:val="19"/>
+              </w:rPr>
+              <w:t xml:space="preserve"> </w:t>
+            </w:r>
+            <w:r>
+              <w:rPr>
+                <w:sz w:val="19"/>
+                <w:szCs w:val="19"/>
+              </w:rPr>
+              <w:t>가까운</w:t>
+            </w:r>
+            <w:r>
+              <w:rPr>
+                <w:sz w:val="19"/>
+                <w:szCs w:val="19"/>
+              </w:rPr>
+              <w:t xml:space="preserve"> </w:t>
+            </w:r>
+            <w:r>
+              <w:rPr>
+                <w:sz w:val="19"/>
+                <w:szCs w:val="19"/>
+              </w:rPr>
+              <w:t>손잡이가</w:t>
             </w:r>
             <w:r>
               <w:rPr>
@@ -23640,35 +24117,119 @@
                 <w:sz w:val="19"/>
                 <w:szCs w:val="19"/>
               </w:rPr>
-              <w:t>지점을</w:t>
-            </w:r>
-            <w:r>
-              <w:rPr>
-                <w:sz w:val="19"/>
-                <w:szCs w:val="19"/>
-              </w:rPr>
-              <w:t xml:space="preserve"> </w:t>
-            </w:r>
-            <w:r>
-              <w:rPr>
-                <w:sz w:val="19"/>
-                <w:szCs w:val="19"/>
-              </w:rPr>
-              <w:t>보여</w:t>
-            </w:r>
-            <w:r>
-              <w:rPr>
-                <w:sz w:val="19"/>
-                <w:szCs w:val="19"/>
-              </w:rPr>
-              <w:t xml:space="preserve"> </w:t>
-            </w:r>
-            <w:r>
-              <w:rPr>
-                <w:sz w:val="19"/>
-                <w:szCs w:val="19"/>
-              </w:rPr>
-              <w:t>줍니다</w:t>
+              <w:t>위치로</w:t>
+            </w:r>
+            <w:r>
+              <w:rPr>
+                <w:sz w:val="19"/>
+                <w:szCs w:val="19"/>
+              </w:rPr>
+              <w:t xml:space="preserve"> </w:t>
+            </w:r>
+            <w:r>
+              <w:rPr>
+                <w:sz w:val="19"/>
+                <w:szCs w:val="19"/>
+              </w:rPr>
+              <w:t>옵니다</w:t>
+            </w:r>
+            <w:r>
+              <w:rPr>
+                <w:sz w:val="19"/>
+                <w:szCs w:val="19"/>
+              </w:rPr>
+              <w:t xml:space="preserve">. </w:t>
+            </w:r>
+            <w:r>
+              <w:rPr>
+                <w:sz w:val="19"/>
+                <w:szCs w:val="19"/>
+              </w:rPr>
+              <w:t>흰</w:t>
+            </w:r>
+            <w:r>
+              <w:rPr>
+                <w:sz w:val="19"/>
+                <w:szCs w:val="19"/>
+              </w:rPr>
+              <w:t xml:space="preserve"> </w:t>
+            </w:r>
+            <w:r>
+              <w:rPr>
+                <w:sz w:val="19"/>
+                <w:szCs w:val="19"/>
+              </w:rPr>
+              <w:t>세로선은</w:t>
+            </w:r>
+            <w:r>
+              <w:rPr>
+                <w:sz w:val="19"/>
+                <w:szCs w:val="19"/>
+              </w:rPr>
+              <w:t xml:space="preserve"> </w:t>
+            </w:r>
+            <w:r>
+              <w:rPr>
+                <w:sz w:val="19"/>
+                <w:szCs w:val="19"/>
+              </w:rPr>
+              <w:t>미리보기가</w:t>
+            </w:r>
+            <w:r>
+              <w:rPr>
+                <w:sz w:val="19"/>
+                <w:szCs w:val="19"/>
+              </w:rPr>
+              <w:t xml:space="preserve"> </w:t>
+            </w:r>
+            <w:r>
+              <w:rPr>
+                <w:sz w:val="19"/>
+                <w:szCs w:val="19"/>
+              </w:rPr>
+              <w:t>지금</w:t>
+            </w:r>
+            <w:r>
+              <w:rPr>
+                <w:sz w:val="19"/>
+                <w:szCs w:val="19"/>
+              </w:rPr>
+              <w:t xml:space="preserve"> </w:t>
+            </w:r>
+            <w:r>
+              <w:rPr>
+                <w:sz w:val="19"/>
+                <w:szCs w:val="19"/>
+              </w:rPr>
+              <w:t>보고</w:t>
+            </w:r>
+            <w:r>
+              <w:rPr>
+                <w:sz w:val="19"/>
+                <w:szCs w:val="19"/>
+              </w:rPr>
+              <w:t xml:space="preserve"> </w:t>
+            </w:r>
+            <w:r>
+              <w:rPr>
+                <w:sz w:val="19"/>
+                <w:szCs w:val="19"/>
+              </w:rPr>
+              <w:t>있는</w:t>
+            </w:r>
+            <w:r>
+              <w:rPr>
+                <w:sz w:val="19"/>
+                <w:szCs w:val="19"/>
+              </w:rPr>
+              <w:t xml:space="preserve"> </w:t>
+            </w:r>
+            <w:r>
+              <w:rPr>
+                <w:sz w:val="19"/>
+                <w:szCs w:val="19"/>
+              </w:rPr>
+              <w:t>위치입니다</w:t>
             </w:r>
             <w:r>
               <w:rPr>
@@ -23706,8 +24267,7 @@
                 <w:sz w:val="19"/>
                 <w:szCs w:val="19"/>
               </w:rPr>
-              <w:lastRenderedPageBreak/>
-              <w:t>시작</w:t>
+              <w:t>여기서부터</w:t>
             </w:r>
             <w:r>
               <w:rPr>
@@ -23721,7 +24281,7 @@
                 <w:sz w:val="19"/>
                 <w:szCs w:val="19"/>
               </w:rPr>
-              <w:t>끝</w:t>
+              <w:t>여기까지</w:t>
             </w:r>
           </w:p>
         </w:tc>
@@ -23744,147 +24304,217 @@
                 <w:sz w:val="19"/>
                 <w:szCs w:val="19"/>
               </w:rPr>
-              <w:t>초</w:t>
-            </w:r>
-            <w:r>
-              <w:rPr>
-                <w:sz w:val="19"/>
-                <w:szCs w:val="19"/>
-              </w:rPr>
-              <w:t xml:space="preserve"> </w:t>
-            </w:r>
-            <w:r>
-              <w:rPr>
-                <w:sz w:val="19"/>
-                <w:szCs w:val="19"/>
-              </w:rPr>
-              <w:t>단위로</w:t>
-            </w:r>
-            <w:r>
-              <w:rPr>
-                <w:sz w:val="19"/>
-                <w:szCs w:val="19"/>
-              </w:rPr>
-              <w:t xml:space="preserve"> </w:t>
-            </w:r>
-            <w:r>
-              <w:rPr>
-                <w:sz w:val="19"/>
-                <w:szCs w:val="19"/>
-              </w:rPr>
-              <w:t>직접</w:t>
-            </w:r>
-            <w:r>
-              <w:rPr>
-                <w:sz w:val="19"/>
-                <w:szCs w:val="19"/>
-              </w:rPr>
-              <w:t xml:space="preserve"> </w:t>
-            </w:r>
-            <w:r>
-              <w:rPr>
-                <w:sz w:val="19"/>
-                <w:szCs w:val="19"/>
-              </w:rPr>
-              <w:t>입력할</w:t>
-            </w:r>
-            <w:r>
-              <w:rPr>
-                <w:sz w:val="19"/>
-                <w:szCs w:val="19"/>
-              </w:rPr>
-              <w:t xml:space="preserve"> </w:t>
-            </w:r>
-            <w:r>
-              <w:rPr>
-                <w:sz w:val="19"/>
-                <w:szCs w:val="19"/>
-              </w:rPr>
-              <w:t>수도</w:t>
-            </w:r>
-            <w:r>
-              <w:rPr>
-                <w:sz w:val="19"/>
-                <w:szCs w:val="19"/>
-              </w:rPr>
-              <w:t xml:space="preserve"> </w:t>
-            </w:r>
-            <w:r>
-              <w:rPr>
-                <w:sz w:val="19"/>
-                <w:szCs w:val="19"/>
-              </w:rPr>
-              <w:t>있습니다</w:t>
-            </w:r>
-            <w:r>
-              <w:rPr>
-                <w:sz w:val="19"/>
-                <w:szCs w:val="19"/>
-              </w:rPr>
-              <w:t>(0.1</w:t>
-            </w:r>
-            <w:r>
-              <w:rPr>
-                <w:sz w:val="19"/>
-                <w:szCs w:val="19"/>
-              </w:rPr>
-              <w:t>초</w:t>
-            </w:r>
-            <w:r>
-              <w:rPr>
-                <w:sz w:val="19"/>
-                <w:szCs w:val="19"/>
-              </w:rPr>
-              <w:t xml:space="preserve"> </w:t>
-            </w:r>
-            <w:r>
-              <w:rPr>
-                <w:sz w:val="19"/>
-                <w:szCs w:val="19"/>
-              </w:rPr>
-              <w:t>단위</w:t>
-            </w:r>
-            <w:r>
-              <w:rPr>
-                <w:sz w:val="19"/>
-                <w:szCs w:val="19"/>
-              </w:rPr>
-              <w:t xml:space="preserve">). </w:t>
-            </w:r>
-            <w:r>
-              <w:rPr>
-                <w:sz w:val="19"/>
-                <w:szCs w:val="19"/>
-              </w:rPr>
-              <w:t>구간은</w:t>
-            </w:r>
-            <w:r>
-              <w:rPr>
-                <w:sz w:val="19"/>
-                <w:szCs w:val="19"/>
-              </w:rPr>
-              <w:t xml:space="preserve"> </w:t>
-            </w:r>
-            <w:r>
-              <w:rPr>
-                <w:sz w:val="19"/>
-                <w:szCs w:val="19"/>
-              </w:rPr>
-              <w:t>최소</w:t>
-            </w:r>
-            <w:r>
-              <w:rPr>
-                <w:sz w:val="19"/>
-                <w:szCs w:val="19"/>
-              </w:rPr>
-              <w:t xml:space="preserve"> 0.5</w:t>
-            </w:r>
-            <w:r>
-              <w:rPr>
-                <w:sz w:val="19"/>
-                <w:szCs w:val="19"/>
-              </w:rPr>
-              <w:t>초입니다</w:t>
+              <w:t>미리보기의</w:t>
+            </w:r>
+            <w:r>
+              <w:rPr>
+                <w:sz w:val="19"/>
+                <w:szCs w:val="19"/>
+              </w:rPr>
+              <w:t xml:space="preserve"> </w:t>
+            </w:r>
+            <w:r>
+              <w:rPr>
+                <w:sz w:val="19"/>
+                <w:szCs w:val="19"/>
+              </w:rPr>
+              <w:t>현재</w:t>
+            </w:r>
+            <w:r>
+              <w:rPr>
+                <w:sz w:val="19"/>
+                <w:szCs w:val="19"/>
+              </w:rPr>
+              <w:t xml:space="preserve"> </w:t>
+            </w:r>
+            <w:r>
+              <w:rPr>
+                <w:sz w:val="19"/>
+                <w:szCs w:val="19"/>
+              </w:rPr>
+              <w:t>장면을</w:t>
+            </w:r>
+            <w:r>
+              <w:rPr>
+                <w:sz w:val="19"/>
+                <w:szCs w:val="19"/>
+              </w:rPr>
+              <w:t xml:space="preserve"> </w:t>
+            </w:r>
+            <w:r>
+              <w:rPr>
+                <w:sz w:val="19"/>
+                <w:szCs w:val="19"/>
+              </w:rPr>
+              <w:t>시작</w:t>
+            </w:r>
+            <w:r>
+              <w:rPr>
+                <w:sz w:val="19"/>
+                <w:szCs w:val="19"/>
+              </w:rPr>
+              <w:t xml:space="preserve"> </w:t>
+            </w:r>
+            <w:r>
+              <w:rPr>
+                <w:sz w:val="19"/>
+                <w:szCs w:val="19"/>
+              </w:rPr>
+              <w:t>또는</w:t>
+            </w:r>
+            <w:r>
+              <w:rPr>
+                <w:sz w:val="19"/>
+                <w:szCs w:val="19"/>
+              </w:rPr>
+              <w:t xml:space="preserve"> </w:t>
+            </w:r>
+            <w:r>
+              <w:rPr>
+                <w:sz w:val="19"/>
+                <w:szCs w:val="19"/>
+              </w:rPr>
+              <w:t>끝</w:t>
+            </w:r>
+            <w:r>
+              <w:rPr>
+                <w:sz w:val="19"/>
+                <w:szCs w:val="19"/>
+              </w:rPr>
+              <w:t xml:space="preserve"> </w:t>
+            </w:r>
+            <w:r>
+              <w:rPr>
+                <w:sz w:val="19"/>
+                <w:szCs w:val="19"/>
+              </w:rPr>
+              <w:t>지점으로</w:t>
+            </w:r>
+            <w:r>
+              <w:rPr>
+                <w:sz w:val="19"/>
+                <w:szCs w:val="19"/>
+              </w:rPr>
+              <w:t xml:space="preserve"> </w:t>
+            </w:r>
+            <w:r>
+              <w:rPr>
+                <w:sz w:val="19"/>
+                <w:szCs w:val="19"/>
+              </w:rPr>
+              <w:t>삼습니다</w:t>
+            </w:r>
+            <w:r>
+              <w:rPr>
+                <w:sz w:val="19"/>
+                <w:szCs w:val="19"/>
+              </w:rPr>
+              <w:t xml:space="preserve">. </w:t>
+            </w:r>
+            <w:r>
+              <w:rPr>
+                <w:sz w:val="19"/>
+                <w:szCs w:val="19"/>
+              </w:rPr>
+              <w:t>미리보기가</w:t>
+            </w:r>
+            <w:r>
+              <w:rPr>
+                <w:sz w:val="19"/>
+                <w:szCs w:val="19"/>
+              </w:rPr>
+              <w:t xml:space="preserve"> </w:t>
+            </w:r>
+            <w:r>
+              <w:rPr>
+                <w:sz w:val="19"/>
+                <w:szCs w:val="19"/>
+              </w:rPr>
+              <w:t>이</w:t>
+            </w:r>
+            <w:r>
+              <w:rPr>
+                <w:sz w:val="19"/>
+                <w:szCs w:val="19"/>
+              </w:rPr>
+              <w:t xml:space="preserve"> </w:t>
+            </w:r>
+            <w:r>
+              <w:rPr>
+                <w:sz w:val="19"/>
+                <w:szCs w:val="19"/>
+              </w:rPr>
+              <w:t>동영상</w:t>
+            </w:r>
+            <w:r>
+              <w:rPr>
+                <w:sz w:val="19"/>
+                <w:szCs w:val="19"/>
+              </w:rPr>
+              <w:t xml:space="preserve"> </w:t>
+            </w:r>
+            <w:r>
+              <w:rPr>
+                <w:sz w:val="19"/>
+                <w:szCs w:val="19"/>
+              </w:rPr>
+              <w:t>화면</w:t>
+            </w:r>
+            <w:r>
+              <w:rPr>
+                <w:sz w:val="19"/>
+                <w:szCs w:val="19"/>
+              </w:rPr>
+              <w:t xml:space="preserve"> </w:t>
+            </w:r>
+            <w:r>
+              <w:rPr>
+                <w:sz w:val="19"/>
+                <w:szCs w:val="19"/>
+              </w:rPr>
+              <w:t>밖에</w:t>
+            </w:r>
+            <w:r>
+              <w:rPr>
+                <w:sz w:val="19"/>
+                <w:szCs w:val="19"/>
+              </w:rPr>
+              <w:t xml:space="preserve"> </w:t>
+            </w:r>
+            <w:r>
+              <w:rPr>
+                <w:sz w:val="19"/>
+                <w:szCs w:val="19"/>
+              </w:rPr>
+              <w:t>있으면</w:t>
+            </w:r>
+            <w:r>
+              <w:rPr>
+                <w:sz w:val="19"/>
+                <w:szCs w:val="19"/>
+              </w:rPr>
+              <w:t xml:space="preserve"> </w:t>
+            </w:r>
+            <w:r>
+              <w:rPr>
+                <w:sz w:val="19"/>
+                <w:szCs w:val="19"/>
+              </w:rPr>
+              <w:t>안내가</w:t>
+            </w:r>
+            <w:r>
+              <w:rPr>
+                <w:sz w:val="19"/>
+                <w:szCs w:val="19"/>
+              </w:rPr>
+              <w:t xml:space="preserve"> </w:t>
+            </w:r>
+            <w:r>
+              <w:rPr>
+                <w:sz w:val="19"/>
+                <w:szCs w:val="19"/>
+              </w:rPr>
+              <w:t>뜹니다</w:t>
             </w:r>
             <w:r>
               <w:rPr>
@@ -23922,7 +24552,35 @@
                 <w:sz w:val="19"/>
                 <w:szCs w:val="19"/>
               </w:rPr>
-              <w:t>전체</w:t>
+              <w:t>시작</w:t>
+            </w:r>
+            <w:r>
+              <w:rPr>
+                <w:sz w:val="19"/>
+                <w:szCs w:val="19"/>
+              </w:rPr>
+              <w:t xml:space="preserve"> / </w:t>
+            </w:r>
+            <w:r>
+              <w:rPr>
+                <w:sz w:val="19"/>
+                <w:szCs w:val="19"/>
+              </w:rPr>
+              <w:t>끝</w:t>
+            </w:r>
+            <w:r>
+              <w:rPr>
+                <w:sz w:val="19"/>
+                <w:szCs w:val="19"/>
+              </w:rPr>
+              <w:t xml:space="preserve"> −, </w:t>
+            </w:r>
+            <w:r>
+              <w:rPr>
+                <w:sz w:val="19"/>
+                <w:szCs w:val="19"/>
+              </w:rPr>
+              <w:t>＋</w:t>
             </w:r>
           </w:p>
         </w:tc>
@@ -23945,49 +24603,294 @@
                 <w:sz w:val="19"/>
                 <w:szCs w:val="19"/>
               </w:rPr>
-              <w:t>구간을</w:t>
-            </w:r>
-            <w:r>
-              <w:rPr>
-                <w:sz w:val="19"/>
-                <w:szCs w:val="19"/>
-              </w:rPr>
-              <w:t xml:space="preserve"> </w:t>
-            </w:r>
-            <w:r>
-              <w:rPr>
-                <w:sz w:val="19"/>
-                <w:szCs w:val="19"/>
-              </w:rPr>
-              <w:t>원본</w:t>
-            </w:r>
-            <w:r>
-              <w:rPr>
-                <w:sz w:val="19"/>
-                <w:szCs w:val="19"/>
-              </w:rPr>
-              <w:t xml:space="preserve"> </w:t>
-            </w:r>
-            <w:r>
-              <w:rPr>
-                <w:sz w:val="19"/>
-                <w:szCs w:val="19"/>
-              </w:rPr>
-              <w:t>전체로</w:t>
-            </w:r>
-            <w:r>
-              <w:rPr>
-                <w:sz w:val="19"/>
-                <w:szCs w:val="19"/>
-              </w:rPr>
-              <w:t xml:space="preserve"> </w:t>
-            </w:r>
-            <w:r>
-              <w:rPr>
-                <w:sz w:val="19"/>
-                <w:szCs w:val="19"/>
-              </w:rPr>
-              <w:t>되돌립니다</w:t>
+              <w:t>0.5</w:t>
+            </w:r>
+            <w:r>
+              <w:rPr>
+                <w:sz w:val="19"/>
+                <w:szCs w:val="19"/>
+              </w:rPr>
+              <w:t>초씩</w:t>
+            </w:r>
+            <w:r>
+              <w:rPr>
+                <w:sz w:val="19"/>
+                <w:szCs w:val="19"/>
+              </w:rPr>
+              <w:t xml:space="preserve"> </w:t>
+            </w:r>
+            <w:r>
+              <w:rPr>
+                <w:sz w:val="19"/>
+                <w:szCs w:val="19"/>
+              </w:rPr>
+              <w:t>앞뒤로</w:t>
+            </w:r>
+            <w:r>
+              <w:rPr>
+                <w:sz w:val="19"/>
+                <w:szCs w:val="19"/>
+              </w:rPr>
+              <w:t xml:space="preserve"> </w:t>
+            </w:r>
+            <w:r>
+              <w:rPr>
+                <w:sz w:val="19"/>
+                <w:szCs w:val="19"/>
+              </w:rPr>
+              <w:t>미세</w:t>
+            </w:r>
+            <w:r>
+              <w:rPr>
+                <w:sz w:val="19"/>
+                <w:szCs w:val="19"/>
+              </w:rPr>
+              <w:t xml:space="preserve"> </w:t>
+            </w:r>
+            <w:r>
+              <w:rPr>
+                <w:sz w:val="19"/>
+                <w:szCs w:val="19"/>
+              </w:rPr>
+              <w:t>조절합니다</w:t>
+            </w:r>
+            <w:r>
+              <w:rPr>
+                <w:sz w:val="19"/>
+                <w:szCs w:val="19"/>
+              </w:rPr>
+              <w:t xml:space="preserve">. </w:t>
+            </w:r>
+            <w:r>
+              <w:rPr>
+                <w:sz w:val="19"/>
+                <w:szCs w:val="19"/>
+              </w:rPr>
+              <w:t>숫자</w:t>
+            </w:r>
+            <w:r>
+              <w:rPr>
+                <w:sz w:val="19"/>
+                <w:szCs w:val="19"/>
+              </w:rPr>
+              <w:t xml:space="preserve"> </w:t>
+            </w:r>
+            <w:r>
+              <w:rPr>
+                <w:sz w:val="19"/>
+                <w:szCs w:val="19"/>
+              </w:rPr>
+              <w:t>칸에</w:t>
+            </w:r>
+            <w:r>
+              <w:rPr>
+                <w:sz w:val="19"/>
+                <w:szCs w:val="19"/>
+              </w:rPr>
+              <w:t xml:space="preserve"> </w:t>
+            </w:r>
+            <w:r>
+              <w:rPr>
+                <w:sz w:val="19"/>
+                <w:szCs w:val="19"/>
+              </w:rPr>
+              <w:t>직접</w:t>
+            </w:r>
+            <w:r>
+              <w:rPr>
+                <w:sz w:val="19"/>
+                <w:szCs w:val="19"/>
+              </w:rPr>
+              <w:t xml:space="preserve"> </w:t>
+            </w:r>
+            <w:r>
+              <w:rPr>
+                <w:sz w:val="19"/>
+                <w:szCs w:val="19"/>
+              </w:rPr>
+              <w:t>입력</w:t>
+            </w:r>
+            <w:r>
+              <w:rPr>
+                <w:sz w:val="19"/>
+                <w:szCs w:val="19"/>
+              </w:rPr>
+              <w:t>(0.1</w:t>
+            </w:r>
+            <w:r>
+              <w:rPr>
+                <w:sz w:val="19"/>
+                <w:szCs w:val="19"/>
+              </w:rPr>
+              <w:t>초</w:t>
+            </w:r>
+            <w:r>
+              <w:rPr>
+                <w:sz w:val="19"/>
+                <w:szCs w:val="19"/>
+              </w:rPr>
+              <w:t xml:space="preserve"> </w:t>
+            </w:r>
+            <w:r>
+              <w:rPr>
+                <w:sz w:val="19"/>
+                <w:szCs w:val="19"/>
+              </w:rPr>
+              <w:t>단위</w:t>
+            </w:r>
+            <w:r>
+              <w:rPr>
+                <w:sz w:val="19"/>
+                <w:szCs w:val="19"/>
+              </w:rPr>
+              <w:t>)</w:t>
+            </w:r>
+            <w:r>
+              <w:rPr>
+                <w:sz w:val="19"/>
+                <w:szCs w:val="19"/>
+              </w:rPr>
+              <w:t>할</w:t>
+            </w:r>
+            <w:r>
+              <w:rPr>
+                <w:sz w:val="19"/>
+                <w:szCs w:val="19"/>
+              </w:rPr>
+              <w:t xml:space="preserve"> </w:t>
+            </w:r>
+            <w:r>
+              <w:rPr>
+                <w:sz w:val="19"/>
+                <w:szCs w:val="19"/>
+              </w:rPr>
+              <w:t>수도</w:t>
+            </w:r>
+            <w:r>
+              <w:rPr>
+                <w:sz w:val="19"/>
+                <w:szCs w:val="19"/>
+              </w:rPr>
+              <w:t xml:space="preserve"> </w:t>
+            </w:r>
+            <w:r>
+              <w:rPr>
+                <w:sz w:val="19"/>
+                <w:szCs w:val="19"/>
+              </w:rPr>
+              <w:t>있습니다</w:t>
+            </w:r>
+            <w:r>
+              <w:rPr>
+                <w:sz w:val="19"/>
+                <w:szCs w:val="19"/>
+              </w:rPr>
+              <w:t xml:space="preserve">. </w:t>
+            </w:r>
+            <w:r>
+              <w:rPr>
+                <w:sz w:val="19"/>
+                <w:szCs w:val="19"/>
+              </w:rPr>
+              <w:t>손잡이를</w:t>
+            </w:r>
+            <w:r>
+              <w:rPr>
+                <w:sz w:val="19"/>
+                <w:szCs w:val="19"/>
+              </w:rPr>
+              <w:t xml:space="preserve"> </w:t>
+            </w:r>
+            <w:r>
+              <w:rPr>
+                <w:sz w:val="19"/>
+                <w:szCs w:val="19"/>
+              </w:rPr>
+              <w:t>누른</w:t>
+            </w:r>
+            <w:r>
+              <w:rPr>
+                <w:sz w:val="19"/>
+                <w:szCs w:val="19"/>
+              </w:rPr>
+              <w:t xml:space="preserve"> </w:t>
+            </w:r>
+            <w:r>
+              <w:rPr>
+                <w:sz w:val="19"/>
+                <w:szCs w:val="19"/>
+              </w:rPr>
+              <w:t>뒤</w:t>
+            </w:r>
+            <w:r>
+              <w:rPr>
+                <w:sz w:val="19"/>
+                <w:szCs w:val="19"/>
+              </w:rPr>
+              <w:t xml:space="preserve"> ← → </w:t>
+            </w:r>
+            <w:r>
+              <w:rPr>
+                <w:sz w:val="19"/>
+                <w:szCs w:val="19"/>
+              </w:rPr>
+              <w:t>키로</w:t>
+            </w:r>
+            <w:r>
+              <w:rPr>
+                <w:sz w:val="19"/>
+                <w:szCs w:val="19"/>
+              </w:rPr>
+              <w:t xml:space="preserve"> 0.1</w:t>
+            </w:r>
+            <w:r>
+              <w:rPr>
+                <w:sz w:val="19"/>
+                <w:szCs w:val="19"/>
+              </w:rPr>
+              <w:t>초씩</w:t>
+            </w:r>
+            <w:r>
+              <w:rPr>
+                <w:sz w:val="19"/>
+                <w:szCs w:val="19"/>
+              </w:rPr>
+              <w:t xml:space="preserve"> </w:t>
+            </w:r>
+            <w:r>
+              <w:rPr>
+                <w:sz w:val="19"/>
+                <w:szCs w:val="19"/>
+              </w:rPr>
+              <w:t>움직일</w:t>
+            </w:r>
+            <w:r>
+              <w:rPr>
+                <w:sz w:val="19"/>
+                <w:szCs w:val="19"/>
+              </w:rPr>
+              <w:t xml:space="preserve"> </w:t>
+            </w:r>
+            <w:r>
+              <w:rPr>
+                <w:sz w:val="19"/>
+                <w:szCs w:val="19"/>
+              </w:rPr>
+              <w:t>수도</w:t>
+            </w:r>
+            <w:r>
+              <w:rPr>
+                <w:sz w:val="19"/>
+                <w:szCs w:val="19"/>
+              </w:rPr>
+              <w:t xml:space="preserve"> </w:t>
+            </w:r>
+            <w:r>
+              <w:rPr>
+                <w:sz w:val="19"/>
+                <w:szCs w:val="19"/>
+              </w:rPr>
+              <w:t>있습니다</w:t>
             </w:r>
             <w:r>
               <w:rPr>
@@ -24025,21 +24928,7 @@
                 <w:sz w:val="19"/>
                 <w:szCs w:val="19"/>
               </w:rPr>
-              <w:t>동영상</w:t>
-            </w:r>
-            <w:r>
-              <w:rPr>
-                <w:sz w:val="19"/>
-                <w:szCs w:val="19"/>
-              </w:rPr>
-              <w:t xml:space="preserve"> </w:t>
-            </w:r>
-            <w:r>
-              <w:rPr>
-                <w:sz w:val="19"/>
-                <w:szCs w:val="19"/>
-              </w:rPr>
-              <w:t>소리</w:t>
+              <w:t>길이</w:t>
             </w:r>
           </w:p>
         </w:tc>
@@ -24062,105 +24951,105 @@
                 <w:sz w:val="19"/>
                 <w:szCs w:val="19"/>
               </w:rPr>
-              <w:t>동영상에</w:t>
-            </w:r>
-            <w:r>
-              <w:rPr>
-                <w:sz w:val="19"/>
-                <w:szCs w:val="19"/>
-              </w:rPr>
-              <w:t xml:space="preserve"> </w:t>
-            </w:r>
-            <w:r>
-              <w:rPr>
-                <w:sz w:val="19"/>
-                <w:szCs w:val="19"/>
-              </w:rPr>
-              <w:t>녹음된</w:t>
-            </w:r>
-            <w:r>
-              <w:rPr>
-                <w:sz w:val="19"/>
-                <w:szCs w:val="19"/>
-              </w:rPr>
-              <w:t xml:space="preserve"> </w:t>
-            </w:r>
-            <w:r>
-              <w:rPr>
-                <w:sz w:val="19"/>
-                <w:szCs w:val="19"/>
-              </w:rPr>
-              <w:t>소리의</w:t>
-            </w:r>
-            <w:r>
-              <w:rPr>
-                <w:sz w:val="19"/>
-                <w:szCs w:val="19"/>
-              </w:rPr>
-              <w:t xml:space="preserve"> </w:t>
-            </w:r>
-            <w:r>
-              <w:rPr>
-                <w:sz w:val="19"/>
-                <w:szCs w:val="19"/>
-              </w:rPr>
-              <w:t>크기</w:t>
-            </w:r>
-            <w:r>
-              <w:rPr>
-                <w:sz w:val="19"/>
-                <w:szCs w:val="19"/>
-              </w:rPr>
-              <w:t xml:space="preserve">(0~150%). </w:t>
-            </w:r>
-            <w:r>
-              <w:rPr>
-                <w:sz w:val="19"/>
-                <w:szCs w:val="19"/>
-              </w:rPr>
-              <w:t>음소거를</w:t>
-            </w:r>
-            <w:r>
-              <w:rPr>
-                <w:sz w:val="19"/>
-                <w:szCs w:val="19"/>
-              </w:rPr>
-              <w:t xml:space="preserve"> </w:t>
-            </w:r>
-            <w:r>
-              <w:rPr>
-                <w:sz w:val="19"/>
-                <w:szCs w:val="19"/>
-              </w:rPr>
-              <w:t>켜면</w:t>
-            </w:r>
-            <w:r>
-              <w:rPr>
-                <w:sz w:val="19"/>
-                <w:szCs w:val="19"/>
-              </w:rPr>
-              <w:t xml:space="preserve"> </w:t>
-            </w:r>
-            <w:r>
-              <w:rPr>
-                <w:sz w:val="19"/>
-                <w:szCs w:val="19"/>
-              </w:rPr>
-              <w:t>배경음악만</w:t>
-            </w:r>
-            <w:r>
-              <w:rPr>
-                <w:sz w:val="19"/>
-                <w:szCs w:val="19"/>
-              </w:rPr>
-              <w:t xml:space="preserve"> </w:t>
-            </w:r>
-            <w:r>
-              <w:rPr>
-                <w:sz w:val="19"/>
-                <w:szCs w:val="19"/>
-              </w:rPr>
-              <w:t>나옵니다</w:t>
+              <w:t>시작</w:t>
+            </w:r>
+            <w:r>
+              <w:rPr>
+                <w:sz w:val="19"/>
+                <w:szCs w:val="19"/>
+              </w:rPr>
+              <w:t xml:space="preserve"> </w:t>
+            </w:r>
+            <w:r>
+              <w:rPr>
+                <w:sz w:val="19"/>
+                <w:szCs w:val="19"/>
+              </w:rPr>
+              <w:t>지점은</w:t>
+            </w:r>
+            <w:r>
+              <w:rPr>
+                <w:sz w:val="19"/>
+                <w:szCs w:val="19"/>
+              </w:rPr>
+              <w:t xml:space="preserve"> </w:t>
+            </w:r>
+            <w:r>
+              <w:rPr>
+                <w:sz w:val="19"/>
+                <w:szCs w:val="19"/>
+              </w:rPr>
+              <w:t>그대로</w:t>
+            </w:r>
+            <w:r>
+              <w:rPr>
+                <w:sz w:val="19"/>
+                <w:szCs w:val="19"/>
+              </w:rPr>
+              <w:t xml:space="preserve"> </w:t>
+            </w:r>
+            <w:r>
+              <w:rPr>
+                <w:sz w:val="19"/>
+                <w:szCs w:val="19"/>
+              </w:rPr>
+              <w:t>두고</w:t>
+            </w:r>
+            <w:r>
+              <w:rPr>
+                <w:sz w:val="19"/>
+                <w:szCs w:val="19"/>
+              </w:rPr>
+              <w:t xml:space="preserve"> </w:t>
+            </w:r>
+            <w:r>
+              <w:rPr>
+                <w:sz w:val="19"/>
+                <w:szCs w:val="19"/>
+              </w:rPr>
+              <w:t>구간</w:t>
+            </w:r>
+            <w:r>
+              <w:rPr>
+                <w:sz w:val="19"/>
+                <w:szCs w:val="19"/>
+              </w:rPr>
+              <w:t xml:space="preserve"> </w:t>
+            </w:r>
+            <w:r>
+              <w:rPr>
+                <w:sz w:val="19"/>
+                <w:szCs w:val="19"/>
+              </w:rPr>
+              <w:t>길이를</w:t>
+            </w:r>
+            <w:r>
+              <w:rPr>
+                <w:sz w:val="19"/>
+                <w:szCs w:val="19"/>
+              </w:rPr>
+              <w:t xml:space="preserve"> </w:t>
+            </w:r>
+            <w:r>
+              <w:rPr>
+                <w:sz w:val="19"/>
+                <w:szCs w:val="19"/>
+              </w:rPr>
+              <w:t>초로</w:t>
+            </w:r>
+            <w:r>
+              <w:rPr>
+                <w:sz w:val="19"/>
+                <w:szCs w:val="19"/>
+              </w:rPr>
+              <w:t xml:space="preserve"> </w:t>
+            </w:r>
+            <w:r>
+              <w:rPr>
+                <w:sz w:val="19"/>
+                <w:szCs w:val="19"/>
+              </w:rPr>
+              <w:t>입력합니다</w:t>
             </w:r>
             <w:r>
               <w:rPr>
@@ -24198,6 +25087,691 @@
                 <w:sz w:val="19"/>
                 <w:szCs w:val="19"/>
               </w:rPr>
+              <w:t>빠른</w:t>
+            </w:r>
+            <w:r>
+              <w:rPr>
+                <w:sz w:val="19"/>
+                <w:szCs w:val="19"/>
+              </w:rPr>
+              <w:t xml:space="preserve"> </w:t>
+            </w:r>
+            <w:r>
+              <w:rPr>
+                <w:sz w:val="19"/>
+                <w:szCs w:val="19"/>
+              </w:rPr>
+              <w:t>선택</w:t>
+            </w:r>
+            <w:r>
+              <w:rPr>
+                <w:sz w:val="19"/>
+                <w:szCs w:val="19"/>
+              </w:rPr>
+              <w:t xml:space="preserve"> 3</w:t>
+            </w:r>
+            <w:r>
+              <w:rPr>
+                <w:sz w:val="19"/>
+                <w:szCs w:val="19"/>
+              </w:rPr>
+              <w:t>초</w:t>
+            </w:r>
+            <w:r>
+              <w:rPr>
+                <w:sz w:val="19"/>
+                <w:szCs w:val="19"/>
+              </w:rPr>
+              <w:t xml:space="preserve"> / 5</w:t>
+            </w:r>
+            <w:r>
+              <w:rPr>
+                <w:sz w:val="19"/>
+                <w:szCs w:val="19"/>
+              </w:rPr>
+              <w:t>초</w:t>
+            </w:r>
+            <w:r>
+              <w:rPr>
+                <w:sz w:val="19"/>
+                <w:szCs w:val="19"/>
+              </w:rPr>
+              <w:t xml:space="preserve"> / 10</w:t>
+            </w:r>
+            <w:r>
+              <w:rPr>
+                <w:sz w:val="19"/>
+                <w:szCs w:val="19"/>
+              </w:rPr>
+              <w:t>초</w:t>
+            </w:r>
+          </w:p>
+        </w:tc>
+        <w:tc>
+          <w:tcPr>
+            <w:tcW w:w="6760" w:type="dxa"/>
+            <w:tcMar>
+              <w:top w:w="70" w:type="dxa"/>
+              <w:left w:w="100" w:type="dxa"/>
+              <w:bottom w:w="70" w:type="dxa"/>
+              <w:right w:w="100" w:type="dxa"/>
+            </w:tcMar>
+          </w:tcPr>
+          <w:p>
+            <w:pPr>
+              <w:spacing w:line="280" w:lineRule="auto"/>
+            </w:pPr>
+            <w:r>
+              <w:rPr>
+                <w:sz w:val="19"/>
+                <w:szCs w:val="19"/>
+              </w:rPr>
+              <w:t>현재</w:t>
+            </w:r>
+            <w:r>
+              <w:rPr>
+                <w:sz w:val="19"/>
+                <w:szCs w:val="19"/>
+              </w:rPr>
+              <w:t xml:space="preserve"> </w:t>
+            </w:r>
+            <w:r>
+              <w:rPr>
+                <w:sz w:val="19"/>
+                <w:szCs w:val="19"/>
+              </w:rPr>
+              <w:t>시작</w:t>
+            </w:r>
+            <w:r>
+              <w:rPr>
+                <w:sz w:val="19"/>
+                <w:szCs w:val="19"/>
+              </w:rPr>
+              <w:t xml:space="preserve"> </w:t>
+            </w:r>
+            <w:r>
+              <w:rPr>
+                <w:sz w:val="19"/>
+                <w:szCs w:val="19"/>
+              </w:rPr>
+              <w:t>지점부터</w:t>
+            </w:r>
+            <w:r>
+              <w:rPr>
+                <w:sz w:val="19"/>
+                <w:szCs w:val="19"/>
+              </w:rPr>
+              <w:t xml:space="preserve"> </w:t>
+            </w:r>
+            <w:r>
+              <w:rPr>
+                <w:sz w:val="19"/>
+                <w:szCs w:val="19"/>
+              </w:rPr>
+              <w:t>그</w:t>
+            </w:r>
+            <w:r>
+              <w:rPr>
+                <w:sz w:val="19"/>
+                <w:szCs w:val="19"/>
+              </w:rPr>
+              <w:t xml:space="preserve"> </w:t>
+            </w:r>
+            <w:r>
+              <w:rPr>
+                <w:sz w:val="19"/>
+                <w:szCs w:val="19"/>
+              </w:rPr>
+              <w:t>길이만큼</w:t>
+            </w:r>
+            <w:r>
+              <w:rPr>
+                <w:sz w:val="19"/>
+                <w:szCs w:val="19"/>
+              </w:rPr>
+              <w:t xml:space="preserve"> </w:t>
+            </w:r>
+            <w:r>
+              <w:rPr>
+                <w:sz w:val="19"/>
+                <w:szCs w:val="19"/>
+              </w:rPr>
+              <w:t>구간을</w:t>
+            </w:r>
+            <w:r>
+              <w:rPr>
+                <w:sz w:val="19"/>
+                <w:szCs w:val="19"/>
+              </w:rPr>
+              <w:t xml:space="preserve"> </w:t>
+            </w:r>
+            <w:r>
+              <w:rPr>
+                <w:sz w:val="19"/>
+                <w:szCs w:val="19"/>
+              </w:rPr>
+              <w:t>잡습니다</w:t>
+            </w:r>
+            <w:r>
+              <w:rPr>
+                <w:sz w:val="19"/>
+                <w:szCs w:val="19"/>
+              </w:rPr>
+              <w:t xml:space="preserve">. </w:t>
+            </w:r>
+            <w:r>
+              <w:rPr>
+                <w:sz w:val="19"/>
+                <w:szCs w:val="19"/>
+              </w:rPr>
+              <w:t>원본이</w:t>
+            </w:r>
+            <w:r>
+              <w:rPr>
+                <w:sz w:val="19"/>
+                <w:szCs w:val="19"/>
+              </w:rPr>
+              <w:t xml:space="preserve"> </w:t>
+            </w:r>
+            <w:r>
+              <w:rPr>
+                <w:sz w:val="19"/>
+                <w:szCs w:val="19"/>
+              </w:rPr>
+              <w:t>짧으면</w:t>
+            </w:r>
+            <w:r>
+              <w:rPr>
+                <w:sz w:val="19"/>
+                <w:szCs w:val="19"/>
+              </w:rPr>
+              <w:t xml:space="preserve"> </w:t>
+            </w:r>
+            <w:r>
+              <w:rPr>
+                <w:sz w:val="19"/>
+                <w:szCs w:val="19"/>
+              </w:rPr>
+              <w:t>끝에</w:t>
+            </w:r>
+            <w:r>
+              <w:rPr>
+                <w:sz w:val="19"/>
+                <w:szCs w:val="19"/>
+              </w:rPr>
+              <w:t xml:space="preserve"> </w:t>
+            </w:r>
+            <w:r>
+              <w:rPr>
+                <w:sz w:val="19"/>
+                <w:szCs w:val="19"/>
+              </w:rPr>
+              <w:t>맞춰</w:t>
+            </w:r>
+            <w:r>
+              <w:rPr>
+                <w:sz w:val="19"/>
+                <w:szCs w:val="19"/>
+              </w:rPr>
+              <w:t xml:space="preserve"> </w:t>
+            </w:r>
+            <w:r>
+              <w:rPr>
+                <w:sz w:val="19"/>
+                <w:szCs w:val="19"/>
+              </w:rPr>
+              <w:t>앞으로</w:t>
+            </w:r>
+            <w:r>
+              <w:rPr>
+                <w:sz w:val="19"/>
+                <w:szCs w:val="19"/>
+              </w:rPr>
+              <w:t xml:space="preserve"> </w:t>
+            </w:r>
+            <w:r>
+              <w:rPr>
+                <w:sz w:val="19"/>
+                <w:szCs w:val="19"/>
+              </w:rPr>
+              <w:t>당깁니다</w:t>
+            </w:r>
+            <w:r>
+              <w:rPr>
+                <w:sz w:val="19"/>
+                <w:szCs w:val="19"/>
+              </w:rPr>
+              <w:t>.</w:t>
+            </w:r>
+          </w:p>
+        </w:tc>
+      </w:tr>
+      <w:tr>
+        <w:tblPrEx>
+          <w:tblCellMar>
+            <w:top w:w="0" w:type="dxa"/>
+            <w:bottom w:w="0" w:type="dxa"/>
+          </w:tblCellMar>
+        </w:tblPrEx>
+        <w:tc>
+          <w:tcPr>
+            <w:tcW w:w="2600" w:type="dxa"/>
+            <w:tcMar>
+              <w:top w:w="70" w:type="dxa"/>
+              <w:left w:w="100" w:type="dxa"/>
+              <w:bottom w:w="70" w:type="dxa"/>
+              <w:right w:w="100" w:type="dxa"/>
+            </w:tcMar>
+          </w:tcPr>
+          <w:p>
+            <w:pPr>
+              <w:spacing w:line="280" w:lineRule="auto"/>
+            </w:pPr>
+            <w:r>
+              <w:rPr>
+                <w:sz w:val="19"/>
+                <w:szCs w:val="19"/>
+              </w:rPr>
+              <w:t>전체</w:t>
+            </w:r>
+          </w:p>
+        </w:tc>
+        <w:tc>
+          <w:tcPr>
+            <w:tcW w:w="6760" w:type="dxa"/>
+            <w:tcMar>
+              <w:top w:w="70" w:type="dxa"/>
+              <w:left w:w="100" w:type="dxa"/>
+              <w:bottom w:w="70" w:type="dxa"/>
+              <w:right w:w="100" w:type="dxa"/>
+            </w:tcMar>
+          </w:tcPr>
+          <w:p>
+            <w:pPr>
+              <w:spacing w:line="280" w:lineRule="auto"/>
+            </w:pPr>
+            <w:r>
+              <w:rPr>
+                <w:sz w:val="19"/>
+                <w:szCs w:val="19"/>
+              </w:rPr>
+              <w:t>구간을</w:t>
+            </w:r>
+            <w:r>
+              <w:rPr>
+                <w:sz w:val="19"/>
+                <w:szCs w:val="19"/>
+              </w:rPr>
+              <w:t xml:space="preserve"> </w:t>
+            </w:r>
+            <w:r>
+              <w:rPr>
+                <w:sz w:val="19"/>
+                <w:szCs w:val="19"/>
+              </w:rPr>
+              <w:t>원본</w:t>
+            </w:r>
+            <w:r>
+              <w:rPr>
+                <w:sz w:val="19"/>
+                <w:szCs w:val="19"/>
+              </w:rPr>
+              <w:t xml:space="preserve"> </w:t>
+            </w:r>
+            <w:r>
+              <w:rPr>
+                <w:sz w:val="19"/>
+                <w:szCs w:val="19"/>
+              </w:rPr>
+              <w:t>전체로</w:t>
+            </w:r>
+            <w:r>
+              <w:rPr>
+                <w:sz w:val="19"/>
+                <w:szCs w:val="19"/>
+              </w:rPr>
+              <w:t xml:space="preserve"> </w:t>
+            </w:r>
+            <w:r>
+              <w:rPr>
+                <w:sz w:val="19"/>
+                <w:szCs w:val="19"/>
+              </w:rPr>
+              <w:t>되돌립니다</w:t>
+            </w:r>
+            <w:r>
+              <w:rPr>
+                <w:sz w:val="19"/>
+                <w:szCs w:val="19"/>
+              </w:rPr>
+              <w:t>.</w:t>
+            </w:r>
+          </w:p>
+        </w:tc>
+      </w:tr>
+      <w:tr>
+        <w:tblPrEx>
+          <w:tblCellMar>
+            <w:top w:w="0" w:type="dxa"/>
+            <w:bottom w:w="0" w:type="dxa"/>
+          </w:tblCellMar>
+        </w:tblPrEx>
+        <w:tc>
+          <w:tcPr>
+            <w:tcW w:w="2600" w:type="dxa"/>
+            <w:tcMar>
+              <w:top w:w="70" w:type="dxa"/>
+              <w:left w:w="100" w:type="dxa"/>
+              <w:bottom w:w="70" w:type="dxa"/>
+              <w:right w:w="100" w:type="dxa"/>
+            </w:tcMar>
+          </w:tcPr>
+          <w:p>
+            <w:pPr>
+              <w:spacing w:line="280" w:lineRule="auto"/>
+            </w:pPr>
+            <w:r>
+              <w:rPr>
+                <w:sz w:val="19"/>
+                <w:szCs w:val="19"/>
+              </w:rPr>
+              <w:t xml:space="preserve">▶ </w:t>
+            </w:r>
+            <w:r>
+              <w:rPr>
+                <w:sz w:val="19"/>
+                <w:szCs w:val="19"/>
+              </w:rPr>
+              <w:t>구간</w:t>
+            </w:r>
+            <w:r>
+              <w:rPr>
+                <w:sz w:val="19"/>
+                <w:szCs w:val="19"/>
+              </w:rPr>
+              <w:t xml:space="preserve"> </w:t>
+            </w:r>
+            <w:r>
+              <w:rPr>
+                <w:sz w:val="19"/>
+                <w:szCs w:val="19"/>
+              </w:rPr>
+              <w:t>재생</w:t>
+            </w:r>
+          </w:p>
+        </w:tc>
+        <w:tc>
+          <w:tcPr>
+            <w:tcW w:w="6760" w:type="dxa"/>
+            <w:tcMar>
+              <w:top w:w="70" w:type="dxa"/>
+              <w:left w:w="100" w:type="dxa"/>
+              <w:bottom w:w="70" w:type="dxa"/>
+              <w:right w:w="100" w:type="dxa"/>
+            </w:tcMar>
+          </w:tcPr>
+          <w:p>
+            <w:pPr>
+              <w:spacing w:line="280" w:lineRule="auto"/>
+            </w:pPr>
+            <w:r>
+              <w:rPr>
+                <w:sz w:val="19"/>
+                <w:szCs w:val="19"/>
+              </w:rPr>
+              <w:t>선택한</w:t>
+            </w:r>
+            <w:r>
+              <w:rPr>
+                <w:sz w:val="19"/>
+                <w:szCs w:val="19"/>
+              </w:rPr>
+              <w:t xml:space="preserve"> </w:t>
+            </w:r>
+            <w:r>
+              <w:rPr>
+                <w:sz w:val="19"/>
+                <w:szCs w:val="19"/>
+              </w:rPr>
+              <w:t>구간만</w:t>
+            </w:r>
+            <w:r>
+              <w:rPr>
+                <w:sz w:val="19"/>
+                <w:szCs w:val="19"/>
+              </w:rPr>
+              <w:t xml:space="preserve"> </w:t>
+            </w:r>
+            <w:r>
+              <w:rPr>
+                <w:sz w:val="19"/>
+                <w:szCs w:val="19"/>
+              </w:rPr>
+              <w:t>재생해서</w:t>
+            </w:r>
+            <w:r>
+              <w:rPr>
+                <w:sz w:val="19"/>
+                <w:szCs w:val="19"/>
+              </w:rPr>
+              <w:t xml:space="preserve"> </w:t>
+            </w:r>
+            <w:r>
+              <w:rPr>
+                <w:sz w:val="19"/>
+                <w:szCs w:val="19"/>
+              </w:rPr>
+              <w:t>확인합니다</w:t>
+            </w:r>
+            <w:r>
+              <w:rPr>
+                <w:sz w:val="19"/>
+                <w:szCs w:val="19"/>
+              </w:rPr>
+              <w:t>.</w:t>
+            </w:r>
+          </w:p>
+        </w:tc>
+      </w:tr>
+      <w:tr>
+        <w:tblPrEx>
+          <w:tblCellMar>
+            <w:top w:w="0" w:type="dxa"/>
+            <w:bottom w:w="0" w:type="dxa"/>
+          </w:tblCellMar>
+        </w:tblPrEx>
+        <w:tc>
+          <w:tcPr>
+            <w:tcW w:w="2600" w:type="dxa"/>
+            <w:tcMar>
+              <w:top w:w="70" w:type="dxa"/>
+              <w:left w:w="100" w:type="dxa"/>
+              <w:bottom w:w="70" w:type="dxa"/>
+              <w:right w:w="100" w:type="dxa"/>
+            </w:tcMar>
+          </w:tcPr>
+          <w:p>
+            <w:pPr>
+              <w:spacing w:line="280" w:lineRule="auto"/>
+            </w:pPr>
+            <w:r>
+              <w:rPr>
+                <w:sz w:val="19"/>
+                <w:szCs w:val="19"/>
+              </w:rPr>
+              <w:t>동영상</w:t>
+            </w:r>
+            <w:r>
+              <w:rPr>
+                <w:sz w:val="19"/>
+                <w:szCs w:val="19"/>
+              </w:rPr>
+              <w:t xml:space="preserve"> </w:t>
+            </w:r>
+            <w:r>
+              <w:rPr>
+                <w:sz w:val="19"/>
+                <w:szCs w:val="19"/>
+              </w:rPr>
+              <w:t>소리</w:t>
+            </w:r>
+          </w:p>
+        </w:tc>
+        <w:tc>
+          <w:tcPr>
+            <w:tcW w:w="6760" w:type="dxa"/>
+            <w:tcMar>
+              <w:top w:w="70" w:type="dxa"/>
+              <w:left w:w="100" w:type="dxa"/>
+              <w:bottom w:w="70" w:type="dxa"/>
+              <w:right w:w="100" w:type="dxa"/>
+            </w:tcMar>
+          </w:tcPr>
+          <w:p>
+            <w:pPr>
+              <w:spacing w:line="280" w:lineRule="auto"/>
+            </w:pPr>
+            <w:r>
+              <w:rPr>
+                <w:sz w:val="19"/>
+                <w:szCs w:val="19"/>
+              </w:rPr>
+              <w:t>동영상에</w:t>
+            </w:r>
+            <w:r>
+              <w:rPr>
+                <w:sz w:val="19"/>
+                <w:szCs w:val="19"/>
+              </w:rPr>
+              <w:t xml:space="preserve"> </w:t>
+            </w:r>
+            <w:r>
+              <w:rPr>
+                <w:sz w:val="19"/>
+                <w:szCs w:val="19"/>
+              </w:rPr>
+              <w:t>녹음된</w:t>
+            </w:r>
+            <w:r>
+              <w:rPr>
+                <w:sz w:val="19"/>
+                <w:szCs w:val="19"/>
+              </w:rPr>
+              <w:t xml:space="preserve"> </w:t>
+            </w:r>
+            <w:r>
+              <w:rPr>
+                <w:sz w:val="19"/>
+                <w:szCs w:val="19"/>
+              </w:rPr>
+              <w:t>소리의</w:t>
+            </w:r>
+            <w:r>
+              <w:rPr>
+                <w:sz w:val="19"/>
+                <w:szCs w:val="19"/>
+              </w:rPr>
+              <w:t xml:space="preserve"> </w:t>
+            </w:r>
+            <w:r>
+              <w:rPr>
+                <w:sz w:val="19"/>
+                <w:szCs w:val="19"/>
+              </w:rPr>
+              <w:t>크기</w:t>
+            </w:r>
+            <w:r>
+              <w:rPr>
+                <w:sz w:val="19"/>
+                <w:szCs w:val="19"/>
+              </w:rPr>
+              <w:t xml:space="preserve">(0~150%). </w:t>
+            </w:r>
+            <w:r>
+              <w:rPr>
+                <w:sz w:val="19"/>
+                <w:szCs w:val="19"/>
+              </w:rPr>
+              <w:t>음소거를</w:t>
+            </w:r>
+            <w:r>
+              <w:rPr>
+                <w:sz w:val="19"/>
+                <w:szCs w:val="19"/>
+              </w:rPr>
+              <w:t xml:space="preserve"> </w:t>
+            </w:r>
+            <w:r>
+              <w:rPr>
+                <w:sz w:val="19"/>
+                <w:szCs w:val="19"/>
+              </w:rPr>
+              <w:t>켜면</w:t>
+            </w:r>
+            <w:r>
+              <w:rPr>
+                <w:sz w:val="19"/>
+                <w:szCs w:val="19"/>
+              </w:rPr>
+              <w:t xml:space="preserve"> </w:t>
+            </w:r>
+            <w:r>
+              <w:rPr>
+                <w:sz w:val="19"/>
+                <w:szCs w:val="19"/>
+              </w:rPr>
+              <w:t>배경음악만</w:t>
+            </w:r>
+            <w:r>
+              <w:rPr>
+                <w:sz w:val="19"/>
+                <w:szCs w:val="19"/>
+              </w:rPr>
+              <w:t xml:space="preserve"> </w:t>
+            </w:r>
+            <w:r>
+              <w:rPr>
+                <w:sz w:val="19"/>
+                <w:szCs w:val="19"/>
+              </w:rPr>
+              <w:t>나옵니다</w:t>
+            </w:r>
+            <w:r>
+              <w:rPr>
+                <w:sz w:val="19"/>
+                <w:szCs w:val="19"/>
+              </w:rPr>
+              <w:t>.</w:t>
+            </w:r>
+          </w:p>
+        </w:tc>
+      </w:tr>
+      <w:tr>
+        <w:tblPrEx>
+          <w:tblCellMar>
+            <w:top w:w="0" w:type="dxa"/>
+            <w:bottom w:w="0" w:type="dxa"/>
+          </w:tblCellMar>
+        </w:tblPrEx>
+        <w:tc>
+          <w:tcPr>
+            <w:tcW w:w="2600" w:type="dxa"/>
+            <w:tcMar>
+              <w:top w:w="70" w:type="dxa"/>
+              <w:left w:w="100" w:type="dxa"/>
+              <w:bottom w:w="70" w:type="dxa"/>
+              <w:right w:w="100" w:type="dxa"/>
+            </w:tcMar>
+          </w:tcPr>
+          <w:p>
+            <w:pPr>
+              <w:spacing w:line="280" w:lineRule="auto"/>
+            </w:pPr>
+            <w:r>
+              <w:rPr>
+                <w:sz w:val="19"/>
+                <w:szCs w:val="19"/>
+              </w:rPr>
               <w:t>재생시간</w:t>
             </w:r>
           </w:p>
@@ -24931,7 +26505,7 @@
         <w:pStyle w:val="1"/>
         <w:pageBreakBefore/>
       </w:pPr>
-      <w:bookmarkStart w:id="25" w:name="_Toc240522202"/>
+      <w:bookmarkStart w:id="25" w:name="_Toc240524530"/>
       <w:r>
         <w:lastRenderedPageBreak/>
         <w:t xml:space="preserve">8. </w:t>
@@ -24951,10 +26525,10 @@
           <w:noProof/>
         </w:rPr>
         <w:drawing>
-          <wp:inline distT="0" distB="0" distL="0" distR="0" wp14:anchorId="74B68F57" wp14:editId="1AA5FF22">
+          <wp:inline distT="0" distB="0" distL="0" distR="0" wp14:anchorId="3D37D390" wp14:editId="21BC183A">
             <wp:extent cx="5943600" cy="3638550"/>
             <wp:effectExtent l="0" t="0" r="0" b="0"/>
-            <wp:docPr id="327911926" name="그림 327911926"/>
+            <wp:docPr id="46406295" name="그림 46406295"/>
             <wp:cNvGraphicFramePr>
               <a:graphicFrameLocks xmlns:a="http://schemas.openxmlformats.org/drawingml/2006/main" noChangeAspect="1"/>
             </wp:cNvGraphicFramePr>
@@ -25050,7 +26624,7 @@
       <w:pPr>
         <w:pStyle w:val="2"/>
       </w:pPr>
-      <w:bookmarkStart w:id="26" w:name="_Toc240522203"/>
+      <w:bookmarkStart w:id="26" w:name="_Toc240524531"/>
       <w:r>
         <w:t xml:space="preserve">8.1 </w:t>
       </w:r>
@@ -26138,7 +27712,7 @@
       <w:pPr>
         <w:pStyle w:val="2"/>
       </w:pPr>
-      <w:bookmarkStart w:id="27" w:name="_Toc240522204"/>
+      <w:bookmarkStart w:id="27" w:name="_Toc240524532"/>
       <w:r>
         <w:t xml:space="preserve">8.2 </w:t>
       </w:r>
@@ -27391,7 +28965,7 @@
       <w:pPr>
         <w:pStyle w:val="2"/>
       </w:pPr>
-      <w:bookmarkStart w:id="28" w:name="_Toc240522205"/>
+      <w:bookmarkStart w:id="28" w:name="_Toc240524533"/>
       <w:r>
         <w:t xml:space="preserve">8.3 </w:t>
       </w:r>
@@ -27644,7 +29218,7 @@
         <w:pStyle w:val="1"/>
         <w:pageBreakBefore/>
       </w:pPr>
-      <w:bookmarkStart w:id="29" w:name="_Toc240522206"/>
+      <w:bookmarkStart w:id="29" w:name="_Toc240524534"/>
       <w:r>
         <w:lastRenderedPageBreak/>
         <w:t xml:space="preserve">9. </w:t>
@@ -27664,10 +29238,10 @@
           <w:noProof/>
         </w:rPr>
         <w:drawing>
-          <wp:inline distT="0" distB="0" distL="0" distR="0" wp14:anchorId="6D397F02" wp14:editId="51CA70C1">
+          <wp:inline distT="0" distB="0" distL="0" distR="0" wp14:anchorId="47FA258A" wp14:editId="627EE903">
             <wp:extent cx="5943600" cy="3638550"/>
             <wp:effectExtent l="0" t="0" r="0" b="0"/>
-            <wp:docPr id="933227499" name="그림 933227499"/>
+            <wp:docPr id="2147171949" name="그림 2147171949"/>
             <wp:cNvGraphicFramePr>
               <a:graphicFrameLocks xmlns:a="http://schemas.openxmlformats.org/drawingml/2006/main" noChangeAspect="1"/>
             </wp:cNvGraphicFramePr>
@@ -27763,7 +29337,7 @@
       <w:pPr>
         <w:pStyle w:val="2"/>
       </w:pPr>
-      <w:bookmarkStart w:id="30" w:name="_Toc240522207"/>
+      <w:bookmarkStart w:id="30" w:name="_Toc240524535"/>
       <w:r>
         <w:t xml:space="preserve">9.1 </w:t>
       </w:r>
@@ -29139,7 +30713,7 @@
       <w:pPr>
         <w:pStyle w:val="2"/>
       </w:pPr>
-      <w:bookmarkStart w:id="31" w:name="_Toc240522208"/>
+      <w:bookmarkStart w:id="31" w:name="_Toc240524536"/>
       <w:r>
         <w:t xml:space="preserve">9.2 </w:t>
       </w:r>
@@ -29308,7 +30882,7 @@
         <w:pStyle w:val="1"/>
         <w:pageBreakBefore/>
       </w:pPr>
-      <w:bookmarkStart w:id="32" w:name="_Toc240522209"/>
+      <w:bookmarkStart w:id="32" w:name="_Toc240524537"/>
       <w:r>
         <w:lastRenderedPageBreak/>
         <w:t xml:space="preserve">10. </w:t>
@@ -29334,10 +30908,10 @@
           <w:noProof/>
         </w:rPr>
         <w:drawing>
-          <wp:inline distT="0" distB="0" distL="0" distR="0" wp14:anchorId="5E546DDC" wp14:editId="68077147">
+          <wp:inline distT="0" distB="0" distL="0" distR="0" wp14:anchorId="39BDF5AD" wp14:editId="4786C2AB">
             <wp:extent cx="5943600" cy="3638550"/>
             <wp:effectExtent l="0" t="0" r="0" b="0"/>
-            <wp:docPr id="1275300327" name="그림 1275300327"/>
+            <wp:docPr id="509919759" name="그림 509919759"/>
             <wp:cNvGraphicFramePr>
               <a:graphicFrameLocks xmlns:a="http://schemas.openxmlformats.org/drawingml/2006/main" noChangeAspect="1"/>
             </wp:cNvGraphicFramePr>
@@ -30973,7 +32547,7 @@
         <w:pStyle w:val="1"/>
         <w:pageBreakBefore/>
       </w:pPr>
-      <w:bookmarkStart w:id="33" w:name="_Toc240522210"/>
+      <w:bookmarkStart w:id="33" w:name="_Toc240524538"/>
       <w:r>
         <w:lastRenderedPageBreak/>
         <w:t xml:space="preserve">11. </w:t>
@@ -30999,10 +32573,10 @@
           <w:noProof/>
         </w:rPr>
         <w:drawing>
-          <wp:inline distT="0" distB="0" distL="0" distR="0" wp14:anchorId="0091A144" wp14:editId="6DE45377">
+          <wp:inline distT="0" distB="0" distL="0" distR="0" wp14:anchorId="17E6E547" wp14:editId="0FF68F64">
             <wp:extent cx="5943600" cy="3638550"/>
             <wp:effectExtent l="0" t="0" r="0" b="0"/>
-            <wp:docPr id="1084283254" name="그림 1084283254"/>
+            <wp:docPr id="716238626" name="그림 716238626"/>
             <wp:cNvGraphicFramePr>
               <a:graphicFrameLocks xmlns:a="http://schemas.openxmlformats.org/drawingml/2006/main" noChangeAspect="1"/>
             </wp:cNvGraphicFramePr>
@@ -31118,7 +32692,7 @@
       <w:pPr>
         <w:pStyle w:val="2"/>
       </w:pPr>
-      <w:bookmarkStart w:id="34" w:name="_Toc240522211"/>
+      <w:bookmarkStart w:id="34" w:name="_Toc240524539"/>
       <w:r>
         <w:t xml:space="preserve">11.1 </w:t>
       </w:r>
@@ -32417,7 +33991,7 @@
       <w:pPr>
         <w:pStyle w:val="2"/>
       </w:pPr>
-      <w:bookmarkStart w:id="35" w:name="_Toc240522212"/>
+      <w:bookmarkStart w:id="35" w:name="_Toc240524540"/>
       <w:r>
         <w:t xml:space="preserve">11.2 </w:t>
       </w:r>
@@ -32858,7 +34432,7 @@
       <w:pPr>
         <w:pStyle w:val="2"/>
       </w:pPr>
-      <w:bookmarkStart w:id="36" w:name="_Toc240522213"/>
+      <w:bookmarkStart w:id="36" w:name="_Toc240524541"/>
       <w:r>
         <w:t xml:space="preserve">11.3 </w:t>
       </w:r>
@@ -33399,7 +34973,7 @@
         <w:pStyle w:val="1"/>
         <w:pageBreakBefore/>
       </w:pPr>
-      <w:bookmarkStart w:id="37" w:name="_Toc240522214"/>
+      <w:bookmarkStart w:id="37" w:name="_Toc240524542"/>
       <w:r>
         <w:lastRenderedPageBreak/>
         <w:t xml:space="preserve">12. </w:t>
@@ -34857,7 +36431,7 @@
         <w:pStyle w:val="1"/>
         <w:pageBreakBefore/>
       </w:pPr>
-      <w:bookmarkStart w:id="38" w:name="_Toc240522215"/>
+      <w:bookmarkStart w:id="38" w:name="_Toc240524543"/>
       <w:r>
         <w:lastRenderedPageBreak/>
         <w:t xml:space="preserve">13. </w:t>
@@ -35673,6 +37247,260 @@
           </w:p>
         </w:tc>
       </w:tr>
+      <w:tr>
+        <w:tblPrEx>
+          <w:tblCellMar>
+            <w:top w:w="0" w:type="dxa"/>
+            <w:bottom w:w="0" w:type="dxa"/>
+          </w:tblCellMar>
+        </w:tblPrEx>
+        <w:tc>
+          <w:tcPr>
+            <w:tcW w:w="1900" w:type="dxa"/>
+            <w:tcMar>
+              <w:top w:w="70" w:type="dxa"/>
+              <w:left w:w="100" w:type="dxa"/>
+              <w:bottom w:w="70" w:type="dxa"/>
+              <w:right w:w="100" w:type="dxa"/>
+            </w:tcMar>
+          </w:tcPr>
+          <w:p>
+            <w:pPr>
+              <w:spacing w:line="280" w:lineRule="auto"/>
+            </w:pPr>
+            <w:r>
+              <w:rPr>
+                <w:sz w:val="19"/>
+                <w:szCs w:val="19"/>
+              </w:rPr>
+              <w:t>I / O</w:t>
+            </w:r>
+          </w:p>
+        </w:tc>
+        <w:tc>
+          <w:tcPr>
+            <w:tcW w:w="2780" w:type="dxa"/>
+            <w:tcMar>
+              <w:top w:w="70" w:type="dxa"/>
+              <w:left w:w="100" w:type="dxa"/>
+              <w:bottom w:w="70" w:type="dxa"/>
+              <w:right w:w="100" w:type="dxa"/>
+            </w:tcMar>
+          </w:tcPr>
+          <w:p>
+            <w:pPr>
+              <w:spacing w:line="280" w:lineRule="auto"/>
+            </w:pPr>
+            <w:r>
+              <w:rPr>
+                <w:sz w:val="19"/>
+                <w:szCs w:val="19"/>
+              </w:rPr>
+              <w:t>동영상</w:t>
+            </w:r>
+            <w:r>
+              <w:rPr>
+                <w:sz w:val="19"/>
+                <w:szCs w:val="19"/>
+              </w:rPr>
+              <w:t xml:space="preserve"> </w:t>
+            </w:r>
+            <w:r>
+              <w:rPr>
+                <w:sz w:val="19"/>
+                <w:szCs w:val="19"/>
+              </w:rPr>
+              <w:t>구간</w:t>
+            </w:r>
+            <w:r>
+              <w:rPr>
+                <w:sz w:val="19"/>
+                <w:szCs w:val="19"/>
+              </w:rPr>
+              <w:t xml:space="preserve"> </w:t>
+            </w:r>
+            <w:r>
+              <w:rPr>
+                <w:sz w:val="19"/>
+                <w:szCs w:val="19"/>
+              </w:rPr>
+              <w:t>시작</w:t>
+            </w:r>
+            <w:r>
+              <w:rPr>
+                <w:sz w:val="19"/>
+                <w:szCs w:val="19"/>
+              </w:rPr>
+              <w:t xml:space="preserve"> / </w:t>
+            </w:r>
+            <w:r>
+              <w:rPr>
+                <w:sz w:val="19"/>
+                <w:szCs w:val="19"/>
+              </w:rPr>
+              <w:t>끝을</w:t>
+            </w:r>
+            <w:r>
+              <w:rPr>
+                <w:sz w:val="19"/>
+                <w:szCs w:val="19"/>
+              </w:rPr>
+              <w:t xml:space="preserve"> </w:t>
+            </w:r>
+            <w:r>
+              <w:rPr>
+                <w:sz w:val="19"/>
+                <w:szCs w:val="19"/>
+              </w:rPr>
+              <w:t>현재</w:t>
+            </w:r>
+            <w:r>
+              <w:rPr>
+                <w:sz w:val="19"/>
+                <w:szCs w:val="19"/>
+              </w:rPr>
+              <w:t xml:space="preserve"> </w:t>
+            </w:r>
+            <w:r>
+              <w:rPr>
+                <w:sz w:val="19"/>
+                <w:szCs w:val="19"/>
+              </w:rPr>
+              <w:t>장면으로</w:t>
+            </w:r>
+          </w:p>
+        </w:tc>
+        <w:tc>
+          <w:tcPr>
+            <w:tcW w:w="1900" w:type="dxa"/>
+            <w:tcMar>
+              <w:top w:w="70" w:type="dxa"/>
+              <w:left w:w="100" w:type="dxa"/>
+              <w:bottom w:w="70" w:type="dxa"/>
+              <w:right w:w="100" w:type="dxa"/>
+            </w:tcMar>
+          </w:tcPr>
+          <w:p>
+            <w:pPr>
+              <w:spacing w:line="280" w:lineRule="auto"/>
+            </w:pPr>
+            <w:r>
+              <w:rPr>
+                <w:sz w:val="19"/>
+                <w:szCs w:val="19"/>
+              </w:rPr>
+              <w:t>← → (</w:t>
+            </w:r>
+            <w:r>
+              <w:rPr>
+                <w:sz w:val="19"/>
+                <w:szCs w:val="19"/>
+              </w:rPr>
+              <w:t>손잡이</w:t>
+            </w:r>
+            <w:r>
+              <w:rPr>
+                <w:sz w:val="19"/>
+                <w:szCs w:val="19"/>
+              </w:rPr>
+              <w:t xml:space="preserve"> </w:t>
+            </w:r>
+            <w:r>
+              <w:rPr>
+                <w:sz w:val="19"/>
+                <w:szCs w:val="19"/>
+              </w:rPr>
+              <w:t>선택</w:t>
+            </w:r>
+            <w:r>
+              <w:rPr>
+                <w:sz w:val="19"/>
+                <w:szCs w:val="19"/>
+              </w:rPr>
+              <w:t xml:space="preserve"> </w:t>
+            </w:r>
+            <w:r>
+              <w:rPr>
+                <w:sz w:val="19"/>
+                <w:szCs w:val="19"/>
+              </w:rPr>
+              <w:t>후</w:t>
+            </w:r>
+            <w:r>
+              <w:rPr>
+                <w:sz w:val="19"/>
+                <w:szCs w:val="19"/>
+              </w:rPr>
+              <w:t>)</w:t>
+            </w:r>
+          </w:p>
+        </w:tc>
+        <w:tc>
+          <w:tcPr>
+            <w:tcW w:w="2780" w:type="dxa"/>
+            <w:tcMar>
+              <w:top w:w="70" w:type="dxa"/>
+              <w:left w:w="100" w:type="dxa"/>
+              <w:bottom w:w="70" w:type="dxa"/>
+              <w:right w:w="100" w:type="dxa"/>
+            </w:tcMar>
+          </w:tcPr>
+          <w:p>
+            <w:pPr>
+              <w:spacing w:line="280" w:lineRule="auto"/>
+            </w:pPr>
+            <w:r>
+              <w:rPr>
+                <w:sz w:val="19"/>
+                <w:szCs w:val="19"/>
+              </w:rPr>
+              <w:t>구간</w:t>
+            </w:r>
+            <w:r>
+              <w:rPr>
+                <w:sz w:val="19"/>
+                <w:szCs w:val="19"/>
+              </w:rPr>
+              <w:t xml:space="preserve"> 0.1</w:t>
+            </w:r>
+            <w:r>
+              <w:rPr>
+                <w:sz w:val="19"/>
+                <w:szCs w:val="19"/>
+              </w:rPr>
+              <w:t>초</w:t>
+            </w:r>
+            <w:r>
+              <w:rPr>
+                <w:sz w:val="19"/>
+                <w:szCs w:val="19"/>
+              </w:rPr>
+              <w:t xml:space="preserve"> </w:t>
+            </w:r>
+            <w:r>
+              <w:rPr>
+                <w:sz w:val="19"/>
+                <w:szCs w:val="19"/>
+              </w:rPr>
+              <w:t>미세</w:t>
+            </w:r>
+            <w:r>
+              <w:rPr>
+                <w:sz w:val="19"/>
+                <w:szCs w:val="19"/>
+              </w:rPr>
+              <w:t xml:space="preserve"> </w:t>
+            </w:r>
+            <w:r>
+              <w:rPr>
+                <w:sz w:val="19"/>
+                <w:szCs w:val="19"/>
+              </w:rPr>
+              <w:t>조절</w:t>
+            </w:r>
+          </w:p>
+        </w:tc>
+      </w:tr>
     </w:tbl>
     <w:p>
       <w:pPr>
@@ -35684,7 +37512,7 @@
         <w:pStyle w:val="1"/>
         <w:pageBreakBefore/>
       </w:pPr>
-      <w:bookmarkStart w:id="39" w:name="_Toc240522216"/>
+      <w:bookmarkStart w:id="39" w:name="_Toc240524544"/>
       <w:r>
         <w:lastRenderedPageBreak/>
         <w:t xml:space="preserve">14. </w:t>
@@ -38397,7 +40225,7 @@
         <w:pStyle w:val="1"/>
         <w:pageBreakBefore/>
       </w:pPr>
-      <w:bookmarkStart w:id="40" w:name="_Toc240522217"/>
+      <w:bookmarkStart w:id="40" w:name="_Toc240524545"/>
       <w:r>
         <w:lastRenderedPageBreak/>
         <w:t>부록</w:t>
@@ -38408,7 +40236,7 @@
       <w:pPr>
         <w:pStyle w:val="2"/>
       </w:pPr>
-      <w:bookmarkStart w:id="41" w:name="_Toc240522218"/>
+      <w:bookmarkStart w:id="41" w:name="_Toc240524546"/>
       <w:r>
         <w:t xml:space="preserve">A. </w:t>
       </w:r>
@@ -38989,7 +40817,7 @@
       <w:pPr>
         <w:pStyle w:val="2"/>
       </w:pPr>
-      <w:bookmarkStart w:id="42" w:name="_Toc240522219"/>
+      <w:bookmarkStart w:id="42" w:name="_Toc240524547"/>
       <w:r>
         <w:t xml:space="preserve">B. </w:t>
       </w:r>
@@ -39224,7 +41052,7 @@
       <w:pPr>
         <w:pStyle w:val="2"/>
       </w:pPr>
-      <w:bookmarkStart w:id="43" w:name="_Toc240522220"/>
+      <w:bookmarkStart w:id="43" w:name="_Toc240524548"/>
       <w:r>
         <w:t xml:space="preserve">C. </w:t>
       </w:r>
@@ -40299,7 +42127,7 @@
       <w:pPr>
         <w:pStyle w:val="2"/>
       </w:pPr>
-      <w:bookmarkStart w:id="44" w:name="_Toc240522221"/>
+      <w:bookmarkStart w:id="44" w:name="_Toc240524549"/>
       <w:r>
         <w:t xml:space="preserve">D. </w:t>
       </w:r>
@@ -40671,7 +42499,7 @@
         <w:sz w:val="16"/>
         <w:szCs w:val="16"/>
       </w:rPr>
-      <w:t xml:space="preserve"> v1.2  ·  </w:t>
+      <w:t xml:space="preserve"> v1.3  ·  </w:t>
     </w:r>
     <w:r>
       <w:rPr>
@@ -40728,118 +42556,10 @@
 <file path=word/numbering.xml><?xml version="1.0" encoding="utf-8"?>
 <w:numbering xmlns:wpc="http://schemas.microsoft.com/office/word/2010/wordprocessingCanvas" xmlns:cx="http://schemas.microsoft.com/office/drawing/2014/chartex" xmlns:cx1="http://schemas.microsoft.com/office/drawing/2015/9/8/chartex" xmlns:cx2="http://schemas.microsoft.com/office/drawing/2015/10/21/chartex" xmlns:cx3="http://schemas.microsoft.com/office/drawing/2016/5/9/chartex" xmlns:cx4="http://schemas.microsoft.com/office/drawing/2016/5/10/chartex" xmlns:cx5="http://schemas.microsoft.com/office/drawing/2016/5/11/chartex" xmlns:cx6="http://schemas.microsoft.com/office/drawing/2016/5/12/chartex" xmlns:cx7="http://schemas.microsoft.com/office/drawing/2016/5/13/chartex" xmlns:cx8="http://schemas.microsoft.com/office/drawing/2016/5/14/chartex" xmlns:mc="http://schemas.openxmlformats.org/markup-compatibility/2006" xmlns:aink="http://schemas.microsoft.com/office/drawing/2016/ink" xmlns:am3d="http://schemas.microsoft.com/office/drawing/2017/model3d" xmlns:o="urn:schemas-microsoft-com:office:office" xmlns:oel="http://schemas.microsoft.com/office/2019/extlst" xmlns:r="http://schemas.openxmlformats.org/officeDocument/2006/relationships" xmlns:m="http://schemas.openxmlformats.org/officeDocument/2006/math" xmlns:v="urn:schemas-microsoft-com:vml" xmlns:wp14="http://schemas.microsoft.com/office/word/2010/wordprocessingDrawing" xmlns:wp="http://schemas.openxmlformats.org/drawingml/2006/wordprocessingDrawing" xmlns:w10="urn:schemas-microsoft-com:office:word" xmlns:w="http://schemas.openxmlformats.org/wordprocessingml/2006/main" xmlns:w14="http://schemas.microsoft.com/office/word/2010/wordml" xmlns:w15="http://schemas.microsoft.com/office/word/2012/wordml" xmlns:w16cex="http://schemas.microsoft.com/office/word/2018/wordml/cex" xmlns:w16cid="http://schemas.microsoft.com/office/word/2016/wordml/cid" xmlns:w16="http://schemas.microsoft.com/office/word/2018/wordml" xmlns:w16du="http://schemas.microsoft.com/office/word/2023/wordml/word16du" xmlns:w16sdtdh="http://schemas.microsoft.com/office/word/2020/wordml/sdtdatahash" xmlns:w16sdtfl="http://schemas.microsoft.com/office/word/2024/wordml/sdtformatlock" xmlns:w16se="http://schemas.microsoft.com/office/word/2015/wordml/symex" xmlns:wpg="http://schemas.microsoft.com/office/word/2010/wordprocessingGroup" xmlns:wpi="http://schemas.microsoft.com/office/word/2010/wordprocessingInk" xmlns:wne="http://schemas.microsoft.com/office/word/2006/wordml" xmlns:wps="http://schemas.microsoft.com/office/word/2010/wordprocessingShape" mc:Ignorable="w14 w15 w16se w16cid w16 w16cex w16sdtdh w16sdtfl w16du wp14">
   <w:abstractNum w:abstractNumId="0" w15:restartNumberingAfterBreak="0">
-    <w:nsid w:val="4E416BBD"/>
+    <w:nsid w:val="2BC860C7"/>
     <w:multiLevelType w:val="hybridMultilevel"/>
-    <w:tmpl w:val="FA7AAFC2"/>
-    <w:lvl w:ilvl="0" w:tplc="193681DA">
-      <w:start w:val="1"/>
-      <w:numFmt w:val="decimal"/>
-      <w:lvlText w:val="%1."/>
-      <w:lvlJc w:val="left"/>
-      <w:pPr>
-        <w:ind w:left="480" w:hanging="300"/>
-      </w:pPr>
-    </w:lvl>
-    <w:lvl w:ilvl="1" w:tplc="E75E950A">
-      <w:numFmt w:val="decimal"/>
-      <w:lvlText w:val=""/>
-      <w:lvlJc w:val="left"/>
-    </w:lvl>
-    <w:lvl w:ilvl="2" w:tplc="0C1A87EC">
-      <w:numFmt w:val="decimal"/>
-      <w:lvlText w:val=""/>
-      <w:lvlJc w:val="left"/>
-    </w:lvl>
-    <w:lvl w:ilvl="3" w:tplc="0FA4641C">
-      <w:numFmt w:val="decimal"/>
-      <w:lvlText w:val=""/>
-      <w:lvlJc w:val="left"/>
-    </w:lvl>
-    <w:lvl w:ilvl="4" w:tplc="2242C818">
-      <w:numFmt w:val="decimal"/>
-      <w:lvlText w:val=""/>
-      <w:lvlJc w:val="left"/>
-    </w:lvl>
-    <w:lvl w:ilvl="5" w:tplc="F006A516">
-      <w:numFmt w:val="decimal"/>
-      <w:lvlText w:val=""/>
-      <w:lvlJc w:val="left"/>
-    </w:lvl>
-    <w:lvl w:ilvl="6" w:tplc="D4CE846A">
-      <w:numFmt w:val="decimal"/>
-      <w:lvlText w:val=""/>
-      <w:lvlJc w:val="left"/>
-    </w:lvl>
-    <w:lvl w:ilvl="7" w:tplc="4022DFDC">
-      <w:numFmt w:val="decimal"/>
-      <w:lvlText w:val=""/>
-      <w:lvlJc w:val="left"/>
-    </w:lvl>
-    <w:lvl w:ilvl="8" w:tplc="84D4273A">
-      <w:numFmt w:val="decimal"/>
-      <w:lvlText w:val=""/>
-      <w:lvlJc w:val="left"/>
-    </w:lvl>
-  </w:abstractNum>
-  <w:abstractNum w:abstractNumId="1" w15:restartNumberingAfterBreak="0">
-    <w:nsid w:val="7440794B"/>
-    <w:multiLevelType w:val="hybridMultilevel"/>
-    <w:tmpl w:val="FDEE192C"/>
-    <w:lvl w:ilvl="0" w:tplc="1FD47FAA">
-      <w:start w:val="1"/>
-      <w:numFmt w:val="bullet"/>
-      <w:lvlText w:val="•"/>
-      <w:lvlJc w:val="left"/>
-      <w:pPr>
-        <w:ind w:left="480" w:hanging="260"/>
-      </w:pPr>
-    </w:lvl>
-    <w:lvl w:ilvl="1" w:tplc="FB1CF5C0">
-      <w:numFmt w:val="decimal"/>
-      <w:lvlText w:val=""/>
-      <w:lvlJc w:val="left"/>
-    </w:lvl>
-    <w:lvl w:ilvl="2" w:tplc="8F58B782">
-      <w:numFmt w:val="decimal"/>
-      <w:lvlText w:val=""/>
-      <w:lvlJc w:val="left"/>
-    </w:lvl>
-    <w:lvl w:ilvl="3" w:tplc="6D9214EE">
-      <w:numFmt w:val="decimal"/>
-      <w:lvlText w:val=""/>
-      <w:lvlJc w:val="left"/>
-    </w:lvl>
-    <w:lvl w:ilvl="4" w:tplc="32A68B9C">
-      <w:numFmt w:val="decimal"/>
-      <w:lvlText w:val=""/>
-      <w:lvlJc w:val="left"/>
-    </w:lvl>
-    <w:lvl w:ilvl="5" w:tplc="7B88B15A">
-      <w:numFmt w:val="decimal"/>
-      <w:lvlText w:val=""/>
-      <w:lvlJc w:val="left"/>
-    </w:lvl>
-    <w:lvl w:ilvl="6" w:tplc="5F549C78">
-      <w:numFmt w:val="decimal"/>
-      <w:lvlText w:val=""/>
-      <w:lvlJc w:val="left"/>
-    </w:lvl>
-    <w:lvl w:ilvl="7" w:tplc="4086C622">
-      <w:numFmt w:val="decimal"/>
-      <w:lvlText w:val=""/>
-      <w:lvlJc w:val="left"/>
-    </w:lvl>
-    <w:lvl w:ilvl="8" w:tplc="8DEAD7DC">
-      <w:numFmt w:val="decimal"/>
-      <w:lvlText w:val=""/>
-      <w:lvlJc w:val="left"/>
-    </w:lvl>
-  </w:abstractNum>
-  <w:abstractNum w:abstractNumId="2" w15:restartNumberingAfterBreak="0">
-    <w:nsid w:val="75DC58C7"/>
-    <w:multiLevelType w:val="hybridMultilevel"/>
-    <w:tmpl w:val="86EA6492"/>
-    <w:lvl w:ilvl="0" w:tplc="9EF4737A">
+    <w:tmpl w:val="B5308A7E"/>
+    <w:lvl w:ilvl="0" w:tplc="875651AE">
       <w:start w:val="1"/>
       <w:numFmt w:val="bullet"/>
       <w:lvlText w:val="●"/>
@@ -40848,7 +42568,7 @@
         <w:ind w:left="720" w:hanging="360"/>
       </w:pPr>
     </w:lvl>
-    <w:lvl w:ilvl="1" w:tplc="99783E6A">
+    <w:lvl w:ilvl="1" w:tplc="143EEEBC">
       <w:start w:val="1"/>
       <w:numFmt w:val="bullet"/>
       <w:lvlText w:val="○"/>
@@ -40857,7 +42577,7 @@
         <w:ind w:left="1440" w:hanging="360"/>
       </w:pPr>
     </w:lvl>
-    <w:lvl w:ilvl="2" w:tplc="B4A217D2">
+    <w:lvl w:ilvl="2" w:tplc="56E4BDCE">
       <w:start w:val="1"/>
       <w:numFmt w:val="bullet"/>
       <w:lvlText w:val="■"/>
@@ -40866,7 +42586,7 @@
         <w:ind w:left="2160" w:hanging="360"/>
       </w:pPr>
     </w:lvl>
-    <w:lvl w:ilvl="3" w:tplc="16A61FE0">
+    <w:lvl w:ilvl="3" w:tplc="40964066">
       <w:start w:val="1"/>
       <w:numFmt w:val="bullet"/>
       <w:lvlText w:val="●"/>
@@ -40875,7 +42595,7 @@
         <w:ind w:left="2880" w:hanging="360"/>
       </w:pPr>
     </w:lvl>
-    <w:lvl w:ilvl="4" w:tplc="2E361A92">
+    <w:lvl w:ilvl="4" w:tplc="154C7E70">
       <w:start w:val="1"/>
       <w:numFmt w:val="bullet"/>
       <w:lvlText w:val="○"/>
@@ -40884,7 +42604,7 @@
         <w:ind w:left="3600" w:hanging="360"/>
       </w:pPr>
     </w:lvl>
-    <w:lvl w:ilvl="5" w:tplc="9DF0B1B2">
+    <w:lvl w:ilvl="5" w:tplc="1C3CAC04">
       <w:start w:val="1"/>
       <w:numFmt w:val="bullet"/>
       <w:lvlText w:val="■"/>
@@ -40893,7 +42613,7 @@
         <w:ind w:left="4320" w:hanging="360"/>
       </w:pPr>
     </w:lvl>
-    <w:lvl w:ilvl="6" w:tplc="71E85828">
+    <w:lvl w:ilvl="6" w:tplc="BB8C90D0">
       <w:start w:val="1"/>
       <w:numFmt w:val="bullet"/>
       <w:lvlText w:val="●"/>
@@ -40902,7 +42622,7 @@
         <w:ind w:left="5040" w:hanging="360"/>
       </w:pPr>
     </w:lvl>
-    <w:lvl w:ilvl="7" w:tplc="714000FE">
+    <w:lvl w:ilvl="7" w:tplc="15E0AA28">
       <w:start w:val="1"/>
       <w:numFmt w:val="bullet"/>
       <w:lvlText w:val="●"/>
@@ -40911,7 +42631,7 @@
         <w:ind w:left="5760" w:hanging="360"/>
       </w:pPr>
     </w:lvl>
-    <w:lvl w:ilvl="8" w:tplc="6906A5D0">
+    <w:lvl w:ilvl="8" w:tplc="3D16EB2C">
       <w:start w:val="1"/>
       <w:numFmt w:val="bullet"/>
       <w:lvlText w:val="●"/>
@@ -40921,26 +42641,134 @@
       </w:pPr>
     </w:lvl>
   </w:abstractNum>
-  <w:num w:numId="1" w16cid:durableId="264071538">
+  <w:abstractNum w:abstractNumId="1" w15:restartNumberingAfterBreak="0">
+    <w:nsid w:val="2D000C35"/>
+    <w:multiLevelType w:val="hybridMultilevel"/>
+    <w:tmpl w:val="0682E6A2"/>
+    <w:lvl w:ilvl="0" w:tplc="8BF8249E">
+      <w:start w:val="1"/>
+      <w:numFmt w:val="bullet"/>
+      <w:lvlText w:val="•"/>
+      <w:lvlJc w:val="left"/>
+      <w:pPr>
+        <w:ind w:left="480" w:hanging="260"/>
+      </w:pPr>
+    </w:lvl>
+    <w:lvl w:ilvl="1" w:tplc="2BA48EB0">
+      <w:numFmt w:val="decimal"/>
+      <w:lvlText w:val=""/>
+      <w:lvlJc w:val="left"/>
+    </w:lvl>
+    <w:lvl w:ilvl="2" w:tplc="92D6B81C">
+      <w:numFmt w:val="decimal"/>
+      <w:lvlText w:val=""/>
+      <w:lvlJc w:val="left"/>
+    </w:lvl>
+    <w:lvl w:ilvl="3" w:tplc="A34E5F22">
+      <w:numFmt w:val="decimal"/>
+      <w:lvlText w:val=""/>
+      <w:lvlJc w:val="left"/>
+    </w:lvl>
+    <w:lvl w:ilvl="4" w:tplc="0E508A4E">
+      <w:numFmt w:val="decimal"/>
+      <w:lvlText w:val=""/>
+      <w:lvlJc w:val="left"/>
+    </w:lvl>
+    <w:lvl w:ilvl="5" w:tplc="436C1766">
+      <w:numFmt w:val="decimal"/>
+      <w:lvlText w:val=""/>
+      <w:lvlJc w:val="left"/>
+    </w:lvl>
+    <w:lvl w:ilvl="6" w:tplc="E78EBDD6">
+      <w:numFmt w:val="decimal"/>
+      <w:lvlText w:val=""/>
+      <w:lvlJc w:val="left"/>
+    </w:lvl>
+    <w:lvl w:ilvl="7" w:tplc="50007418">
+      <w:numFmt w:val="decimal"/>
+      <w:lvlText w:val=""/>
+      <w:lvlJc w:val="left"/>
+    </w:lvl>
+    <w:lvl w:ilvl="8" w:tplc="4F48D792">
+      <w:numFmt w:val="decimal"/>
+      <w:lvlText w:val=""/>
+      <w:lvlJc w:val="left"/>
+    </w:lvl>
+  </w:abstractNum>
+  <w:abstractNum w:abstractNumId="2" w15:restartNumberingAfterBreak="0">
+    <w:nsid w:val="7CCE4910"/>
+    <w:multiLevelType w:val="hybridMultilevel"/>
+    <w:tmpl w:val="777A1924"/>
+    <w:lvl w:ilvl="0" w:tplc="FF5CF3FE">
+      <w:start w:val="1"/>
+      <w:numFmt w:val="decimal"/>
+      <w:lvlText w:val="%1."/>
+      <w:lvlJc w:val="left"/>
+      <w:pPr>
+        <w:ind w:left="480" w:hanging="300"/>
+      </w:pPr>
+    </w:lvl>
+    <w:lvl w:ilvl="1" w:tplc="DF4600AA">
+      <w:numFmt w:val="decimal"/>
+      <w:lvlText w:val=""/>
+      <w:lvlJc w:val="left"/>
+    </w:lvl>
+    <w:lvl w:ilvl="2" w:tplc="C9AC797A">
+      <w:numFmt w:val="decimal"/>
+      <w:lvlText w:val=""/>
+      <w:lvlJc w:val="left"/>
+    </w:lvl>
+    <w:lvl w:ilvl="3" w:tplc="D19254D8">
+      <w:numFmt w:val="decimal"/>
+      <w:lvlText w:val=""/>
+      <w:lvlJc w:val="left"/>
+    </w:lvl>
+    <w:lvl w:ilvl="4" w:tplc="44E684DE">
+      <w:numFmt w:val="decimal"/>
+      <w:lvlText w:val=""/>
+      <w:lvlJc w:val="left"/>
+    </w:lvl>
+    <w:lvl w:ilvl="5" w:tplc="BD40BC3C">
+      <w:numFmt w:val="decimal"/>
+      <w:lvlText w:val=""/>
+      <w:lvlJc w:val="left"/>
+    </w:lvl>
+    <w:lvl w:ilvl="6" w:tplc="F22E95B6">
+      <w:numFmt w:val="decimal"/>
+      <w:lvlText w:val=""/>
+      <w:lvlJc w:val="left"/>
+    </w:lvl>
+    <w:lvl w:ilvl="7" w:tplc="0FD004A6">
+      <w:numFmt w:val="decimal"/>
+      <w:lvlText w:val=""/>
+      <w:lvlJc w:val="left"/>
+    </w:lvl>
+    <w:lvl w:ilvl="8" w:tplc="94B0C8C2">
+      <w:numFmt w:val="decimal"/>
+      <w:lvlText w:val=""/>
+      <w:lvlJc w:val="left"/>
+    </w:lvl>
+  </w:abstractNum>
+  <w:num w:numId="1" w16cid:durableId="144779858">
+    <w:abstractNumId w:val="0"/>
+    <w:lvlOverride w:ilvl="0">
+      <w:startOverride w:val="1"/>
+    </w:lvlOverride>
+  </w:num>
+  <w:num w:numId="2" w16cid:durableId="1281183035">
+    <w:abstractNumId w:val="1"/>
+    <w:lvlOverride w:ilvl="0">
+      <w:startOverride w:val="1"/>
+    </w:lvlOverride>
+  </w:num>
+  <w:num w:numId="3" w16cid:durableId="1291742046">
     <w:abstractNumId w:val="2"/>
     <w:lvlOverride w:ilvl="0">
       <w:startOverride w:val="1"/>
     </w:lvlOverride>
   </w:num>
-  <w:num w:numId="2" w16cid:durableId="2041590877">
-    <w:abstractNumId w:val="1"/>
-    <w:lvlOverride w:ilvl="0">
-      <w:startOverride w:val="1"/>
-    </w:lvlOverride>
-  </w:num>
-  <w:num w:numId="3" w16cid:durableId="459425271">
-    <w:abstractNumId w:val="0"/>
-    <w:lvlOverride w:ilvl="0">
-      <w:startOverride w:val="1"/>
-    </w:lvlOverride>
-  </w:num>
-  <w:num w:numId="4" w16cid:durableId="1905139349">
-    <w:abstractNumId w:val="0"/>
+  <w:num w:numId="4" w16cid:durableId="284700715">
+    <w:abstractNumId w:val="2"/>
     <w:lvlOverride w:ilvl="0">
       <w:startOverride w:val="1"/>
     </w:lvlOverride>
@@ -41564,7 +43392,7 @@
     <w:autoRedefine/>
     <w:uiPriority w:val="39"/>
     <w:unhideWhenUsed/>
-    <w:rsid w:val="00DD7298"/>
+    <w:rsid w:val="00270918"/>
   </w:style>
   <w:style w:type="paragraph" w:styleId="20">
     <w:name w:val="toc 2"/>
@@ -41573,7 +43401,7 @@
     <w:autoRedefine/>
     <w:uiPriority w:val="39"/>
     <w:unhideWhenUsed/>
-    <w:rsid w:val="00DD7298"/>
+    <w:rsid w:val="00270918"/>
     <w:pPr>
       <w:ind w:leftChars="200" w:left="425"/>
     </w:pPr>
@@ -41584,7 +43412,7 @@
     <w:link w:val="Char1"/>
     <w:uiPriority w:val="99"/>
     <w:unhideWhenUsed/>
-    <w:rsid w:val="00DD7298"/>
+    <w:rsid w:val="00270918"/>
     <w:pPr>
       <w:tabs>
         <w:tab w:val="center" w:pos="4513"/>
@@ -41598,7 +43426,7 @@
     <w:basedOn w:val="a0"/>
     <w:link w:val="aa"/>
     <w:uiPriority w:val="99"/>
-    <w:rsid w:val="00DD7298"/>
+    <w:rsid w:val="00270918"/>
   </w:style>
   <w:style w:type="paragraph" w:styleId="ab">
     <w:name w:val="footer"/>
@@ -41606,7 +43434,7 @@
     <w:link w:val="Char2"/>
     <w:uiPriority w:val="99"/>
     <w:unhideWhenUsed/>
-    <w:rsid w:val="00DD7298"/>
+    <w:rsid w:val="00270918"/>
     <w:pPr>
       <w:tabs>
         <w:tab w:val="center" w:pos="4513"/>
@@ -41620,7 +43448,7 @@
     <w:basedOn w:val="a0"/>
     <w:link w:val="ab"/>
     <w:uiPriority w:val="99"/>
-    <w:rsid w:val="00DD7298"/>
+    <w:rsid w:val="00270918"/>
   </w:style>
 </w:styles>
 </file>

</xml_diff>

<commit_message>
Music buttons: 곡 추가 first, AI (label) last in step 2 and music tab
Co-Authored-By: Claude Fable 5.1 <noreply@anthropic.com>
</commit_message>
<xml_diff>
--- a/docs/manual/RuninqVic_사용설명서.docx
+++ b/docs/manual/RuninqVic_사용설명서.docx
@@ -355,7 +355,7 @@
             <w:noProof/>
           </w:rPr>
           <w:drawing>
-            <wp:inline distT="0" distB="0" distL="0" distR="0" wp14:anchorId="167EC14A" wp14:editId="17C9F719">
+            <wp:inline distT="0" distB="0" distL="0" distR="0" wp14:anchorId="66153696" wp14:editId="56DBFA0C">
               <wp:extent cx="1905000" cy="762000"/>
               <wp:effectExtent l="0" t="0" r="0" b="0"/>
               <wp:docPr id="1" name="그림 1">
@@ -496,7 +496,7 @@
     <w:sdt>
       <w:sdtPr>
         <w:alias w:val="목차"/>
-        <w:id w:val="837584787"/>
+        <w:id w:val="1297570807"/>
       </w:sdtPr>
       <w:sdtEndPr/>
       <w:sdtContent>
@@ -524,7 +524,7 @@
           <w:r>
             <w:fldChar w:fldCharType="separate"/>
           </w:r>
-          <w:hyperlink w:anchor="_Toc240525910" w:history="1">
+          <w:hyperlink w:anchor="_Toc240526440" w:history="1">
             <w:r>
               <w:rPr>
                 <w:rStyle w:val="a5"/>
@@ -548,7 +548,7 @@
               <w:rPr>
                 <w:noProof/>
               </w:rPr>
-              <w:instrText xml:space="preserve"> PAGEREF _Toc240525910 \h </w:instrText>
+              <w:instrText xml:space="preserve"> PAGEREF _Toc240526440 \h </w:instrText>
             </w:r>
             <w:r>
               <w:rPr>
@@ -591,7 +591,7 @@
               <w14:ligatures w14:val="standardContextual"/>
             </w:rPr>
           </w:pPr>
-          <w:hyperlink w:anchor="_Toc240525911" w:history="1">
+          <w:hyperlink w:anchor="_Toc240526441" w:history="1">
             <w:r>
               <w:rPr>
                 <w:rStyle w:val="a5"/>
@@ -615,7 +615,7 @@
               <w:rPr>
                 <w:noProof/>
               </w:rPr>
-              <w:instrText xml:space="preserve"> PAGEREF _Toc240525911 \h </w:instrText>
+              <w:instrText xml:space="preserve"> PAGEREF _Toc240526441 \h </w:instrText>
             </w:r>
             <w:r>
               <w:rPr>
@@ -658,7 +658,7 @@
               <w14:ligatures w14:val="standardContextual"/>
             </w:rPr>
           </w:pPr>
-          <w:hyperlink w:anchor="_Toc240525912" w:history="1">
+          <w:hyperlink w:anchor="_Toc240526442" w:history="1">
             <w:r>
               <w:rPr>
                 <w:rStyle w:val="a5"/>
@@ -682,7 +682,7 @@
               <w:rPr>
                 <w:noProof/>
               </w:rPr>
-              <w:instrText xml:space="preserve"> PAGEREF _Toc240525912 \h </w:instrText>
+              <w:instrText xml:space="preserve"> PAGEREF _Toc240526442 \h </w:instrText>
             </w:r>
             <w:r>
               <w:rPr>
@@ -725,7 +725,7 @@
               <w14:ligatures w14:val="standardContextual"/>
             </w:rPr>
           </w:pPr>
-          <w:hyperlink w:anchor="_Toc240525913" w:history="1">
+          <w:hyperlink w:anchor="_Toc240526443" w:history="1">
             <w:r>
               <w:rPr>
                 <w:rStyle w:val="a5"/>
@@ -749,7 +749,7 @@
               <w:rPr>
                 <w:noProof/>
               </w:rPr>
-              <w:instrText xml:space="preserve"> PAGEREF _Toc240525913 \h </w:instrText>
+              <w:instrText xml:space="preserve"> PAGEREF _Toc240526443 \h </w:instrText>
             </w:r>
             <w:r>
               <w:rPr>
@@ -791,7 +791,7 @@
               <w14:ligatures w14:val="standardContextual"/>
             </w:rPr>
           </w:pPr>
-          <w:hyperlink w:anchor="_Toc240525914" w:history="1">
+          <w:hyperlink w:anchor="_Toc240526444" w:history="1">
             <w:r>
               <w:rPr>
                 <w:rStyle w:val="a5"/>
@@ -815,7 +815,7 @@
               <w:rPr>
                 <w:noProof/>
               </w:rPr>
-              <w:instrText xml:space="preserve"> PAGEREF _Toc240525914 \h </w:instrText>
+              <w:instrText xml:space="preserve"> PAGEREF _Toc240526444 \h </w:instrText>
             </w:r>
             <w:r>
               <w:rPr>
@@ -858,7 +858,7 @@
               <w14:ligatures w14:val="standardContextual"/>
             </w:rPr>
           </w:pPr>
-          <w:hyperlink w:anchor="_Toc240525915" w:history="1">
+          <w:hyperlink w:anchor="_Toc240526445" w:history="1">
             <w:r>
               <w:rPr>
                 <w:rStyle w:val="a5"/>
@@ -882,7 +882,7 @@
               <w:rPr>
                 <w:noProof/>
               </w:rPr>
-              <w:instrText xml:space="preserve"> PAGEREF _Toc240525915 \h </w:instrText>
+              <w:instrText xml:space="preserve"> PAGEREF _Toc240526445 \h </w:instrText>
             </w:r>
             <w:r>
               <w:rPr>
@@ -925,7 +925,7 @@
               <w14:ligatures w14:val="standardContextual"/>
             </w:rPr>
           </w:pPr>
-          <w:hyperlink w:anchor="_Toc240525916" w:history="1">
+          <w:hyperlink w:anchor="_Toc240526446" w:history="1">
             <w:r>
               <w:rPr>
                 <w:rStyle w:val="a5"/>
@@ -949,7 +949,7 @@
               <w:rPr>
                 <w:noProof/>
               </w:rPr>
-              <w:instrText xml:space="preserve"> PAGEREF _Toc240525916 \h </w:instrText>
+              <w:instrText xml:space="preserve"> PAGEREF _Toc240526446 \h </w:instrText>
             </w:r>
             <w:r>
               <w:rPr>
@@ -992,7 +992,7 @@
               <w14:ligatures w14:val="standardContextual"/>
             </w:rPr>
           </w:pPr>
-          <w:hyperlink w:anchor="_Toc240525917" w:history="1">
+          <w:hyperlink w:anchor="_Toc240526447" w:history="1">
             <w:r>
               <w:rPr>
                 <w:rStyle w:val="a5"/>
@@ -1016,7 +1016,7 @@
               <w:rPr>
                 <w:noProof/>
               </w:rPr>
-              <w:instrText xml:space="preserve"> PAGEREF _Toc240525917 \h </w:instrText>
+              <w:instrText xml:space="preserve"> PAGEREF _Toc240526447 \h </w:instrText>
             </w:r>
             <w:r>
               <w:rPr>
@@ -1059,7 +1059,7 @@
               <w14:ligatures w14:val="standardContextual"/>
             </w:rPr>
           </w:pPr>
-          <w:hyperlink w:anchor="_Toc240525918" w:history="1">
+          <w:hyperlink w:anchor="_Toc240526448" w:history="1">
             <w:r>
               <w:rPr>
                 <w:rStyle w:val="a5"/>
@@ -1083,7 +1083,7 @@
               <w:rPr>
                 <w:noProof/>
               </w:rPr>
-              <w:instrText xml:space="preserve"> PAGEREF _Toc240525918 \h </w:instrText>
+              <w:instrText xml:space="preserve"> PAGEREF _Toc240526448 \h </w:instrText>
             </w:r>
             <w:r>
               <w:rPr>
@@ -1125,7 +1125,7 @@
               <w14:ligatures w14:val="standardContextual"/>
             </w:rPr>
           </w:pPr>
-          <w:hyperlink w:anchor="_Toc240525919" w:history="1">
+          <w:hyperlink w:anchor="_Toc240526449" w:history="1">
             <w:r>
               <w:rPr>
                 <w:rStyle w:val="a5"/>
@@ -1149,7 +1149,7 @@
               <w:rPr>
                 <w:noProof/>
               </w:rPr>
-              <w:instrText xml:space="preserve"> PAGEREF _Toc240525919 \h </w:instrText>
+              <w:instrText xml:space="preserve"> PAGEREF _Toc240526449 \h </w:instrText>
             </w:r>
             <w:r>
               <w:rPr>
@@ -1191,7 +1191,7 @@
               <w14:ligatures w14:val="standardContextual"/>
             </w:rPr>
           </w:pPr>
-          <w:hyperlink w:anchor="_Toc240525920" w:history="1">
+          <w:hyperlink w:anchor="_Toc240526450" w:history="1">
             <w:r>
               <w:rPr>
                 <w:rStyle w:val="a5"/>
@@ -1215,7 +1215,7 @@
               <w:rPr>
                 <w:noProof/>
               </w:rPr>
-              <w:instrText xml:space="preserve"> PAGEREF _Toc240525920 \h </w:instrText>
+              <w:instrText xml:space="preserve"> PAGEREF _Toc240526450 \h </w:instrText>
             </w:r>
             <w:r>
               <w:rPr>
@@ -1258,7 +1258,7 @@
               <w14:ligatures w14:val="standardContextual"/>
             </w:rPr>
           </w:pPr>
-          <w:hyperlink w:anchor="_Toc240525921" w:history="1">
+          <w:hyperlink w:anchor="_Toc240526451" w:history="1">
             <w:r>
               <w:rPr>
                 <w:rStyle w:val="a5"/>
@@ -1282,7 +1282,7 @@
               <w:rPr>
                 <w:noProof/>
               </w:rPr>
-              <w:instrText xml:space="preserve"> PAGEREF _Toc240525921 \h </w:instrText>
+              <w:instrText xml:space="preserve"> PAGEREF _Toc240526451 \h </w:instrText>
             </w:r>
             <w:r>
               <w:rPr>
@@ -1325,7 +1325,7 @@
               <w14:ligatures w14:val="standardContextual"/>
             </w:rPr>
           </w:pPr>
-          <w:hyperlink w:anchor="_Toc240525922" w:history="1">
+          <w:hyperlink w:anchor="_Toc240526452" w:history="1">
             <w:r>
               <w:rPr>
                 <w:rStyle w:val="a5"/>
@@ -1349,7 +1349,7 @@
               <w:rPr>
                 <w:noProof/>
               </w:rPr>
-              <w:instrText xml:space="preserve"> PAGEREF _Toc240525922 \h </w:instrText>
+              <w:instrText xml:space="preserve"> PAGEREF _Toc240526452 \h </w:instrText>
             </w:r>
             <w:r>
               <w:rPr>
@@ -1392,7 +1392,7 @@
               <w14:ligatures w14:val="standardContextual"/>
             </w:rPr>
           </w:pPr>
-          <w:hyperlink w:anchor="_Toc240525923" w:history="1">
+          <w:hyperlink w:anchor="_Toc240526453" w:history="1">
             <w:r>
               <w:rPr>
                 <w:rStyle w:val="a5"/>
@@ -1416,7 +1416,7 @@
               <w:rPr>
                 <w:noProof/>
               </w:rPr>
-              <w:instrText xml:space="preserve"> PAGEREF _Toc240525923 \h </w:instrText>
+              <w:instrText xml:space="preserve"> PAGEREF _Toc240526453 \h </w:instrText>
             </w:r>
             <w:r>
               <w:rPr>
@@ -1459,7 +1459,7 @@
               <w14:ligatures w14:val="standardContextual"/>
             </w:rPr>
           </w:pPr>
-          <w:hyperlink w:anchor="_Toc240525924" w:history="1">
+          <w:hyperlink w:anchor="_Toc240526454" w:history="1">
             <w:r>
               <w:rPr>
                 <w:rStyle w:val="a5"/>
@@ -1483,7 +1483,7 @@
               <w:rPr>
                 <w:noProof/>
               </w:rPr>
-              <w:instrText xml:space="preserve"> PAGEREF _Toc240525924 \h </w:instrText>
+              <w:instrText xml:space="preserve"> PAGEREF _Toc240526454 \h </w:instrText>
             </w:r>
             <w:r>
               <w:rPr>
@@ -1526,7 +1526,7 @@
               <w14:ligatures w14:val="standardContextual"/>
             </w:rPr>
           </w:pPr>
-          <w:hyperlink w:anchor="_Toc240525925" w:history="1">
+          <w:hyperlink w:anchor="_Toc240526455" w:history="1">
             <w:r>
               <w:rPr>
                 <w:rStyle w:val="a5"/>
@@ -1550,7 +1550,7 @@
               <w:rPr>
                 <w:noProof/>
               </w:rPr>
-              <w:instrText xml:space="preserve"> PAGEREF _Toc240525925 \h </w:instrText>
+              <w:instrText xml:space="preserve"> PAGEREF _Toc240526455 \h </w:instrText>
             </w:r>
             <w:r>
               <w:rPr>
@@ -1592,7 +1592,7 @@
               <w14:ligatures w14:val="standardContextual"/>
             </w:rPr>
           </w:pPr>
-          <w:hyperlink w:anchor="_Toc240525926" w:history="1">
+          <w:hyperlink w:anchor="_Toc240526456" w:history="1">
             <w:r>
               <w:rPr>
                 <w:rStyle w:val="a5"/>
@@ -1616,7 +1616,7 @@
               <w:rPr>
                 <w:noProof/>
               </w:rPr>
-              <w:instrText xml:space="preserve"> PAGEREF _Toc240525926 \h </w:instrText>
+              <w:instrText xml:space="preserve"> PAGEREF _Toc240526456 \h </w:instrText>
             </w:r>
             <w:r>
               <w:rPr>
@@ -1659,7 +1659,7 @@
               <w14:ligatures w14:val="standardContextual"/>
             </w:rPr>
           </w:pPr>
-          <w:hyperlink w:anchor="_Toc240525927" w:history="1">
+          <w:hyperlink w:anchor="_Toc240526457" w:history="1">
             <w:r>
               <w:rPr>
                 <w:rStyle w:val="a5"/>
@@ -1683,7 +1683,7 @@
               <w:rPr>
                 <w:noProof/>
               </w:rPr>
-              <w:instrText xml:space="preserve"> PAGEREF _Toc240525927 \h </w:instrText>
+              <w:instrText xml:space="preserve"> PAGEREF _Toc240526457 \h </w:instrText>
             </w:r>
             <w:r>
               <w:rPr>
@@ -1726,7 +1726,7 @@
               <w14:ligatures w14:val="standardContextual"/>
             </w:rPr>
           </w:pPr>
-          <w:hyperlink w:anchor="_Toc240525928" w:history="1">
+          <w:hyperlink w:anchor="_Toc240526458" w:history="1">
             <w:r>
               <w:rPr>
                 <w:rStyle w:val="a5"/>
@@ -1750,7 +1750,7 @@
               <w:rPr>
                 <w:noProof/>
               </w:rPr>
-              <w:instrText xml:space="preserve"> PAGEREF _Toc240525928 \h </w:instrText>
+              <w:instrText xml:space="preserve"> PAGEREF _Toc240526458 \h </w:instrText>
             </w:r>
             <w:r>
               <w:rPr>
@@ -1793,7 +1793,7 @@
               <w14:ligatures w14:val="standardContextual"/>
             </w:rPr>
           </w:pPr>
-          <w:hyperlink w:anchor="_Toc240525929" w:history="1">
+          <w:hyperlink w:anchor="_Toc240526459" w:history="1">
             <w:r>
               <w:rPr>
                 <w:rStyle w:val="a5"/>
@@ -1817,7 +1817,7 @@
               <w:rPr>
                 <w:noProof/>
               </w:rPr>
-              <w:instrText xml:space="preserve"> PAGEREF _Toc240525929 \h </w:instrText>
+              <w:instrText xml:space="preserve"> PAGEREF _Toc240526459 \h </w:instrText>
             </w:r>
             <w:r>
               <w:rPr>
@@ -1860,7 +1860,7 @@
               <w14:ligatures w14:val="standardContextual"/>
             </w:rPr>
           </w:pPr>
-          <w:hyperlink w:anchor="_Toc240525930" w:history="1">
+          <w:hyperlink w:anchor="_Toc240526460" w:history="1">
             <w:r>
               <w:rPr>
                 <w:rStyle w:val="a5"/>
@@ -1884,7 +1884,7 @@
               <w:rPr>
                 <w:noProof/>
               </w:rPr>
-              <w:instrText xml:space="preserve"> PAGEREF _Toc240525930 \h </w:instrText>
+              <w:instrText xml:space="preserve"> PAGEREF _Toc240526460 \h </w:instrText>
             </w:r>
             <w:r>
               <w:rPr>
@@ -1927,7 +1927,7 @@
               <w14:ligatures w14:val="standardContextual"/>
             </w:rPr>
           </w:pPr>
-          <w:hyperlink w:anchor="_Toc240525931" w:history="1">
+          <w:hyperlink w:anchor="_Toc240526461" w:history="1">
             <w:r>
               <w:rPr>
                 <w:rStyle w:val="a5"/>
@@ -1951,7 +1951,7 @@
               <w:rPr>
                 <w:noProof/>
               </w:rPr>
-              <w:instrText xml:space="preserve"> PAGEREF _Toc240525931 \h </w:instrText>
+              <w:instrText xml:space="preserve"> PAGEREF _Toc240526461 \h </w:instrText>
             </w:r>
             <w:r>
               <w:rPr>
@@ -1994,7 +1994,7 @@
               <w14:ligatures w14:val="standardContextual"/>
             </w:rPr>
           </w:pPr>
-          <w:hyperlink w:anchor="_Toc240525932" w:history="1">
+          <w:hyperlink w:anchor="_Toc240526462" w:history="1">
             <w:r>
               <w:rPr>
                 <w:rStyle w:val="a5"/>
@@ -2018,7 +2018,7 @@
               <w:rPr>
                 <w:noProof/>
               </w:rPr>
-              <w:instrText xml:space="preserve"> PAGEREF _Toc240525932 \h </w:instrText>
+              <w:instrText xml:space="preserve"> PAGEREF _Toc240526462 \h </w:instrText>
             </w:r>
             <w:r>
               <w:rPr>
@@ -2060,7 +2060,7 @@
               <w14:ligatures w14:val="standardContextual"/>
             </w:rPr>
           </w:pPr>
-          <w:hyperlink w:anchor="_Toc240525933" w:history="1">
+          <w:hyperlink w:anchor="_Toc240526463" w:history="1">
             <w:r>
               <w:rPr>
                 <w:rStyle w:val="a5"/>
@@ -2084,7 +2084,7 @@
               <w:rPr>
                 <w:noProof/>
               </w:rPr>
-              <w:instrText xml:space="preserve"> PAGEREF _Toc240525933 \h </w:instrText>
+              <w:instrText xml:space="preserve"> PAGEREF _Toc240526463 \h </w:instrText>
             </w:r>
             <w:r>
               <w:rPr>
@@ -2126,7 +2126,7 @@
               <w14:ligatures w14:val="standardContextual"/>
             </w:rPr>
           </w:pPr>
-          <w:hyperlink w:anchor="_Toc240525934" w:history="1">
+          <w:hyperlink w:anchor="_Toc240526464" w:history="1">
             <w:r>
               <w:rPr>
                 <w:rStyle w:val="a5"/>
@@ -2150,7 +2150,7 @@
               <w:rPr>
                 <w:noProof/>
               </w:rPr>
-              <w:instrText xml:space="preserve"> PAGEREF _Toc240525934 \h </w:instrText>
+              <w:instrText xml:space="preserve"> PAGEREF _Toc240526464 \h </w:instrText>
             </w:r>
             <w:r>
               <w:rPr>
@@ -2193,7 +2193,7 @@
               <w14:ligatures w14:val="standardContextual"/>
             </w:rPr>
           </w:pPr>
-          <w:hyperlink w:anchor="_Toc240525935" w:history="1">
+          <w:hyperlink w:anchor="_Toc240526465" w:history="1">
             <w:r>
               <w:rPr>
                 <w:rStyle w:val="a5"/>
@@ -2217,7 +2217,7 @@
               <w:rPr>
                 <w:noProof/>
               </w:rPr>
-              <w:instrText xml:space="preserve"> PAGEREF _Toc240525935 \h </w:instrText>
+              <w:instrText xml:space="preserve"> PAGEREF _Toc240526465 \h </w:instrText>
             </w:r>
             <w:r>
               <w:rPr>
@@ -2259,7 +2259,7 @@
               <w14:ligatures w14:val="standardContextual"/>
             </w:rPr>
           </w:pPr>
-          <w:hyperlink w:anchor="_Toc240525936" w:history="1">
+          <w:hyperlink w:anchor="_Toc240526466" w:history="1">
             <w:r>
               <w:rPr>
                 <w:rStyle w:val="a5"/>
@@ -2283,7 +2283,7 @@
               <w:rPr>
                 <w:noProof/>
               </w:rPr>
-              <w:instrText xml:space="preserve"> PAGEREF _Toc240525936 \h </w:instrText>
+              <w:instrText xml:space="preserve"> PAGEREF _Toc240526466 \h </w:instrText>
             </w:r>
             <w:r>
               <w:rPr>
@@ -2326,7 +2326,7 @@
               <w14:ligatures w14:val="standardContextual"/>
             </w:rPr>
           </w:pPr>
-          <w:hyperlink w:anchor="_Toc240525937" w:history="1">
+          <w:hyperlink w:anchor="_Toc240526467" w:history="1">
             <w:r>
               <w:rPr>
                 <w:rStyle w:val="a5"/>
@@ -2350,7 +2350,7 @@
               <w:rPr>
                 <w:noProof/>
               </w:rPr>
-              <w:instrText xml:space="preserve"> PAGEREF _Toc240525937 \h </w:instrText>
+              <w:instrText xml:space="preserve"> PAGEREF _Toc240526467 \h </w:instrText>
             </w:r>
             <w:r>
               <w:rPr>
@@ -2393,7 +2393,7 @@
               <w14:ligatures w14:val="standardContextual"/>
             </w:rPr>
           </w:pPr>
-          <w:hyperlink w:anchor="_Toc240525938" w:history="1">
+          <w:hyperlink w:anchor="_Toc240526468" w:history="1">
             <w:r>
               <w:rPr>
                 <w:rStyle w:val="a5"/>
@@ -2417,7 +2417,7 @@
               <w:rPr>
                 <w:noProof/>
               </w:rPr>
-              <w:instrText xml:space="preserve"> PAGEREF _Toc240525938 \h </w:instrText>
+              <w:instrText xml:space="preserve"> PAGEREF _Toc240526468 \h </w:instrText>
             </w:r>
             <w:r>
               <w:rPr>
@@ -2460,7 +2460,7 @@
               <w14:ligatures w14:val="standardContextual"/>
             </w:rPr>
           </w:pPr>
-          <w:hyperlink w:anchor="_Toc240525939" w:history="1">
+          <w:hyperlink w:anchor="_Toc240526469" w:history="1">
             <w:r>
               <w:rPr>
                 <w:rStyle w:val="a5"/>
@@ -2484,7 +2484,7 @@
               <w:rPr>
                 <w:noProof/>
               </w:rPr>
-              <w:instrText xml:space="preserve"> PAGEREF _Toc240525939 \h </w:instrText>
+              <w:instrText xml:space="preserve"> PAGEREF _Toc240526469 \h </w:instrText>
             </w:r>
             <w:r>
               <w:rPr>
@@ -2526,7 +2526,7 @@
               <w14:ligatures w14:val="standardContextual"/>
             </w:rPr>
           </w:pPr>
-          <w:hyperlink w:anchor="_Toc240525940" w:history="1">
+          <w:hyperlink w:anchor="_Toc240526470" w:history="1">
             <w:r>
               <w:rPr>
                 <w:rStyle w:val="a5"/>
@@ -2550,7 +2550,7 @@
               <w:rPr>
                 <w:noProof/>
               </w:rPr>
-              <w:instrText xml:space="preserve"> PAGEREF _Toc240525940 \h </w:instrText>
+              <w:instrText xml:space="preserve"> PAGEREF _Toc240526470 \h </w:instrText>
             </w:r>
             <w:r>
               <w:rPr>
@@ -2593,7 +2593,7 @@
               <w14:ligatures w14:val="standardContextual"/>
             </w:rPr>
           </w:pPr>
-          <w:hyperlink w:anchor="_Toc240525941" w:history="1">
+          <w:hyperlink w:anchor="_Toc240526471" w:history="1">
             <w:r>
               <w:rPr>
                 <w:rStyle w:val="a5"/>
@@ -2617,7 +2617,7 @@
               <w:rPr>
                 <w:noProof/>
               </w:rPr>
-              <w:instrText xml:space="preserve"> PAGEREF _Toc240525941 \h </w:instrText>
+              <w:instrText xml:space="preserve"> PAGEREF _Toc240526471 \h </w:instrText>
             </w:r>
             <w:r>
               <w:rPr>
@@ -2660,7 +2660,7 @@
               <w14:ligatures w14:val="standardContextual"/>
             </w:rPr>
           </w:pPr>
-          <w:hyperlink w:anchor="_Toc240525942" w:history="1">
+          <w:hyperlink w:anchor="_Toc240526472" w:history="1">
             <w:r>
               <w:rPr>
                 <w:rStyle w:val="a5"/>
@@ -2684,7 +2684,7 @@
               <w:rPr>
                 <w:noProof/>
               </w:rPr>
-              <w:instrText xml:space="preserve"> PAGEREF _Toc240525942 \h </w:instrText>
+              <w:instrText xml:space="preserve"> PAGEREF _Toc240526472 \h </w:instrText>
             </w:r>
             <w:r>
               <w:rPr>
@@ -2726,7 +2726,7 @@
               <w14:ligatures w14:val="standardContextual"/>
             </w:rPr>
           </w:pPr>
-          <w:hyperlink w:anchor="_Toc240525943" w:history="1">
+          <w:hyperlink w:anchor="_Toc240526473" w:history="1">
             <w:r>
               <w:rPr>
                 <w:rStyle w:val="a5"/>
@@ -2750,7 +2750,7 @@
               <w:rPr>
                 <w:noProof/>
               </w:rPr>
-              <w:instrText xml:space="preserve"> PAGEREF _Toc240525943 \h </w:instrText>
+              <w:instrText xml:space="preserve"> PAGEREF _Toc240526473 \h </w:instrText>
             </w:r>
             <w:r>
               <w:rPr>
@@ -2792,7 +2792,7 @@
               <w14:ligatures w14:val="standardContextual"/>
             </w:rPr>
           </w:pPr>
-          <w:hyperlink w:anchor="_Toc240525944" w:history="1">
+          <w:hyperlink w:anchor="_Toc240526474" w:history="1">
             <w:r>
               <w:rPr>
                 <w:rStyle w:val="a5"/>
@@ -2816,7 +2816,7 @@
               <w:rPr>
                 <w:noProof/>
               </w:rPr>
-              <w:instrText xml:space="preserve"> PAGEREF _Toc240525944 \h </w:instrText>
+              <w:instrText xml:space="preserve"> PAGEREF _Toc240526474 \h </w:instrText>
             </w:r>
             <w:r>
               <w:rPr>
@@ -2859,7 +2859,7 @@
               <w14:ligatures w14:val="standardContextual"/>
             </w:rPr>
           </w:pPr>
-          <w:hyperlink w:anchor="_Toc240525945" w:history="1">
+          <w:hyperlink w:anchor="_Toc240526475" w:history="1">
             <w:r>
               <w:rPr>
                 <w:rStyle w:val="a5"/>
@@ -2883,7 +2883,7 @@
               <w:rPr>
                 <w:noProof/>
               </w:rPr>
-              <w:instrText xml:space="preserve"> PAGEREF _Toc240525945 \h </w:instrText>
+              <w:instrText xml:space="preserve"> PAGEREF _Toc240526475 \h </w:instrText>
             </w:r>
             <w:r>
               <w:rPr>
@@ -2926,7 +2926,7 @@
               <w14:ligatures w14:val="standardContextual"/>
             </w:rPr>
           </w:pPr>
-          <w:hyperlink w:anchor="_Toc240525946" w:history="1">
+          <w:hyperlink w:anchor="_Toc240526476" w:history="1">
             <w:r>
               <w:rPr>
                 <w:rStyle w:val="a5"/>
@@ -2950,7 +2950,7 @@
               <w:rPr>
                 <w:noProof/>
               </w:rPr>
-              <w:instrText xml:space="preserve"> PAGEREF _Toc240525946 \h </w:instrText>
+              <w:instrText xml:space="preserve"> PAGEREF _Toc240526476 \h </w:instrText>
             </w:r>
             <w:r>
               <w:rPr>
@@ -2993,7 +2993,7 @@
               <w14:ligatures w14:val="standardContextual"/>
             </w:rPr>
           </w:pPr>
-          <w:hyperlink w:anchor="_Toc240525947" w:history="1">
+          <w:hyperlink w:anchor="_Toc240526477" w:history="1">
             <w:r>
               <w:rPr>
                 <w:rStyle w:val="a5"/>
@@ -3017,7 +3017,7 @@
               <w:rPr>
                 <w:noProof/>
               </w:rPr>
-              <w:instrText xml:space="preserve"> PAGEREF _Toc240525947 \h </w:instrText>
+              <w:instrText xml:space="preserve"> PAGEREF _Toc240526477 \h </w:instrText>
             </w:r>
             <w:r>
               <w:rPr>
@@ -3059,7 +3059,7 @@
               <w14:ligatures w14:val="standardContextual"/>
             </w:rPr>
           </w:pPr>
-          <w:hyperlink w:anchor="_Toc240525948" w:history="1">
+          <w:hyperlink w:anchor="_Toc240526478" w:history="1">
             <w:r>
               <w:rPr>
                 <w:rStyle w:val="a5"/>
@@ -3083,7 +3083,7 @@
               <w:rPr>
                 <w:noProof/>
               </w:rPr>
-              <w:instrText xml:space="preserve"> PAGEREF _Toc240525948 \h </w:instrText>
+              <w:instrText xml:space="preserve"> PAGEREF _Toc240526478 \h </w:instrText>
             </w:r>
             <w:r>
               <w:rPr>
@@ -3125,7 +3125,7 @@
               <w14:ligatures w14:val="standardContextual"/>
             </w:rPr>
           </w:pPr>
-          <w:hyperlink w:anchor="_Toc240525949" w:history="1">
+          <w:hyperlink w:anchor="_Toc240526479" w:history="1">
             <w:r>
               <w:rPr>
                 <w:rStyle w:val="a5"/>
@@ -3149,7 +3149,7 @@
               <w:rPr>
                 <w:noProof/>
               </w:rPr>
-              <w:instrText xml:space="preserve"> PAGEREF _Toc240525949 \h </w:instrText>
+              <w:instrText xml:space="preserve"> PAGEREF _Toc240526479 \h </w:instrText>
             </w:r>
             <w:r>
               <w:rPr>
@@ -3191,7 +3191,7 @@
               <w14:ligatures w14:val="standardContextual"/>
             </w:rPr>
           </w:pPr>
-          <w:hyperlink w:anchor="_Toc240525950" w:history="1">
+          <w:hyperlink w:anchor="_Toc240526480" w:history="1">
             <w:r>
               <w:rPr>
                 <w:rStyle w:val="a5"/>
@@ -3215,7 +3215,7 @@
               <w:rPr>
                 <w:noProof/>
               </w:rPr>
-              <w:instrText xml:space="preserve"> PAGEREF _Toc240525950 \h </w:instrText>
+              <w:instrText xml:space="preserve"> PAGEREF _Toc240526480 \h </w:instrText>
             </w:r>
             <w:r>
               <w:rPr>
@@ -3257,7 +3257,7 @@
               <w14:ligatures w14:val="standardContextual"/>
             </w:rPr>
           </w:pPr>
-          <w:hyperlink w:anchor="_Toc240525951" w:history="1">
+          <w:hyperlink w:anchor="_Toc240526481" w:history="1">
             <w:r>
               <w:rPr>
                 <w:rStyle w:val="a5"/>
@@ -3281,7 +3281,7 @@
               <w:rPr>
                 <w:noProof/>
               </w:rPr>
-              <w:instrText xml:space="preserve"> PAGEREF _Toc240525951 \h </w:instrText>
+              <w:instrText xml:space="preserve"> PAGEREF _Toc240526481 \h </w:instrText>
             </w:r>
             <w:r>
               <w:rPr>
@@ -3324,7 +3324,7 @@
               <w14:ligatures w14:val="standardContextual"/>
             </w:rPr>
           </w:pPr>
-          <w:hyperlink w:anchor="_Toc240525952" w:history="1">
+          <w:hyperlink w:anchor="_Toc240526482" w:history="1">
             <w:r>
               <w:rPr>
                 <w:rStyle w:val="a5"/>
@@ -3348,7 +3348,7 @@
               <w:rPr>
                 <w:noProof/>
               </w:rPr>
-              <w:instrText xml:space="preserve"> PAGEREF _Toc240525952 \h </w:instrText>
+              <w:instrText xml:space="preserve"> PAGEREF _Toc240526482 \h </w:instrText>
             </w:r>
             <w:r>
               <w:rPr>
@@ -3391,7 +3391,7 @@
               <w14:ligatures w14:val="standardContextual"/>
             </w:rPr>
           </w:pPr>
-          <w:hyperlink w:anchor="_Toc240525953" w:history="1">
+          <w:hyperlink w:anchor="_Toc240526483" w:history="1">
             <w:r>
               <w:rPr>
                 <w:rStyle w:val="a5"/>
@@ -3415,7 +3415,7 @@
               <w:rPr>
                 <w:noProof/>
               </w:rPr>
-              <w:instrText xml:space="preserve"> PAGEREF _Toc240525953 \h </w:instrText>
+              <w:instrText xml:space="preserve"> PAGEREF _Toc240526483 \h </w:instrText>
             </w:r>
             <w:r>
               <w:rPr>
@@ -3458,7 +3458,7 @@
               <w14:ligatures w14:val="standardContextual"/>
             </w:rPr>
           </w:pPr>
-          <w:hyperlink w:anchor="_Toc240525954" w:history="1">
+          <w:hyperlink w:anchor="_Toc240526484" w:history="1">
             <w:r>
               <w:rPr>
                 <w:rStyle w:val="a5"/>
@@ -3482,7 +3482,7 @@
               <w:rPr>
                 <w:noProof/>
               </w:rPr>
-              <w:instrText xml:space="preserve"> PAGEREF _Toc240525954 \h </w:instrText>
+              <w:instrText xml:space="preserve"> PAGEREF _Toc240526484 \h </w:instrText>
             </w:r>
             <w:r>
               <w:rPr>
@@ -3525,7 +3525,7 @@
               <w14:ligatures w14:val="standardContextual"/>
             </w:rPr>
           </w:pPr>
-          <w:hyperlink w:anchor="_Toc240525955" w:history="1">
+          <w:hyperlink w:anchor="_Toc240526485" w:history="1">
             <w:r>
               <w:rPr>
                 <w:rStyle w:val="a5"/>
@@ -3549,7 +3549,7 @@
               <w:rPr>
                 <w:noProof/>
               </w:rPr>
-              <w:instrText xml:space="preserve"> PAGEREF _Toc240525955 \h </w:instrText>
+              <w:instrText xml:space="preserve"> PAGEREF _Toc240526485 \h </w:instrText>
             </w:r>
             <w:r>
               <w:rPr>
@@ -3588,7 +3588,7 @@
         <w:pStyle w:val="1"/>
         <w:pageBreakBefore/>
       </w:pPr>
-      <w:bookmarkStart w:id="0" w:name="_Toc240525910"/>
+      <w:bookmarkStart w:id="0" w:name="_Toc240526440"/>
       <w:r>
         <w:lastRenderedPageBreak/>
         <w:t xml:space="preserve">1. </w:t>
@@ -3602,7 +3602,7 @@
       <w:pPr>
         <w:pStyle w:val="2"/>
       </w:pPr>
-      <w:bookmarkStart w:id="1" w:name="_Toc240525911"/>
+      <w:bookmarkStart w:id="1" w:name="_Toc240526441"/>
       <w:r>
         <w:t>1.1 RuninqVic</w:t>
       </w:r>
@@ -4012,7 +4012,7 @@
       <w:pPr>
         <w:pStyle w:val="2"/>
       </w:pPr>
-      <w:bookmarkStart w:id="2" w:name="_Toc240525912"/>
+      <w:bookmarkStart w:id="2" w:name="_Toc240526442"/>
       <w:r>
         <w:t xml:space="preserve">1.2 </w:t>
       </w:r>
@@ -6821,7 +6821,7 @@
       <w:pPr>
         <w:pStyle w:val="2"/>
       </w:pPr>
-      <w:bookmarkStart w:id="3" w:name="_Toc240525913"/>
+      <w:bookmarkStart w:id="3" w:name="_Toc240526443"/>
       <w:r>
         <w:t xml:space="preserve">1.3 </w:t>
       </w:r>
@@ -7053,7 +7053,7 @@
         <w:pStyle w:val="1"/>
         <w:pageBreakBefore/>
       </w:pPr>
-      <w:bookmarkStart w:id="4" w:name="_Toc240525914"/>
+      <w:bookmarkStart w:id="4" w:name="_Toc240526444"/>
       <w:r>
         <w:lastRenderedPageBreak/>
         <w:t xml:space="preserve">2. </w:t>
@@ -7067,7 +7067,7 @@
       <w:pPr>
         <w:pStyle w:val="2"/>
       </w:pPr>
-      <w:bookmarkStart w:id="5" w:name="_Toc240525915"/>
+      <w:bookmarkStart w:id="5" w:name="_Toc240526445"/>
       <w:r>
         <w:t xml:space="preserve">2.1 </w:t>
       </w:r>
@@ -8045,7 +8045,7 @@
       <w:pPr>
         <w:pStyle w:val="2"/>
       </w:pPr>
-      <w:bookmarkStart w:id="6" w:name="_Toc240525916"/>
+      <w:bookmarkStart w:id="6" w:name="_Toc240526446"/>
       <w:r>
         <w:t xml:space="preserve">2.2 </w:t>
       </w:r>
@@ -8399,10 +8399,10 @@
         </w:rPr>
         <w:lastRenderedPageBreak/>
         <w:drawing>
-          <wp:inline distT="0" distB="0" distL="0" distR="0" wp14:anchorId="3A192AF0" wp14:editId="7290FD25">
+          <wp:inline distT="0" distB="0" distL="0" distR="0" wp14:anchorId="50148B3B" wp14:editId="3F2E2D5A">
             <wp:extent cx="5943600" cy="3638550"/>
             <wp:effectExtent l="0" t="0" r="0" b="0"/>
-            <wp:docPr id="527807753" name="그림 527807753"/>
+            <wp:docPr id="1302441777" name="그림 1302441777"/>
             <wp:cNvGraphicFramePr>
               <a:graphicFrameLocks xmlns:a="http://schemas.openxmlformats.org/drawingml/2006/main" noChangeAspect="1"/>
             </wp:cNvGraphicFramePr>
@@ -8518,7 +8518,7 @@
       <w:pPr>
         <w:pStyle w:val="2"/>
       </w:pPr>
-      <w:bookmarkStart w:id="7" w:name="_Toc240525917"/>
+      <w:bookmarkStart w:id="7" w:name="_Toc240526447"/>
       <w:r>
         <w:t xml:space="preserve">2.3 </w:t>
       </w:r>
@@ -8543,10 +8543,10 @@
           <w:noProof/>
         </w:rPr>
         <w:drawing>
-          <wp:inline distT="0" distB="0" distL="0" distR="0" wp14:anchorId="3F4C6AFA" wp14:editId="71B0E072">
+          <wp:inline distT="0" distB="0" distL="0" distR="0" wp14:anchorId="698EA425" wp14:editId="203C001A">
             <wp:extent cx="5943600" cy="3638550"/>
             <wp:effectExtent l="0" t="0" r="0" b="0"/>
-            <wp:docPr id="1508373030" name="그림 1508373030"/>
+            <wp:docPr id="1407301033" name="그림 1407301033"/>
             <wp:cNvGraphicFramePr>
               <a:graphicFrameLocks xmlns:a="http://schemas.openxmlformats.org/drawingml/2006/main" noChangeAspect="1"/>
             </wp:cNvGraphicFramePr>
@@ -9976,7 +9976,7 @@
       <w:pPr>
         <w:pStyle w:val="2"/>
       </w:pPr>
-      <w:bookmarkStart w:id="8" w:name="_Toc240525918"/>
+      <w:bookmarkStart w:id="8" w:name="_Toc240526448"/>
       <w:r>
         <w:t xml:space="preserve">2.4 </w:t>
       </w:r>
@@ -10002,10 +10002,10 @@
         </w:rPr>
         <w:lastRenderedPageBreak/>
         <w:drawing>
-          <wp:inline distT="0" distB="0" distL="0" distR="0" wp14:anchorId="299F5746" wp14:editId="60E3D498">
+          <wp:inline distT="0" distB="0" distL="0" distR="0" wp14:anchorId="38DCA50F" wp14:editId="03B51276">
             <wp:extent cx="5943600" cy="12858750"/>
             <wp:effectExtent l="0" t="0" r="0" b="0"/>
-            <wp:docPr id="1720188493" name="그림 1720188493"/>
+            <wp:docPr id="79514819" name="그림 79514819"/>
             <wp:cNvGraphicFramePr>
               <a:graphicFrameLocks xmlns:a="http://schemas.openxmlformats.org/drawingml/2006/main" noChangeAspect="1"/>
             </wp:cNvGraphicFramePr>
@@ -12671,7 +12671,7 @@
         <w:pStyle w:val="1"/>
         <w:pageBreakBefore/>
       </w:pPr>
-      <w:bookmarkStart w:id="9" w:name="_Toc240525919"/>
+      <w:bookmarkStart w:id="9" w:name="_Toc240526449"/>
       <w:r>
         <w:lastRenderedPageBreak/>
         <w:t>3. 5</w:t>
@@ -13375,7 +13375,7 @@
         <w:pStyle w:val="1"/>
         <w:pageBreakBefore/>
       </w:pPr>
-      <w:bookmarkStart w:id="10" w:name="_Toc240525920"/>
+      <w:bookmarkStart w:id="10" w:name="_Toc240526450"/>
       <w:r>
         <w:lastRenderedPageBreak/>
         <w:t xml:space="preserve">4. </w:t>
@@ -13454,7 +13454,7 @@
       <w:pPr>
         <w:pStyle w:val="2"/>
       </w:pPr>
-      <w:bookmarkStart w:id="11" w:name="_Toc240525921"/>
+      <w:bookmarkStart w:id="11" w:name="_Toc240526451"/>
       <w:r>
         <w:t xml:space="preserve">4.1 ① </w:t>
       </w:r>
@@ -14176,7 +14176,7 @@
       <w:pPr>
         <w:pStyle w:val="2"/>
       </w:pPr>
-      <w:bookmarkStart w:id="12" w:name="_Toc240525922"/>
+      <w:bookmarkStart w:id="12" w:name="_Toc240526452"/>
       <w:r>
         <w:t xml:space="preserve">4.2 ② </w:t>
       </w:r>
@@ -14201,6 +14201,18 @@
         <w:t>＋</w:t>
       </w:r>
       <w:r>
+        <w:t xml:space="preserve"> </w:t>
+      </w:r>
+      <w:r>
+        <w:t>곡</w:t>
+      </w:r>
+      <w:r>
+        <w:t xml:space="preserve"> </w:t>
+      </w:r>
+      <w:r>
+        <w:t>추가</w:t>
+      </w:r>
+      <w:r>
         <w:t xml:space="preserve">]: </w:t>
       </w:r>
       <w:r>
@@ -14609,13 +14621,7 @@
         <w:spacing w:after="80" w:line="300" w:lineRule="auto"/>
       </w:pPr>
       <w:r>
-        <w:t xml:space="preserve">[✨ AI </w:t>
-      </w:r>
-      <w:r>
-        <w:t>작곡</w:t>
-      </w:r>
-      <w:r>
-        <w:t xml:space="preserve">]: </w:t>
+        <w:t xml:space="preserve">[AI]: </w:t>
       </w:r>
       <w:r>
         <w:t>가지고</w:t>
@@ -14706,7 +14712,7 @@
       <w:pPr>
         <w:pStyle w:val="2"/>
       </w:pPr>
-      <w:bookmarkStart w:id="13" w:name="_Toc240525923"/>
+      <w:bookmarkStart w:id="13" w:name="_Toc240526453"/>
       <w:r>
         <w:t>4.2.1 AI</w:t>
       </w:r>
@@ -14738,10 +14744,10 @@
         </w:rPr>
         <w:lastRenderedPageBreak/>
         <w:drawing>
-          <wp:inline distT="0" distB="0" distL="0" distR="0" wp14:anchorId="1F5FC5F4" wp14:editId="3839E959">
+          <wp:inline distT="0" distB="0" distL="0" distR="0" wp14:anchorId="5491DC75" wp14:editId="7AC3590E">
             <wp:extent cx="5943600" cy="3638550"/>
             <wp:effectExtent l="0" t="0" r="0" b="0"/>
-            <wp:docPr id="1970407371" name="그림 1970407371"/>
+            <wp:docPr id="299212964" name="그림 299212964"/>
             <wp:cNvGraphicFramePr>
               <a:graphicFrameLocks xmlns:a="http://schemas.openxmlformats.org/drawingml/2006/main" noChangeAspect="1"/>
             </wp:cNvGraphicFramePr>
@@ -14867,16 +14873,28 @@
         <w:t xml:space="preserve"> </w:t>
       </w:r>
       <w:r>
-        <w:t>항목의</w:t>
-      </w:r>
-      <w:r>
-        <w:t xml:space="preserve"> [✨ AI </w:t>
-      </w:r>
-      <w:r>
-        <w:t>작곡</w:t>
-      </w:r>
-      <w:r>
-        <w:t>](</w:t>
+        <w:t>항목</w:t>
+      </w:r>
+      <w:r>
+        <w:t xml:space="preserve"> </w:t>
+      </w:r>
+      <w:r>
+        <w:t>오른쪽</w:t>
+      </w:r>
+      <w:r>
+        <w:t xml:space="preserve"> </w:t>
+      </w:r>
+      <w:r>
+        <w:t>끝의</w:t>
+      </w:r>
+      <w:r>
+        <w:t xml:space="preserve"> [AI] </w:t>
+      </w:r>
+      <w:r>
+        <w:t>버튼</w:t>
+      </w:r>
+      <w:r>
+        <w:t>(</w:t>
       </w:r>
       <w:r>
         <w:t>음악</w:t>
@@ -18684,7 +18702,7 @@
       <w:pPr>
         <w:pStyle w:val="2"/>
       </w:pPr>
-      <w:bookmarkStart w:id="14" w:name="_Toc240525924"/>
+      <w:bookmarkStart w:id="14" w:name="_Toc240526454"/>
       <w:r>
         <w:t xml:space="preserve">4.3 ③ </w:t>
       </w:r>
@@ -20284,7 +20302,7 @@
       <w:pPr>
         <w:pStyle w:val="2"/>
       </w:pPr>
-      <w:bookmarkStart w:id="15" w:name="_Toc240525925"/>
+      <w:bookmarkStart w:id="15" w:name="_Toc240526455"/>
       <w:r>
         <w:t xml:space="preserve">4.4 ④ </w:t>
       </w:r>
@@ -20792,7 +20810,7 @@
         <w:pStyle w:val="1"/>
         <w:pageBreakBefore/>
       </w:pPr>
-      <w:bookmarkStart w:id="16" w:name="_Toc240525926"/>
+      <w:bookmarkStart w:id="16" w:name="_Toc240526456"/>
       <w:r>
         <w:lastRenderedPageBreak/>
         <w:t xml:space="preserve">5. </w:t>
@@ -20818,7 +20836,7 @@
       <w:pPr>
         <w:pStyle w:val="2"/>
       </w:pPr>
-      <w:bookmarkStart w:id="17" w:name="_Toc240525927"/>
+      <w:bookmarkStart w:id="17" w:name="_Toc240526457"/>
       <w:r>
         <w:t xml:space="preserve">5.1 </w:t>
       </w:r>
@@ -21127,7 +21145,7 @@
       <w:pPr>
         <w:pStyle w:val="2"/>
       </w:pPr>
-      <w:bookmarkStart w:id="18" w:name="_Toc240525928"/>
+      <w:bookmarkStart w:id="18" w:name="_Toc240526458"/>
       <w:r>
         <w:t xml:space="preserve">5.2 </w:t>
       </w:r>
@@ -21656,7 +21674,7 @@
       <w:pPr>
         <w:pStyle w:val="2"/>
       </w:pPr>
-      <w:bookmarkStart w:id="19" w:name="_Toc240525929"/>
+      <w:bookmarkStart w:id="19" w:name="_Toc240526459"/>
       <w:r>
         <w:t xml:space="preserve">5.3 </w:t>
       </w:r>
@@ -21927,7 +21945,7 @@
       <w:pPr>
         <w:pStyle w:val="2"/>
       </w:pPr>
-      <w:bookmarkStart w:id="20" w:name="_Toc240525930"/>
+      <w:bookmarkStart w:id="20" w:name="_Toc240526460"/>
       <w:r>
         <w:t xml:space="preserve">5.4 </w:t>
       </w:r>
@@ -22137,7 +22155,7 @@
       <w:pPr>
         <w:pStyle w:val="2"/>
       </w:pPr>
-      <w:bookmarkStart w:id="21" w:name="_Toc240525931"/>
+      <w:bookmarkStart w:id="21" w:name="_Toc240526461"/>
       <w:r>
         <w:t xml:space="preserve">5.5 </w:t>
       </w:r>
@@ -22360,7 +22378,7 @@
       <w:pPr>
         <w:pStyle w:val="2"/>
       </w:pPr>
-      <w:bookmarkStart w:id="22" w:name="_Toc240525932"/>
+      <w:bookmarkStart w:id="22" w:name="_Toc240526462"/>
       <w:r>
         <w:t xml:space="preserve">5.6 </w:t>
       </w:r>
@@ -22481,7 +22499,7 @@
         <w:pStyle w:val="1"/>
         <w:pageBreakBefore/>
       </w:pPr>
-      <w:bookmarkStart w:id="23" w:name="_Toc240525933"/>
+      <w:bookmarkStart w:id="23" w:name="_Toc240526463"/>
       <w:r>
         <w:lastRenderedPageBreak/>
         <w:t xml:space="preserve">6. </w:t>
@@ -24330,7 +24348,7 @@
         <w:pStyle w:val="1"/>
         <w:pageBreakBefore/>
       </w:pPr>
-      <w:bookmarkStart w:id="24" w:name="_Toc240525934"/>
+      <w:bookmarkStart w:id="24" w:name="_Toc240526464"/>
       <w:r>
         <w:lastRenderedPageBreak/>
         <w:t xml:space="preserve">7. </w:t>
@@ -24350,10 +24368,10 @@
           <w:noProof/>
         </w:rPr>
         <w:drawing>
-          <wp:inline distT="0" distB="0" distL="0" distR="0" wp14:anchorId="20B9CEA8" wp14:editId="1339B5E9">
+          <wp:inline distT="0" distB="0" distL="0" distR="0" wp14:anchorId="333C6526" wp14:editId="2F012E69">
             <wp:extent cx="5943600" cy="3638550"/>
             <wp:effectExtent l="0" t="0" r="0" b="0"/>
-            <wp:docPr id="1224426383" name="그림 1224426383"/>
+            <wp:docPr id="2065796674" name="그림 2065796674"/>
             <wp:cNvGraphicFramePr>
               <a:graphicFrameLocks xmlns:a="http://schemas.openxmlformats.org/drawingml/2006/main" noChangeAspect="1"/>
             </wp:cNvGraphicFramePr>
@@ -27159,7 +27177,7 @@
       <w:pPr>
         <w:pStyle w:val="2"/>
       </w:pPr>
-      <w:bookmarkStart w:id="25" w:name="_Toc240525935"/>
+      <w:bookmarkStart w:id="25" w:name="_Toc240526465"/>
       <w:r>
         <w:t xml:space="preserve">7.1 </w:t>
       </w:r>
@@ -27190,10 +27208,10 @@
           <w:noProof/>
         </w:rPr>
         <w:drawing>
-          <wp:inline distT="0" distB="0" distL="0" distR="0" wp14:anchorId="28046BEF" wp14:editId="4CAD83D2">
+          <wp:inline distT="0" distB="0" distL="0" distR="0" wp14:anchorId="5B5E302F" wp14:editId="476B6433">
             <wp:extent cx="5943600" cy="3638550"/>
             <wp:effectExtent l="0" t="0" r="0" b="0"/>
-            <wp:docPr id="803202566" name="그림 803202566"/>
+            <wp:docPr id="687640389" name="그림 687640389"/>
             <wp:cNvGraphicFramePr>
               <a:graphicFrameLocks xmlns:a="http://schemas.openxmlformats.org/drawingml/2006/main" noChangeAspect="1"/>
             </wp:cNvGraphicFramePr>
@@ -30842,7 +30860,7 @@
         <w:pStyle w:val="1"/>
         <w:pageBreakBefore/>
       </w:pPr>
-      <w:bookmarkStart w:id="26" w:name="_Toc240525936"/>
+      <w:bookmarkStart w:id="26" w:name="_Toc240526466"/>
       <w:r>
         <w:lastRenderedPageBreak/>
         <w:t xml:space="preserve">8. </w:t>
@@ -30862,10 +30880,10 @@
           <w:noProof/>
         </w:rPr>
         <w:drawing>
-          <wp:inline distT="0" distB="0" distL="0" distR="0" wp14:anchorId="37A6DA85" wp14:editId="1719E1E2">
+          <wp:inline distT="0" distB="0" distL="0" distR="0" wp14:anchorId="7DEFCC4B" wp14:editId="737D5C4B">
             <wp:extent cx="5943600" cy="3638550"/>
             <wp:effectExtent l="0" t="0" r="0" b="0"/>
-            <wp:docPr id="629758795" name="그림 629758795"/>
+            <wp:docPr id="458305147" name="그림 458305147"/>
             <wp:cNvGraphicFramePr>
               <a:graphicFrameLocks xmlns:a="http://schemas.openxmlformats.org/drawingml/2006/main" noChangeAspect="1"/>
             </wp:cNvGraphicFramePr>
@@ -30961,7 +30979,7 @@
       <w:pPr>
         <w:pStyle w:val="2"/>
       </w:pPr>
-      <w:bookmarkStart w:id="27" w:name="_Toc240525937"/>
+      <w:bookmarkStart w:id="27" w:name="_Toc240526467"/>
       <w:r>
         <w:t xml:space="preserve">8.1 </w:t>
       </w:r>
@@ -32049,7 +32067,7 @@
       <w:pPr>
         <w:pStyle w:val="2"/>
       </w:pPr>
-      <w:bookmarkStart w:id="28" w:name="_Toc240525938"/>
+      <w:bookmarkStart w:id="28" w:name="_Toc240526468"/>
       <w:r>
         <w:t xml:space="preserve">8.2 </w:t>
       </w:r>
@@ -33302,7 +33320,7 @@
       <w:pPr>
         <w:pStyle w:val="2"/>
       </w:pPr>
-      <w:bookmarkStart w:id="29" w:name="_Toc240525939"/>
+      <w:bookmarkStart w:id="29" w:name="_Toc240526469"/>
       <w:r>
         <w:t xml:space="preserve">8.3 </w:t>
       </w:r>
@@ -33555,7 +33573,7 @@
         <w:pStyle w:val="1"/>
         <w:pageBreakBefore/>
       </w:pPr>
-      <w:bookmarkStart w:id="30" w:name="_Toc240525940"/>
+      <w:bookmarkStart w:id="30" w:name="_Toc240526470"/>
       <w:r>
         <w:lastRenderedPageBreak/>
         <w:t xml:space="preserve">9. </w:t>
@@ -33575,10 +33593,10 @@
           <w:noProof/>
         </w:rPr>
         <w:drawing>
-          <wp:inline distT="0" distB="0" distL="0" distR="0" wp14:anchorId="56FB4C1B" wp14:editId="01A379B6">
+          <wp:inline distT="0" distB="0" distL="0" distR="0" wp14:anchorId="2B4A9D9C" wp14:editId="688D46F5">
             <wp:extent cx="5943600" cy="3638550"/>
             <wp:effectExtent l="0" t="0" r="0" b="0"/>
-            <wp:docPr id="248765626" name="그림 248765626"/>
+            <wp:docPr id="378562467" name="그림 378562467"/>
             <wp:cNvGraphicFramePr>
               <a:graphicFrameLocks xmlns:a="http://schemas.openxmlformats.org/drawingml/2006/main" noChangeAspect="1"/>
             </wp:cNvGraphicFramePr>
@@ -33674,7 +33692,7 @@
       <w:pPr>
         <w:pStyle w:val="2"/>
       </w:pPr>
-      <w:bookmarkStart w:id="31" w:name="_Toc240525941"/>
+      <w:bookmarkStart w:id="31" w:name="_Toc240526471"/>
       <w:r>
         <w:t xml:space="preserve">9.1 </w:t>
       </w:r>
@@ -35050,7 +35068,7 @@
       <w:pPr>
         <w:pStyle w:val="2"/>
       </w:pPr>
-      <w:bookmarkStart w:id="32" w:name="_Toc240525942"/>
+      <w:bookmarkStart w:id="32" w:name="_Toc240526472"/>
       <w:r>
         <w:t xml:space="preserve">9.2 </w:t>
       </w:r>
@@ -35219,7 +35237,7 @@
         <w:pStyle w:val="1"/>
         <w:pageBreakBefore/>
       </w:pPr>
-      <w:bookmarkStart w:id="33" w:name="_Toc240525943"/>
+      <w:bookmarkStart w:id="33" w:name="_Toc240526473"/>
       <w:r>
         <w:lastRenderedPageBreak/>
         <w:t xml:space="preserve">10. </w:t>
@@ -35245,10 +35263,10 @@
           <w:noProof/>
         </w:rPr>
         <w:drawing>
-          <wp:inline distT="0" distB="0" distL="0" distR="0" wp14:anchorId="7780DCAF" wp14:editId="259F0DCD">
+          <wp:inline distT="0" distB="0" distL="0" distR="0" wp14:anchorId="0EE80451" wp14:editId="75FA4CB2">
             <wp:extent cx="5943600" cy="3638550"/>
             <wp:effectExtent l="0" t="0" r="0" b="0"/>
-            <wp:docPr id="1337305198" name="그림 1337305198"/>
+            <wp:docPr id="793527301" name="그림 793527301"/>
             <wp:cNvGraphicFramePr>
               <a:graphicFrameLocks xmlns:a="http://schemas.openxmlformats.org/drawingml/2006/main" noChangeAspect="1"/>
             </wp:cNvGraphicFramePr>
@@ -36884,7 +36902,7 @@
         <w:pStyle w:val="1"/>
         <w:pageBreakBefore/>
       </w:pPr>
-      <w:bookmarkStart w:id="34" w:name="_Toc240525944"/>
+      <w:bookmarkStart w:id="34" w:name="_Toc240526474"/>
       <w:r>
         <w:lastRenderedPageBreak/>
         <w:t xml:space="preserve">11. </w:t>
@@ -36910,10 +36928,10 @@
           <w:noProof/>
         </w:rPr>
         <w:drawing>
-          <wp:inline distT="0" distB="0" distL="0" distR="0" wp14:anchorId="61E149F6" wp14:editId="1ADF5011">
+          <wp:inline distT="0" distB="0" distL="0" distR="0" wp14:anchorId="1E5D4E7D" wp14:editId="7C98D4C4">
             <wp:extent cx="5943600" cy="3638550"/>
             <wp:effectExtent l="0" t="0" r="0" b="0"/>
-            <wp:docPr id="1441052594" name="그림 1441052594"/>
+            <wp:docPr id="1369408137" name="그림 1369408137"/>
             <wp:cNvGraphicFramePr>
               <a:graphicFrameLocks xmlns:a="http://schemas.openxmlformats.org/drawingml/2006/main" noChangeAspect="1"/>
             </wp:cNvGraphicFramePr>
@@ -37029,7 +37047,7 @@
       <w:pPr>
         <w:pStyle w:val="2"/>
       </w:pPr>
-      <w:bookmarkStart w:id="35" w:name="_Toc240525945"/>
+      <w:bookmarkStart w:id="35" w:name="_Toc240526475"/>
       <w:r>
         <w:t xml:space="preserve">11.1 </w:t>
       </w:r>
@@ -38328,7 +38346,7 @@
       <w:pPr>
         <w:pStyle w:val="2"/>
       </w:pPr>
-      <w:bookmarkStart w:id="36" w:name="_Toc240525946"/>
+      <w:bookmarkStart w:id="36" w:name="_Toc240526476"/>
       <w:r>
         <w:t xml:space="preserve">11.2 </w:t>
       </w:r>
@@ -38769,7 +38787,7 @@
       <w:pPr>
         <w:pStyle w:val="2"/>
       </w:pPr>
-      <w:bookmarkStart w:id="37" w:name="_Toc240525947"/>
+      <w:bookmarkStart w:id="37" w:name="_Toc240526477"/>
       <w:r>
         <w:t xml:space="preserve">11.3 </w:t>
       </w:r>
@@ -39310,7 +39328,7 @@
         <w:pStyle w:val="1"/>
         <w:pageBreakBefore/>
       </w:pPr>
-      <w:bookmarkStart w:id="38" w:name="_Toc240525948"/>
+      <w:bookmarkStart w:id="38" w:name="_Toc240526478"/>
       <w:r>
         <w:lastRenderedPageBreak/>
         <w:t xml:space="preserve">12. </w:t>
@@ -40768,7 +40786,7 @@
         <w:pStyle w:val="1"/>
         <w:pageBreakBefore/>
       </w:pPr>
-      <w:bookmarkStart w:id="39" w:name="_Toc240525949"/>
+      <w:bookmarkStart w:id="39" w:name="_Toc240526479"/>
       <w:r>
         <w:lastRenderedPageBreak/>
         <w:t xml:space="preserve">13. </w:t>
@@ -41849,7 +41867,7 @@
         <w:pStyle w:val="1"/>
         <w:pageBreakBefore/>
       </w:pPr>
-      <w:bookmarkStart w:id="40" w:name="_Toc240525950"/>
+      <w:bookmarkStart w:id="40" w:name="_Toc240526480"/>
       <w:r>
         <w:lastRenderedPageBreak/>
         <w:t xml:space="preserve">14. </w:t>
@@ -44874,7 +44892,7 @@
         <w:pStyle w:val="1"/>
         <w:pageBreakBefore/>
       </w:pPr>
-      <w:bookmarkStart w:id="41" w:name="_Toc240525951"/>
+      <w:bookmarkStart w:id="41" w:name="_Toc240526481"/>
       <w:r>
         <w:lastRenderedPageBreak/>
         <w:t>부록</w:t>
@@ -44885,7 +44903,7 @@
       <w:pPr>
         <w:pStyle w:val="2"/>
       </w:pPr>
-      <w:bookmarkStart w:id="42" w:name="_Toc240525952"/>
+      <w:bookmarkStart w:id="42" w:name="_Toc240526482"/>
       <w:r>
         <w:t xml:space="preserve">A. </w:t>
       </w:r>
@@ -45466,7 +45484,7 @@
       <w:pPr>
         <w:pStyle w:val="2"/>
       </w:pPr>
-      <w:bookmarkStart w:id="43" w:name="_Toc240525953"/>
+      <w:bookmarkStart w:id="43" w:name="_Toc240526483"/>
       <w:r>
         <w:t xml:space="preserve">B. </w:t>
       </w:r>
@@ -45701,7 +45719,7 @@
       <w:pPr>
         <w:pStyle w:val="2"/>
       </w:pPr>
-      <w:bookmarkStart w:id="44" w:name="_Toc240525954"/>
+      <w:bookmarkStart w:id="44" w:name="_Toc240526484"/>
       <w:r>
         <w:t xml:space="preserve">C. </w:t>
       </w:r>
@@ -46776,7 +46794,7 @@
       <w:pPr>
         <w:pStyle w:val="2"/>
       </w:pPr>
-      <w:bookmarkStart w:id="45" w:name="_Toc240525955"/>
+      <w:bookmarkStart w:id="45" w:name="_Toc240526485"/>
       <w:r>
         <w:t xml:space="preserve">D. </w:t>
       </w:r>
@@ -47205,10 +47223,64 @@
 <file path=word/numbering.xml><?xml version="1.0" encoding="utf-8"?>
 <w:numbering xmlns:wpc="http://schemas.microsoft.com/office/word/2010/wordprocessingCanvas" xmlns:cx="http://schemas.microsoft.com/office/drawing/2014/chartex" xmlns:cx1="http://schemas.microsoft.com/office/drawing/2015/9/8/chartex" xmlns:cx2="http://schemas.microsoft.com/office/drawing/2015/10/21/chartex" xmlns:cx3="http://schemas.microsoft.com/office/drawing/2016/5/9/chartex" xmlns:cx4="http://schemas.microsoft.com/office/drawing/2016/5/10/chartex" xmlns:cx5="http://schemas.microsoft.com/office/drawing/2016/5/11/chartex" xmlns:cx6="http://schemas.microsoft.com/office/drawing/2016/5/12/chartex" xmlns:cx7="http://schemas.microsoft.com/office/drawing/2016/5/13/chartex" xmlns:cx8="http://schemas.microsoft.com/office/drawing/2016/5/14/chartex" xmlns:mc="http://schemas.openxmlformats.org/markup-compatibility/2006" xmlns:aink="http://schemas.microsoft.com/office/drawing/2016/ink" xmlns:am3d="http://schemas.microsoft.com/office/drawing/2017/model3d" xmlns:o="urn:schemas-microsoft-com:office:office" xmlns:oel="http://schemas.microsoft.com/office/2019/extlst" xmlns:r="http://schemas.openxmlformats.org/officeDocument/2006/relationships" xmlns:m="http://schemas.openxmlformats.org/officeDocument/2006/math" xmlns:v="urn:schemas-microsoft-com:vml" xmlns:wp14="http://schemas.microsoft.com/office/word/2010/wordprocessingDrawing" xmlns:wp="http://schemas.openxmlformats.org/drawingml/2006/wordprocessingDrawing" xmlns:w10="urn:schemas-microsoft-com:office:word" xmlns:w="http://schemas.openxmlformats.org/wordprocessingml/2006/main" xmlns:w14="http://schemas.microsoft.com/office/word/2010/wordml" xmlns:w15="http://schemas.microsoft.com/office/word/2012/wordml" xmlns:w16cex="http://schemas.microsoft.com/office/word/2018/wordml/cex" xmlns:w16cid="http://schemas.microsoft.com/office/word/2016/wordml/cid" xmlns:w16="http://schemas.microsoft.com/office/word/2018/wordml" xmlns:w16du="http://schemas.microsoft.com/office/word/2023/wordml/word16du" xmlns:w16sdtdh="http://schemas.microsoft.com/office/word/2020/wordml/sdtdatahash" xmlns:w16sdtfl="http://schemas.microsoft.com/office/word/2024/wordml/sdtformatlock" xmlns:w16se="http://schemas.microsoft.com/office/word/2015/wordml/symex" xmlns:wpg="http://schemas.microsoft.com/office/word/2010/wordprocessingGroup" xmlns:wpi="http://schemas.microsoft.com/office/word/2010/wordprocessingInk" xmlns:wne="http://schemas.microsoft.com/office/word/2006/wordml" xmlns:wps="http://schemas.microsoft.com/office/word/2010/wordprocessingShape" mc:Ignorable="w14 w15 w16se w16cid w16 w16cex w16sdtdh w16sdtfl w16du wp14">
   <w:abstractNum w:abstractNumId="0" w15:restartNumberingAfterBreak="0">
-    <w:nsid w:val="0CF3790C"/>
+    <w:nsid w:val="48CA2E3F"/>
     <w:multiLevelType w:val="hybridMultilevel"/>
-    <w:tmpl w:val="3C2CE03C"/>
-    <w:lvl w:ilvl="0" w:tplc="E0B29CC6">
+    <w:tmpl w:val="D1484C24"/>
+    <w:lvl w:ilvl="0" w:tplc="7F6EFD4A">
+      <w:start w:val="1"/>
+      <w:numFmt w:val="bullet"/>
+      <w:lvlText w:val="•"/>
+      <w:lvlJc w:val="left"/>
+      <w:pPr>
+        <w:ind w:left="480" w:hanging="260"/>
+      </w:pPr>
+    </w:lvl>
+    <w:lvl w:ilvl="1" w:tplc="88B29F54">
+      <w:numFmt w:val="decimal"/>
+      <w:lvlText w:val=""/>
+      <w:lvlJc w:val="left"/>
+    </w:lvl>
+    <w:lvl w:ilvl="2" w:tplc="C722F4CA">
+      <w:numFmt w:val="decimal"/>
+      <w:lvlText w:val=""/>
+      <w:lvlJc w:val="left"/>
+    </w:lvl>
+    <w:lvl w:ilvl="3" w:tplc="802EC706">
+      <w:numFmt w:val="decimal"/>
+      <w:lvlText w:val=""/>
+      <w:lvlJc w:val="left"/>
+    </w:lvl>
+    <w:lvl w:ilvl="4" w:tplc="CEC86E64">
+      <w:numFmt w:val="decimal"/>
+      <w:lvlText w:val=""/>
+      <w:lvlJc w:val="left"/>
+    </w:lvl>
+    <w:lvl w:ilvl="5" w:tplc="91F4D7F4">
+      <w:numFmt w:val="decimal"/>
+      <w:lvlText w:val=""/>
+      <w:lvlJc w:val="left"/>
+    </w:lvl>
+    <w:lvl w:ilvl="6" w:tplc="3EEEC0AA">
+      <w:numFmt w:val="decimal"/>
+      <w:lvlText w:val=""/>
+      <w:lvlJc w:val="left"/>
+    </w:lvl>
+    <w:lvl w:ilvl="7" w:tplc="E5F2221C">
+      <w:numFmt w:val="decimal"/>
+      <w:lvlText w:val=""/>
+      <w:lvlJc w:val="left"/>
+    </w:lvl>
+    <w:lvl w:ilvl="8" w:tplc="F3549508">
+      <w:numFmt w:val="decimal"/>
+      <w:lvlText w:val=""/>
+      <w:lvlJc w:val="left"/>
+    </w:lvl>
+  </w:abstractNum>
+  <w:abstractNum w:abstractNumId="1" w15:restartNumberingAfterBreak="0">
+    <w:nsid w:val="6B770E1F"/>
+    <w:multiLevelType w:val="hybridMultilevel"/>
+    <w:tmpl w:val="C7405CD0"/>
+    <w:lvl w:ilvl="0" w:tplc="EADED792">
       <w:start w:val="1"/>
       <w:numFmt w:val="decimal"/>
       <w:lvlText w:val="%1."/>
@@ -47217,52 +47289,52 @@
         <w:ind w:left="480" w:hanging="300"/>
       </w:pPr>
     </w:lvl>
-    <w:lvl w:ilvl="1" w:tplc="C22A817A">
+    <w:lvl w:ilvl="1" w:tplc="82A20240">
       <w:numFmt w:val="decimal"/>
       <w:lvlText w:val=""/>
       <w:lvlJc w:val="left"/>
     </w:lvl>
-    <w:lvl w:ilvl="2" w:tplc="AA5C254A">
+    <w:lvl w:ilvl="2" w:tplc="D34221EC">
       <w:numFmt w:val="decimal"/>
       <w:lvlText w:val=""/>
       <w:lvlJc w:val="left"/>
     </w:lvl>
-    <w:lvl w:ilvl="3" w:tplc="F0C0BC80">
+    <w:lvl w:ilvl="3" w:tplc="CD58341C">
       <w:numFmt w:val="decimal"/>
       <w:lvlText w:val=""/>
       <w:lvlJc w:val="left"/>
     </w:lvl>
-    <w:lvl w:ilvl="4" w:tplc="1780EF30">
+    <w:lvl w:ilvl="4" w:tplc="7B88B6F2">
       <w:numFmt w:val="decimal"/>
       <w:lvlText w:val=""/>
       <w:lvlJc w:val="left"/>
     </w:lvl>
-    <w:lvl w:ilvl="5" w:tplc="AA6428EA">
+    <w:lvl w:ilvl="5" w:tplc="E7A08856">
       <w:numFmt w:val="decimal"/>
       <w:lvlText w:val=""/>
       <w:lvlJc w:val="left"/>
     </w:lvl>
-    <w:lvl w:ilvl="6" w:tplc="2412337E">
+    <w:lvl w:ilvl="6" w:tplc="F5A4470A">
       <w:numFmt w:val="decimal"/>
       <w:lvlText w:val=""/>
       <w:lvlJc w:val="left"/>
     </w:lvl>
-    <w:lvl w:ilvl="7" w:tplc="EFCAC7A6">
+    <w:lvl w:ilvl="7" w:tplc="B2862C64">
       <w:numFmt w:val="decimal"/>
       <w:lvlText w:val=""/>
       <w:lvlJc w:val="left"/>
     </w:lvl>
-    <w:lvl w:ilvl="8" w:tplc="CB2AB52A">
+    <w:lvl w:ilvl="8" w:tplc="825463E2">
       <w:numFmt w:val="decimal"/>
       <w:lvlText w:val=""/>
       <w:lvlJc w:val="left"/>
     </w:lvl>
   </w:abstractNum>
-  <w:abstractNum w:abstractNumId="1" w15:restartNumberingAfterBreak="0">
-    <w:nsid w:val="24434719"/>
+  <w:abstractNum w:abstractNumId="2" w15:restartNumberingAfterBreak="0">
+    <w:nsid w:val="709550D3"/>
     <w:multiLevelType w:val="hybridMultilevel"/>
-    <w:tmpl w:val="2DCA25C4"/>
-    <w:lvl w:ilvl="0" w:tplc="35B85036">
+    <w:tmpl w:val="D4903560"/>
+    <w:lvl w:ilvl="0" w:tplc="1DB297A8">
       <w:start w:val="1"/>
       <w:numFmt w:val="bullet"/>
       <w:lvlText w:val="●"/>
@@ -47271,7 +47343,7 @@
         <w:ind w:left="720" w:hanging="360"/>
       </w:pPr>
     </w:lvl>
-    <w:lvl w:ilvl="1" w:tplc="94B0B236">
+    <w:lvl w:ilvl="1" w:tplc="9A0AF6A4">
       <w:start w:val="1"/>
       <w:numFmt w:val="bullet"/>
       <w:lvlText w:val="○"/>
@@ -47280,7 +47352,7 @@
         <w:ind w:left="1440" w:hanging="360"/>
       </w:pPr>
     </w:lvl>
-    <w:lvl w:ilvl="2" w:tplc="467423AA">
+    <w:lvl w:ilvl="2" w:tplc="992000D6">
       <w:start w:val="1"/>
       <w:numFmt w:val="bullet"/>
       <w:lvlText w:val="■"/>
@@ -47289,7 +47361,7 @@
         <w:ind w:left="2160" w:hanging="360"/>
       </w:pPr>
     </w:lvl>
-    <w:lvl w:ilvl="3" w:tplc="966E9546">
+    <w:lvl w:ilvl="3" w:tplc="4B8A4E4C">
       <w:start w:val="1"/>
       <w:numFmt w:val="bullet"/>
       <w:lvlText w:val="●"/>
@@ -47298,7 +47370,7 @@
         <w:ind w:left="2880" w:hanging="360"/>
       </w:pPr>
     </w:lvl>
-    <w:lvl w:ilvl="4" w:tplc="0E1CB1EA">
+    <w:lvl w:ilvl="4" w:tplc="0C5A3B16">
       <w:start w:val="1"/>
       <w:numFmt w:val="bullet"/>
       <w:lvlText w:val="○"/>
@@ -47307,7 +47379,7 @@
         <w:ind w:left="3600" w:hanging="360"/>
       </w:pPr>
     </w:lvl>
-    <w:lvl w:ilvl="5" w:tplc="100E3B9E">
+    <w:lvl w:ilvl="5" w:tplc="0882BE3C">
       <w:start w:val="1"/>
       <w:numFmt w:val="bullet"/>
       <w:lvlText w:val="■"/>
@@ -47316,7 +47388,7 @@
         <w:ind w:left="4320" w:hanging="360"/>
       </w:pPr>
     </w:lvl>
-    <w:lvl w:ilvl="6" w:tplc="7D465FF0">
+    <w:lvl w:ilvl="6" w:tplc="A63A792E">
       <w:start w:val="1"/>
       <w:numFmt w:val="bullet"/>
       <w:lvlText w:val="●"/>
@@ -47325,7 +47397,7 @@
         <w:ind w:left="5040" w:hanging="360"/>
       </w:pPr>
     </w:lvl>
-    <w:lvl w:ilvl="7" w:tplc="D85613B6">
+    <w:lvl w:ilvl="7" w:tplc="65ACFB9C">
       <w:start w:val="1"/>
       <w:numFmt w:val="bullet"/>
       <w:lvlText w:val="●"/>
@@ -47334,7 +47406,7 @@
         <w:ind w:left="5760" w:hanging="360"/>
       </w:pPr>
     </w:lvl>
-    <w:lvl w:ilvl="8" w:tplc="74B84600">
+    <w:lvl w:ilvl="8" w:tplc="32A41BD8">
       <w:start w:val="1"/>
       <w:numFmt w:val="bullet"/>
       <w:lvlText w:val="●"/>
@@ -47344,80 +47416,26 @@
       </w:pPr>
     </w:lvl>
   </w:abstractNum>
-  <w:abstractNum w:abstractNumId="2" w15:restartNumberingAfterBreak="0">
-    <w:nsid w:val="4E392A72"/>
-    <w:multiLevelType w:val="hybridMultilevel"/>
-    <w:tmpl w:val="3A0C25E2"/>
-    <w:lvl w:ilvl="0" w:tplc="9886FC44">
-      <w:start w:val="1"/>
-      <w:numFmt w:val="bullet"/>
-      <w:lvlText w:val="•"/>
-      <w:lvlJc w:val="left"/>
-      <w:pPr>
-        <w:ind w:left="480" w:hanging="260"/>
-      </w:pPr>
-    </w:lvl>
-    <w:lvl w:ilvl="1" w:tplc="3F063C5A">
-      <w:numFmt w:val="decimal"/>
-      <w:lvlText w:val=""/>
-      <w:lvlJc w:val="left"/>
-    </w:lvl>
-    <w:lvl w:ilvl="2" w:tplc="B2E2117E">
-      <w:numFmt w:val="decimal"/>
-      <w:lvlText w:val=""/>
-      <w:lvlJc w:val="left"/>
-    </w:lvl>
-    <w:lvl w:ilvl="3" w:tplc="8A2E73DE">
-      <w:numFmt w:val="decimal"/>
-      <w:lvlText w:val=""/>
-      <w:lvlJc w:val="left"/>
-    </w:lvl>
-    <w:lvl w:ilvl="4" w:tplc="9D6A5836">
-      <w:numFmt w:val="decimal"/>
-      <w:lvlText w:val=""/>
-      <w:lvlJc w:val="left"/>
-    </w:lvl>
-    <w:lvl w:ilvl="5" w:tplc="9E709590">
-      <w:numFmt w:val="decimal"/>
-      <w:lvlText w:val=""/>
-      <w:lvlJc w:val="left"/>
-    </w:lvl>
-    <w:lvl w:ilvl="6" w:tplc="24041950">
-      <w:numFmt w:val="decimal"/>
-      <w:lvlText w:val=""/>
-      <w:lvlJc w:val="left"/>
-    </w:lvl>
-    <w:lvl w:ilvl="7" w:tplc="90767AFC">
-      <w:numFmt w:val="decimal"/>
-      <w:lvlText w:val=""/>
-      <w:lvlJc w:val="left"/>
-    </w:lvl>
-    <w:lvl w:ilvl="8" w:tplc="892E34DC">
-      <w:numFmt w:val="decimal"/>
-      <w:lvlText w:val=""/>
-      <w:lvlJc w:val="left"/>
-    </w:lvl>
-  </w:abstractNum>
-  <w:num w:numId="1" w16cid:durableId="2086952733">
+  <w:num w:numId="1" w16cid:durableId="1280335349">
+    <w:abstractNumId w:val="2"/>
+    <w:lvlOverride w:ilvl="0">
+      <w:startOverride w:val="1"/>
+    </w:lvlOverride>
+  </w:num>
+  <w:num w:numId="2" w16cid:durableId="70124065">
+    <w:abstractNumId w:val="0"/>
+    <w:lvlOverride w:ilvl="0">
+      <w:startOverride w:val="1"/>
+    </w:lvlOverride>
+  </w:num>
+  <w:num w:numId="3" w16cid:durableId="796795358">
     <w:abstractNumId w:val="1"/>
     <w:lvlOverride w:ilvl="0">
       <w:startOverride w:val="1"/>
     </w:lvlOverride>
   </w:num>
-  <w:num w:numId="2" w16cid:durableId="451172004">
-    <w:abstractNumId w:val="2"/>
-    <w:lvlOverride w:ilvl="0">
-      <w:startOverride w:val="1"/>
-    </w:lvlOverride>
-  </w:num>
-  <w:num w:numId="3" w16cid:durableId="1689603731">
-    <w:abstractNumId w:val="0"/>
-    <w:lvlOverride w:ilvl="0">
-      <w:startOverride w:val="1"/>
-    </w:lvlOverride>
-  </w:num>
-  <w:num w:numId="4" w16cid:durableId="616988503">
-    <w:abstractNumId w:val="0"/>
+  <w:num w:numId="4" w16cid:durableId="959915899">
+    <w:abstractNumId w:val="1"/>
     <w:lvlOverride w:ilvl="0">
       <w:startOverride w:val="1"/>
     </w:lvlOverride>
@@ -48041,7 +48059,7 @@
     <w:autoRedefine/>
     <w:uiPriority w:val="39"/>
     <w:unhideWhenUsed/>
-    <w:rsid w:val="005F13E5"/>
+    <w:rsid w:val="0017429F"/>
   </w:style>
   <w:style w:type="paragraph" w:styleId="20">
     <w:name w:val="toc 2"/>
@@ -48050,7 +48068,7 @@
     <w:autoRedefine/>
     <w:uiPriority w:val="39"/>
     <w:unhideWhenUsed/>
-    <w:rsid w:val="005F13E5"/>
+    <w:rsid w:val="0017429F"/>
     <w:pPr>
       <w:ind w:leftChars="200" w:left="425"/>
     </w:pPr>
@@ -48061,7 +48079,7 @@
     <w:link w:val="Char1"/>
     <w:uiPriority w:val="99"/>
     <w:unhideWhenUsed/>
-    <w:rsid w:val="005F13E5"/>
+    <w:rsid w:val="0017429F"/>
     <w:pPr>
       <w:tabs>
         <w:tab w:val="center" w:pos="4513"/>
@@ -48075,7 +48093,7 @@
     <w:basedOn w:val="a0"/>
     <w:link w:val="aa"/>
     <w:uiPriority w:val="99"/>
-    <w:rsid w:val="005F13E5"/>
+    <w:rsid w:val="0017429F"/>
   </w:style>
   <w:style w:type="paragraph" w:styleId="ab">
     <w:name w:val="footer"/>
@@ -48083,7 +48101,7 @@
     <w:link w:val="Char2"/>
     <w:uiPriority w:val="99"/>
     <w:unhideWhenUsed/>
-    <w:rsid w:val="005F13E5"/>
+    <w:rsid w:val="0017429F"/>
     <w:pPr>
       <w:tabs>
         <w:tab w:val="center" w:pos="4513"/>
@@ -48097,7 +48115,7 @@
     <w:basedOn w:val="a0"/>
     <w:link w:val="ab"/>
     <w:uiPriority w:val="99"/>
-    <w:rsid w:val="005F13E5"/>
+    <w:rsid w:val="0017429F"/>
   </w:style>
 </w:styles>
 </file>

</xml_diff>

<commit_message>
Phone: separate photo and video pickers (image/* multi-select opens the photo picker), multi-select guidance
Co-Authored-By: Claude Fable 5.1 <noreply@anthropic.com>
</commit_message>
<xml_diff>
--- a/docs/manual/RuninqVic_사용설명서.docx
+++ b/docs/manual/RuninqVic_사용설명서.docx
@@ -355,7 +355,7 @@
             <w:noProof/>
           </w:rPr>
           <w:drawing>
-            <wp:inline distT="0" distB="0" distL="0" distR="0" wp14:anchorId="18214674" wp14:editId="4F98941A">
+            <wp:inline distT="0" distB="0" distL="0" distR="0" wp14:anchorId="01484B45" wp14:editId="4D7C4BB7">
               <wp:extent cx="1905000" cy="762000"/>
               <wp:effectExtent l="0" t="0" r="0" b="0"/>
               <wp:docPr id="1" name="그림 1">
@@ -496,7 +496,7 @@
     <w:sdt>
       <w:sdtPr>
         <w:alias w:val="목차"/>
-        <w:id w:val="479192171"/>
+        <w:id w:val="1321386946"/>
       </w:sdtPr>
       <w:sdtEndPr/>
       <w:sdtContent>
@@ -524,7 +524,7 @@
           <w:r>
             <w:fldChar w:fldCharType="separate"/>
           </w:r>
-          <w:hyperlink w:anchor="_Toc240528690" w:history="1">
+          <w:hyperlink w:anchor="_Toc240529405" w:history="1">
             <w:r>
               <w:rPr>
                 <w:rStyle w:val="a5"/>
@@ -548,7 +548,7 @@
               <w:rPr>
                 <w:noProof/>
               </w:rPr>
-              <w:instrText xml:space="preserve"> PAGEREF _Toc240528690 \h </w:instrText>
+              <w:instrText xml:space="preserve"> PAGEREF _Toc240529405 \h </w:instrText>
             </w:r>
             <w:r>
               <w:rPr>
@@ -591,7 +591,7 @@
               <w14:ligatures w14:val="standardContextual"/>
             </w:rPr>
           </w:pPr>
-          <w:hyperlink w:anchor="_Toc240528691" w:history="1">
+          <w:hyperlink w:anchor="_Toc240529406" w:history="1">
             <w:r>
               <w:rPr>
                 <w:rStyle w:val="a5"/>
@@ -615,7 +615,7 @@
               <w:rPr>
                 <w:noProof/>
               </w:rPr>
-              <w:instrText xml:space="preserve"> PAGEREF _Toc240528691 \h </w:instrText>
+              <w:instrText xml:space="preserve"> PAGEREF _Toc240529406 \h </w:instrText>
             </w:r>
             <w:r>
               <w:rPr>
@@ -658,7 +658,7 @@
               <w14:ligatures w14:val="standardContextual"/>
             </w:rPr>
           </w:pPr>
-          <w:hyperlink w:anchor="_Toc240528692" w:history="1">
+          <w:hyperlink w:anchor="_Toc240529407" w:history="1">
             <w:r>
               <w:rPr>
                 <w:rStyle w:val="a5"/>
@@ -682,7 +682,7 @@
               <w:rPr>
                 <w:noProof/>
               </w:rPr>
-              <w:instrText xml:space="preserve"> PAGEREF _Toc240528692 \h </w:instrText>
+              <w:instrText xml:space="preserve"> PAGEREF _Toc240529407 \h </w:instrText>
             </w:r>
             <w:r>
               <w:rPr>
@@ -725,7 +725,7 @@
               <w14:ligatures w14:val="standardContextual"/>
             </w:rPr>
           </w:pPr>
-          <w:hyperlink w:anchor="_Toc240528693" w:history="1">
+          <w:hyperlink w:anchor="_Toc240529408" w:history="1">
             <w:r>
               <w:rPr>
                 <w:rStyle w:val="a5"/>
@@ -749,7 +749,7 @@
               <w:rPr>
                 <w:noProof/>
               </w:rPr>
-              <w:instrText xml:space="preserve"> PAGEREF _Toc240528693 \h </w:instrText>
+              <w:instrText xml:space="preserve"> PAGEREF _Toc240529408 \h </w:instrText>
             </w:r>
             <w:r>
               <w:rPr>
@@ -791,7 +791,7 @@
               <w14:ligatures w14:val="standardContextual"/>
             </w:rPr>
           </w:pPr>
-          <w:hyperlink w:anchor="_Toc240528694" w:history="1">
+          <w:hyperlink w:anchor="_Toc240529409" w:history="1">
             <w:r>
               <w:rPr>
                 <w:rStyle w:val="a5"/>
@@ -815,7 +815,7 @@
               <w:rPr>
                 <w:noProof/>
               </w:rPr>
-              <w:instrText xml:space="preserve"> PAGEREF _Toc240528694 \h </w:instrText>
+              <w:instrText xml:space="preserve"> PAGEREF _Toc240529409 \h </w:instrText>
             </w:r>
             <w:r>
               <w:rPr>
@@ -858,7 +858,7 @@
               <w14:ligatures w14:val="standardContextual"/>
             </w:rPr>
           </w:pPr>
-          <w:hyperlink w:anchor="_Toc240528695" w:history="1">
+          <w:hyperlink w:anchor="_Toc240529410" w:history="1">
             <w:r>
               <w:rPr>
                 <w:rStyle w:val="a5"/>
@@ -882,7 +882,7 @@
               <w:rPr>
                 <w:noProof/>
               </w:rPr>
-              <w:instrText xml:space="preserve"> PAGEREF _Toc240528695 \h </w:instrText>
+              <w:instrText xml:space="preserve"> PAGEREF _Toc240529410 \h </w:instrText>
             </w:r>
             <w:r>
               <w:rPr>
@@ -925,7 +925,7 @@
               <w14:ligatures w14:val="standardContextual"/>
             </w:rPr>
           </w:pPr>
-          <w:hyperlink w:anchor="_Toc240528696" w:history="1">
+          <w:hyperlink w:anchor="_Toc240529411" w:history="1">
             <w:r>
               <w:rPr>
                 <w:rStyle w:val="a5"/>
@@ -949,7 +949,7 @@
               <w:rPr>
                 <w:noProof/>
               </w:rPr>
-              <w:instrText xml:space="preserve"> PAGEREF _Toc240528696 \h </w:instrText>
+              <w:instrText xml:space="preserve"> PAGEREF _Toc240529411 \h </w:instrText>
             </w:r>
             <w:r>
               <w:rPr>
@@ -992,7 +992,7 @@
               <w14:ligatures w14:val="standardContextual"/>
             </w:rPr>
           </w:pPr>
-          <w:hyperlink w:anchor="_Toc240528697" w:history="1">
+          <w:hyperlink w:anchor="_Toc240529412" w:history="1">
             <w:r>
               <w:rPr>
                 <w:rStyle w:val="a5"/>
@@ -1016,7 +1016,7 @@
               <w:rPr>
                 <w:noProof/>
               </w:rPr>
-              <w:instrText xml:space="preserve"> PAGEREF _Toc240528697 \h </w:instrText>
+              <w:instrText xml:space="preserve"> PAGEREF _Toc240529412 \h </w:instrText>
             </w:r>
             <w:r>
               <w:rPr>
@@ -1059,7 +1059,7 @@
               <w14:ligatures w14:val="standardContextual"/>
             </w:rPr>
           </w:pPr>
-          <w:hyperlink w:anchor="_Toc240528698" w:history="1">
+          <w:hyperlink w:anchor="_Toc240529413" w:history="1">
             <w:r>
               <w:rPr>
                 <w:rStyle w:val="a5"/>
@@ -1083,7 +1083,7 @@
               <w:rPr>
                 <w:noProof/>
               </w:rPr>
-              <w:instrText xml:space="preserve"> PAGEREF _Toc240528698 \h </w:instrText>
+              <w:instrText xml:space="preserve"> PAGEREF _Toc240529413 \h </w:instrText>
             </w:r>
             <w:r>
               <w:rPr>
@@ -1125,7 +1125,7 @@
               <w14:ligatures w14:val="standardContextual"/>
             </w:rPr>
           </w:pPr>
-          <w:hyperlink w:anchor="_Toc240528699" w:history="1">
+          <w:hyperlink w:anchor="_Toc240529414" w:history="1">
             <w:r>
               <w:rPr>
                 <w:rStyle w:val="a5"/>
@@ -1149,7 +1149,7 @@
               <w:rPr>
                 <w:noProof/>
               </w:rPr>
-              <w:instrText xml:space="preserve"> PAGEREF _Toc240528699 \h </w:instrText>
+              <w:instrText xml:space="preserve"> PAGEREF _Toc240529414 \h </w:instrText>
             </w:r>
             <w:r>
               <w:rPr>
@@ -1166,7 +1166,7 @@
               <w:rPr>
                 <w:noProof/>
               </w:rPr>
-              <w:t>13</w:t>
+              <w:t>14</w:t>
             </w:r>
             <w:r>
               <w:rPr>
@@ -1191,7 +1191,7 @@
               <w14:ligatures w14:val="standardContextual"/>
             </w:rPr>
           </w:pPr>
-          <w:hyperlink w:anchor="_Toc240528700" w:history="1">
+          <w:hyperlink w:anchor="_Toc240529415" w:history="1">
             <w:r>
               <w:rPr>
                 <w:rStyle w:val="a5"/>
@@ -1215,7 +1215,7 @@
               <w:rPr>
                 <w:noProof/>
               </w:rPr>
-              <w:instrText xml:space="preserve"> PAGEREF _Toc240528700 \h </w:instrText>
+              <w:instrText xml:space="preserve"> PAGEREF _Toc240529415 \h </w:instrText>
             </w:r>
             <w:r>
               <w:rPr>
@@ -1232,7 +1232,7 @@
               <w:rPr>
                 <w:noProof/>
               </w:rPr>
-              <w:t>14</w:t>
+              <w:t>15</w:t>
             </w:r>
             <w:r>
               <w:rPr>
@@ -1258,7 +1258,7 @@
               <w14:ligatures w14:val="standardContextual"/>
             </w:rPr>
           </w:pPr>
-          <w:hyperlink w:anchor="_Toc240528701" w:history="1">
+          <w:hyperlink w:anchor="_Toc240529416" w:history="1">
             <w:r>
               <w:rPr>
                 <w:rStyle w:val="a5"/>
@@ -1282,7 +1282,7 @@
               <w:rPr>
                 <w:noProof/>
               </w:rPr>
-              <w:instrText xml:space="preserve"> PAGEREF _Toc240528701 \h </w:instrText>
+              <w:instrText xml:space="preserve"> PAGEREF _Toc240529416 \h </w:instrText>
             </w:r>
             <w:r>
               <w:rPr>
@@ -1299,7 +1299,7 @@
               <w:rPr>
                 <w:noProof/>
               </w:rPr>
-              <w:t>14</w:t>
+              <w:t>15</w:t>
             </w:r>
             <w:r>
               <w:rPr>
@@ -1325,7 +1325,7 @@
               <w14:ligatures w14:val="standardContextual"/>
             </w:rPr>
           </w:pPr>
-          <w:hyperlink w:anchor="_Toc240528702" w:history="1">
+          <w:hyperlink w:anchor="_Toc240529417" w:history="1">
             <w:r>
               <w:rPr>
                 <w:rStyle w:val="a5"/>
@@ -1349,7 +1349,7 @@
               <w:rPr>
                 <w:noProof/>
               </w:rPr>
-              <w:instrText xml:space="preserve"> PAGEREF _Toc240528702 \h </w:instrText>
+              <w:instrText xml:space="preserve"> PAGEREF _Toc240529417 \h </w:instrText>
             </w:r>
             <w:r>
               <w:rPr>
@@ -1366,7 +1366,7 @@
               <w:rPr>
                 <w:noProof/>
               </w:rPr>
-              <w:t>14</w:t>
+              <w:t>15</w:t>
             </w:r>
             <w:r>
               <w:rPr>
@@ -1392,7 +1392,7 @@
               <w14:ligatures w14:val="standardContextual"/>
             </w:rPr>
           </w:pPr>
-          <w:hyperlink w:anchor="_Toc240528703" w:history="1">
+          <w:hyperlink w:anchor="_Toc240529418" w:history="1">
             <w:r>
               <w:rPr>
                 <w:rStyle w:val="a5"/>
@@ -1416,7 +1416,7 @@
               <w:rPr>
                 <w:noProof/>
               </w:rPr>
-              <w:instrText xml:space="preserve"> PAGEREF _Toc240528703 \h </w:instrText>
+              <w:instrText xml:space="preserve"> PAGEREF _Toc240529418 \h </w:instrText>
             </w:r>
             <w:r>
               <w:rPr>
@@ -1433,7 +1433,7 @@
               <w:rPr>
                 <w:noProof/>
               </w:rPr>
-              <w:t>14</w:t>
+              <w:t>15</w:t>
             </w:r>
             <w:r>
               <w:rPr>
@@ -1459,7 +1459,7 @@
               <w14:ligatures w14:val="standardContextual"/>
             </w:rPr>
           </w:pPr>
-          <w:hyperlink w:anchor="_Toc240528704" w:history="1">
+          <w:hyperlink w:anchor="_Toc240529419" w:history="1">
             <w:r>
               <w:rPr>
                 <w:rStyle w:val="a5"/>
@@ -1483,7 +1483,7 @@
               <w:rPr>
                 <w:noProof/>
               </w:rPr>
-              <w:instrText xml:space="preserve"> PAGEREF _Toc240528704 \h </w:instrText>
+              <w:instrText xml:space="preserve"> PAGEREF _Toc240529419 \h </w:instrText>
             </w:r>
             <w:r>
               <w:rPr>
@@ -1500,7 +1500,7 @@
               <w:rPr>
                 <w:noProof/>
               </w:rPr>
-              <w:t>16</w:t>
+              <w:t>17</w:t>
             </w:r>
             <w:r>
               <w:rPr>
@@ -1526,7 +1526,7 @@
               <w14:ligatures w14:val="standardContextual"/>
             </w:rPr>
           </w:pPr>
-          <w:hyperlink w:anchor="_Toc240528705" w:history="1">
+          <w:hyperlink w:anchor="_Toc240529420" w:history="1">
             <w:r>
               <w:rPr>
                 <w:rStyle w:val="a5"/>
@@ -1550,7 +1550,7 @@
               <w:rPr>
                 <w:noProof/>
               </w:rPr>
-              <w:instrText xml:space="preserve"> PAGEREF _Toc240528705 \h </w:instrText>
+              <w:instrText xml:space="preserve"> PAGEREF _Toc240529420 \h </w:instrText>
             </w:r>
             <w:r>
               <w:rPr>
@@ -1567,7 +1567,7 @@
               <w:rPr>
                 <w:noProof/>
               </w:rPr>
-              <w:t>16</w:t>
+              <w:t>17</w:t>
             </w:r>
             <w:r>
               <w:rPr>
@@ -1592,7 +1592,7 @@
               <w14:ligatures w14:val="standardContextual"/>
             </w:rPr>
           </w:pPr>
-          <w:hyperlink w:anchor="_Toc240528706" w:history="1">
+          <w:hyperlink w:anchor="_Toc240529421" w:history="1">
             <w:r>
               <w:rPr>
                 <w:rStyle w:val="a5"/>
@@ -1616,7 +1616,7 @@
               <w:rPr>
                 <w:noProof/>
               </w:rPr>
-              <w:instrText xml:space="preserve"> PAGEREF _Toc240528706 \h </w:instrText>
+              <w:instrText xml:space="preserve"> PAGEREF _Toc240529421 \h </w:instrText>
             </w:r>
             <w:r>
               <w:rPr>
@@ -1633,7 +1633,7 @@
               <w:rPr>
                 <w:noProof/>
               </w:rPr>
-              <w:t>18</w:t>
+              <w:t>19</w:t>
             </w:r>
             <w:r>
               <w:rPr>
@@ -1659,7 +1659,7 @@
               <w14:ligatures w14:val="standardContextual"/>
             </w:rPr>
           </w:pPr>
-          <w:hyperlink w:anchor="_Toc240528707" w:history="1">
+          <w:hyperlink w:anchor="_Toc240529422" w:history="1">
             <w:r>
               <w:rPr>
                 <w:rStyle w:val="a5"/>
@@ -1683,7 +1683,7 @@
               <w:rPr>
                 <w:noProof/>
               </w:rPr>
-              <w:instrText xml:space="preserve"> PAGEREF _Toc240528707 \h </w:instrText>
+              <w:instrText xml:space="preserve"> PAGEREF _Toc240529422 \h </w:instrText>
             </w:r>
             <w:r>
               <w:rPr>
@@ -1700,7 +1700,7 @@
               <w:rPr>
                 <w:noProof/>
               </w:rPr>
-              <w:t>18</w:t>
+              <w:t>19</w:t>
             </w:r>
             <w:r>
               <w:rPr>
@@ -1726,7 +1726,7 @@
               <w14:ligatures w14:val="standardContextual"/>
             </w:rPr>
           </w:pPr>
-          <w:hyperlink w:anchor="_Toc240528708" w:history="1">
+          <w:hyperlink w:anchor="_Toc240529423" w:history="1">
             <w:r>
               <w:rPr>
                 <w:rStyle w:val="a5"/>
@@ -1750,7 +1750,7 @@
               <w:rPr>
                 <w:noProof/>
               </w:rPr>
-              <w:instrText xml:space="preserve"> PAGEREF _Toc240528708 \h </w:instrText>
+              <w:instrText xml:space="preserve"> PAGEREF _Toc240529423 \h </w:instrText>
             </w:r>
             <w:r>
               <w:rPr>
@@ -1767,7 +1767,7 @@
               <w:rPr>
                 <w:noProof/>
               </w:rPr>
-              <w:t>18</w:t>
+              <w:t>19</w:t>
             </w:r>
             <w:r>
               <w:rPr>
@@ -1793,7 +1793,7 @@
               <w14:ligatures w14:val="standardContextual"/>
             </w:rPr>
           </w:pPr>
-          <w:hyperlink w:anchor="_Toc240528709" w:history="1">
+          <w:hyperlink w:anchor="_Toc240529424" w:history="1">
             <w:r>
               <w:rPr>
                 <w:rStyle w:val="a5"/>
@@ -1817,7 +1817,7 @@
               <w:rPr>
                 <w:noProof/>
               </w:rPr>
-              <w:instrText xml:space="preserve"> PAGEREF _Toc240528709 \h </w:instrText>
+              <w:instrText xml:space="preserve"> PAGEREF _Toc240529424 \h </w:instrText>
             </w:r>
             <w:r>
               <w:rPr>
@@ -1834,7 +1834,7 @@
               <w:rPr>
                 <w:noProof/>
               </w:rPr>
-              <w:t>18</w:t>
+              <w:t>19</w:t>
             </w:r>
             <w:r>
               <w:rPr>
@@ -1860,7 +1860,7 @@
               <w14:ligatures w14:val="standardContextual"/>
             </w:rPr>
           </w:pPr>
-          <w:hyperlink w:anchor="_Toc240528710" w:history="1">
+          <w:hyperlink w:anchor="_Toc240529425" w:history="1">
             <w:r>
               <w:rPr>
                 <w:rStyle w:val="a5"/>
@@ -1884,7 +1884,7 @@
               <w:rPr>
                 <w:noProof/>
               </w:rPr>
-              <w:instrText xml:space="preserve"> PAGEREF _Toc240528710 \h </w:instrText>
+              <w:instrText xml:space="preserve"> PAGEREF _Toc240529425 \h </w:instrText>
             </w:r>
             <w:r>
               <w:rPr>
@@ -1901,7 +1901,7 @@
               <w:rPr>
                 <w:noProof/>
               </w:rPr>
-              <w:t>18</w:t>
+              <w:t>19</w:t>
             </w:r>
             <w:r>
               <w:rPr>
@@ -1927,7 +1927,7 @@
               <w14:ligatures w14:val="standardContextual"/>
             </w:rPr>
           </w:pPr>
-          <w:hyperlink w:anchor="_Toc240528711" w:history="1">
+          <w:hyperlink w:anchor="_Toc240529426" w:history="1">
             <w:r>
               <w:rPr>
                 <w:rStyle w:val="a5"/>
@@ -1951,7 +1951,7 @@
               <w:rPr>
                 <w:noProof/>
               </w:rPr>
-              <w:instrText xml:space="preserve"> PAGEREF _Toc240528711 \h </w:instrText>
+              <w:instrText xml:space="preserve"> PAGEREF _Toc240529426 \h </w:instrText>
             </w:r>
             <w:r>
               <w:rPr>
@@ -1968,7 +1968,7 @@
               <w:rPr>
                 <w:noProof/>
               </w:rPr>
-              <w:t>18</w:t>
+              <w:t>19</w:t>
             </w:r>
             <w:r>
               <w:rPr>
@@ -1994,7 +1994,7 @@
               <w14:ligatures w14:val="standardContextual"/>
             </w:rPr>
           </w:pPr>
-          <w:hyperlink w:anchor="_Toc240528712" w:history="1">
+          <w:hyperlink w:anchor="_Toc240529427" w:history="1">
             <w:r>
               <w:rPr>
                 <w:rStyle w:val="a5"/>
@@ -2018,7 +2018,7 @@
               <w:rPr>
                 <w:noProof/>
               </w:rPr>
-              <w:instrText xml:space="preserve"> PAGEREF _Toc240528712 \h </w:instrText>
+              <w:instrText xml:space="preserve"> PAGEREF _Toc240529427 \h </w:instrText>
             </w:r>
             <w:r>
               <w:rPr>
@@ -2035,7 +2035,7 @@
               <w:rPr>
                 <w:noProof/>
               </w:rPr>
-              <w:t>19</w:t>
+              <w:t>20</w:t>
             </w:r>
             <w:r>
               <w:rPr>
@@ -2060,7 +2060,7 @@
               <w14:ligatures w14:val="standardContextual"/>
             </w:rPr>
           </w:pPr>
-          <w:hyperlink w:anchor="_Toc240528713" w:history="1">
+          <w:hyperlink w:anchor="_Toc240529428" w:history="1">
             <w:r>
               <w:rPr>
                 <w:rStyle w:val="a5"/>
@@ -2084,7 +2084,7 @@
               <w:rPr>
                 <w:noProof/>
               </w:rPr>
-              <w:instrText xml:space="preserve"> PAGEREF _Toc240528713 \h </w:instrText>
+              <w:instrText xml:space="preserve"> PAGEREF _Toc240529428 \h </w:instrText>
             </w:r>
             <w:r>
               <w:rPr>
@@ -2101,7 +2101,7 @@
               <w:rPr>
                 <w:noProof/>
               </w:rPr>
-              <w:t>20</w:t>
+              <w:t>21</w:t>
             </w:r>
             <w:r>
               <w:rPr>
@@ -2126,7 +2126,7 @@
               <w14:ligatures w14:val="standardContextual"/>
             </w:rPr>
           </w:pPr>
-          <w:hyperlink w:anchor="_Toc240528714" w:history="1">
+          <w:hyperlink w:anchor="_Toc240529429" w:history="1">
             <w:r>
               <w:rPr>
                 <w:rStyle w:val="a5"/>
@@ -2150,7 +2150,7 @@
               <w:rPr>
                 <w:noProof/>
               </w:rPr>
-              <w:instrText xml:space="preserve"> PAGEREF _Toc240528714 \h </w:instrText>
+              <w:instrText xml:space="preserve"> PAGEREF _Toc240529429 \h </w:instrText>
             </w:r>
             <w:r>
               <w:rPr>
@@ -2167,7 +2167,7 @@
               <w:rPr>
                 <w:noProof/>
               </w:rPr>
-              <w:t>21</w:t>
+              <w:t>22</w:t>
             </w:r>
             <w:r>
               <w:rPr>
@@ -2193,7 +2193,7 @@
               <w14:ligatures w14:val="standardContextual"/>
             </w:rPr>
           </w:pPr>
-          <w:hyperlink w:anchor="_Toc240528715" w:history="1">
+          <w:hyperlink w:anchor="_Toc240529430" w:history="1">
             <w:r>
               <w:rPr>
                 <w:rStyle w:val="a5"/>
@@ -2217,7 +2217,7 @@
               <w:rPr>
                 <w:noProof/>
               </w:rPr>
-              <w:instrText xml:space="preserve"> PAGEREF _Toc240528715 \h </w:instrText>
+              <w:instrText xml:space="preserve"> PAGEREF _Toc240529430 \h </w:instrText>
             </w:r>
             <w:r>
               <w:rPr>
@@ -2234,7 +2234,7 @@
               <w:rPr>
                 <w:noProof/>
               </w:rPr>
-              <w:t>22</w:t>
+              <w:t>23</w:t>
             </w:r>
             <w:r>
               <w:rPr>
@@ -2259,7 +2259,7 @@
               <w14:ligatures w14:val="standardContextual"/>
             </w:rPr>
           </w:pPr>
-          <w:hyperlink w:anchor="_Toc240528716" w:history="1">
+          <w:hyperlink w:anchor="_Toc240529431" w:history="1">
             <w:r>
               <w:rPr>
                 <w:rStyle w:val="a5"/>
@@ -2283,7 +2283,7 @@
               <w:rPr>
                 <w:noProof/>
               </w:rPr>
-              <w:instrText xml:space="preserve"> PAGEREF _Toc240528716 \h </w:instrText>
+              <w:instrText xml:space="preserve"> PAGEREF _Toc240529431 \h </w:instrText>
             </w:r>
             <w:r>
               <w:rPr>
@@ -2300,7 +2300,7 @@
               <w:rPr>
                 <w:noProof/>
               </w:rPr>
-              <w:t>24</w:t>
+              <w:t>25</w:t>
             </w:r>
             <w:r>
               <w:rPr>
@@ -2326,7 +2326,7 @@
               <w14:ligatures w14:val="standardContextual"/>
             </w:rPr>
           </w:pPr>
-          <w:hyperlink w:anchor="_Toc240528717" w:history="1">
+          <w:hyperlink w:anchor="_Toc240529432" w:history="1">
             <w:r>
               <w:rPr>
                 <w:rStyle w:val="a5"/>
@@ -2350,7 +2350,7 @@
               <w:rPr>
                 <w:noProof/>
               </w:rPr>
-              <w:instrText xml:space="preserve"> PAGEREF _Toc240528717 \h </w:instrText>
+              <w:instrText xml:space="preserve"> PAGEREF _Toc240529432 \h </w:instrText>
             </w:r>
             <w:r>
               <w:rPr>
@@ -2367,7 +2367,7 @@
               <w:rPr>
                 <w:noProof/>
               </w:rPr>
-              <w:t>24</w:t>
+              <w:t>25</w:t>
             </w:r>
             <w:r>
               <w:rPr>
@@ -2393,7 +2393,7 @@
               <w14:ligatures w14:val="standardContextual"/>
             </w:rPr>
           </w:pPr>
-          <w:hyperlink w:anchor="_Toc240528718" w:history="1">
+          <w:hyperlink w:anchor="_Toc240529433" w:history="1">
             <w:r>
               <w:rPr>
                 <w:rStyle w:val="a5"/>
@@ -2417,7 +2417,7 @@
               <w:rPr>
                 <w:noProof/>
               </w:rPr>
-              <w:instrText xml:space="preserve"> PAGEREF _Toc240528718 \h </w:instrText>
+              <w:instrText xml:space="preserve"> PAGEREF _Toc240529433 \h </w:instrText>
             </w:r>
             <w:r>
               <w:rPr>
@@ -2434,7 +2434,7 @@
               <w:rPr>
                 <w:noProof/>
               </w:rPr>
-              <w:t>24</w:t>
+              <w:t>25</w:t>
             </w:r>
             <w:r>
               <w:rPr>
@@ -2460,7 +2460,7 @@
               <w14:ligatures w14:val="standardContextual"/>
             </w:rPr>
           </w:pPr>
-          <w:hyperlink w:anchor="_Toc240528719" w:history="1">
+          <w:hyperlink w:anchor="_Toc240529434" w:history="1">
             <w:r>
               <w:rPr>
                 <w:rStyle w:val="a5"/>
@@ -2484,7 +2484,7 @@
               <w:rPr>
                 <w:noProof/>
               </w:rPr>
-              <w:instrText xml:space="preserve"> PAGEREF _Toc240528719 \h </w:instrText>
+              <w:instrText xml:space="preserve"> PAGEREF _Toc240529434 \h </w:instrText>
             </w:r>
             <w:r>
               <w:rPr>
@@ -2501,7 +2501,7 @@
               <w:rPr>
                 <w:noProof/>
               </w:rPr>
-              <w:t>25</w:t>
+              <w:t>26</w:t>
             </w:r>
             <w:r>
               <w:rPr>
@@ -2526,7 +2526,7 @@
               <w14:ligatures w14:val="standardContextual"/>
             </w:rPr>
           </w:pPr>
-          <w:hyperlink w:anchor="_Toc240528720" w:history="1">
+          <w:hyperlink w:anchor="_Toc240529435" w:history="1">
             <w:r>
               <w:rPr>
                 <w:rStyle w:val="a5"/>
@@ -2550,7 +2550,7 @@
               <w:rPr>
                 <w:noProof/>
               </w:rPr>
-              <w:instrText xml:space="preserve"> PAGEREF _Toc240528720 \h </w:instrText>
+              <w:instrText xml:space="preserve"> PAGEREF _Toc240529435 \h </w:instrText>
             </w:r>
             <w:r>
               <w:rPr>
@@ -2567,7 +2567,7 @@
               <w:rPr>
                 <w:noProof/>
               </w:rPr>
-              <w:t>26</w:t>
+              <w:t>27</w:t>
             </w:r>
             <w:r>
               <w:rPr>
@@ -2593,7 +2593,7 @@
               <w14:ligatures w14:val="standardContextual"/>
             </w:rPr>
           </w:pPr>
-          <w:hyperlink w:anchor="_Toc240528721" w:history="1">
+          <w:hyperlink w:anchor="_Toc240529436" w:history="1">
             <w:r>
               <w:rPr>
                 <w:rStyle w:val="a5"/>
@@ -2617,7 +2617,7 @@
               <w:rPr>
                 <w:noProof/>
               </w:rPr>
-              <w:instrText xml:space="preserve"> PAGEREF _Toc240528721 \h </w:instrText>
+              <w:instrText xml:space="preserve"> PAGEREF _Toc240529436 \h </w:instrText>
             </w:r>
             <w:r>
               <w:rPr>
@@ -2634,7 +2634,7 @@
               <w:rPr>
                 <w:noProof/>
               </w:rPr>
-              <w:t>26</w:t>
+              <w:t>27</w:t>
             </w:r>
             <w:r>
               <w:rPr>
@@ -2660,7 +2660,7 @@
               <w14:ligatures w14:val="standardContextual"/>
             </w:rPr>
           </w:pPr>
-          <w:hyperlink w:anchor="_Toc240528722" w:history="1">
+          <w:hyperlink w:anchor="_Toc240529437" w:history="1">
             <w:r>
               <w:rPr>
                 <w:rStyle w:val="a5"/>
@@ -2684,7 +2684,7 @@
               <w:rPr>
                 <w:noProof/>
               </w:rPr>
-              <w:instrText xml:space="preserve"> PAGEREF _Toc240528722 \h </w:instrText>
+              <w:instrText xml:space="preserve"> PAGEREF _Toc240529437 \h </w:instrText>
             </w:r>
             <w:r>
               <w:rPr>
@@ -2701,7 +2701,7 @@
               <w:rPr>
                 <w:noProof/>
               </w:rPr>
-              <w:t>27</w:t>
+              <w:t>28</w:t>
             </w:r>
             <w:r>
               <w:rPr>
@@ -2726,7 +2726,7 @@
               <w14:ligatures w14:val="standardContextual"/>
             </w:rPr>
           </w:pPr>
-          <w:hyperlink w:anchor="_Toc240528723" w:history="1">
+          <w:hyperlink w:anchor="_Toc240529438" w:history="1">
             <w:r>
               <w:rPr>
                 <w:rStyle w:val="a5"/>
@@ -2750,7 +2750,7 @@
               <w:rPr>
                 <w:noProof/>
               </w:rPr>
-              <w:instrText xml:space="preserve"> PAGEREF _Toc240528723 \h </w:instrText>
+              <w:instrText xml:space="preserve"> PAGEREF _Toc240529438 \h </w:instrText>
             </w:r>
             <w:r>
               <w:rPr>
@@ -2767,7 +2767,7 @@
               <w:rPr>
                 <w:noProof/>
               </w:rPr>
-              <w:t>28</w:t>
+              <w:t>29</w:t>
             </w:r>
             <w:r>
               <w:rPr>
@@ -2792,7 +2792,7 @@
               <w14:ligatures w14:val="standardContextual"/>
             </w:rPr>
           </w:pPr>
-          <w:hyperlink w:anchor="_Toc240528724" w:history="1">
+          <w:hyperlink w:anchor="_Toc240529439" w:history="1">
             <w:r>
               <w:rPr>
                 <w:rStyle w:val="a5"/>
@@ -2816,7 +2816,7 @@
               <w:rPr>
                 <w:noProof/>
               </w:rPr>
-              <w:instrText xml:space="preserve"> PAGEREF _Toc240528724 \h </w:instrText>
+              <w:instrText xml:space="preserve"> PAGEREF _Toc240529439 \h </w:instrText>
             </w:r>
             <w:r>
               <w:rPr>
@@ -2833,7 +2833,7 @@
               <w:rPr>
                 <w:noProof/>
               </w:rPr>
-              <w:t>29</w:t>
+              <w:t>30</w:t>
             </w:r>
             <w:r>
               <w:rPr>
@@ -2859,7 +2859,7 @@
               <w14:ligatures w14:val="standardContextual"/>
             </w:rPr>
           </w:pPr>
-          <w:hyperlink w:anchor="_Toc240528725" w:history="1">
+          <w:hyperlink w:anchor="_Toc240529440" w:history="1">
             <w:r>
               <w:rPr>
                 <w:rStyle w:val="a5"/>
@@ -2883,7 +2883,7 @@
               <w:rPr>
                 <w:noProof/>
               </w:rPr>
-              <w:instrText xml:space="preserve"> PAGEREF _Toc240528725 \h </w:instrText>
+              <w:instrText xml:space="preserve"> PAGEREF _Toc240529440 \h </w:instrText>
             </w:r>
             <w:r>
               <w:rPr>
@@ -2900,7 +2900,7 @@
               <w:rPr>
                 <w:noProof/>
               </w:rPr>
-              <w:t>29</w:t>
+              <w:t>30</w:t>
             </w:r>
             <w:r>
               <w:rPr>
@@ -2926,7 +2926,7 @@
               <w14:ligatures w14:val="standardContextual"/>
             </w:rPr>
           </w:pPr>
-          <w:hyperlink w:anchor="_Toc240528726" w:history="1">
+          <w:hyperlink w:anchor="_Toc240529441" w:history="1">
             <w:r>
               <w:rPr>
                 <w:rStyle w:val="a5"/>
@@ -2950,7 +2950,7 @@
               <w:rPr>
                 <w:noProof/>
               </w:rPr>
-              <w:instrText xml:space="preserve"> PAGEREF _Toc240528726 \h </w:instrText>
+              <w:instrText xml:space="preserve"> PAGEREF _Toc240529441 \h </w:instrText>
             </w:r>
             <w:r>
               <w:rPr>
@@ -2967,7 +2967,7 @@
               <w:rPr>
                 <w:noProof/>
               </w:rPr>
-              <w:t>29</w:t>
+              <w:t>30</w:t>
             </w:r>
             <w:r>
               <w:rPr>
@@ -2993,7 +2993,7 @@
               <w14:ligatures w14:val="standardContextual"/>
             </w:rPr>
           </w:pPr>
-          <w:hyperlink w:anchor="_Toc240528727" w:history="1">
+          <w:hyperlink w:anchor="_Toc240529442" w:history="1">
             <w:r>
               <w:rPr>
                 <w:rStyle w:val="a5"/>
@@ -3017,7 +3017,7 @@
               <w:rPr>
                 <w:noProof/>
               </w:rPr>
-              <w:instrText xml:space="preserve"> PAGEREF _Toc240528727 \h </w:instrText>
+              <w:instrText xml:space="preserve"> PAGEREF _Toc240529442 \h </w:instrText>
             </w:r>
             <w:r>
               <w:rPr>
@@ -3034,7 +3034,7 @@
               <w:rPr>
                 <w:noProof/>
               </w:rPr>
-              <w:t>30</w:t>
+              <w:t>31</w:t>
             </w:r>
             <w:r>
               <w:rPr>
@@ -3059,7 +3059,7 @@
               <w14:ligatures w14:val="standardContextual"/>
             </w:rPr>
           </w:pPr>
-          <w:hyperlink w:anchor="_Toc240528728" w:history="1">
+          <w:hyperlink w:anchor="_Toc240529443" w:history="1">
             <w:r>
               <w:rPr>
                 <w:rStyle w:val="a5"/>
@@ -3083,7 +3083,7 @@
               <w:rPr>
                 <w:noProof/>
               </w:rPr>
-              <w:instrText xml:space="preserve"> PAGEREF _Toc240528728 \h </w:instrText>
+              <w:instrText xml:space="preserve"> PAGEREF _Toc240529443 \h </w:instrText>
             </w:r>
             <w:r>
               <w:rPr>
@@ -3100,7 +3100,7 @@
               <w:rPr>
                 <w:noProof/>
               </w:rPr>
-              <w:t>31</w:t>
+              <w:t>32</w:t>
             </w:r>
             <w:r>
               <w:rPr>
@@ -3125,7 +3125,7 @@
               <w14:ligatures w14:val="standardContextual"/>
             </w:rPr>
           </w:pPr>
-          <w:hyperlink w:anchor="_Toc240528729" w:history="1">
+          <w:hyperlink w:anchor="_Toc240529444" w:history="1">
             <w:r>
               <w:rPr>
                 <w:rStyle w:val="a5"/>
@@ -3149,7 +3149,7 @@
               <w:rPr>
                 <w:noProof/>
               </w:rPr>
-              <w:instrText xml:space="preserve"> PAGEREF _Toc240528729 \h </w:instrText>
+              <w:instrText xml:space="preserve"> PAGEREF _Toc240529444 \h </w:instrText>
             </w:r>
             <w:r>
               <w:rPr>
@@ -3166,7 +3166,7 @@
               <w:rPr>
                 <w:noProof/>
               </w:rPr>
-              <w:t>32</w:t>
+              <w:t>33</w:t>
             </w:r>
             <w:r>
               <w:rPr>
@@ -3191,7 +3191,7 @@
               <w14:ligatures w14:val="standardContextual"/>
             </w:rPr>
           </w:pPr>
-          <w:hyperlink w:anchor="_Toc240528730" w:history="1">
+          <w:hyperlink w:anchor="_Toc240529445" w:history="1">
             <w:r>
               <w:rPr>
                 <w:rStyle w:val="a5"/>
@@ -3215,7 +3215,7 @@
               <w:rPr>
                 <w:noProof/>
               </w:rPr>
-              <w:instrText xml:space="preserve"> PAGEREF _Toc240528730 \h </w:instrText>
+              <w:instrText xml:space="preserve"> PAGEREF _Toc240529445 \h </w:instrText>
             </w:r>
             <w:r>
               <w:rPr>
@@ -3232,7 +3232,7 @@
               <w:rPr>
                 <w:noProof/>
               </w:rPr>
-              <w:t>33</w:t>
+              <w:t>34</w:t>
             </w:r>
             <w:r>
               <w:rPr>
@@ -3257,7 +3257,7 @@
               <w14:ligatures w14:val="standardContextual"/>
             </w:rPr>
           </w:pPr>
-          <w:hyperlink w:anchor="_Toc240528731" w:history="1">
+          <w:hyperlink w:anchor="_Toc240529446" w:history="1">
             <w:r>
               <w:rPr>
                 <w:rStyle w:val="a5"/>
@@ -3281,7 +3281,7 @@
               <w:rPr>
                 <w:noProof/>
               </w:rPr>
-              <w:instrText xml:space="preserve"> PAGEREF _Toc240528731 \h </w:instrText>
+              <w:instrText xml:space="preserve"> PAGEREF _Toc240529446 \h </w:instrText>
             </w:r>
             <w:r>
               <w:rPr>
@@ -3298,7 +3298,7 @@
               <w:rPr>
                 <w:noProof/>
               </w:rPr>
-              <w:t>35</w:t>
+              <w:t>36</w:t>
             </w:r>
             <w:r>
               <w:rPr>
@@ -3324,7 +3324,7 @@
               <w14:ligatures w14:val="standardContextual"/>
             </w:rPr>
           </w:pPr>
-          <w:hyperlink w:anchor="_Toc240528732" w:history="1">
+          <w:hyperlink w:anchor="_Toc240529447" w:history="1">
             <w:r>
               <w:rPr>
                 <w:rStyle w:val="a5"/>
@@ -3348,7 +3348,7 @@
               <w:rPr>
                 <w:noProof/>
               </w:rPr>
-              <w:instrText xml:space="preserve"> PAGEREF _Toc240528732 \h </w:instrText>
+              <w:instrText xml:space="preserve"> PAGEREF _Toc240529447 \h </w:instrText>
             </w:r>
             <w:r>
               <w:rPr>
@@ -3365,7 +3365,7 @@
               <w:rPr>
                 <w:noProof/>
               </w:rPr>
-              <w:t>35</w:t>
+              <w:t>36</w:t>
             </w:r>
             <w:r>
               <w:rPr>
@@ -3391,7 +3391,7 @@
               <w14:ligatures w14:val="standardContextual"/>
             </w:rPr>
           </w:pPr>
-          <w:hyperlink w:anchor="_Toc240528733" w:history="1">
+          <w:hyperlink w:anchor="_Toc240529448" w:history="1">
             <w:r>
               <w:rPr>
                 <w:rStyle w:val="a5"/>
@@ -3415,7 +3415,7 @@
               <w:rPr>
                 <w:noProof/>
               </w:rPr>
-              <w:instrText xml:space="preserve"> PAGEREF _Toc240528733 \h </w:instrText>
+              <w:instrText xml:space="preserve"> PAGEREF _Toc240529448 \h </w:instrText>
             </w:r>
             <w:r>
               <w:rPr>
@@ -3432,7 +3432,7 @@
               <w:rPr>
                 <w:noProof/>
               </w:rPr>
-              <w:t>35</w:t>
+              <w:t>36</w:t>
             </w:r>
             <w:r>
               <w:rPr>
@@ -3458,7 +3458,7 @@
               <w14:ligatures w14:val="standardContextual"/>
             </w:rPr>
           </w:pPr>
-          <w:hyperlink w:anchor="_Toc240528734" w:history="1">
+          <w:hyperlink w:anchor="_Toc240529449" w:history="1">
             <w:r>
               <w:rPr>
                 <w:rStyle w:val="a5"/>
@@ -3482,7 +3482,7 @@
               <w:rPr>
                 <w:noProof/>
               </w:rPr>
-              <w:instrText xml:space="preserve"> PAGEREF _Toc240528734 \h </w:instrText>
+              <w:instrText xml:space="preserve"> PAGEREF _Toc240529449 \h </w:instrText>
             </w:r>
             <w:r>
               <w:rPr>
@@ -3499,7 +3499,7 @@
               <w:rPr>
                 <w:noProof/>
               </w:rPr>
-              <w:t>35</w:t>
+              <w:t>36</w:t>
             </w:r>
             <w:r>
               <w:rPr>
@@ -3525,7 +3525,7 @@
               <w14:ligatures w14:val="standardContextual"/>
             </w:rPr>
           </w:pPr>
-          <w:hyperlink w:anchor="_Toc240528735" w:history="1">
+          <w:hyperlink w:anchor="_Toc240529450" w:history="1">
             <w:r>
               <w:rPr>
                 <w:rStyle w:val="a5"/>
@@ -3549,7 +3549,7 @@
               <w:rPr>
                 <w:noProof/>
               </w:rPr>
-              <w:instrText xml:space="preserve"> PAGEREF _Toc240528735 \h </w:instrText>
+              <w:instrText xml:space="preserve"> PAGEREF _Toc240529450 \h </w:instrText>
             </w:r>
             <w:r>
               <w:rPr>
@@ -3566,7 +3566,7 @@
               <w:rPr>
                 <w:noProof/>
               </w:rPr>
-              <w:t>35</w:t>
+              <w:t>36</w:t>
             </w:r>
             <w:r>
               <w:rPr>
@@ -3588,7 +3588,7 @@
         <w:pStyle w:val="1"/>
         <w:pageBreakBefore/>
       </w:pPr>
-      <w:bookmarkStart w:id="0" w:name="_Toc240528690"/>
+      <w:bookmarkStart w:id="0" w:name="_Toc240529405"/>
       <w:r>
         <w:lastRenderedPageBreak/>
         <w:t xml:space="preserve">1. </w:t>
@@ -3602,7 +3602,7 @@
       <w:pPr>
         <w:pStyle w:val="2"/>
       </w:pPr>
-      <w:bookmarkStart w:id="1" w:name="_Toc240528691"/>
+      <w:bookmarkStart w:id="1" w:name="_Toc240529406"/>
       <w:r>
         <w:t>1.1 RuninqVic</w:t>
       </w:r>
@@ -4012,7 +4012,7 @@
       <w:pPr>
         <w:pStyle w:val="2"/>
       </w:pPr>
-      <w:bookmarkStart w:id="2" w:name="_Toc240528692"/>
+      <w:bookmarkStart w:id="2" w:name="_Toc240529407"/>
       <w:r>
         <w:t xml:space="preserve">1.2 </w:t>
       </w:r>
@@ -6821,7 +6821,7 @@
       <w:pPr>
         <w:pStyle w:val="2"/>
       </w:pPr>
-      <w:bookmarkStart w:id="3" w:name="_Toc240528693"/>
+      <w:bookmarkStart w:id="3" w:name="_Toc240529408"/>
       <w:r>
         <w:t xml:space="preserve">1.3 </w:t>
       </w:r>
@@ -7053,7 +7053,7 @@
         <w:pStyle w:val="1"/>
         <w:pageBreakBefore/>
       </w:pPr>
-      <w:bookmarkStart w:id="4" w:name="_Toc240528694"/>
+      <w:bookmarkStart w:id="4" w:name="_Toc240529409"/>
       <w:r>
         <w:lastRenderedPageBreak/>
         <w:t xml:space="preserve">2. </w:t>
@@ -7067,7 +7067,7 @@
       <w:pPr>
         <w:pStyle w:val="2"/>
       </w:pPr>
-      <w:bookmarkStart w:id="5" w:name="_Toc240528695"/>
+      <w:bookmarkStart w:id="5" w:name="_Toc240529410"/>
       <w:r>
         <w:t xml:space="preserve">2.1 </w:t>
       </w:r>
@@ -8045,7 +8045,7 @@
       <w:pPr>
         <w:pStyle w:val="2"/>
       </w:pPr>
-      <w:bookmarkStart w:id="6" w:name="_Toc240528696"/>
+      <w:bookmarkStart w:id="6" w:name="_Toc240529411"/>
       <w:r>
         <w:t xml:space="preserve">2.2 </w:t>
       </w:r>
@@ -8399,10 +8399,10 @@
         </w:rPr>
         <w:lastRenderedPageBreak/>
         <w:drawing>
-          <wp:inline distT="0" distB="0" distL="0" distR="0" wp14:anchorId="2B76799F" wp14:editId="7B2489DF">
+          <wp:inline distT="0" distB="0" distL="0" distR="0" wp14:anchorId="3471876B" wp14:editId="0264F44F">
             <wp:extent cx="5943600" cy="3638550"/>
             <wp:effectExtent l="0" t="0" r="0" b="0"/>
-            <wp:docPr id="686941455" name="그림 686941455"/>
+            <wp:docPr id="103019374" name="그림 103019374"/>
             <wp:cNvGraphicFramePr>
               <a:graphicFrameLocks xmlns:a="http://schemas.openxmlformats.org/drawingml/2006/main" noChangeAspect="1"/>
             </wp:cNvGraphicFramePr>
@@ -8518,7 +8518,7 @@
       <w:pPr>
         <w:pStyle w:val="2"/>
       </w:pPr>
-      <w:bookmarkStart w:id="7" w:name="_Toc240528697"/>
+      <w:bookmarkStart w:id="7" w:name="_Toc240529412"/>
       <w:r>
         <w:t xml:space="preserve">2.3 </w:t>
       </w:r>
@@ -8543,10 +8543,10 @@
           <w:noProof/>
         </w:rPr>
         <w:drawing>
-          <wp:inline distT="0" distB="0" distL="0" distR="0" wp14:anchorId="43CA2A4B" wp14:editId="3DC569DF">
+          <wp:inline distT="0" distB="0" distL="0" distR="0" wp14:anchorId="75FD2568" wp14:editId="0B90F528">
             <wp:extent cx="5943600" cy="3638550"/>
             <wp:effectExtent l="0" t="0" r="0" b="0"/>
-            <wp:docPr id="1493422437" name="그림 1493422437"/>
+            <wp:docPr id="538679899" name="그림 538679899"/>
             <wp:cNvGraphicFramePr>
               <a:graphicFrameLocks xmlns:a="http://schemas.openxmlformats.org/drawingml/2006/main" noChangeAspect="1"/>
             </wp:cNvGraphicFramePr>
@@ -9976,7 +9976,7 @@
       <w:pPr>
         <w:pStyle w:val="2"/>
       </w:pPr>
-      <w:bookmarkStart w:id="8" w:name="_Toc240528698"/>
+      <w:bookmarkStart w:id="8" w:name="_Toc240529413"/>
       <w:r>
         <w:t xml:space="preserve">2.4 </w:t>
       </w:r>
@@ -10002,10 +10002,10 @@
         </w:rPr>
         <w:lastRenderedPageBreak/>
         <w:drawing>
-          <wp:inline distT="0" distB="0" distL="0" distR="0" wp14:anchorId="597B55B2" wp14:editId="6B9364A7">
+          <wp:inline distT="0" distB="0" distL="0" distR="0" wp14:anchorId="5319B900" wp14:editId="1CDB1B0E">
             <wp:extent cx="5943600" cy="12858750"/>
             <wp:effectExtent l="0" t="0" r="0" b="0"/>
-            <wp:docPr id="846727030" name="그림 846727030"/>
+            <wp:docPr id="62076901" name="그림 62076901"/>
             <wp:cNvGraphicFramePr>
               <a:graphicFrameLocks xmlns:a="http://schemas.openxmlformats.org/drawingml/2006/main" noChangeAspect="1"/>
             </wp:cNvGraphicFramePr>
@@ -10693,7 +10693,14 @@
                 <w:sz w:val="19"/>
                 <w:szCs w:val="19"/>
               </w:rPr>
-              <w:t>[</w:t>
+              <w:t>스마트폰에서는</w:t>
+            </w:r>
+            <w:r>
+              <w:rPr>
+                <w:sz w:val="19"/>
+                <w:szCs w:val="19"/>
+              </w:rPr>
+              <w:t xml:space="preserve"> [</w:t>
             </w:r>
             <w:r>
               <w:rPr>
@@ -10707,7 +10714,21 @@
                 <w:sz w:val="19"/>
                 <w:szCs w:val="19"/>
               </w:rPr>
-              <w:t>·</w:t>
+              <w:t>]</w:t>
+            </w:r>
+            <w:r>
+              <w:rPr>
+                <w:sz w:val="19"/>
+                <w:szCs w:val="19"/>
+              </w:rPr>
+              <w:t>과</w:t>
+            </w:r>
+            <w:r>
+              <w:rPr>
+                <w:sz w:val="19"/>
+                <w:szCs w:val="19"/>
+              </w:rPr>
+              <w:t xml:space="preserve"> [</w:t>
             </w:r>
             <w:r>
               <w:rPr>
@@ -10721,7 +10742,259 @@
                 <w:sz w:val="19"/>
                 <w:szCs w:val="19"/>
               </w:rPr>
-              <w:t xml:space="preserve"> </w:t>
+              <w:t xml:space="preserve">] </w:t>
+            </w:r>
+            <w:r>
+              <w:rPr>
+                <w:sz w:val="19"/>
+                <w:szCs w:val="19"/>
+              </w:rPr>
+              <w:t>버튼이</w:t>
+            </w:r>
+            <w:r>
+              <w:rPr>
+                <w:sz w:val="19"/>
+                <w:szCs w:val="19"/>
+              </w:rPr>
+              <w:t xml:space="preserve"> </w:t>
+            </w:r>
+            <w:r>
+              <w:rPr>
+                <w:sz w:val="19"/>
+                <w:szCs w:val="19"/>
+              </w:rPr>
+              <w:t>따로</w:t>
+            </w:r>
+            <w:r>
+              <w:rPr>
+                <w:sz w:val="19"/>
+                <w:szCs w:val="19"/>
+              </w:rPr>
+              <w:t xml:space="preserve"> </w:t>
+            </w:r>
+            <w:r>
+              <w:rPr>
+                <w:sz w:val="19"/>
+                <w:szCs w:val="19"/>
+              </w:rPr>
+              <w:t>있습니다</w:t>
+            </w:r>
+            <w:r>
+              <w:rPr>
+                <w:sz w:val="19"/>
+                <w:szCs w:val="19"/>
+              </w:rPr>
+              <w:t>. [</w:t>
+            </w:r>
+            <w:r>
+              <w:rPr>
+                <w:sz w:val="19"/>
+                <w:szCs w:val="19"/>
+              </w:rPr>
+              <w:t>사진</w:t>
+            </w:r>
+            <w:r>
+              <w:rPr>
+                <w:sz w:val="19"/>
+                <w:szCs w:val="19"/>
+              </w:rPr>
+              <w:t>]</w:t>
+            </w:r>
+            <w:r>
+              <w:rPr>
+                <w:sz w:val="19"/>
+                <w:szCs w:val="19"/>
+              </w:rPr>
+              <w:t>을</w:t>
+            </w:r>
+            <w:r>
+              <w:rPr>
+                <w:sz w:val="19"/>
+                <w:szCs w:val="19"/>
+              </w:rPr>
+              <w:t xml:space="preserve"> </w:t>
+            </w:r>
+            <w:r>
+              <w:rPr>
+                <w:sz w:val="19"/>
+                <w:szCs w:val="19"/>
+              </w:rPr>
+              <w:t>누르면</w:t>
+            </w:r>
+            <w:r>
+              <w:rPr>
+                <w:sz w:val="19"/>
+                <w:szCs w:val="19"/>
+              </w:rPr>
+              <w:t xml:space="preserve"> </w:t>
+            </w:r>
+            <w:r>
+              <w:rPr>
+                <w:sz w:val="19"/>
+                <w:szCs w:val="19"/>
+              </w:rPr>
+              <w:t>사진</w:t>
+            </w:r>
+            <w:r>
+              <w:rPr>
+                <w:sz w:val="19"/>
+                <w:szCs w:val="19"/>
+              </w:rPr>
+              <w:t xml:space="preserve"> </w:t>
+            </w:r>
+            <w:r>
+              <w:rPr>
+                <w:sz w:val="19"/>
+                <w:szCs w:val="19"/>
+              </w:rPr>
+              <w:t>선택</w:t>
+            </w:r>
+            <w:r>
+              <w:rPr>
+                <w:sz w:val="19"/>
+                <w:szCs w:val="19"/>
+              </w:rPr>
+              <w:t xml:space="preserve"> </w:t>
+            </w:r>
+            <w:r>
+              <w:rPr>
+                <w:sz w:val="19"/>
+                <w:szCs w:val="19"/>
+              </w:rPr>
+              <w:t>화면이</w:t>
+            </w:r>
+            <w:r>
+              <w:rPr>
+                <w:sz w:val="19"/>
+                <w:szCs w:val="19"/>
+              </w:rPr>
+              <w:t xml:space="preserve"> </w:t>
+            </w:r>
+            <w:r>
+              <w:rPr>
+                <w:sz w:val="19"/>
+                <w:szCs w:val="19"/>
+              </w:rPr>
+              <w:t>열리고</w:t>
+            </w:r>
+            <w:r>
+              <w:rPr>
+                <w:sz w:val="19"/>
+                <w:szCs w:val="19"/>
+              </w:rPr>
+              <w:t xml:space="preserve">, </w:t>
+            </w:r>
+            <w:r>
+              <w:rPr>
+                <w:sz w:val="19"/>
+                <w:szCs w:val="19"/>
+              </w:rPr>
+              <w:t>사진을</w:t>
+            </w:r>
+            <w:r>
+              <w:rPr>
+                <w:sz w:val="19"/>
+                <w:szCs w:val="19"/>
+              </w:rPr>
+              <w:t xml:space="preserve"> </w:t>
+            </w:r>
+            <w:r>
+              <w:rPr>
+                <w:sz w:val="19"/>
+                <w:szCs w:val="19"/>
+              </w:rPr>
+              <w:t>차례로</w:t>
+            </w:r>
+            <w:r>
+              <w:rPr>
+                <w:sz w:val="19"/>
+                <w:szCs w:val="19"/>
+              </w:rPr>
+              <w:t xml:space="preserve"> </w:t>
+            </w:r>
+            <w:r>
+              <w:rPr>
+                <w:sz w:val="19"/>
+                <w:szCs w:val="19"/>
+              </w:rPr>
+              <w:t>눌러</w:t>
+            </w:r>
+            <w:r>
+              <w:rPr>
+                <w:sz w:val="19"/>
+                <w:szCs w:val="19"/>
+              </w:rPr>
+              <w:t xml:space="preserve"> </w:t>
+            </w:r>
+            <w:r>
+              <w:rPr>
+                <w:sz w:val="19"/>
+                <w:szCs w:val="19"/>
+              </w:rPr>
+              <w:t>여러</w:t>
+            </w:r>
+            <w:r>
+              <w:rPr>
+                <w:sz w:val="19"/>
+                <w:szCs w:val="19"/>
+              </w:rPr>
+              <w:t xml:space="preserve"> </w:t>
+            </w:r>
+            <w:r>
+              <w:rPr>
+                <w:sz w:val="19"/>
+                <w:szCs w:val="19"/>
+              </w:rPr>
+              <w:t>장을</w:t>
+            </w:r>
+            <w:r>
+              <w:rPr>
+                <w:sz w:val="19"/>
+                <w:szCs w:val="19"/>
+              </w:rPr>
+              <w:t xml:space="preserve"> </w:t>
+            </w:r>
+            <w:r>
+              <w:rPr>
+                <w:sz w:val="19"/>
+                <w:szCs w:val="19"/>
+              </w:rPr>
+              <w:t>고른</w:t>
+            </w:r>
+            <w:r>
+              <w:rPr>
+                <w:sz w:val="19"/>
+                <w:szCs w:val="19"/>
+              </w:rPr>
+              <w:t xml:space="preserve"> </w:t>
+            </w:r>
+            <w:r>
+              <w:rPr>
+                <w:sz w:val="19"/>
+                <w:szCs w:val="19"/>
+              </w:rPr>
+              <w:t>뒤</w:t>
+            </w:r>
+            <w:r>
+              <w:rPr>
+                <w:sz w:val="19"/>
+                <w:szCs w:val="19"/>
+              </w:rPr>
+              <w:t xml:space="preserve"> </w:t>
+            </w:r>
+            <w:r>
+              <w:rPr>
+                <w:sz w:val="19"/>
+                <w:szCs w:val="19"/>
+              </w:rPr>
+              <w:t>완료</w:t>
+            </w:r>
+            <w:r>
+              <w:rPr>
+                <w:sz w:val="19"/>
+                <w:szCs w:val="19"/>
+              </w:rPr>
+              <w:t>(</w:t>
             </w:r>
             <w:r>
               <w:rPr>
@@ -10735,6 +11008,342 @@
                 <w:sz w:val="19"/>
                 <w:szCs w:val="19"/>
               </w:rPr>
+              <w:t>)</w:t>
+            </w:r>
+            <w:r>
+              <w:rPr>
+                <w:sz w:val="19"/>
+                <w:szCs w:val="19"/>
+              </w:rPr>
+              <w:t>를</w:t>
+            </w:r>
+            <w:r>
+              <w:rPr>
+                <w:sz w:val="19"/>
+                <w:szCs w:val="19"/>
+              </w:rPr>
+              <w:t xml:space="preserve"> </w:t>
+            </w:r>
+            <w:r>
+              <w:rPr>
+                <w:sz w:val="19"/>
+                <w:szCs w:val="19"/>
+              </w:rPr>
+              <w:t>누르면</w:t>
+            </w:r>
+            <w:r>
+              <w:rPr>
+                <w:sz w:val="19"/>
+                <w:szCs w:val="19"/>
+              </w:rPr>
+              <w:t xml:space="preserve"> </w:t>
+            </w:r>
+            <w:r>
+              <w:rPr>
+                <w:sz w:val="19"/>
+                <w:szCs w:val="19"/>
+              </w:rPr>
+              <w:t>한</w:t>
+            </w:r>
+            <w:r>
+              <w:rPr>
+                <w:sz w:val="19"/>
+                <w:szCs w:val="19"/>
+              </w:rPr>
+              <w:t xml:space="preserve"> </w:t>
+            </w:r>
+            <w:r>
+              <w:rPr>
+                <w:sz w:val="19"/>
+                <w:szCs w:val="19"/>
+              </w:rPr>
+              <w:t>번에</w:t>
+            </w:r>
+            <w:r>
+              <w:rPr>
+                <w:sz w:val="19"/>
+                <w:szCs w:val="19"/>
+              </w:rPr>
+              <w:t xml:space="preserve"> </w:t>
+            </w:r>
+            <w:r>
+              <w:rPr>
+                <w:sz w:val="19"/>
+                <w:szCs w:val="19"/>
+              </w:rPr>
+              <w:t>들어갑니다</w:t>
+            </w:r>
+            <w:r>
+              <w:rPr>
+                <w:sz w:val="19"/>
+                <w:szCs w:val="19"/>
+              </w:rPr>
+              <w:t xml:space="preserve">. </w:t>
+            </w:r>
+            <w:r>
+              <w:rPr>
+                <w:sz w:val="19"/>
+                <w:szCs w:val="19"/>
+              </w:rPr>
+              <w:t>안드로이드에서</w:t>
+            </w:r>
+            <w:r>
+              <w:rPr>
+                <w:sz w:val="19"/>
+                <w:szCs w:val="19"/>
+              </w:rPr>
+              <w:t xml:space="preserve"> </w:t>
+            </w:r>
+            <w:r>
+              <w:rPr>
+                <w:sz w:val="19"/>
+                <w:szCs w:val="19"/>
+              </w:rPr>
+              <w:t>갤러리</w:t>
+            </w:r>
+            <w:r>
+              <w:rPr>
+                <w:sz w:val="19"/>
+                <w:szCs w:val="19"/>
+              </w:rPr>
+              <w:t xml:space="preserve"> </w:t>
+            </w:r>
+            <w:r>
+              <w:rPr>
+                <w:sz w:val="19"/>
+                <w:szCs w:val="19"/>
+              </w:rPr>
+              <w:t>앱이</w:t>
+            </w:r>
+            <w:r>
+              <w:rPr>
+                <w:sz w:val="19"/>
+                <w:szCs w:val="19"/>
+              </w:rPr>
+              <w:t xml:space="preserve"> </w:t>
+            </w:r>
+            <w:r>
+              <w:rPr>
+                <w:sz w:val="19"/>
+                <w:szCs w:val="19"/>
+              </w:rPr>
+              <w:t>열리는</w:t>
+            </w:r>
+            <w:r>
+              <w:rPr>
+                <w:sz w:val="19"/>
+                <w:szCs w:val="19"/>
+              </w:rPr>
+              <w:t xml:space="preserve"> </w:t>
+            </w:r>
+            <w:r>
+              <w:rPr>
+                <w:sz w:val="19"/>
+                <w:szCs w:val="19"/>
+              </w:rPr>
+              <w:t>경우에는</w:t>
+            </w:r>
+            <w:r>
+              <w:rPr>
+                <w:sz w:val="19"/>
+                <w:szCs w:val="19"/>
+              </w:rPr>
+              <w:t xml:space="preserve"> </w:t>
+            </w:r>
+            <w:r>
+              <w:rPr>
+                <w:sz w:val="19"/>
+                <w:szCs w:val="19"/>
+              </w:rPr>
+              <w:t>사진을</w:t>
+            </w:r>
+            <w:r>
+              <w:rPr>
+                <w:sz w:val="19"/>
+                <w:szCs w:val="19"/>
+              </w:rPr>
+              <w:t xml:space="preserve"> </w:t>
+            </w:r>
+            <w:r>
+              <w:rPr>
+                <w:sz w:val="19"/>
+                <w:szCs w:val="19"/>
+              </w:rPr>
+              <w:t>길게</w:t>
+            </w:r>
+            <w:r>
+              <w:rPr>
+                <w:sz w:val="19"/>
+                <w:szCs w:val="19"/>
+              </w:rPr>
+              <w:t xml:space="preserve"> </w:t>
+            </w:r>
+            <w:r>
+              <w:rPr>
+                <w:sz w:val="19"/>
+                <w:szCs w:val="19"/>
+              </w:rPr>
+              <w:t>눌러</w:t>
+            </w:r>
+            <w:r>
+              <w:rPr>
+                <w:sz w:val="19"/>
+                <w:szCs w:val="19"/>
+              </w:rPr>
+              <w:t xml:space="preserve"> </w:t>
+            </w:r>
+            <w:r>
+              <w:rPr>
+                <w:sz w:val="19"/>
+                <w:szCs w:val="19"/>
+              </w:rPr>
+              <w:t>선택을</w:t>
+            </w:r>
+            <w:r>
+              <w:rPr>
+                <w:sz w:val="19"/>
+                <w:szCs w:val="19"/>
+              </w:rPr>
+              <w:t xml:space="preserve"> </w:t>
+            </w:r>
+            <w:r>
+              <w:rPr>
+                <w:sz w:val="19"/>
+                <w:szCs w:val="19"/>
+              </w:rPr>
+              <w:t>시작합니다</w:t>
+            </w:r>
+            <w:r>
+              <w:rPr>
+                <w:sz w:val="19"/>
+                <w:szCs w:val="19"/>
+              </w:rPr>
+              <w:t xml:space="preserve">. </w:t>
+            </w:r>
+            <w:r>
+              <w:rPr>
+                <w:sz w:val="19"/>
+                <w:szCs w:val="19"/>
+              </w:rPr>
+              <w:t>아이폰은</w:t>
+            </w:r>
+            <w:r>
+              <w:rPr>
+                <w:sz w:val="19"/>
+                <w:szCs w:val="19"/>
+              </w:rPr>
+              <w:t xml:space="preserve"> </w:t>
+            </w:r>
+            <w:r>
+              <w:rPr>
+                <w:sz w:val="19"/>
+                <w:szCs w:val="19"/>
+              </w:rPr>
+              <w:t>사진</w:t>
+            </w:r>
+            <w:r>
+              <w:rPr>
+                <w:sz w:val="19"/>
+                <w:szCs w:val="19"/>
+              </w:rPr>
+              <w:t xml:space="preserve"> </w:t>
+            </w:r>
+            <w:r>
+              <w:rPr>
+                <w:sz w:val="19"/>
+                <w:szCs w:val="19"/>
+              </w:rPr>
+              <w:t>보관함에서</w:t>
+            </w:r>
+            <w:r>
+              <w:rPr>
+                <w:sz w:val="19"/>
+                <w:szCs w:val="19"/>
+              </w:rPr>
+              <w:t xml:space="preserve"> </w:t>
+            </w:r>
+            <w:r>
+              <w:rPr>
+                <w:sz w:val="19"/>
+                <w:szCs w:val="19"/>
+              </w:rPr>
+              <w:t>여러</w:t>
+            </w:r>
+            <w:r>
+              <w:rPr>
+                <w:sz w:val="19"/>
+                <w:szCs w:val="19"/>
+              </w:rPr>
+              <w:t xml:space="preserve"> </w:t>
+            </w:r>
+            <w:r>
+              <w:rPr>
+                <w:sz w:val="19"/>
+                <w:szCs w:val="19"/>
+              </w:rPr>
+              <w:t>장을</w:t>
+            </w:r>
+            <w:r>
+              <w:rPr>
+                <w:sz w:val="19"/>
+                <w:szCs w:val="19"/>
+              </w:rPr>
+              <w:t xml:space="preserve"> </w:t>
+            </w:r>
+            <w:r>
+              <w:rPr>
+                <w:sz w:val="19"/>
+                <w:szCs w:val="19"/>
+              </w:rPr>
+              <w:t>눌러</w:t>
+            </w:r>
+            <w:r>
+              <w:rPr>
+                <w:sz w:val="19"/>
+                <w:szCs w:val="19"/>
+              </w:rPr>
+              <w:t xml:space="preserve"> </w:t>
+            </w:r>
+            <w:r>
+              <w:rPr>
+                <w:sz w:val="19"/>
+                <w:szCs w:val="19"/>
+              </w:rPr>
+              <w:t>고른</w:t>
+            </w:r>
+            <w:r>
+              <w:rPr>
+                <w:sz w:val="19"/>
+                <w:szCs w:val="19"/>
+              </w:rPr>
+              <w:t xml:space="preserve"> </w:t>
+            </w:r>
+            <w:r>
+              <w:rPr>
+                <w:sz w:val="19"/>
+                <w:szCs w:val="19"/>
+              </w:rPr>
+              <w:t>뒤</w:t>
+            </w:r>
+            <w:r>
+              <w:rPr>
+                <w:sz w:val="19"/>
+                <w:szCs w:val="19"/>
+              </w:rPr>
+              <w:t xml:space="preserve"> [</w:t>
+            </w:r>
+            <w:r>
+              <w:rPr>
+                <w:sz w:val="19"/>
+                <w:szCs w:val="19"/>
+              </w:rPr>
+              <w:t>추가</w:t>
+            </w:r>
+            <w:r>
+              <w:rPr>
+                <w:sz w:val="19"/>
+                <w:szCs w:val="19"/>
+              </w:rPr>
               <w:t>]</w:t>
             </w:r>
             <w:r>
@@ -10756,133 +11365,7 @@
                 <w:sz w:val="19"/>
                 <w:szCs w:val="19"/>
               </w:rPr>
-              <w:t>누르면</w:t>
-            </w:r>
-            <w:r>
-              <w:rPr>
-                <w:sz w:val="19"/>
-                <w:szCs w:val="19"/>
-              </w:rPr>
-              <w:t xml:space="preserve"> </w:t>
-            </w:r>
-            <w:r>
-              <w:rPr>
-                <w:sz w:val="19"/>
-                <w:szCs w:val="19"/>
-              </w:rPr>
-              <w:t>갤러리가</w:t>
-            </w:r>
-            <w:r>
-              <w:rPr>
-                <w:sz w:val="19"/>
-                <w:szCs w:val="19"/>
-              </w:rPr>
-              <w:t xml:space="preserve"> </w:t>
-            </w:r>
-            <w:r>
-              <w:rPr>
-                <w:sz w:val="19"/>
-                <w:szCs w:val="19"/>
-              </w:rPr>
-              <w:t>열립니다</w:t>
-            </w:r>
-            <w:r>
-              <w:rPr>
-                <w:sz w:val="19"/>
-                <w:szCs w:val="19"/>
-              </w:rPr>
-              <w:t xml:space="preserve">. </w:t>
-            </w:r>
-            <w:r>
-              <w:rPr>
-                <w:sz w:val="19"/>
-                <w:szCs w:val="19"/>
-              </w:rPr>
-              <w:t>여러</w:t>
-            </w:r>
-            <w:r>
-              <w:rPr>
-                <w:sz w:val="19"/>
-                <w:szCs w:val="19"/>
-              </w:rPr>
-              <w:t xml:space="preserve"> </w:t>
-            </w:r>
-            <w:r>
-              <w:rPr>
-                <w:sz w:val="19"/>
-                <w:szCs w:val="19"/>
-              </w:rPr>
-              <w:t>장을</w:t>
-            </w:r>
-            <w:r>
-              <w:rPr>
-                <w:sz w:val="19"/>
-                <w:szCs w:val="19"/>
-              </w:rPr>
-              <w:t xml:space="preserve"> </w:t>
-            </w:r>
-            <w:r>
-              <w:rPr>
-                <w:sz w:val="19"/>
-                <w:szCs w:val="19"/>
-              </w:rPr>
-              <w:t>한</w:t>
-            </w:r>
-            <w:r>
-              <w:rPr>
-                <w:sz w:val="19"/>
-                <w:szCs w:val="19"/>
-              </w:rPr>
-              <w:t xml:space="preserve"> </w:t>
-            </w:r>
-            <w:r>
-              <w:rPr>
-                <w:sz w:val="19"/>
-                <w:szCs w:val="19"/>
-              </w:rPr>
-              <w:t>번에</w:t>
-            </w:r>
-            <w:r>
-              <w:rPr>
-                <w:sz w:val="19"/>
-                <w:szCs w:val="19"/>
-              </w:rPr>
-              <w:t xml:space="preserve"> </w:t>
-            </w:r>
-            <w:r>
-              <w:rPr>
-                <w:sz w:val="19"/>
-                <w:szCs w:val="19"/>
-              </w:rPr>
-              <w:t>고를</w:t>
-            </w:r>
-            <w:r>
-              <w:rPr>
-                <w:sz w:val="19"/>
-                <w:szCs w:val="19"/>
-              </w:rPr>
-              <w:t xml:space="preserve"> </w:t>
-            </w:r>
-            <w:r>
-              <w:rPr>
-                <w:sz w:val="19"/>
-                <w:szCs w:val="19"/>
-              </w:rPr>
-              <w:t>수</w:t>
-            </w:r>
-            <w:r>
-              <w:rPr>
-                <w:sz w:val="19"/>
-                <w:szCs w:val="19"/>
-              </w:rPr>
-              <w:t xml:space="preserve"> </w:t>
-            </w:r>
-            <w:r>
-              <w:rPr>
-                <w:sz w:val="19"/>
-                <w:szCs w:val="19"/>
-              </w:rPr>
-              <w:t>있습니다</w:t>
+              <w:t>누릅니다</w:t>
             </w:r>
             <w:r>
               <w:rPr>
@@ -13785,6 +14268,7 @@
                 <w:sz w:val="19"/>
                 <w:szCs w:val="19"/>
               </w:rPr>
+              <w:lastRenderedPageBreak/>
               <w:t>이동하지</w:t>
             </w:r>
             <w:r>
@@ -13828,10 +14312,10 @@
         </w:rPr>
         <w:lastRenderedPageBreak/>
         <w:drawing>
-          <wp:inline distT="0" distB="0" distL="0" distR="0" wp14:anchorId="10895674" wp14:editId="7FC6564F">
+          <wp:inline distT="0" distB="0" distL="0" distR="0" wp14:anchorId="1CA9AAB3" wp14:editId="34065ADD">
             <wp:extent cx="5943600" cy="12858750"/>
             <wp:effectExtent l="0" t="0" r="0" b="0"/>
-            <wp:docPr id="271745101" name="그림 271745101"/>
+            <wp:docPr id="1326564195" name="그림 1326564195"/>
             <wp:cNvGraphicFramePr>
               <a:graphicFrameLocks xmlns:a="http://schemas.openxmlformats.org/drawingml/2006/main" noChangeAspect="1"/>
             </wp:cNvGraphicFramePr>
@@ -14039,7 +14523,7 @@
         <w:pStyle w:val="1"/>
         <w:pageBreakBefore/>
       </w:pPr>
-      <w:bookmarkStart w:id="9" w:name="_Toc240528699"/>
+      <w:bookmarkStart w:id="9" w:name="_Toc240529414"/>
       <w:r>
         <w:lastRenderedPageBreak/>
         <w:t>3. 5</w:t>
@@ -14743,7 +15227,7 @@
         <w:pStyle w:val="1"/>
         <w:pageBreakBefore/>
       </w:pPr>
-      <w:bookmarkStart w:id="10" w:name="_Toc240528700"/>
+      <w:bookmarkStart w:id="10" w:name="_Toc240529415"/>
       <w:r>
         <w:lastRenderedPageBreak/>
         <w:t xml:space="preserve">4. </w:t>
@@ -14822,7 +15306,7 @@
       <w:pPr>
         <w:pStyle w:val="2"/>
       </w:pPr>
-      <w:bookmarkStart w:id="11" w:name="_Toc240528701"/>
+      <w:bookmarkStart w:id="11" w:name="_Toc240529416"/>
       <w:r>
         <w:t xml:space="preserve">4.1 ① </w:t>
       </w:r>
@@ -15544,7 +16028,7 @@
       <w:pPr>
         <w:pStyle w:val="2"/>
       </w:pPr>
-      <w:bookmarkStart w:id="12" w:name="_Toc240528702"/>
+      <w:bookmarkStart w:id="12" w:name="_Toc240529417"/>
       <w:r>
         <w:t xml:space="preserve">4.2 ② </w:t>
       </w:r>
@@ -16080,7 +16564,7 @@
       <w:pPr>
         <w:pStyle w:val="2"/>
       </w:pPr>
-      <w:bookmarkStart w:id="13" w:name="_Toc240528703"/>
+      <w:bookmarkStart w:id="13" w:name="_Toc240529418"/>
       <w:r>
         <w:t>4.2.1 AI</w:t>
       </w:r>
@@ -16112,10 +16596,10 @@
         </w:rPr>
         <w:lastRenderedPageBreak/>
         <w:drawing>
-          <wp:inline distT="0" distB="0" distL="0" distR="0" wp14:anchorId="76EA2169" wp14:editId="0F10BE25">
+          <wp:inline distT="0" distB="0" distL="0" distR="0" wp14:anchorId="72D88ED9" wp14:editId="78ED0E5E">
             <wp:extent cx="5943600" cy="3638550"/>
             <wp:effectExtent l="0" t="0" r="0" b="0"/>
-            <wp:docPr id="369537415" name="그림 369537415"/>
+            <wp:docPr id="1604114985" name="그림 1604114985"/>
             <wp:cNvGraphicFramePr>
               <a:graphicFrameLocks xmlns:a="http://schemas.openxmlformats.org/drawingml/2006/main" noChangeAspect="1"/>
             </wp:cNvGraphicFramePr>
@@ -20070,7 +20554,7 @@
       <w:pPr>
         <w:pStyle w:val="2"/>
       </w:pPr>
-      <w:bookmarkStart w:id="14" w:name="_Toc240528704"/>
+      <w:bookmarkStart w:id="14" w:name="_Toc240529419"/>
       <w:r>
         <w:t xml:space="preserve">4.3 ③ </w:t>
       </w:r>
@@ -21670,7 +22154,7 @@
       <w:pPr>
         <w:pStyle w:val="2"/>
       </w:pPr>
-      <w:bookmarkStart w:id="15" w:name="_Toc240528705"/>
+      <w:bookmarkStart w:id="15" w:name="_Toc240529420"/>
       <w:r>
         <w:t xml:space="preserve">4.4 ④ </w:t>
       </w:r>
@@ -22178,7 +22662,7 @@
         <w:pStyle w:val="1"/>
         <w:pageBreakBefore/>
       </w:pPr>
-      <w:bookmarkStart w:id="16" w:name="_Toc240528706"/>
+      <w:bookmarkStart w:id="16" w:name="_Toc240529421"/>
       <w:r>
         <w:lastRenderedPageBreak/>
         <w:t xml:space="preserve">5. </w:t>
@@ -22204,7 +22688,7 @@
       <w:pPr>
         <w:pStyle w:val="2"/>
       </w:pPr>
-      <w:bookmarkStart w:id="17" w:name="_Toc240528707"/>
+      <w:bookmarkStart w:id="17" w:name="_Toc240529422"/>
       <w:r>
         <w:t xml:space="preserve">5.1 </w:t>
       </w:r>
@@ -22513,7 +22997,7 @@
       <w:pPr>
         <w:pStyle w:val="2"/>
       </w:pPr>
-      <w:bookmarkStart w:id="18" w:name="_Toc240528708"/>
+      <w:bookmarkStart w:id="18" w:name="_Toc240529423"/>
       <w:r>
         <w:t xml:space="preserve">5.2 </w:t>
       </w:r>
@@ -23042,7 +23526,7 @@
       <w:pPr>
         <w:pStyle w:val="2"/>
       </w:pPr>
-      <w:bookmarkStart w:id="19" w:name="_Toc240528709"/>
+      <w:bookmarkStart w:id="19" w:name="_Toc240529424"/>
       <w:r>
         <w:t xml:space="preserve">5.3 </w:t>
       </w:r>
@@ -23313,7 +23797,7 @@
       <w:pPr>
         <w:pStyle w:val="2"/>
       </w:pPr>
-      <w:bookmarkStart w:id="20" w:name="_Toc240528710"/>
+      <w:bookmarkStart w:id="20" w:name="_Toc240529425"/>
       <w:r>
         <w:t xml:space="preserve">5.4 </w:t>
       </w:r>
@@ -23523,7 +24007,7 @@
       <w:pPr>
         <w:pStyle w:val="2"/>
       </w:pPr>
-      <w:bookmarkStart w:id="21" w:name="_Toc240528711"/>
+      <w:bookmarkStart w:id="21" w:name="_Toc240529426"/>
       <w:r>
         <w:t xml:space="preserve">5.5 </w:t>
       </w:r>
@@ -23746,7 +24230,7 @@
       <w:pPr>
         <w:pStyle w:val="2"/>
       </w:pPr>
-      <w:bookmarkStart w:id="22" w:name="_Toc240528712"/>
+      <w:bookmarkStart w:id="22" w:name="_Toc240529427"/>
       <w:r>
         <w:t xml:space="preserve">5.6 </w:t>
       </w:r>
@@ -23867,7 +24351,7 @@
         <w:pStyle w:val="1"/>
         <w:pageBreakBefore/>
       </w:pPr>
-      <w:bookmarkStart w:id="23" w:name="_Toc240528713"/>
+      <w:bookmarkStart w:id="23" w:name="_Toc240529428"/>
       <w:r>
         <w:lastRenderedPageBreak/>
         <w:t xml:space="preserve">6. </w:t>
@@ -25716,7 +26200,7 @@
         <w:pStyle w:val="1"/>
         <w:pageBreakBefore/>
       </w:pPr>
-      <w:bookmarkStart w:id="24" w:name="_Toc240528714"/>
+      <w:bookmarkStart w:id="24" w:name="_Toc240529429"/>
       <w:r>
         <w:lastRenderedPageBreak/>
         <w:t xml:space="preserve">7. </w:t>
@@ -25736,10 +26220,10 @@
           <w:noProof/>
         </w:rPr>
         <w:drawing>
-          <wp:inline distT="0" distB="0" distL="0" distR="0" wp14:anchorId="105B54CE" wp14:editId="1AD121A1">
+          <wp:inline distT="0" distB="0" distL="0" distR="0" wp14:anchorId="394D2FF3" wp14:editId="6135443C">
             <wp:extent cx="5943600" cy="3638550"/>
             <wp:effectExtent l="0" t="0" r="0" b="0"/>
-            <wp:docPr id="1621985746" name="그림 1621985746"/>
+            <wp:docPr id="399601714" name="그림 399601714"/>
             <wp:cNvGraphicFramePr>
               <a:graphicFrameLocks xmlns:a="http://schemas.openxmlformats.org/drawingml/2006/main" noChangeAspect="1"/>
             </wp:cNvGraphicFramePr>
@@ -28545,7 +29029,7 @@
       <w:pPr>
         <w:pStyle w:val="2"/>
       </w:pPr>
-      <w:bookmarkStart w:id="25" w:name="_Toc240528715"/>
+      <w:bookmarkStart w:id="25" w:name="_Toc240529430"/>
       <w:r>
         <w:t xml:space="preserve">7.1 </w:t>
       </w:r>
@@ -28576,10 +29060,10 @@
           <w:noProof/>
         </w:rPr>
         <w:drawing>
-          <wp:inline distT="0" distB="0" distL="0" distR="0" wp14:anchorId="6403D934" wp14:editId="02B0972E">
+          <wp:inline distT="0" distB="0" distL="0" distR="0" wp14:anchorId="53878C29" wp14:editId="1218DCFC">
             <wp:extent cx="5943600" cy="3638550"/>
             <wp:effectExtent l="0" t="0" r="0" b="0"/>
-            <wp:docPr id="976768705" name="그림 976768705"/>
+            <wp:docPr id="1493804949" name="그림 1493804949"/>
             <wp:cNvGraphicFramePr>
               <a:graphicFrameLocks xmlns:a="http://schemas.openxmlformats.org/drawingml/2006/main" noChangeAspect="1"/>
             </wp:cNvGraphicFramePr>
@@ -32228,7 +32712,7 @@
         <w:pStyle w:val="1"/>
         <w:pageBreakBefore/>
       </w:pPr>
-      <w:bookmarkStart w:id="26" w:name="_Toc240528716"/>
+      <w:bookmarkStart w:id="26" w:name="_Toc240529431"/>
       <w:r>
         <w:lastRenderedPageBreak/>
         <w:t xml:space="preserve">8. </w:t>
@@ -32248,10 +32732,10 @@
           <w:noProof/>
         </w:rPr>
         <w:drawing>
-          <wp:inline distT="0" distB="0" distL="0" distR="0" wp14:anchorId="4BA479C8" wp14:editId="7FE0BEBA">
+          <wp:inline distT="0" distB="0" distL="0" distR="0" wp14:anchorId="5EE26C16" wp14:editId="2F597F34">
             <wp:extent cx="5943600" cy="3638550"/>
             <wp:effectExtent l="0" t="0" r="0" b="0"/>
-            <wp:docPr id="301343673" name="그림 301343673"/>
+            <wp:docPr id="76597454" name="그림 76597454"/>
             <wp:cNvGraphicFramePr>
               <a:graphicFrameLocks xmlns:a="http://schemas.openxmlformats.org/drawingml/2006/main" noChangeAspect="1"/>
             </wp:cNvGraphicFramePr>
@@ -32347,7 +32831,7 @@
       <w:pPr>
         <w:pStyle w:val="2"/>
       </w:pPr>
-      <w:bookmarkStart w:id="27" w:name="_Toc240528717"/>
+      <w:bookmarkStart w:id="27" w:name="_Toc240529432"/>
       <w:r>
         <w:t xml:space="preserve">8.1 </w:t>
       </w:r>
@@ -33435,7 +33919,7 @@
       <w:pPr>
         <w:pStyle w:val="2"/>
       </w:pPr>
-      <w:bookmarkStart w:id="28" w:name="_Toc240528718"/>
+      <w:bookmarkStart w:id="28" w:name="_Toc240529433"/>
       <w:r>
         <w:t xml:space="preserve">8.2 </w:t>
       </w:r>
@@ -34688,7 +35172,7 @@
       <w:pPr>
         <w:pStyle w:val="2"/>
       </w:pPr>
-      <w:bookmarkStart w:id="29" w:name="_Toc240528719"/>
+      <w:bookmarkStart w:id="29" w:name="_Toc240529434"/>
       <w:r>
         <w:t xml:space="preserve">8.3 </w:t>
       </w:r>
@@ -34941,7 +35425,7 @@
         <w:pStyle w:val="1"/>
         <w:pageBreakBefore/>
       </w:pPr>
-      <w:bookmarkStart w:id="30" w:name="_Toc240528720"/>
+      <w:bookmarkStart w:id="30" w:name="_Toc240529435"/>
       <w:r>
         <w:lastRenderedPageBreak/>
         <w:t xml:space="preserve">9. </w:t>
@@ -34961,10 +35445,10 @@
           <w:noProof/>
         </w:rPr>
         <w:drawing>
-          <wp:inline distT="0" distB="0" distL="0" distR="0" wp14:anchorId="6C01EAF1" wp14:editId="209F05AE">
+          <wp:inline distT="0" distB="0" distL="0" distR="0" wp14:anchorId="1771C75C" wp14:editId="02F9C342">
             <wp:extent cx="5943600" cy="3638550"/>
             <wp:effectExtent l="0" t="0" r="0" b="0"/>
-            <wp:docPr id="2058248769" name="그림 2058248769"/>
+            <wp:docPr id="690215810" name="그림 690215810"/>
             <wp:cNvGraphicFramePr>
               <a:graphicFrameLocks xmlns:a="http://schemas.openxmlformats.org/drawingml/2006/main" noChangeAspect="1"/>
             </wp:cNvGraphicFramePr>
@@ -35060,7 +35544,7 @@
       <w:pPr>
         <w:pStyle w:val="2"/>
       </w:pPr>
-      <w:bookmarkStart w:id="31" w:name="_Toc240528721"/>
+      <w:bookmarkStart w:id="31" w:name="_Toc240529436"/>
       <w:r>
         <w:t xml:space="preserve">9.1 </w:t>
       </w:r>
@@ -36436,7 +36920,7 @@
       <w:pPr>
         <w:pStyle w:val="2"/>
       </w:pPr>
-      <w:bookmarkStart w:id="32" w:name="_Toc240528722"/>
+      <w:bookmarkStart w:id="32" w:name="_Toc240529437"/>
       <w:r>
         <w:t xml:space="preserve">9.2 </w:t>
       </w:r>
@@ -36605,7 +37089,7 @@
         <w:pStyle w:val="1"/>
         <w:pageBreakBefore/>
       </w:pPr>
-      <w:bookmarkStart w:id="33" w:name="_Toc240528723"/>
+      <w:bookmarkStart w:id="33" w:name="_Toc240529438"/>
       <w:r>
         <w:lastRenderedPageBreak/>
         <w:t xml:space="preserve">10. </w:t>
@@ -36631,10 +37115,10 @@
           <w:noProof/>
         </w:rPr>
         <w:drawing>
-          <wp:inline distT="0" distB="0" distL="0" distR="0" wp14:anchorId="0FA9ADDE" wp14:editId="7B7FE653">
+          <wp:inline distT="0" distB="0" distL="0" distR="0" wp14:anchorId="42C45C3F" wp14:editId="0213A93F">
             <wp:extent cx="5943600" cy="3638550"/>
             <wp:effectExtent l="0" t="0" r="0" b="0"/>
-            <wp:docPr id="835594460" name="그림 835594460"/>
+            <wp:docPr id="1666189866" name="그림 1666189866"/>
             <wp:cNvGraphicFramePr>
               <a:graphicFrameLocks xmlns:a="http://schemas.openxmlformats.org/drawingml/2006/main" noChangeAspect="1"/>
             </wp:cNvGraphicFramePr>
@@ -38270,7 +38754,7 @@
         <w:pStyle w:val="1"/>
         <w:pageBreakBefore/>
       </w:pPr>
-      <w:bookmarkStart w:id="34" w:name="_Toc240528724"/>
+      <w:bookmarkStart w:id="34" w:name="_Toc240529439"/>
       <w:r>
         <w:lastRenderedPageBreak/>
         <w:t xml:space="preserve">11. </w:t>
@@ -38296,10 +38780,10 @@
           <w:noProof/>
         </w:rPr>
         <w:drawing>
-          <wp:inline distT="0" distB="0" distL="0" distR="0" wp14:anchorId="74B405B2" wp14:editId="394B6E22">
+          <wp:inline distT="0" distB="0" distL="0" distR="0" wp14:anchorId="47507D86" wp14:editId="75EC5AE4">
             <wp:extent cx="5943600" cy="3638550"/>
             <wp:effectExtent l="0" t="0" r="0" b="0"/>
-            <wp:docPr id="263480305" name="그림 263480305"/>
+            <wp:docPr id="614432500" name="그림 614432500"/>
             <wp:cNvGraphicFramePr>
               <a:graphicFrameLocks xmlns:a="http://schemas.openxmlformats.org/drawingml/2006/main" noChangeAspect="1"/>
             </wp:cNvGraphicFramePr>
@@ -38415,7 +38899,7 @@
       <w:pPr>
         <w:pStyle w:val="2"/>
       </w:pPr>
-      <w:bookmarkStart w:id="35" w:name="_Toc240528725"/>
+      <w:bookmarkStart w:id="35" w:name="_Toc240529440"/>
       <w:r>
         <w:t xml:space="preserve">11.1 </w:t>
       </w:r>
@@ -39714,7 +40198,7 @@
       <w:pPr>
         <w:pStyle w:val="2"/>
       </w:pPr>
-      <w:bookmarkStart w:id="36" w:name="_Toc240528726"/>
+      <w:bookmarkStart w:id="36" w:name="_Toc240529441"/>
       <w:r>
         <w:t xml:space="preserve">11.2 </w:t>
       </w:r>
@@ -40155,7 +40639,7 @@
       <w:pPr>
         <w:pStyle w:val="2"/>
       </w:pPr>
-      <w:bookmarkStart w:id="37" w:name="_Toc240528727"/>
+      <w:bookmarkStart w:id="37" w:name="_Toc240529442"/>
       <w:r>
         <w:t xml:space="preserve">11.3 </w:t>
       </w:r>
@@ -40696,7 +41180,7 @@
         <w:pStyle w:val="1"/>
         <w:pageBreakBefore/>
       </w:pPr>
-      <w:bookmarkStart w:id="38" w:name="_Toc240528728"/>
+      <w:bookmarkStart w:id="38" w:name="_Toc240529443"/>
       <w:r>
         <w:lastRenderedPageBreak/>
         <w:t xml:space="preserve">12. </w:t>
@@ -42154,7 +42638,7 @@
         <w:pStyle w:val="1"/>
         <w:pageBreakBefore/>
       </w:pPr>
-      <w:bookmarkStart w:id="39" w:name="_Toc240528729"/>
+      <w:bookmarkStart w:id="39" w:name="_Toc240529444"/>
       <w:r>
         <w:lastRenderedPageBreak/>
         <w:t xml:space="preserve">13. </w:t>
@@ -43235,7 +43719,7 @@
         <w:pStyle w:val="1"/>
         <w:pageBreakBefore/>
       </w:pPr>
-      <w:bookmarkStart w:id="40" w:name="_Toc240528730"/>
+      <w:bookmarkStart w:id="40" w:name="_Toc240529445"/>
       <w:r>
         <w:lastRenderedPageBreak/>
         <w:t xml:space="preserve">14. </w:t>
@@ -46576,7 +47060,7 @@
         <w:pStyle w:val="1"/>
         <w:pageBreakBefore/>
       </w:pPr>
-      <w:bookmarkStart w:id="41" w:name="_Toc240528731"/>
+      <w:bookmarkStart w:id="41" w:name="_Toc240529446"/>
       <w:r>
         <w:lastRenderedPageBreak/>
         <w:t>부록</w:t>
@@ -46587,7 +47071,7 @@
       <w:pPr>
         <w:pStyle w:val="2"/>
       </w:pPr>
-      <w:bookmarkStart w:id="42" w:name="_Toc240528732"/>
+      <w:bookmarkStart w:id="42" w:name="_Toc240529447"/>
       <w:r>
         <w:t xml:space="preserve">A. </w:t>
       </w:r>
@@ -47168,7 +47652,7 @@
       <w:pPr>
         <w:pStyle w:val="2"/>
       </w:pPr>
-      <w:bookmarkStart w:id="43" w:name="_Toc240528733"/>
+      <w:bookmarkStart w:id="43" w:name="_Toc240529448"/>
       <w:r>
         <w:t xml:space="preserve">B. </w:t>
       </w:r>
@@ -47403,7 +47887,7 @@
       <w:pPr>
         <w:pStyle w:val="2"/>
       </w:pPr>
-      <w:bookmarkStart w:id="44" w:name="_Toc240528734"/>
+      <w:bookmarkStart w:id="44" w:name="_Toc240529449"/>
       <w:r>
         <w:t xml:space="preserve">C. </w:t>
       </w:r>
@@ -48478,7 +48962,7 @@
       <w:pPr>
         <w:pStyle w:val="2"/>
       </w:pPr>
-      <w:bookmarkStart w:id="45" w:name="_Toc240528735"/>
+      <w:bookmarkStart w:id="45" w:name="_Toc240529450"/>
       <w:r>
         <w:t xml:space="preserve">D. </w:t>
       </w:r>
@@ -48907,118 +49391,10 @@
 <file path=word/numbering.xml><?xml version="1.0" encoding="utf-8"?>
 <w:numbering xmlns:wpc="http://schemas.microsoft.com/office/word/2010/wordprocessingCanvas" xmlns:cx="http://schemas.microsoft.com/office/drawing/2014/chartex" xmlns:cx1="http://schemas.microsoft.com/office/drawing/2015/9/8/chartex" xmlns:cx2="http://schemas.microsoft.com/office/drawing/2015/10/21/chartex" xmlns:cx3="http://schemas.microsoft.com/office/drawing/2016/5/9/chartex" xmlns:cx4="http://schemas.microsoft.com/office/drawing/2016/5/10/chartex" xmlns:cx5="http://schemas.microsoft.com/office/drawing/2016/5/11/chartex" xmlns:cx6="http://schemas.microsoft.com/office/drawing/2016/5/12/chartex" xmlns:cx7="http://schemas.microsoft.com/office/drawing/2016/5/13/chartex" xmlns:cx8="http://schemas.microsoft.com/office/drawing/2016/5/14/chartex" xmlns:mc="http://schemas.openxmlformats.org/markup-compatibility/2006" xmlns:aink="http://schemas.microsoft.com/office/drawing/2016/ink" xmlns:am3d="http://schemas.microsoft.com/office/drawing/2017/model3d" xmlns:o="urn:schemas-microsoft-com:office:office" xmlns:oel="http://schemas.microsoft.com/office/2019/extlst" xmlns:r="http://schemas.openxmlformats.org/officeDocument/2006/relationships" xmlns:m="http://schemas.openxmlformats.org/officeDocument/2006/math" xmlns:v="urn:schemas-microsoft-com:vml" xmlns:wp14="http://schemas.microsoft.com/office/word/2010/wordprocessingDrawing" xmlns:wp="http://schemas.openxmlformats.org/drawingml/2006/wordprocessingDrawing" xmlns:w10="urn:schemas-microsoft-com:office:word" xmlns:w="http://schemas.openxmlformats.org/wordprocessingml/2006/main" xmlns:w14="http://schemas.microsoft.com/office/word/2010/wordml" xmlns:w15="http://schemas.microsoft.com/office/word/2012/wordml" xmlns:w16cex="http://schemas.microsoft.com/office/word/2018/wordml/cex" xmlns:w16cid="http://schemas.microsoft.com/office/word/2016/wordml/cid" xmlns:w16="http://schemas.microsoft.com/office/word/2018/wordml" xmlns:w16du="http://schemas.microsoft.com/office/word/2023/wordml/word16du" xmlns:w16sdtdh="http://schemas.microsoft.com/office/word/2020/wordml/sdtdatahash" xmlns:w16sdtfl="http://schemas.microsoft.com/office/word/2024/wordml/sdtformatlock" xmlns:w16se="http://schemas.microsoft.com/office/word/2015/wordml/symex" xmlns:wpg="http://schemas.microsoft.com/office/word/2010/wordprocessingGroup" xmlns:wpi="http://schemas.microsoft.com/office/word/2010/wordprocessingInk" xmlns:wne="http://schemas.microsoft.com/office/word/2006/wordml" xmlns:wps="http://schemas.microsoft.com/office/word/2010/wordprocessingShape" mc:Ignorable="w14 w15 w16se w16cid w16 w16cex w16sdtdh w16sdtfl w16du wp14">
   <w:abstractNum w:abstractNumId="0" w15:restartNumberingAfterBreak="0">
-    <w:nsid w:val="38DA4FB9"/>
+    <w:nsid w:val="04724A58"/>
     <w:multiLevelType w:val="hybridMultilevel"/>
-    <w:tmpl w:val="5EF2C436"/>
-    <w:lvl w:ilvl="0" w:tplc="C8D07166">
-      <w:start w:val="1"/>
-      <w:numFmt w:val="bullet"/>
-      <w:lvlText w:val="•"/>
-      <w:lvlJc w:val="left"/>
-      <w:pPr>
-        <w:ind w:left="480" w:hanging="260"/>
-      </w:pPr>
-    </w:lvl>
-    <w:lvl w:ilvl="1" w:tplc="C388CC94">
-      <w:numFmt w:val="decimal"/>
-      <w:lvlText w:val=""/>
-      <w:lvlJc w:val="left"/>
-    </w:lvl>
-    <w:lvl w:ilvl="2" w:tplc="EAA20EE8">
-      <w:numFmt w:val="decimal"/>
-      <w:lvlText w:val=""/>
-      <w:lvlJc w:val="left"/>
-    </w:lvl>
-    <w:lvl w:ilvl="3" w:tplc="30CC7714">
-      <w:numFmt w:val="decimal"/>
-      <w:lvlText w:val=""/>
-      <w:lvlJc w:val="left"/>
-    </w:lvl>
-    <w:lvl w:ilvl="4" w:tplc="C074BFF4">
-      <w:numFmt w:val="decimal"/>
-      <w:lvlText w:val=""/>
-      <w:lvlJc w:val="left"/>
-    </w:lvl>
-    <w:lvl w:ilvl="5" w:tplc="6B16A870">
-      <w:numFmt w:val="decimal"/>
-      <w:lvlText w:val=""/>
-      <w:lvlJc w:val="left"/>
-    </w:lvl>
-    <w:lvl w:ilvl="6" w:tplc="6938F7C6">
-      <w:numFmt w:val="decimal"/>
-      <w:lvlText w:val=""/>
-      <w:lvlJc w:val="left"/>
-    </w:lvl>
-    <w:lvl w:ilvl="7" w:tplc="25A239CC">
-      <w:numFmt w:val="decimal"/>
-      <w:lvlText w:val=""/>
-      <w:lvlJc w:val="left"/>
-    </w:lvl>
-    <w:lvl w:ilvl="8" w:tplc="C0A06D8E">
-      <w:numFmt w:val="decimal"/>
-      <w:lvlText w:val=""/>
-      <w:lvlJc w:val="left"/>
-    </w:lvl>
-  </w:abstractNum>
-  <w:abstractNum w:abstractNumId="1" w15:restartNumberingAfterBreak="0">
-    <w:nsid w:val="63766D7D"/>
-    <w:multiLevelType w:val="hybridMultilevel"/>
-    <w:tmpl w:val="38FC89AA"/>
-    <w:lvl w:ilvl="0" w:tplc="E460CA64">
-      <w:start w:val="1"/>
-      <w:numFmt w:val="decimal"/>
-      <w:lvlText w:val="%1."/>
-      <w:lvlJc w:val="left"/>
-      <w:pPr>
-        <w:ind w:left="480" w:hanging="300"/>
-      </w:pPr>
-    </w:lvl>
-    <w:lvl w:ilvl="1" w:tplc="1CEC11AA">
-      <w:numFmt w:val="decimal"/>
-      <w:lvlText w:val=""/>
-      <w:lvlJc w:val="left"/>
-    </w:lvl>
-    <w:lvl w:ilvl="2" w:tplc="0F547B44">
-      <w:numFmt w:val="decimal"/>
-      <w:lvlText w:val=""/>
-      <w:lvlJc w:val="left"/>
-    </w:lvl>
-    <w:lvl w:ilvl="3" w:tplc="5656BBFC">
-      <w:numFmt w:val="decimal"/>
-      <w:lvlText w:val=""/>
-      <w:lvlJc w:val="left"/>
-    </w:lvl>
-    <w:lvl w:ilvl="4" w:tplc="2BF83508">
-      <w:numFmt w:val="decimal"/>
-      <w:lvlText w:val=""/>
-      <w:lvlJc w:val="left"/>
-    </w:lvl>
-    <w:lvl w:ilvl="5" w:tplc="D05E527A">
-      <w:numFmt w:val="decimal"/>
-      <w:lvlText w:val=""/>
-      <w:lvlJc w:val="left"/>
-    </w:lvl>
-    <w:lvl w:ilvl="6" w:tplc="9A38BF20">
-      <w:numFmt w:val="decimal"/>
-      <w:lvlText w:val=""/>
-      <w:lvlJc w:val="left"/>
-    </w:lvl>
-    <w:lvl w:ilvl="7" w:tplc="A23C4D00">
-      <w:numFmt w:val="decimal"/>
-      <w:lvlText w:val=""/>
-      <w:lvlJc w:val="left"/>
-    </w:lvl>
-    <w:lvl w:ilvl="8" w:tplc="63701808">
-      <w:numFmt w:val="decimal"/>
-      <w:lvlText w:val=""/>
-      <w:lvlJc w:val="left"/>
-    </w:lvl>
-  </w:abstractNum>
-  <w:abstractNum w:abstractNumId="2" w15:restartNumberingAfterBreak="0">
-    <w:nsid w:val="720A2E38"/>
-    <w:multiLevelType w:val="hybridMultilevel"/>
-    <w:tmpl w:val="65D4F0F4"/>
-    <w:lvl w:ilvl="0" w:tplc="7062EC84">
+    <w:tmpl w:val="A264717E"/>
+    <w:lvl w:ilvl="0" w:tplc="6E9CBB16">
       <w:start w:val="1"/>
       <w:numFmt w:val="bullet"/>
       <w:lvlText w:val="●"/>
@@ -49027,7 +49403,7 @@
         <w:ind w:left="720" w:hanging="360"/>
       </w:pPr>
     </w:lvl>
-    <w:lvl w:ilvl="1" w:tplc="3014B48C">
+    <w:lvl w:ilvl="1" w:tplc="B462AB6C">
       <w:start w:val="1"/>
       <w:numFmt w:val="bullet"/>
       <w:lvlText w:val="○"/>
@@ -49036,7 +49412,7 @@
         <w:ind w:left="1440" w:hanging="360"/>
       </w:pPr>
     </w:lvl>
-    <w:lvl w:ilvl="2" w:tplc="D13A529C">
+    <w:lvl w:ilvl="2" w:tplc="F108460A">
       <w:start w:val="1"/>
       <w:numFmt w:val="bullet"/>
       <w:lvlText w:val="■"/>
@@ -49045,7 +49421,7 @@
         <w:ind w:left="2160" w:hanging="360"/>
       </w:pPr>
     </w:lvl>
-    <w:lvl w:ilvl="3" w:tplc="B28642B2">
+    <w:lvl w:ilvl="3" w:tplc="60503BC0">
       <w:start w:val="1"/>
       <w:numFmt w:val="bullet"/>
       <w:lvlText w:val="●"/>
@@ -49054,7 +49430,7 @@
         <w:ind w:left="2880" w:hanging="360"/>
       </w:pPr>
     </w:lvl>
-    <w:lvl w:ilvl="4" w:tplc="FCFE21E6">
+    <w:lvl w:ilvl="4" w:tplc="AAB0920A">
       <w:start w:val="1"/>
       <w:numFmt w:val="bullet"/>
       <w:lvlText w:val="○"/>
@@ -49063,7 +49439,7 @@
         <w:ind w:left="3600" w:hanging="360"/>
       </w:pPr>
     </w:lvl>
-    <w:lvl w:ilvl="5" w:tplc="BB649AA8">
+    <w:lvl w:ilvl="5" w:tplc="2F00581C">
       <w:start w:val="1"/>
       <w:numFmt w:val="bullet"/>
       <w:lvlText w:val="■"/>
@@ -49072,7 +49448,7 @@
         <w:ind w:left="4320" w:hanging="360"/>
       </w:pPr>
     </w:lvl>
-    <w:lvl w:ilvl="6" w:tplc="CC54382E">
+    <w:lvl w:ilvl="6" w:tplc="92207D36">
       <w:start w:val="1"/>
       <w:numFmt w:val="bullet"/>
       <w:lvlText w:val="●"/>
@@ -49081,7 +49457,7 @@
         <w:ind w:left="5040" w:hanging="360"/>
       </w:pPr>
     </w:lvl>
-    <w:lvl w:ilvl="7" w:tplc="B1242582">
+    <w:lvl w:ilvl="7" w:tplc="155E3DDA">
       <w:start w:val="1"/>
       <w:numFmt w:val="bullet"/>
       <w:lvlText w:val="●"/>
@@ -49090,7 +49466,7 @@
         <w:ind w:left="5760" w:hanging="360"/>
       </w:pPr>
     </w:lvl>
-    <w:lvl w:ilvl="8" w:tplc="481E0912">
+    <w:lvl w:ilvl="8" w:tplc="4CC23CBA">
       <w:start w:val="1"/>
       <w:numFmt w:val="bullet"/>
       <w:lvlText w:val="●"/>
@@ -49100,26 +49476,134 @@
       </w:pPr>
     </w:lvl>
   </w:abstractNum>
-  <w:num w:numId="1" w16cid:durableId="814298363">
+  <w:abstractNum w:abstractNumId="1" w15:restartNumberingAfterBreak="0">
+    <w:nsid w:val="34130A6B"/>
+    <w:multiLevelType w:val="hybridMultilevel"/>
+    <w:tmpl w:val="C876FF52"/>
+    <w:lvl w:ilvl="0" w:tplc="993E49F2">
+      <w:start w:val="1"/>
+      <w:numFmt w:val="bullet"/>
+      <w:lvlText w:val="•"/>
+      <w:lvlJc w:val="left"/>
+      <w:pPr>
+        <w:ind w:left="480" w:hanging="260"/>
+      </w:pPr>
+    </w:lvl>
+    <w:lvl w:ilvl="1" w:tplc="2BC0B6EA">
+      <w:numFmt w:val="decimal"/>
+      <w:lvlText w:val=""/>
+      <w:lvlJc w:val="left"/>
+    </w:lvl>
+    <w:lvl w:ilvl="2" w:tplc="C966D720">
+      <w:numFmt w:val="decimal"/>
+      <w:lvlText w:val=""/>
+      <w:lvlJc w:val="left"/>
+    </w:lvl>
+    <w:lvl w:ilvl="3" w:tplc="7E1EA928">
+      <w:numFmt w:val="decimal"/>
+      <w:lvlText w:val=""/>
+      <w:lvlJc w:val="left"/>
+    </w:lvl>
+    <w:lvl w:ilvl="4" w:tplc="F5100674">
+      <w:numFmt w:val="decimal"/>
+      <w:lvlText w:val=""/>
+      <w:lvlJc w:val="left"/>
+    </w:lvl>
+    <w:lvl w:ilvl="5" w:tplc="EFB44C1E">
+      <w:numFmt w:val="decimal"/>
+      <w:lvlText w:val=""/>
+      <w:lvlJc w:val="left"/>
+    </w:lvl>
+    <w:lvl w:ilvl="6" w:tplc="6BCE4F9E">
+      <w:numFmt w:val="decimal"/>
+      <w:lvlText w:val=""/>
+      <w:lvlJc w:val="left"/>
+    </w:lvl>
+    <w:lvl w:ilvl="7" w:tplc="EF867850">
+      <w:numFmt w:val="decimal"/>
+      <w:lvlText w:val=""/>
+      <w:lvlJc w:val="left"/>
+    </w:lvl>
+    <w:lvl w:ilvl="8" w:tplc="204A25B0">
+      <w:numFmt w:val="decimal"/>
+      <w:lvlText w:val=""/>
+      <w:lvlJc w:val="left"/>
+    </w:lvl>
+  </w:abstractNum>
+  <w:abstractNum w:abstractNumId="2" w15:restartNumberingAfterBreak="0">
+    <w:nsid w:val="6EBB388D"/>
+    <w:multiLevelType w:val="hybridMultilevel"/>
+    <w:tmpl w:val="68340890"/>
+    <w:lvl w:ilvl="0" w:tplc="EDB4BA0A">
+      <w:start w:val="1"/>
+      <w:numFmt w:val="decimal"/>
+      <w:lvlText w:val="%1."/>
+      <w:lvlJc w:val="left"/>
+      <w:pPr>
+        <w:ind w:left="480" w:hanging="300"/>
+      </w:pPr>
+    </w:lvl>
+    <w:lvl w:ilvl="1" w:tplc="A6187CA6">
+      <w:numFmt w:val="decimal"/>
+      <w:lvlText w:val=""/>
+      <w:lvlJc w:val="left"/>
+    </w:lvl>
+    <w:lvl w:ilvl="2" w:tplc="8CB46E4E">
+      <w:numFmt w:val="decimal"/>
+      <w:lvlText w:val=""/>
+      <w:lvlJc w:val="left"/>
+    </w:lvl>
+    <w:lvl w:ilvl="3" w:tplc="15CCA740">
+      <w:numFmt w:val="decimal"/>
+      <w:lvlText w:val=""/>
+      <w:lvlJc w:val="left"/>
+    </w:lvl>
+    <w:lvl w:ilvl="4" w:tplc="C1F69FF0">
+      <w:numFmt w:val="decimal"/>
+      <w:lvlText w:val=""/>
+      <w:lvlJc w:val="left"/>
+    </w:lvl>
+    <w:lvl w:ilvl="5" w:tplc="6576D73C">
+      <w:numFmt w:val="decimal"/>
+      <w:lvlText w:val=""/>
+      <w:lvlJc w:val="left"/>
+    </w:lvl>
+    <w:lvl w:ilvl="6" w:tplc="A86A5ADA">
+      <w:numFmt w:val="decimal"/>
+      <w:lvlText w:val=""/>
+      <w:lvlJc w:val="left"/>
+    </w:lvl>
+    <w:lvl w:ilvl="7" w:tplc="E7925C0C">
+      <w:numFmt w:val="decimal"/>
+      <w:lvlText w:val=""/>
+      <w:lvlJc w:val="left"/>
+    </w:lvl>
+    <w:lvl w:ilvl="8" w:tplc="A09E61EA">
+      <w:numFmt w:val="decimal"/>
+      <w:lvlText w:val=""/>
+      <w:lvlJc w:val="left"/>
+    </w:lvl>
+  </w:abstractNum>
+  <w:num w:numId="1" w16cid:durableId="483546899">
+    <w:abstractNumId w:val="0"/>
+    <w:lvlOverride w:ilvl="0">
+      <w:startOverride w:val="1"/>
+    </w:lvlOverride>
+  </w:num>
+  <w:num w:numId="2" w16cid:durableId="1727141524">
+    <w:abstractNumId w:val="1"/>
+    <w:lvlOverride w:ilvl="0">
+      <w:startOverride w:val="1"/>
+    </w:lvlOverride>
+  </w:num>
+  <w:num w:numId="3" w16cid:durableId="1645545351">
     <w:abstractNumId w:val="2"/>
     <w:lvlOverride w:ilvl="0">
       <w:startOverride w:val="1"/>
     </w:lvlOverride>
   </w:num>
-  <w:num w:numId="2" w16cid:durableId="1412504554">
-    <w:abstractNumId w:val="0"/>
-    <w:lvlOverride w:ilvl="0">
-      <w:startOverride w:val="1"/>
-    </w:lvlOverride>
-  </w:num>
-  <w:num w:numId="3" w16cid:durableId="613293445">
-    <w:abstractNumId w:val="1"/>
-    <w:lvlOverride w:ilvl="0">
-      <w:startOverride w:val="1"/>
-    </w:lvlOverride>
-  </w:num>
-  <w:num w:numId="4" w16cid:durableId="1836528433">
-    <w:abstractNumId w:val="1"/>
+  <w:num w:numId="4" w16cid:durableId="1821120595">
+    <w:abstractNumId w:val="2"/>
     <w:lvlOverride w:ilvl="0">
       <w:startOverride w:val="1"/>
     </w:lvlOverride>
@@ -49743,7 +50227,7 @@
     <w:autoRedefine/>
     <w:uiPriority w:val="39"/>
     <w:unhideWhenUsed/>
-    <w:rsid w:val="00941080"/>
+    <w:rsid w:val="0093580A"/>
   </w:style>
   <w:style w:type="paragraph" w:styleId="20">
     <w:name w:val="toc 2"/>
@@ -49752,7 +50236,7 @@
     <w:autoRedefine/>
     <w:uiPriority w:val="39"/>
     <w:unhideWhenUsed/>
-    <w:rsid w:val="00941080"/>
+    <w:rsid w:val="0093580A"/>
     <w:pPr>
       <w:ind w:leftChars="200" w:left="425"/>
     </w:pPr>
@@ -49763,7 +50247,7 @@
     <w:link w:val="Char1"/>
     <w:uiPriority w:val="99"/>
     <w:unhideWhenUsed/>
-    <w:rsid w:val="00941080"/>
+    <w:rsid w:val="0093580A"/>
     <w:pPr>
       <w:tabs>
         <w:tab w:val="center" w:pos="4513"/>
@@ -49777,7 +50261,7 @@
     <w:basedOn w:val="a0"/>
     <w:link w:val="aa"/>
     <w:uiPriority w:val="99"/>
-    <w:rsid w:val="00941080"/>
+    <w:rsid w:val="0093580A"/>
   </w:style>
   <w:style w:type="paragraph" w:styleId="ab">
     <w:name w:val="footer"/>
@@ -49785,7 +50269,7 @@
     <w:link w:val="Char2"/>
     <w:uiPriority w:val="99"/>
     <w:unhideWhenUsed/>
-    <w:rsid w:val="00941080"/>
+    <w:rsid w:val="0093580A"/>
     <w:pPr>
       <w:tabs>
         <w:tab w:val="center" w:pos="4513"/>
@@ -49799,7 +50283,7 @@
     <w:basedOn w:val="a0"/>
     <w:link w:val="ab"/>
     <w:uiPriority w:val="99"/>
-    <w:rsid w:val="00941080"/>
+    <w:rsid w:val="0093580A"/>
   </w:style>
 </w:styles>
 </file>

</xml_diff>

<commit_message>
v1.6.1: dialogs keep title and buttons in view (usage button was below the fold), #usage shortcut
Co-Authored-By: Claude Fable 5.1 <noreply@anthropic.com>
</commit_message>
<xml_diff>
--- a/docs/manual/RuninqVic_사용설명서.docx
+++ b/docs/manual/RuninqVic_사용설명서.docx
@@ -17,7 +17,7 @@
           <w:noProof/>
         </w:rPr>
         <w:drawing>
-          <wp:inline distT="0" distB="0" distL="0" distR="0" wp14:anchorId="27DD9146" wp14:editId="7A1AF701">
+          <wp:inline distT="0" distB="0" distL="0" distR="0" wp14:anchorId="1880753C" wp14:editId="131E36D9">
             <wp:extent cx="838200" cy="838200"/>
             <wp:effectExtent l="0" t="0" r="0" b="0"/>
             <wp:docPr id="1" name="그림 1"/>
@@ -396,10 +396,10 @@
             <w:noProof/>
           </w:rPr>
           <w:drawing>
-            <wp:inline distT="0" distB="0" distL="0" distR="0" wp14:anchorId="7782D3A0" wp14:editId="70FDA179">
+            <wp:inline distT="0" distB="0" distL="0" distR="0" wp14:anchorId="092AD137" wp14:editId="4AA8EF2A">
               <wp:extent cx="1905000" cy="762000"/>
               <wp:effectExtent l="0" t="0" r="0" b="0"/>
-              <wp:docPr id="2076847065" name="그림 2076847065">
+              <wp:docPr id="338446325" name="그림 338446325">
                 <a:hlinkClick xmlns:a="http://schemas.openxmlformats.org/drawingml/2006/main" r:id="rId9"/>
               </wp:docPr>
               <wp:cNvGraphicFramePr>
@@ -537,7 +537,7 @@
     <w:sdt>
       <w:sdtPr>
         <w:alias w:val="목차"/>
-        <w:id w:val="-1868058301"/>
+        <w:id w:val="1453056417"/>
       </w:sdtPr>
       <w:sdtEndPr/>
       <w:sdtContent>
@@ -565,7 +565,7 @@
           <w:r>
             <w:fldChar w:fldCharType="separate"/>
           </w:r>
-          <w:hyperlink w:anchor="_Toc240675071" w:history="1">
+          <w:hyperlink w:anchor="_Toc240675675" w:history="1">
             <w:r>
               <w:rPr>
                 <w:rStyle w:val="a5"/>
@@ -589,7 +589,7 @@
               <w:rPr>
                 <w:noProof/>
               </w:rPr>
-              <w:instrText xml:space="preserve"> PAGEREF _Toc240675071 \h </w:instrText>
+              <w:instrText xml:space="preserve"> PAGEREF _Toc240675675 \h </w:instrText>
             </w:r>
             <w:r>
               <w:rPr>
@@ -632,7 +632,7 @@
               <w14:ligatures w14:val="standardContextual"/>
             </w:rPr>
           </w:pPr>
-          <w:hyperlink w:anchor="_Toc240675072" w:history="1">
+          <w:hyperlink w:anchor="_Toc240675676" w:history="1">
             <w:r>
               <w:rPr>
                 <w:rStyle w:val="a5"/>
@@ -656,7 +656,7 @@
               <w:rPr>
                 <w:noProof/>
               </w:rPr>
-              <w:instrText xml:space="preserve"> PAGEREF _Toc240675072 \h </w:instrText>
+              <w:instrText xml:space="preserve"> PAGEREF _Toc240675676 \h </w:instrText>
             </w:r>
             <w:r>
               <w:rPr>
@@ -699,7 +699,7 @@
               <w14:ligatures w14:val="standardContextual"/>
             </w:rPr>
           </w:pPr>
-          <w:hyperlink w:anchor="_Toc240675073" w:history="1">
+          <w:hyperlink w:anchor="_Toc240675677" w:history="1">
             <w:r>
               <w:rPr>
                 <w:rStyle w:val="a5"/>
@@ -723,7 +723,7 @@
               <w:rPr>
                 <w:noProof/>
               </w:rPr>
-              <w:instrText xml:space="preserve"> PAGEREF _Toc240675073 \h </w:instrText>
+              <w:instrText xml:space="preserve"> PAGEREF _Toc240675677 \h </w:instrText>
             </w:r>
             <w:r>
               <w:rPr>
@@ -766,7 +766,7 @@
               <w14:ligatures w14:val="standardContextual"/>
             </w:rPr>
           </w:pPr>
-          <w:hyperlink w:anchor="_Toc240675074" w:history="1">
+          <w:hyperlink w:anchor="_Toc240675678" w:history="1">
             <w:r>
               <w:rPr>
                 <w:rStyle w:val="a5"/>
@@ -790,7 +790,7 @@
               <w:rPr>
                 <w:noProof/>
               </w:rPr>
-              <w:instrText xml:space="preserve"> PAGEREF _Toc240675074 \h </w:instrText>
+              <w:instrText xml:space="preserve"> PAGEREF _Toc240675678 \h </w:instrText>
             </w:r>
             <w:r>
               <w:rPr>
@@ -832,7 +832,7 @@
               <w14:ligatures w14:val="standardContextual"/>
             </w:rPr>
           </w:pPr>
-          <w:hyperlink w:anchor="_Toc240675075" w:history="1">
+          <w:hyperlink w:anchor="_Toc240675679" w:history="1">
             <w:r>
               <w:rPr>
                 <w:rStyle w:val="a5"/>
@@ -856,7 +856,7 @@
               <w:rPr>
                 <w:noProof/>
               </w:rPr>
-              <w:instrText xml:space="preserve"> PAGEREF _Toc240675075 \h </w:instrText>
+              <w:instrText xml:space="preserve"> PAGEREF _Toc240675679 \h </w:instrText>
             </w:r>
             <w:r>
               <w:rPr>
@@ -899,7 +899,7 @@
               <w14:ligatures w14:val="standardContextual"/>
             </w:rPr>
           </w:pPr>
-          <w:hyperlink w:anchor="_Toc240675076" w:history="1">
+          <w:hyperlink w:anchor="_Toc240675680" w:history="1">
             <w:r>
               <w:rPr>
                 <w:rStyle w:val="a5"/>
@@ -923,7 +923,7 @@
               <w:rPr>
                 <w:noProof/>
               </w:rPr>
-              <w:instrText xml:space="preserve"> PAGEREF _Toc240675076 \h </w:instrText>
+              <w:instrText xml:space="preserve"> PAGEREF _Toc240675680 \h </w:instrText>
             </w:r>
             <w:r>
               <w:rPr>
@@ -966,7 +966,7 @@
               <w14:ligatures w14:val="standardContextual"/>
             </w:rPr>
           </w:pPr>
-          <w:hyperlink w:anchor="_Toc240675077" w:history="1">
+          <w:hyperlink w:anchor="_Toc240675681" w:history="1">
             <w:r>
               <w:rPr>
                 <w:rStyle w:val="a5"/>
@@ -990,7 +990,7 @@
               <w:rPr>
                 <w:noProof/>
               </w:rPr>
-              <w:instrText xml:space="preserve"> PAGEREF _Toc240675077 \h </w:instrText>
+              <w:instrText xml:space="preserve"> PAGEREF _Toc240675681 \h </w:instrText>
             </w:r>
             <w:r>
               <w:rPr>
@@ -1033,7 +1033,7 @@
               <w14:ligatures w14:val="standardContextual"/>
             </w:rPr>
           </w:pPr>
-          <w:hyperlink w:anchor="_Toc240675078" w:history="1">
+          <w:hyperlink w:anchor="_Toc240675682" w:history="1">
             <w:r>
               <w:rPr>
                 <w:rStyle w:val="a5"/>
@@ -1057,7 +1057,7 @@
               <w:rPr>
                 <w:noProof/>
               </w:rPr>
-              <w:instrText xml:space="preserve"> PAGEREF _Toc240675078 \h </w:instrText>
+              <w:instrText xml:space="preserve"> PAGEREF _Toc240675682 \h </w:instrText>
             </w:r>
             <w:r>
               <w:rPr>
@@ -1100,7 +1100,7 @@
               <w14:ligatures w14:val="standardContextual"/>
             </w:rPr>
           </w:pPr>
-          <w:hyperlink w:anchor="_Toc240675079" w:history="1">
+          <w:hyperlink w:anchor="_Toc240675683" w:history="1">
             <w:r>
               <w:rPr>
                 <w:rStyle w:val="a5"/>
@@ -1124,7 +1124,7 @@
               <w:rPr>
                 <w:noProof/>
               </w:rPr>
-              <w:instrText xml:space="preserve"> PAGEREF _Toc240675079 \h </w:instrText>
+              <w:instrText xml:space="preserve"> PAGEREF _Toc240675683 \h </w:instrText>
             </w:r>
             <w:r>
               <w:rPr>
@@ -1166,7 +1166,7 @@
               <w14:ligatures w14:val="standardContextual"/>
             </w:rPr>
           </w:pPr>
-          <w:hyperlink w:anchor="_Toc240675080" w:history="1">
+          <w:hyperlink w:anchor="_Toc240675684" w:history="1">
             <w:r>
               <w:rPr>
                 <w:rStyle w:val="a5"/>
@@ -1190,7 +1190,7 @@
               <w:rPr>
                 <w:noProof/>
               </w:rPr>
-              <w:instrText xml:space="preserve"> PAGEREF _Toc240675080 \h </w:instrText>
+              <w:instrText xml:space="preserve"> PAGEREF _Toc240675684 \h </w:instrText>
             </w:r>
             <w:r>
               <w:rPr>
@@ -1232,7 +1232,7 @@
               <w14:ligatures w14:val="standardContextual"/>
             </w:rPr>
           </w:pPr>
-          <w:hyperlink w:anchor="_Toc240675081" w:history="1">
+          <w:hyperlink w:anchor="_Toc240675685" w:history="1">
             <w:r>
               <w:rPr>
                 <w:rStyle w:val="a5"/>
@@ -1256,7 +1256,7 @@
               <w:rPr>
                 <w:noProof/>
               </w:rPr>
-              <w:instrText xml:space="preserve"> PAGEREF _Toc240675081 \h </w:instrText>
+              <w:instrText xml:space="preserve"> PAGEREF _Toc240675685 \h </w:instrText>
             </w:r>
             <w:r>
               <w:rPr>
@@ -1299,7 +1299,7 @@
               <w14:ligatures w14:val="standardContextual"/>
             </w:rPr>
           </w:pPr>
-          <w:hyperlink w:anchor="_Toc240675082" w:history="1">
+          <w:hyperlink w:anchor="_Toc240675686" w:history="1">
             <w:r>
               <w:rPr>
                 <w:rStyle w:val="a5"/>
@@ -1323,7 +1323,7 @@
               <w:rPr>
                 <w:noProof/>
               </w:rPr>
-              <w:instrText xml:space="preserve"> PAGEREF _Toc240675082 \h </w:instrText>
+              <w:instrText xml:space="preserve"> PAGEREF _Toc240675686 \h </w:instrText>
             </w:r>
             <w:r>
               <w:rPr>
@@ -1366,7 +1366,7 @@
               <w14:ligatures w14:val="standardContextual"/>
             </w:rPr>
           </w:pPr>
-          <w:hyperlink w:anchor="_Toc240675083" w:history="1">
+          <w:hyperlink w:anchor="_Toc240675687" w:history="1">
             <w:r>
               <w:rPr>
                 <w:rStyle w:val="a5"/>
@@ -1390,7 +1390,7 @@
               <w:rPr>
                 <w:noProof/>
               </w:rPr>
-              <w:instrText xml:space="preserve"> PAGEREF _Toc240675083 \h </w:instrText>
+              <w:instrText xml:space="preserve"> PAGEREF _Toc240675687 \h </w:instrText>
             </w:r>
             <w:r>
               <w:rPr>
@@ -1433,7 +1433,7 @@
               <w14:ligatures w14:val="standardContextual"/>
             </w:rPr>
           </w:pPr>
-          <w:hyperlink w:anchor="_Toc240675084" w:history="1">
+          <w:hyperlink w:anchor="_Toc240675688" w:history="1">
             <w:r>
               <w:rPr>
                 <w:rStyle w:val="a5"/>
@@ -1457,7 +1457,7 @@
               <w:rPr>
                 <w:noProof/>
               </w:rPr>
-              <w:instrText xml:space="preserve"> PAGEREF _Toc240675084 \h </w:instrText>
+              <w:instrText xml:space="preserve"> PAGEREF _Toc240675688 \h </w:instrText>
             </w:r>
             <w:r>
               <w:rPr>
@@ -1500,7 +1500,7 @@
               <w14:ligatures w14:val="standardContextual"/>
             </w:rPr>
           </w:pPr>
-          <w:hyperlink w:anchor="_Toc240675085" w:history="1">
+          <w:hyperlink w:anchor="_Toc240675689" w:history="1">
             <w:r>
               <w:rPr>
                 <w:rStyle w:val="a5"/>
@@ -1524,7 +1524,7 @@
               <w:rPr>
                 <w:noProof/>
               </w:rPr>
-              <w:instrText xml:space="preserve"> PAGEREF _Toc240675085 \h </w:instrText>
+              <w:instrText xml:space="preserve"> PAGEREF _Toc240675689 \h </w:instrText>
             </w:r>
             <w:r>
               <w:rPr>
@@ -1567,7 +1567,7 @@
               <w14:ligatures w14:val="standardContextual"/>
             </w:rPr>
           </w:pPr>
-          <w:hyperlink w:anchor="_Toc240675086" w:history="1">
+          <w:hyperlink w:anchor="_Toc240675690" w:history="1">
             <w:r>
               <w:rPr>
                 <w:rStyle w:val="a5"/>
@@ -1591,7 +1591,7 @@
               <w:rPr>
                 <w:noProof/>
               </w:rPr>
-              <w:instrText xml:space="preserve"> PAGEREF _Toc240675086 \h </w:instrText>
+              <w:instrText xml:space="preserve"> PAGEREF _Toc240675690 \h </w:instrText>
             </w:r>
             <w:r>
               <w:rPr>
@@ -1633,7 +1633,7 @@
               <w14:ligatures w14:val="standardContextual"/>
             </w:rPr>
           </w:pPr>
-          <w:hyperlink w:anchor="_Toc240675087" w:history="1">
+          <w:hyperlink w:anchor="_Toc240675691" w:history="1">
             <w:r>
               <w:rPr>
                 <w:rStyle w:val="a5"/>
@@ -1657,7 +1657,7 @@
               <w:rPr>
                 <w:noProof/>
               </w:rPr>
-              <w:instrText xml:space="preserve"> PAGEREF _Toc240675087 \h </w:instrText>
+              <w:instrText xml:space="preserve"> PAGEREF _Toc240675691 \h </w:instrText>
             </w:r>
             <w:r>
               <w:rPr>
@@ -1700,7 +1700,7 @@
               <w14:ligatures w14:val="standardContextual"/>
             </w:rPr>
           </w:pPr>
-          <w:hyperlink w:anchor="_Toc240675088" w:history="1">
+          <w:hyperlink w:anchor="_Toc240675692" w:history="1">
             <w:r>
               <w:rPr>
                 <w:rStyle w:val="a5"/>
@@ -1724,7 +1724,7 @@
               <w:rPr>
                 <w:noProof/>
               </w:rPr>
-              <w:instrText xml:space="preserve"> PAGEREF _Toc240675088 \h </w:instrText>
+              <w:instrText xml:space="preserve"> PAGEREF _Toc240675692 \h </w:instrText>
             </w:r>
             <w:r>
               <w:rPr>
@@ -1767,7 +1767,7 @@
               <w14:ligatures w14:val="standardContextual"/>
             </w:rPr>
           </w:pPr>
-          <w:hyperlink w:anchor="_Toc240675089" w:history="1">
+          <w:hyperlink w:anchor="_Toc240675693" w:history="1">
             <w:r>
               <w:rPr>
                 <w:rStyle w:val="a5"/>
@@ -1791,7 +1791,7 @@
               <w:rPr>
                 <w:noProof/>
               </w:rPr>
-              <w:instrText xml:space="preserve"> PAGEREF _Toc240675089 \h </w:instrText>
+              <w:instrText xml:space="preserve"> PAGEREF _Toc240675693 \h </w:instrText>
             </w:r>
             <w:r>
               <w:rPr>
@@ -1834,7 +1834,7 @@
               <w14:ligatures w14:val="standardContextual"/>
             </w:rPr>
           </w:pPr>
-          <w:hyperlink w:anchor="_Toc240675090" w:history="1">
+          <w:hyperlink w:anchor="_Toc240675694" w:history="1">
             <w:r>
               <w:rPr>
                 <w:rStyle w:val="a5"/>
@@ -1858,7 +1858,7 @@
               <w:rPr>
                 <w:noProof/>
               </w:rPr>
-              <w:instrText xml:space="preserve"> PAGEREF _Toc240675090 \h </w:instrText>
+              <w:instrText xml:space="preserve"> PAGEREF _Toc240675694 \h </w:instrText>
             </w:r>
             <w:r>
               <w:rPr>
@@ -1901,7 +1901,7 @@
               <w14:ligatures w14:val="standardContextual"/>
             </w:rPr>
           </w:pPr>
-          <w:hyperlink w:anchor="_Toc240675091" w:history="1">
+          <w:hyperlink w:anchor="_Toc240675695" w:history="1">
             <w:r>
               <w:rPr>
                 <w:rStyle w:val="a5"/>
@@ -1925,7 +1925,7 @@
               <w:rPr>
                 <w:noProof/>
               </w:rPr>
-              <w:instrText xml:space="preserve"> PAGEREF _Toc240675091 \h </w:instrText>
+              <w:instrText xml:space="preserve"> PAGEREF _Toc240675695 \h </w:instrText>
             </w:r>
             <w:r>
               <w:rPr>
@@ -1968,7 +1968,7 @@
               <w14:ligatures w14:val="standardContextual"/>
             </w:rPr>
           </w:pPr>
-          <w:hyperlink w:anchor="_Toc240675092" w:history="1">
+          <w:hyperlink w:anchor="_Toc240675696" w:history="1">
             <w:r>
               <w:rPr>
                 <w:rStyle w:val="a5"/>
@@ -1992,7 +1992,7 @@
               <w:rPr>
                 <w:noProof/>
               </w:rPr>
-              <w:instrText xml:space="preserve"> PAGEREF _Toc240675092 \h </w:instrText>
+              <w:instrText xml:space="preserve"> PAGEREF _Toc240675696 \h </w:instrText>
             </w:r>
             <w:r>
               <w:rPr>
@@ -2035,7 +2035,7 @@
               <w14:ligatures w14:val="standardContextual"/>
             </w:rPr>
           </w:pPr>
-          <w:hyperlink w:anchor="_Toc240675093" w:history="1">
+          <w:hyperlink w:anchor="_Toc240675697" w:history="1">
             <w:r>
               <w:rPr>
                 <w:rStyle w:val="a5"/>
@@ -2059,7 +2059,7 @@
               <w:rPr>
                 <w:noProof/>
               </w:rPr>
-              <w:instrText xml:space="preserve"> PAGEREF _Toc240675093 \h </w:instrText>
+              <w:instrText xml:space="preserve"> PAGEREF _Toc240675697 \h </w:instrText>
             </w:r>
             <w:r>
               <w:rPr>
@@ -2101,7 +2101,7 @@
               <w14:ligatures w14:val="standardContextual"/>
             </w:rPr>
           </w:pPr>
-          <w:hyperlink w:anchor="_Toc240675094" w:history="1">
+          <w:hyperlink w:anchor="_Toc240675698" w:history="1">
             <w:r>
               <w:rPr>
                 <w:rStyle w:val="a5"/>
@@ -2125,7 +2125,7 @@
               <w:rPr>
                 <w:noProof/>
               </w:rPr>
-              <w:instrText xml:space="preserve"> PAGEREF _Toc240675094 \h </w:instrText>
+              <w:instrText xml:space="preserve"> PAGEREF _Toc240675698 \h </w:instrText>
             </w:r>
             <w:r>
               <w:rPr>
@@ -2167,7 +2167,7 @@
               <w14:ligatures w14:val="standardContextual"/>
             </w:rPr>
           </w:pPr>
-          <w:hyperlink w:anchor="_Toc240675095" w:history="1">
+          <w:hyperlink w:anchor="_Toc240675699" w:history="1">
             <w:r>
               <w:rPr>
                 <w:rStyle w:val="a5"/>
@@ -2191,7 +2191,7 @@
               <w:rPr>
                 <w:noProof/>
               </w:rPr>
-              <w:instrText xml:space="preserve"> PAGEREF _Toc240675095 \h </w:instrText>
+              <w:instrText xml:space="preserve"> PAGEREF _Toc240675699 \h </w:instrText>
             </w:r>
             <w:r>
               <w:rPr>
@@ -2234,7 +2234,7 @@
               <w14:ligatures w14:val="standardContextual"/>
             </w:rPr>
           </w:pPr>
-          <w:hyperlink w:anchor="_Toc240675096" w:history="1">
+          <w:hyperlink w:anchor="_Toc240675700" w:history="1">
             <w:r>
               <w:rPr>
                 <w:rStyle w:val="a5"/>
@@ -2258,7 +2258,7 @@
               <w:rPr>
                 <w:noProof/>
               </w:rPr>
-              <w:instrText xml:space="preserve"> PAGEREF _Toc240675096 \h </w:instrText>
+              <w:instrText xml:space="preserve"> PAGEREF _Toc240675700 \h </w:instrText>
             </w:r>
             <w:r>
               <w:rPr>
@@ -2300,7 +2300,7 @@
               <w14:ligatures w14:val="standardContextual"/>
             </w:rPr>
           </w:pPr>
-          <w:hyperlink w:anchor="_Toc240675097" w:history="1">
+          <w:hyperlink w:anchor="_Toc240675701" w:history="1">
             <w:r>
               <w:rPr>
                 <w:rStyle w:val="a5"/>
@@ -2324,7 +2324,7 @@
               <w:rPr>
                 <w:noProof/>
               </w:rPr>
-              <w:instrText xml:space="preserve"> PAGEREF _Toc240675097 \h </w:instrText>
+              <w:instrText xml:space="preserve"> PAGEREF _Toc240675701 \h </w:instrText>
             </w:r>
             <w:r>
               <w:rPr>
@@ -2367,7 +2367,7 @@
               <w14:ligatures w14:val="standardContextual"/>
             </w:rPr>
           </w:pPr>
-          <w:hyperlink w:anchor="_Toc240675098" w:history="1">
+          <w:hyperlink w:anchor="_Toc240675702" w:history="1">
             <w:r>
               <w:rPr>
                 <w:rStyle w:val="a5"/>
@@ -2391,7 +2391,7 @@
               <w:rPr>
                 <w:noProof/>
               </w:rPr>
-              <w:instrText xml:space="preserve"> PAGEREF _Toc240675098 \h </w:instrText>
+              <w:instrText xml:space="preserve"> PAGEREF _Toc240675702 \h </w:instrText>
             </w:r>
             <w:r>
               <w:rPr>
@@ -2434,7 +2434,7 @@
               <w14:ligatures w14:val="standardContextual"/>
             </w:rPr>
           </w:pPr>
-          <w:hyperlink w:anchor="_Toc240675099" w:history="1">
+          <w:hyperlink w:anchor="_Toc240675703" w:history="1">
             <w:r>
               <w:rPr>
                 <w:rStyle w:val="a5"/>
@@ -2458,7 +2458,7 @@
               <w:rPr>
                 <w:noProof/>
               </w:rPr>
-              <w:instrText xml:space="preserve"> PAGEREF _Toc240675099 \h </w:instrText>
+              <w:instrText xml:space="preserve"> PAGEREF _Toc240675703 \h </w:instrText>
             </w:r>
             <w:r>
               <w:rPr>
@@ -2501,7 +2501,7 @@
               <w14:ligatures w14:val="standardContextual"/>
             </w:rPr>
           </w:pPr>
-          <w:hyperlink w:anchor="_Toc240675100" w:history="1">
+          <w:hyperlink w:anchor="_Toc240675704" w:history="1">
             <w:r>
               <w:rPr>
                 <w:rStyle w:val="a5"/>
@@ -2525,7 +2525,7 @@
               <w:rPr>
                 <w:noProof/>
               </w:rPr>
-              <w:instrText xml:space="preserve"> PAGEREF _Toc240675100 \h </w:instrText>
+              <w:instrText xml:space="preserve"> PAGEREF _Toc240675704 \h </w:instrText>
             </w:r>
             <w:r>
               <w:rPr>
@@ -2567,7 +2567,7 @@
               <w14:ligatures w14:val="standardContextual"/>
             </w:rPr>
           </w:pPr>
-          <w:hyperlink w:anchor="_Toc240675101" w:history="1">
+          <w:hyperlink w:anchor="_Toc240675705" w:history="1">
             <w:r>
               <w:rPr>
                 <w:rStyle w:val="a5"/>
@@ -2591,7 +2591,7 @@
               <w:rPr>
                 <w:noProof/>
               </w:rPr>
-              <w:instrText xml:space="preserve"> PAGEREF _Toc240675101 \h </w:instrText>
+              <w:instrText xml:space="preserve"> PAGEREF _Toc240675705 \h </w:instrText>
             </w:r>
             <w:r>
               <w:rPr>
@@ -2634,7 +2634,7 @@
               <w14:ligatures w14:val="standardContextual"/>
             </w:rPr>
           </w:pPr>
-          <w:hyperlink w:anchor="_Toc240675102" w:history="1">
+          <w:hyperlink w:anchor="_Toc240675706" w:history="1">
             <w:r>
               <w:rPr>
                 <w:rStyle w:val="a5"/>
@@ -2658,7 +2658,7 @@
               <w:rPr>
                 <w:noProof/>
               </w:rPr>
-              <w:instrText xml:space="preserve"> PAGEREF _Toc240675102 \h </w:instrText>
+              <w:instrText xml:space="preserve"> PAGEREF _Toc240675706 \h </w:instrText>
             </w:r>
             <w:r>
               <w:rPr>
@@ -2701,7 +2701,7 @@
               <w14:ligatures w14:val="standardContextual"/>
             </w:rPr>
           </w:pPr>
-          <w:hyperlink w:anchor="_Toc240675103" w:history="1">
+          <w:hyperlink w:anchor="_Toc240675707" w:history="1">
             <w:r>
               <w:rPr>
                 <w:rStyle w:val="a5"/>
@@ -2725,7 +2725,7 @@
               <w:rPr>
                 <w:noProof/>
               </w:rPr>
-              <w:instrText xml:space="preserve"> PAGEREF _Toc240675103 \h </w:instrText>
+              <w:instrText xml:space="preserve"> PAGEREF _Toc240675707 \h </w:instrText>
             </w:r>
             <w:r>
               <w:rPr>
@@ -2767,7 +2767,7 @@
               <w14:ligatures w14:val="standardContextual"/>
             </w:rPr>
           </w:pPr>
-          <w:hyperlink w:anchor="_Toc240675104" w:history="1">
+          <w:hyperlink w:anchor="_Toc240675708" w:history="1">
             <w:r>
               <w:rPr>
                 <w:rStyle w:val="a5"/>
@@ -2791,7 +2791,7 @@
               <w:rPr>
                 <w:noProof/>
               </w:rPr>
-              <w:instrText xml:space="preserve"> PAGEREF _Toc240675104 \h </w:instrText>
+              <w:instrText xml:space="preserve"> PAGEREF _Toc240675708 \h </w:instrText>
             </w:r>
             <w:r>
               <w:rPr>
@@ -2833,7 +2833,7 @@
               <w14:ligatures w14:val="standardContextual"/>
             </w:rPr>
           </w:pPr>
-          <w:hyperlink w:anchor="_Toc240675105" w:history="1">
+          <w:hyperlink w:anchor="_Toc240675709" w:history="1">
             <w:r>
               <w:rPr>
                 <w:rStyle w:val="a5"/>
@@ -2857,7 +2857,7 @@
               <w:rPr>
                 <w:noProof/>
               </w:rPr>
-              <w:instrText xml:space="preserve"> PAGEREF _Toc240675105 \h </w:instrText>
+              <w:instrText xml:space="preserve"> PAGEREF _Toc240675709 \h </w:instrText>
             </w:r>
             <w:r>
               <w:rPr>
@@ -2900,7 +2900,7 @@
               <w14:ligatures w14:val="standardContextual"/>
             </w:rPr>
           </w:pPr>
-          <w:hyperlink w:anchor="_Toc240675106" w:history="1">
+          <w:hyperlink w:anchor="_Toc240675710" w:history="1">
             <w:r>
               <w:rPr>
                 <w:rStyle w:val="a5"/>
@@ -2924,7 +2924,7 @@
               <w:rPr>
                 <w:noProof/>
               </w:rPr>
-              <w:instrText xml:space="preserve"> PAGEREF _Toc240675106 \h </w:instrText>
+              <w:instrText xml:space="preserve"> PAGEREF _Toc240675710 \h </w:instrText>
             </w:r>
             <w:r>
               <w:rPr>
@@ -2967,7 +2967,7 @@
               <w14:ligatures w14:val="standardContextual"/>
             </w:rPr>
           </w:pPr>
-          <w:hyperlink w:anchor="_Toc240675107" w:history="1">
+          <w:hyperlink w:anchor="_Toc240675711" w:history="1">
             <w:r>
               <w:rPr>
                 <w:rStyle w:val="a5"/>
@@ -2991,7 +2991,7 @@
               <w:rPr>
                 <w:noProof/>
               </w:rPr>
-              <w:instrText xml:space="preserve"> PAGEREF _Toc240675107 \h </w:instrText>
+              <w:instrText xml:space="preserve"> PAGEREF _Toc240675711 \h </w:instrText>
             </w:r>
             <w:r>
               <w:rPr>
@@ -3034,7 +3034,7 @@
               <w14:ligatures w14:val="standardContextual"/>
             </w:rPr>
           </w:pPr>
-          <w:hyperlink w:anchor="_Toc240675108" w:history="1">
+          <w:hyperlink w:anchor="_Toc240675712" w:history="1">
             <w:r>
               <w:rPr>
                 <w:rStyle w:val="a5"/>
@@ -3058,7 +3058,7 @@
               <w:rPr>
                 <w:noProof/>
               </w:rPr>
-              <w:instrText xml:space="preserve"> PAGEREF _Toc240675108 \h </w:instrText>
+              <w:instrText xml:space="preserve"> PAGEREF _Toc240675712 \h </w:instrText>
             </w:r>
             <w:r>
               <w:rPr>
@@ -3101,7 +3101,7 @@
               <w14:ligatures w14:val="standardContextual"/>
             </w:rPr>
           </w:pPr>
-          <w:hyperlink w:anchor="_Toc240675109" w:history="1">
+          <w:hyperlink w:anchor="_Toc240675713" w:history="1">
             <w:r>
               <w:rPr>
                 <w:rStyle w:val="a5"/>
@@ -3125,7 +3125,7 @@
               <w:rPr>
                 <w:noProof/>
               </w:rPr>
-              <w:instrText xml:space="preserve"> PAGEREF _Toc240675109 \h </w:instrText>
+              <w:instrText xml:space="preserve"> PAGEREF _Toc240675713 \h </w:instrText>
             </w:r>
             <w:r>
               <w:rPr>
@@ -3167,7 +3167,7 @@
               <w14:ligatures w14:val="standardContextual"/>
             </w:rPr>
           </w:pPr>
-          <w:hyperlink w:anchor="_Toc240675110" w:history="1">
+          <w:hyperlink w:anchor="_Toc240675714" w:history="1">
             <w:r>
               <w:rPr>
                 <w:rStyle w:val="a5"/>
@@ -3191,7 +3191,7 @@
               <w:rPr>
                 <w:noProof/>
               </w:rPr>
-              <w:instrText xml:space="preserve"> PAGEREF _Toc240675110 \h </w:instrText>
+              <w:instrText xml:space="preserve"> PAGEREF _Toc240675714 \h </w:instrText>
             </w:r>
             <w:r>
               <w:rPr>
@@ -3233,7 +3233,7 @@
               <w14:ligatures w14:val="standardContextual"/>
             </w:rPr>
           </w:pPr>
-          <w:hyperlink w:anchor="_Toc240675111" w:history="1">
+          <w:hyperlink w:anchor="_Toc240675715" w:history="1">
             <w:r>
               <w:rPr>
                 <w:rStyle w:val="a5"/>
@@ -3257,7 +3257,7 @@
               <w:rPr>
                 <w:noProof/>
               </w:rPr>
-              <w:instrText xml:space="preserve"> PAGEREF _Toc240675111 \h </w:instrText>
+              <w:instrText xml:space="preserve"> PAGEREF _Toc240675715 \h </w:instrText>
             </w:r>
             <w:r>
               <w:rPr>
@@ -3299,7 +3299,7 @@
               <w14:ligatures w14:val="standardContextual"/>
             </w:rPr>
           </w:pPr>
-          <w:hyperlink w:anchor="_Toc240675112" w:history="1">
+          <w:hyperlink w:anchor="_Toc240675716" w:history="1">
             <w:r>
               <w:rPr>
                 <w:rStyle w:val="a5"/>
@@ -3323,7 +3323,7 @@
               <w:rPr>
                 <w:noProof/>
               </w:rPr>
-              <w:instrText xml:space="preserve"> PAGEREF _Toc240675112 \h </w:instrText>
+              <w:instrText xml:space="preserve"> PAGEREF _Toc240675716 \h </w:instrText>
             </w:r>
             <w:r>
               <w:rPr>
@@ -3365,7 +3365,7 @@
               <w14:ligatures w14:val="standardContextual"/>
             </w:rPr>
           </w:pPr>
-          <w:hyperlink w:anchor="_Toc240675113" w:history="1">
+          <w:hyperlink w:anchor="_Toc240675717" w:history="1">
             <w:r>
               <w:rPr>
                 <w:rStyle w:val="a5"/>
@@ -3389,7 +3389,7 @@
               <w:rPr>
                 <w:noProof/>
               </w:rPr>
-              <w:instrText xml:space="preserve"> PAGEREF _Toc240675113 \h </w:instrText>
+              <w:instrText xml:space="preserve"> PAGEREF _Toc240675717 \h </w:instrText>
             </w:r>
             <w:r>
               <w:rPr>
@@ -3432,7 +3432,7 @@
               <w14:ligatures w14:val="standardContextual"/>
             </w:rPr>
           </w:pPr>
-          <w:hyperlink w:anchor="_Toc240675114" w:history="1">
+          <w:hyperlink w:anchor="_Toc240675718" w:history="1">
             <w:r>
               <w:rPr>
                 <w:rStyle w:val="a5"/>
@@ -3456,7 +3456,7 @@
               <w:rPr>
                 <w:noProof/>
               </w:rPr>
-              <w:instrText xml:space="preserve"> PAGEREF _Toc240675114 \h </w:instrText>
+              <w:instrText xml:space="preserve"> PAGEREF _Toc240675718 \h </w:instrText>
             </w:r>
             <w:r>
               <w:rPr>
@@ -3499,7 +3499,7 @@
               <w14:ligatures w14:val="standardContextual"/>
             </w:rPr>
           </w:pPr>
-          <w:hyperlink w:anchor="_Toc240675115" w:history="1">
+          <w:hyperlink w:anchor="_Toc240675719" w:history="1">
             <w:r>
               <w:rPr>
                 <w:rStyle w:val="a5"/>
@@ -3523,7 +3523,7 @@
               <w:rPr>
                 <w:noProof/>
               </w:rPr>
-              <w:instrText xml:space="preserve"> PAGEREF _Toc240675115 \h </w:instrText>
+              <w:instrText xml:space="preserve"> PAGEREF _Toc240675719 \h </w:instrText>
             </w:r>
             <w:r>
               <w:rPr>
@@ -3566,7 +3566,7 @@
               <w14:ligatures w14:val="standardContextual"/>
             </w:rPr>
           </w:pPr>
-          <w:hyperlink w:anchor="_Toc240675116" w:history="1">
+          <w:hyperlink w:anchor="_Toc240675720" w:history="1">
             <w:r>
               <w:rPr>
                 <w:rStyle w:val="a5"/>
@@ -3590,7 +3590,7 @@
               <w:rPr>
                 <w:noProof/>
               </w:rPr>
-              <w:instrText xml:space="preserve"> PAGEREF _Toc240675116 \h </w:instrText>
+              <w:instrText xml:space="preserve"> PAGEREF _Toc240675720 \h </w:instrText>
             </w:r>
             <w:r>
               <w:rPr>
@@ -3633,7 +3633,7 @@
               <w14:ligatures w14:val="standardContextual"/>
             </w:rPr>
           </w:pPr>
-          <w:hyperlink w:anchor="_Toc240675117" w:history="1">
+          <w:hyperlink w:anchor="_Toc240675721" w:history="1">
             <w:r>
               <w:rPr>
                 <w:rStyle w:val="a5"/>
@@ -3657,7 +3657,7 @@
               <w:rPr>
                 <w:noProof/>
               </w:rPr>
-              <w:instrText xml:space="preserve"> PAGEREF _Toc240675117 \h </w:instrText>
+              <w:instrText xml:space="preserve"> PAGEREF _Toc240675721 \h </w:instrText>
             </w:r>
             <w:r>
               <w:rPr>
@@ -3700,7 +3700,7 @@
               <w14:ligatures w14:val="standardContextual"/>
             </w:rPr>
           </w:pPr>
-          <w:hyperlink w:anchor="_Toc240675118" w:history="1">
+          <w:hyperlink w:anchor="_Toc240675722" w:history="1">
             <w:r>
               <w:rPr>
                 <w:rStyle w:val="a5"/>
@@ -3724,7 +3724,7 @@
               <w:rPr>
                 <w:noProof/>
               </w:rPr>
-              <w:instrText xml:space="preserve"> PAGEREF _Toc240675118 \h </w:instrText>
+              <w:instrText xml:space="preserve"> PAGEREF _Toc240675722 \h </w:instrText>
             </w:r>
             <w:r>
               <w:rPr>
@@ -3763,7 +3763,7 @@
         <w:pStyle w:val="1"/>
         <w:pageBreakBefore/>
       </w:pPr>
-      <w:bookmarkStart w:id="0" w:name="_Toc240675071"/>
+      <w:bookmarkStart w:id="0" w:name="_Toc240675675"/>
       <w:r>
         <w:lastRenderedPageBreak/>
         <w:t xml:space="preserve">1. </w:t>
@@ -3777,7 +3777,7 @@
       <w:pPr>
         <w:pStyle w:val="2"/>
       </w:pPr>
-      <w:bookmarkStart w:id="1" w:name="_Toc240675072"/>
+      <w:bookmarkStart w:id="1" w:name="_Toc240675676"/>
       <w:r>
         <w:t>1.1 RuninqVic</w:t>
       </w:r>
@@ -4187,7 +4187,7 @@
       <w:pPr>
         <w:pStyle w:val="2"/>
       </w:pPr>
-      <w:bookmarkStart w:id="2" w:name="_Toc240675073"/>
+      <w:bookmarkStart w:id="2" w:name="_Toc240675677"/>
       <w:r>
         <w:t xml:space="preserve">1.2 </w:t>
       </w:r>
@@ -7452,7 +7452,7 @@
       <w:pPr>
         <w:pStyle w:val="2"/>
       </w:pPr>
-      <w:bookmarkStart w:id="3" w:name="_Toc240675074"/>
+      <w:bookmarkStart w:id="3" w:name="_Toc240675678"/>
       <w:r>
         <w:t xml:space="preserve">1.3 </w:t>
       </w:r>
@@ -7684,7 +7684,7 @@
         <w:pStyle w:val="1"/>
         <w:pageBreakBefore/>
       </w:pPr>
-      <w:bookmarkStart w:id="4" w:name="_Toc240675075"/>
+      <w:bookmarkStart w:id="4" w:name="_Toc240675679"/>
       <w:r>
         <w:lastRenderedPageBreak/>
         <w:t xml:space="preserve">2. </w:t>
@@ -7698,7 +7698,7 @@
       <w:pPr>
         <w:pStyle w:val="2"/>
       </w:pPr>
-      <w:bookmarkStart w:id="5" w:name="_Toc240675076"/>
+      <w:bookmarkStart w:id="5" w:name="_Toc240675680"/>
       <w:r>
         <w:t xml:space="preserve">2.1 </w:t>
       </w:r>
@@ -8676,7 +8676,7 @@
       <w:pPr>
         <w:pStyle w:val="2"/>
       </w:pPr>
-      <w:bookmarkStart w:id="6" w:name="_Toc240675077"/>
+      <w:bookmarkStart w:id="6" w:name="_Toc240675681"/>
       <w:r>
         <w:t xml:space="preserve">2.2 </w:t>
       </w:r>
@@ -9030,10 +9030,10 @@
         </w:rPr>
         <w:lastRenderedPageBreak/>
         <w:drawing>
-          <wp:inline distT="0" distB="0" distL="0" distR="0" wp14:anchorId="4D28A501" wp14:editId="2B4EEF8E">
+          <wp:inline distT="0" distB="0" distL="0" distR="0" wp14:anchorId="4DEC0356" wp14:editId="7248D55A">
             <wp:extent cx="5943600" cy="3638550"/>
             <wp:effectExtent l="0" t="0" r="0" b="0"/>
-            <wp:docPr id="1841132618" name="그림 1841132618"/>
+            <wp:docPr id="1627114032" name="그림 1627114032"/>
             <wp:cNvGraphicFramePr>
               <a:graphicFrameLocks xmlns:a="http://schemas.openxmlformats.org/drawingml/2006/main" noChangeAspect="1"/>
             </wp:cNvGraphicFramePr>
@@ -9149,7 +9149,7 @@
       <w:pPr>
         <w:pStyle w:val="2"/>
       </w:pPr>
-      <w:bookmarkStart w:id="7" w:name="_Toc240675078"/>
+      <w:bookmarkStart w:id="7" w:name="_Toc240675682"/>
       <w:r>
         <w:t xml:space="preserve">2.3 </w:t>
       </w:r>
@@ -9174,10 +9174,10 @@
           <w:noProof/>
         </w:rPr>
         <w:drawing>
-          <wp:inline distT="0" distB="0" distL="0" distR="0" wp14:anchorId="0E48EC69" wp14:editId="1EA2391C">
+          <wp:inline distT="0" distB="0" distL="0" distR="0" wp14:anchorId="6F2DD91A" wp14:editId="4CEE9A94">
             <wp:extent cx="5943600" cy="3638550"/>
             <wp:effectExtent l="0" t="0" r="0" b="0"/>
-            <wp:docPr id="874524401" name="그림 874524401"/>
+            <wp:docPr id="1393095884" name="그림 1393095884"/>
             <wp:cNvGraphicFramePr>
               <a:graphicFrameLocks xmlns:a="http://schemas.openxmlformats.org/drawingml/2006/main" noChangeAspect="1"/>
             </wp:cNvGraphicFramePr>
@@ -10607,7 +10607,7 @@
       <w:pPr>
         <w:pStyle w:val="2"/>
       </w:pPr>
-      <w:bookmarkStart w:id="8" w:name="_Toc240675079"/>
+      <w:bookmarkStart w:id="8" w:name="_Toc240675683"/>
       <w:r>
         <w:t xml:space="preserve">2.4 </w:t>
       </w:r>
@@ -10633,10 +10633,10 @@
         </w:rPr>
         <w:lastRenderedPageBreak/>
         <w:drawing>
-          <wp:inline distT="0" distB="0" distL="0" distR="0" wp14:anchorId="5075AD27" wp14:editId="4D80A408">
+          <wp:inline distT="0" distB="0" distL="0" distR="0" wp14:anchorId="78ACFB66" wp14:editId="1F357DE1">
             <wp:extent cx="5943600" cy="12858750"/>
             <wp:effectExtent l="0" t="0" r="0" b="0"/>
-            <wp:docPr id="1509046784" name="그림 1509046784"/>
+            <wp:docPr id="543941858" name="그림 543941858"/>
             <wp:cNvGraphicFramePr>
               <a:graphicFrameLocks xmlns:a="http://schemas.openxmlformats.org/drawingml/2006/main" noChangeAspect="1"/>
             </wp:cNvGraphicFramePr>
@@ -15460,10 +15460,10 @@
         </w:rPr>
         <w:lastRenderedPageBreak/>
         <w:drawing>
-          <wp:inline distT="0" distB="0" distL="0" distR="0" wp14:anchorId="5B21B234" wp14:editId="36BE52ED">
+          <wp:inline distT="0" distB="0" distL="0" distR="0" wp14:anchorId="622AE419" wp14:editId="227D783D">
             <wp:extent cx="5943600" cy="12858750"/>
             <wp:effectExtent l="0" t="0" r="0" b="0"/>
-            <wp:docPr id="2079487851" name="그림 2079487851"/>
+            <wp:docPr id="1156650834" name="그림 1156650834"/>
             <wp:cNvGraphicFramePr>
               <a:graphicFrameLocks xmlns:a="http://schemas.openxmlformats.org/drawingml/2006/main" noChangeAspect="1"/>
             </wp:cNvGraphicFramePr>
@@ -15691,7 +15691,7 @@
         <w:pStyle w:val="1"/>
         <w:pageBreakBefore/>
       </w:pPr>
-      <w:bookmarkStart w:id="9" w:name="_Toc240675080"/>
+      <w:bookmarkStart w:id="9" w:name="_Toc240675684"/>
       <w:r>
         <w:lastRenderedPageBreak/>
         <w:t>3. 5</w:t>
@@ -16395,7 +16395,7 @@
         <w:pStyle w:val="1"/>
         <w:pageBreakBefore/>
       </w:pPr>
-      <w:bookmarkStart w:id="10" w:name="_Toc240675081"/>
+      <w:bookmarkStart w:id="10" w:name="_Toc240675685"/>
       <w:r>
         <w:lastRenderedPageBreak/>
         <w:t xml:space="preserve">4. </w:t>
@@ -16474,7 +16474,7 @@
       <w:pPr>
         <w:pStyle w:val="2"/>
       </w:pPr>
-      <w:bookmarkStart w:id="11" w:name="_Toc240675082"/>
+      <w:bookmarkStart w:id="11" w:name="_Toc240675686"/>
       <w:r>
         <w:t xml:space="preserve">4.1 ① </w:t>
       </w:r>
@@ -17196,7 +17196,7 @@
       <w:pPr>
         <w:pStyle w:val="2"/>
       </w:pPr>
-      <w:bookmarkStart w:id="12" w:name="_Toc240675083"/>
+      <w:bookmarkStart w:id="12" w:name="_Toc240675687"/>
       <w:r>
         <w:t xml:space="preserve">4.2 ② </w:t>
       </w:r>
@@ -17768,7 +17768,7 @@
       <w:pPr>
         <w:pStyle w:val="2"/>
       </w:pPr>
-      <w:bookmarkStart w:id="13" w:name="_Toc240675084"/>
+      <w:bookmarkStart w:id="13" w:name="_Toc240675688"/>
       <w:r>
         <w:t xml:space="preserve">4.2.1 </w:t>
       </w:r>
@@ -17806,10 +17806,10 @@
         </w:rPr>
         <w:lastRenderedPageBreak/>
         <w:drawing>
-          <wp:inline distT="0" distB="0" distL="0" distR="0" wp14:anchorId="3E80265D" wp14:editId="554C9693">
+          <wp:inline distT="0" distB="0" distL="0" distR="0" wp14:anchorId="427A77E1" wp14:editId="6F55C3A9">
             <wp:extent cx="5943600" cy="3638550"/>
             <wp:effectExtent l="0" t="0" r="0" b="0"/>
-            <wp:docPr id="78150442" name="그림 78150442"/>
+            <wp:docPr id="929611402" name="그림 929611402"/>
             <wp:cNvGraphicFramePr>
               <a:graphicFrameLocks xmlns:a="http://schemas.openxmlformats.org/drawingml/2006/main" noChangeAspect="1"/>
             </wp:cNvGraphicFramePr>
@@ -22734,7 +22734,7 @@
       <w:pPr>
         <w:pStyle w:val="2"/>
       </w:pPr>
-      <w:bookmarkStart w:id="14" w:name="_Toc240675085"/>
+      <w:bookmarkStart w:id="14" w:name="_Toc240675689"/>
       <w:r>
         <w:t xml:space="preserve">4.3 ③ </w:t>
       </w:r>
@@ -24344,7 +24344,7 @@
       <w:pPr>
         <w:pStyle w:val="2"/>
       </w:pPr>
-      <w:bookmarkStart w:id="15" w:name="_Toc240675086"/>
+      <w:bookmarkStart w:id="15" w:name="_Toc240675690"/>
       <w:r>
         <w:t xml:space="preserve">4.4 ④ </w:t>
       </w:r>
@@ -24851,7 +24851,7 @@
         <w:pStyle w:val="1"/>
         <w:pageBreakBefore/>
       </w:pPr>
-      <w:bookmarkStart w:id="16" w:name="_Toc240675087"/>
+      <w:bookmarkStart w:id="16" w:name="_Toc240675691"/>
       <w:r>
         <w:lastRenderedPageBreak/>
         <w:t xml:space="preserve">5. </w:t>
@@ -24877,7 +24877,7 @@
       <w:pPr>
         <w:pStyle w:val="2"/>
       </w:pPr>
-      <w:bookmarkStart w:id="17" w:name="_Toc240675088"/>
+      <w:bookmarkStart w:id="17" w:name="_Toc240675692"/>
       <w:r>
         <w:t xml:space="preserve">5.1 </w:t>
       </w:r>
@@ -25186,7 +25186,7 @@
       <w:pPr>
         <w:pStyle w:val="2"/>
       </w:pPr>
-      <w:bookmarkStart w:id="18" w:name="_Toc240675089"/>
+      <w:bookmarkStart w:id="18" w:name="_Toc240675693"/>
       <w:r>
         <w:t xml:space="preserve">5.2 </w:t>
       </w:r>
@@ -25715,7 +25715,7 @@
       <w:pPr>
         <w:pStyle w:val="2"/>
       </w:pPr>
-      <w:bookmarkStart w:id="19" w:name="_Toc240675090"/>
+      <w:bookmarkStart w:id="19" w:name="_Toc240675694"/>
       <w:r>
         <w:t xml:space="preserve">5.3 </w:t>
       </w:r>
@@ -25986,7 +25986,7 @@
       <w:pPr>
         <w:pStyle w:val="2"/>
       </w:pPr>
-      <w:bookmarkStart w:id="20" w:name="_Toc240675091"/>
+      <w:bookmarkStart w:id="20" w:name="_Toc240675695"/>
       <w:r>
         <w:t xml:space="preserve">5.4 </w:t>
       </w:r>
@@ -26196,7 +26196,7 @@
       <w:pPr>
         <w:pStyle w:val="2"/>
       </w:pPr>
-      <w:bookmarkStart w:id="21" w:name="_Toc240675092"/>
+      <w:bookmarkStart w:id="21" w:name="_Toc240675696"/>
       <w:r>
         <w:t xml:space="preserve">5.5 </w:t>
       </w:r>
@@ -26419,7 +26419,7 @@
       <w:pPr>
         <w:pStyle w:val="2"/>
       </w:pPr>
-      <w:bookmarkStart w:id="22" w:name="_Toc240675093"/>
+      <w:bookmarkStart w:id="22" w:name="_Toc240675697"/>
       <w:r>
         <w:t xml:space="preserve">5.6 </w:t>
       </w:r>
@@ -26540,7 +26540,7 @@
         <w:pStyle w:val="1"/>
         <w:pageBreakBefore/>
       </w:pPr>
-      <w:bookmarkStart w:id="23" w:name="_Toc240675094"/>
+      <w:bookmarkStart w:id="23" w:name="_Toc240675698"/>
       <w:r>
         <w:lastRenderedPageBreak/>
         <w:t xml:space="preserve">6. </w:t>
@@ -28389,7 +28389,7 @@
         <w:pStyle w:val="1"/>
         <w:pageBreakBefore/>
       </w:pPr>
-      <w:bookmarkStart w:id="24" w:name="_Toc240675095"/>
+      <w:bookmarkStart w:id="24" w:name="_Toc240675699"/>
       <w:r>
         <w:lastRenderedPageBreak/>
         <w:t xml:space="preserve">7. </w:t>
@@ -28409,10 +28409,10 @@
           <w:noProof/>
         </w:rPr>
         <w:drawing>
-          <wp:inline distT="0" distB="0" distL="0" distR="0" wp14:anchorId="7639689B" wp14:editId="136EEF08">
+          <wp:inline distT="0" distB="0" distL="0" distR="0" wp14:anchorId="48400AD4" wp14:editId="5BEC3829">
             <wp:extent cx="5943600" cy="3638550"/>
             <wp:effectExtent l="0" t="0" r="0" b="0"/>
-            <wp:docPr id="1811968750" name="그림 1811968750"/>
+            <wp:docPr id="153927188" name="그림 153927188"/>
             <wp:cNvGraphicFramePr>
               <a:graphicFrameLocks xmlns:a="http://schemas.openxmlformats.org/drawingml/2006/main" noChangeAspect="1"/>
             </wp:cNvGraphicFramePr>
@@ -31218,7 +31218,7 @@
       <w:pPr>
         <w:pStyle w:val="2"/>
       </w:pPr>
-      <w:bookmarkStart w:id="25" w:name="_Toc240675096"/>
+      <w:bookmarkStart w:id="25" w:name="_Toc240675700"/>
       <w:r>
         <w:t xml:space="preserve">7.1 </w:t>
       </w:r>
@@ -31249,10 +31249,10 @@
           <w:noProof/>
         </w:rPr>
         <w:drawing>
-          <wp:inline distT="0" distB="0" distL="0" distR="0" wp14:anchorId="21D4CEF7" wp14:editId="7C149106">
+          <wp:inline distT="0" distB="0" distL="0" distR="0" wp14:anchorId="1033723C" wp14:editId="20B22C82">
             <wp:extent cx="5943600" cy="3638550"/>
             <wp:effectExtent l="0" t="0" r="0" b="0"/>
-            <wp:docPr id="119075887" name="그림 119075887"/>
+            <wp:docPr id="351554939" name="그림 351554939"/>
             <wp:cNvGraphicFramePr>
               <a:graphicFrameLocks xmlns:a="http://schemas.openxmlformats.org/drawingml/2006/main" noChangeAspect="1"/>
             </wp:cNvGraphicFramePr>
@@ -34901,7 +34901,7 @@
         <w:pStyle w:val="1"/>
         <w:pageBreakBefore/>
       </w:pPr>
-      <w:bookmarkStart w:id="26" w:name="_Toc240675097"/>
+      <w:bookmarkStart w:id="26" w:name="_Toc240675701"/>
       <w:r>
         <w:lastRenderedPageBreak/>
         <w:t xml:space="preserve">8. </w:t>
@@ -34921,10 +34921,10 @@
           <w:noProof/>
         </w:rPr>
         <w:drawing>
-          <wp:inline distT="0" distB="0" distL="0" distR="0" wp14:anchorId="3C0C9555" wp14:editId="49C9A4FC">
+          <wp:inline distT="0" distB="0" distL="0" distR="0" wp14:anchorId="6E62405B" wp14:editId="4A4BC7B0">
             <wp:extent cx="5943600" cy="3638550"/>
             <wp:effectExtent l="0" t="0" r="0" b="0"/>
-            <wp:docPr id="161202762" name="그림 161202762"/>
+            <wp:docPr id="256382370" name="그림 256382370"/>
             <wp:cNvGraphicFramePr>
               <a:graphicFrameLocks xmlns:a="http://schemas.openxmlformats.org/drawingml/2006/main" noChangeAspect="1"/>
             </wp:cNvGraphicFramePr>
@@ -35020,7 +35020,7 @@
       <w:pPr>
         <w:pStyle w:val="2"/>
       </w:pPr>
-      <w:bookmarkStart w:id="27" w:name="_Toc240675098"/>
+      <w:bookmarkStart w:id="27" w:name="_Toc240675702"/>
       <w:r>
         <w:t xml:space="preserve">8.1 </w:t>
       </w:r>
@@ -36108,7 +36108,7 @@
       <w:pPr>
         <w:pStyle w:val="2"/>
       </w:pPr>
-      <w:bookmarkStart w:id="28" w:name="_Toc240675099"/>
+      <w:bookmarkStart w:id="28" w:name="_Toc240675703"/>
       <w:r>
         <w:t xml:space="preserve">8.2 </w:t>
       </w:r>
@@ -37361,7 +37361,7 @@
       <w:pPr>
         <w:pStyle w:val="2"/>
       </w:pPr>
-      <w:bookmarkStart w:id="29" w:name="_Toc240675100"/>
+      <w:bookmarkStart w:id="29" w:name="_Toc240675704"/>
       <w:r>
         <w:t xml:space="preserve">8.3 </w:t>
       </w:r>
@@ -37614,7 +37614,7 @@
         <w:pStyle w:val="1"/>
         <w:pageBreakBefore/>
       </w:pPr>
-      <w:bookmarkStart w:id="30" w:name="_Toc240675101"/>
+      <w:bookmarkStart w:id="30" w:name="_Toc240675705"/>
       <w:r>
         <w:lastRenderedPageBreak/>
         <w:t xml:space="preserve">9. </w:t>
@@ -37634,10 +37634,10 @@
           <w:noProof/>
         </w:rPr>
         <w:drawing>
-          <wp:inline distT="0" distB="0" distL="0" distR="0" wp14:anchorId="57CB3FD9" wp14:editId="2B5D3BAE">
+          <wp:inline distT="0" distB="0" distL="0" distR="0" wp14:anchorId="583882AD" wp14:editId="0AFA1B97">
             <wp:extent cx="5943600" cy="3638550"/>
             <wp:effectExtent l="0" t="0" r="0" b="0"/>
-            <wp:docPr id="1016702612" name="그림 1016702612"/>
+            <wp:docPr id="73941306" name="그림 73941306"/>
             <wp:cNvGraphicFramePr>
               <a:graphicFrameLocks xmlns:a="http://schemas.openxmlformats.org/drawingml/2006/main" noChangeAspect="1"/>
             </wp:cNvGraphicFramePr>
@@ -37733,7 +37733,7 @@
       <w:pPr>
         <w:pStyle w:val="2"/>
       </w:pPr>
-      <w:bookmarkStart w:id="31" w:name="_Toc240675102"/>
+      <w:bookmarkStart w:id="31" w:name="_Toc240675706"/>
       <w:r>
         <w:t xml:space="preserve">9.1 </w:t>
       </w:r>
@@ -39109,7 +39109,7 @@
       <w:pPr>
         <w:pStyle w:val="2"/>
       </w:pPr>
-      <w:bookmarkStart w:id="32" w:name="_Toc240675103"/>
+      <w:bookmarkStart w:id="32" w:name="_Toc240675707"/>
       <w:r>
         <w:t xml:space="preserve">9.2 </w:t>
       </w:r>
@@ -39278,7 +39278,7 @@
         <w:pStyle w:val="1"/>
         <w:pageBreakBefore/>
       </w:pPr>
-      <w:bookmarkStart w:id="33" w:name="_Toc240675104"/>
+      <w:bookmarkStart w:id="33" w:name="_Toc240675708"/>
       <w:r>
         <w:lastRenderedPageBreak/>
         <w:t xml:space="preserve">10. </w:t>
@@ -39304,10 +39304,10 @@
           <w:noProof/>
         </w:rPr>
         <w:drawing>
-          <wp:inline distT="0" distB="0" distL="0" distR="0" wp14:anchorId="32C73F81" wp14:editId="20DC01AB">
+          <wp:inline distT="0" distB="0" distL="0" distR="0" wp14:anchorId="3801232F" wp14:editId="1EAF85D0">
             <wp:extent cx="5943600" cy="3638550"/>
             <wp:effectExtent l="0" t="0" r="0" b="0"/>
-            <wp:docPr id="1794131479" name="그림 1794131479"/>
+            <wp:docPr id="1157117469" name="그림 1157117469"/>
             <wp:cNvGraphicFramePr>
               <a:graphicFrameLocks xmlns:a="http://schemas.openxmlformats.org/drawingml/2006/main" noChangeAspect="1"/>
             </wp:cNvGraphicFramePr>
@@ -40943,7 +40943,7 @@
         <w:pStyle w:val="1"/>
         <w:pageBreakBefore/>
       </w:pPr>
-      <w:bookmarkStart w:id="34" w:name="_Toc240675105"/>
+      <w:bookmarkStart w:id="34" w:name="_Toc240675709"/>
       <w:r>
         <w:lastRenderedPageBreak/>
         <w:t xml:space="preserve">11. </w:t>
@@ -40969,10 +40969,10 @@
           <w:noProof/>
         </w:rPr>
         <w:drawing>
-          <wp:inline distT="0" distB="0" distL="0" distR="0" wp14:anchorId="3338D3BD" wp14:editId="261FD29A">
+          <wp:inline distT="0" distB="0" distL="0" distR="0" wp14:anchorId="4EAD37D5" wp14:editId="6643B3DA">
             <wp:extent cx="5943600" cy="3638550"/>
             <wp:effectExtent l="0" t="0" r="0" b="0"/>
-            <wp:docPr id="1398522465" name="그림 1398522465"/>
+            <wp:docPr id="1364601531" name="그림 1364601531"/>
             <wp:cNvGraphicFramePr>
               <a:graphicFrameLocks xmlns:a="http://schemas.openxmlformats.org/drawingml/2006/main" noChangeAspect="1"/>
             </wp:cNvGraphicFramePr>
@@ -41088,7 +41088,7 @@
       <w:pPr>
         <w:pStyle w:val="2"/>
       </w:pPr>
-      <w:bookmarkStart w:id="35" w:name="_Toc240675106"/>
+      <w:bookmarkStart w:id="35" w:name="_Toc240675710"/>
       <w:r>
         <w:t xml:space="preserve">11.1 </w:t>
       </w:r>
@@ -42387,7 +42387,7 @@
       <w:pPr>
         <w:pStyle w:val="2"/>
       </w:pPr>
-      <w:bookmarkStart w:id="36" w:name="_Toc240675107"/>
+      <w:bookmarkStart w:id="36" w:name="_Toc240675711"/>
       <w:r>
         <w:t xml:space="preserve">11.2 </w:t>
       </w:r>
@@ -42828,7 +42828,7 @@
       <w:pPr>
         <w:pStyle w:val="2"/>
       </w:pPr>
-      <w:bookmarkStart w:id="37" w:name="_Toc240675108"/>
+      <w:bookmarkStart w:id="37" w:name="_Toc240675712"/>
       <w:r>
         <w:t xml:space="preserve">11.3 </w:t>
       </w:r>
@@ -43368,7 +43368,7 @@
       <w:pPr>
         <w:pStyle w:val="2"/>
       </w:pPr>
-      <w:bookmarkStart w:id="38" w:name="_Toc240675109"/>
+      <w:bookmarkStart w:id="38" w:name="_Toc240675713"/>
       <w:r>
         <w:t xml:space="preserve">11.4 </w:t>
       </w:r>
@@ -43415,10 +43415,10 @@
         </w:rPr>
         <w:lastRenderedPageBreak/>
         <w:drawing>
-          <wp:inline distT="0" distB="0" distL="0" distR="0" wp14:anchorId="2DDF28BA" wp14:editId="652A25AF">
+          <wp:inline distT="0" distB="0" distL="0" distR="0" wp14:anchorId="4E57AB5B" wp14:editId="145590E3">
             <wp:extent cx="5943600" cy="3752850"/>
             <wp:effectExtent l="0" t="0" r="0" b="0"/>
-            <wp:docPr id="1795008711" name="그림 1795008711"/>
+            <wp:docPr id="921378267" name="그림 921378267"/>
             <wp:cNvGraphicFramePr>
               <a:graphicFrameLocks xmlns:a="http://schemas.openxmlformats.org/drawingml/2006/main" noChangeAspect="1"/>
             </wp:cNvGraphicFramePr>
@@ -45520,7 +45520,7 @@
         <w:pStyle w:val="1"/>
         <w:pageBreakBefore/>
       </w:pPr>
-      <w:bookmarkStart w:id="39" w:name="_Toc240675110"/>
+      <w:bookmarkStart w:id="39" w:name="_Toc240675714"/>
       <w:r>
         <w:lastRenderedPageBreak/>
         <w:t xml:space="preserve">12. </w:t>
@@ -46978,7 +46978,7 @@
         <w:pStyle w:val="1"/>
         <w:pageBreakBefore/>
       </w:pPr>
-      <w:bookmarkStart w:id="40" w:name="_Toc240675111"/>
+      <w:bookmarkStart w:id="40" w:name="_Toc240675715"/>
       <w:r>
         <w:lastRenderedPageBreak/>
         <w:t xml:space="preserve">13. </w:t>
@@ -48059,7 +48059,7 @@
         <w:pStyle w:val="1"/>
         <w:pageBreakBefore/>
       </w:pPr>
-      <w:bookmarkStart w:id="41" w:name="_Toc240675112"/>
+      <w:bookmarkStart w:id="41" w:name="_Toc240675716"/>
       <w:r>
         <w:lastRenderedPageBreak/>
         <w:t xml:space="preserve">14. </w:t>
@@ -51984,7 +51984,7 @@
         <w:pStyle w:val="1"/>
         <w:pageBreakBefore/>
       </w:pPr>
-      <w:bookmarkStart w:id="42" w:name="_Toc240675113"/>
+      <w:bookmarkStart w:id="42" w:name="_Toc240675717"/>
       <w:r>
         <w:lastRenderedPageBreak/>
         <w:t>부록</w:t>
@@ -51995,7 +51995,7 @@
       <w:pPr>
         <w:pStyle w:val="2"/>
       </w:pPr>
-      <w:bookmarkStart w:id="43" w:name="_Toc240675114"/>
+      <w:bookmarkStart w:id="43" w:name="_Toc240675718"/>
       <w:r>
         <w:t xml:space="preserve">A. </w:t>
       </w:r>
@@ -52576,7 +52576,7 @@
       <w:pPr>
         <w:pStyle w:val="2"/>
       </w:pPr>
-      <w:bookmarkStart w:id="44" w:name="_Toc240675115"/>
+      <w:bookmarkStart w:id="44" w:name="_Toc240675719"/>
       <w:r>
         <w:t xml:space="preserve">B. </w:t>
       </w:r>
@@ -52811,7 +52811,7 @@
       <w:pPr>
         <w:pStyle w:val="2"/>
       </w:pPr>
-      <w:bookmarkStart w:id="45" w:name="_Toc240675116"/>
+      <w:bookmarkStart w:id="45" w:name="_Toc240675720"/>
       <w:r>
         <w:t xml:space="preserve">C. </w:t>
       </w:r>
@@ -53886,7 +53886,7 @@
       <w:pPr>
         <w:pStyle w:val="2"/>
       </w:pPr>
-      <w:bookmarkStart w:id="46" w:name="_Toc240675117"/>
+      <w:bookmarkStart w:id="46" w:name="_Toc240675721"/>
       <w:r>
         <w:t xml:space="preserve">E. </w:t>
       </w:r>
@@ -57082,14 +57082,42 @@
                 <w:sz w:val="19"/>
                 <w:szCs w:val="19"/>
               </w:rPr>
-              <w:t>앱의</w:t>
-            </w:r>
-            <w:r>
-              <w:rPr>
-                <w:sz w:val="19"/>
-                <w:szCs w:val="19"/>
-              </w:rPr>
-              <w:t xml:space="preserve"> </w:t>
+              <w:t>화면</w:t>
+            </w:r>
+            <w:r>
+              <w:rPr>
+                <w:sz w:val="19"/>
+                <w:szCs w:val="19"/>
+              </w:rPr>
+              <w:t xml:space="preserve"> </w:t>
+            </w:r>
+            <w:r>
+              <w:rPr>
+                <w:sz w:val="19"/>
+                <w:szCs w:val="19"/>
+              </w:rPr>
+              <w:t>오른쪽</w:t>
+            </w:r>
+            <w:r>
+              <w:rPr>
+                <w:sz w:val="19"/>
+                <w:szCs w:val="19"/>
+              </w:rPr>
+              <w:t xml:space="preserve"> </w:t>
+            </w:r>
+            <w:r>
+              <w:rPr>
+                <w:sz w:val="19"/>
+                <w:szCs w:val="19"/>
+              </w:rPr>
+              <w:t>위</w:t>
+            </w:r>
+            <w:r>
+              <w:rPr>
+                <w:sz w:val="19"/>
+                <w:szCs w:val="19"/>
+              </w:rPr>
+              <w:t xml:space="preserve"> [</w:t>
             </w:r>
             <w:r>
               <w:rPr>
@@ -57103,7 +57131,119 @@
                 <w:sz w:val="19"/>
                 <w:szCs w:val="19"/>
               </w:rPr>
-              <w:t xml:space="preserve"> › [</w:t>
+              <w:t>]</w:t>
+            </w:r>
+            <w:r>
+              <w:rPr>
+                <w:sz w:val="19"/>
+                <w:szCs w:val="19"/>
+              </w:rPr>
+              <w:t>을</w:t>
+            </w:r>
+            <w:r>
+              <w:rPr>
+                <w:sz w:val="19"/>
+                <w:szCs w:val="19"/>
+              </w:rPr>
+              <w:t xml:space="preserve"> </w:t>
+            </w:r>
+            <w:r>
+              <w:rPr>
+                <w:sz w:val="19"/>
+                <w:szCs w:val="19"/>
+              </w:rPr>
+              <w:t>누르면</w:t>
+            </w:r>
+            <w:r>
+              <w:rPr>
+                <w:sz w:val="19"/>
+                <w:szCs w:val="19"/>
+              </w:rPr>
+              <w:t xml:space="preserve"> </w:t>
+            </w:r>
+            <w:r>
+              <w:rPr>
+                <w:sz w:val="19"/>
+                <w:szCs w:val="19"/>
+              </w:rPr>
+              <w:t>열리는</w:t>
+            </w:r>
+            <w:r>
+              <w:rPr>
+                <w:sz w:val="19"/>
+                <w:szCs w:val="19"/>
+              </w:rPr>
+              <w:t xml:space="preserve"> </w:t>
+            </w:r>
+            <w:r>
+              <w:rPr>
+                <w:sz w:val="19"/>
+                <w:szCs w:val="19"/>
+              </w:rPr>
+              <w:t>창의</w:t>
+            </w:r>
+            <w:r>
+              <w:rPr>
+                <w:sz w:val="19"/>
+                <w:szCs w:val="19"/>
+              </w:rPr>
+              <w:t xml:space="preserve"> </w:t>
+            </w:r>
+            <w:r>
+              <w:rPr>
+                <w:sz w:val="19"/>
+                <w:szCs w:val="19"/>
+              </w:rPr>
+              <w:t>맨</w:t>
+            </w:r>
+            <w:r>
+              <w:rPr>
+                <w:sz w:val="19"/>
+                <w:szCs w:val="19"/>
+              </w:rPr>
+              <w:t xml:space="preserve"> </w:t>
+            </w:r>
+            <w:r>
+              <w:rPr>
+                <w:sz w:val="19"/>
+                <w:szCs w:val="19"/>
+              </w:rPr>
+              <w:t>아래</w:t>
+            </w:r>
+            <w:r>
+              <w:rPr>
+                <w:sz w:val="19"/>
+                <w:szCs w:val="19"/>
+              </w:rPr>
+              <w:t xml:space="preserve"> </w:t>
+            </w:r>
+            <w:r>
+              <w:rPr>
+                <w:sz w:val="19"/>
+                <w:szCs w:val="19"/>
+              </w:rPr>
+              <w:t>줄에</w:t>
+            </w:r>
+            <w:r>
+              <w:rPr>
+                <w:sz w:val="19"/>
+                <w:szCs w:val="19"/>
+              </w:rPr>
+              <w:t xml:space="preserve"> [</w:t>
+            </w:r>
+            <w:r>
+              <w:rPr>
+                <w:sz w:val="19"/>
+                <w:szCs w:val="19"/>
+              </w:rPr>
+              <w:t>📊</w:t>
+            </w:r>
+            <w:r>
+              <w:rPr>
+                <w:sz w:val="19"/>
+                <w:szCs w:val="19"/>
+              </w:rPr>
+              <w:t xml:space="preserve"> </w:t>
             </w:r>
             <w:r>
               <w:rPr>
@@ -57131,35 +57271,161 @@
                 <w:sz w:val="19"/>
                 <w:szCs w:val="19"/>
               </w:rPr>
-              <w:t>)]</w:t>
-            </w:r>
-            <w:r>
-              <w:rPr>
-                <w:sz w:val="19"/>
-                <w:szCs w:val="19"/>
-              </w:rPr>
-              <w:t>을</w:t>
-            </w:r>
-            <w:r>
-              <w:rPr>
-                <w:sz w:val="19"/>
-                <w:szCs w:val="19"/>
-              </w:rPr>
-              <w:t xml:space="preserve"> </w:t>
-            </w:r>
-            <w:r>
-              <w:rPr>
-                <w:sz w:val="19"/>
-                <w:szCs w:val="19"/>
-              </w:rPr>
-              <w:t>누르고</w:t>
-            </w:r>
-            <w:r>
-              <w:rPr>
-                <w:sz w:val="19"/>
-                <w:szCs w:val="19"/>
-              </w:rPr>
-              <w:t xml:space="preserve"> </w:t>
+              <w:t xml:space="preserve">)] </w:t>
+            </w:r>
+            <w:r>
+              <w:rPr>
+                <w:sz w:val="19"/>
+                <w:szCs w:val="19"/>
+              </w:rPr>
+              <w:t>버튼이</w:t>
+            </w:r>
+            <w:r>
+              <w:rPr>
+                <w:sz w:val="19"/>
+                <w:szCs w:val="19"/>
+              </w:rPr>
+              <w:t xml:space="preserve"> </w:t>
+            </w:r>
+            <w:r>
+              <w:rPr>
+                <w:sz w:val="19"/>
+                <w:szCs w:val="19"/>
+              </w:rPr>
+              <w:t>있습니다</w:t>
+            </w:r>
+            <w:r>
+              <w:rPr>
+                <w:sz w:val="19"/>
+                <w:szCs w:val="19"/>
+              </w:rPr>
+              <w:t xml:space="preserve">. </w:t>
+            </w:r>
+            <w:r>
+              <w:rPr>
+                <w:sz w:val="19"/>
+                <w:szCs w:val="19"/>
+              </w:rPr>
+              <w:t>사이트</w:t>
+            </w:r>
+            <w:r>
+              <w:rPr>
+                <w:sz w:val="19"/>
+                <w:szCs w:val="19"/>
+              </w:rPr>
+              <w:t xml:space="preserve"> </w:t>
+            </w:r>
+            <w:r>
+              <w:rPr>
+                <w:sz w:val="19"/>
+                <w:szCs w:val="19"/>
+              </w:rPr>
+              <w:t>주소</w:t>
+            </w:r>
+            <w:r>
+              <w:rPr>
+                <w:sz w:val="19"/>
+                <w:szCs w:val="19"/>
+              </w:rPr>
+              <w:t xml:space="preserve"> </w:t>
+            </w:r>
+            <w:r>
+              <w:rPr>
+                <w:sz w:val="19"/>
+                <w:szCs w:val="19"/>
+              </w:rPr>
+              <w:t>끝에</w:t>
+            </w:r>
+            <w:r>
+              <w:rPr>
+                <w:sz w:val="19"/>
+                <w:szCs w:val="19"/>
+              </w:rPr>
+              <w:t xml:space="preserve"> #usage </w:t>
+            </w:r>
+            <w:r>
+              <w:rPr>
+                <w:sz w:val="19"/>
+                <w:szCs w:val="19"/>
+              </w:rPr>
+              <w:t>를</w:t>
+            </w:r>
+            <w:r>
+              <w:rPr>
+                <w:sz w:val="19"/>
+                <w:szCs w:val="19"/>
+              </w:rPr>
+              <w:t xml:space="preserve"> </w:t>
+            </w:r>
+            <w:r>
+              <w:rPr>
+                <w:sz w:val="19"/>
+                <w:szCs w:val="19"/>
+              </w:rPr>
+              <w:t>붙여</w:t>
+            </w:r>
+            <w:r>
+              <w:rPr>
+                <w:sz w:val="19"/>
+                <w:szCs w:val="19"/>
+              </w:rPr>
+              <w:t xml:space="preserve">(runinqvic.vercel.app/#usage) </w:t>
+            </w:r>
+            <w:r>
+              <w:rPr>
+                <w:sz w:val="19"/>
+                <w:szCs w:val="19"/>
+              </w:rPr>
+              <w:t>즐겨찾기해</w:t>
+            </w:r>
+            <w:r>
+              <w:rPr>
+                <w:sz w:val="19"/>
+                <w:szCs w:val="19"/>
+              </w:rPr>
+              <w:t xml:space="preserve"> </w:t>
+            </w:r>
+            <w:r>
+              <w:rPr>
+                <w:sz w:val="19"/>
+                <w:szCs w:val="19"/>
+              </w:rPr>
+              <w:t>두면</w:t>
+            </w:r>
+            <w:r>
+              <w:rPr>
+                <w:sz w:val="19"/>
+                <w:szCs w:val="19"/>
+              </w:rPr>
+              <w:t xml:space="preserve"> </w:t>
+            </w:r>
+            <w:r>
+              <w:rPr>
+                <w:sz w:val="19"/>
+                <w:szCs w:val="19"/>
+              </w:rPr>
+              <w:t>바로</w:t>
+            </w:r>
+            <w:r>
+              <w:rPr>
+                <w:sz w:val="19"/>
+                <w:szCs w:val="19"/>
+              </w:rPr>
+              <w:t xml:space="preserve"> </w:t>
+            </w:r>
+            <w:r>
+              <w:rPr>
+                <w:sz w:val="19"/>
+                <w:szCs w:val="19"/>
+              </w:rPr>
+              <w:t>열립니다</w:t>
+            </w:r>
+            <w:r>
+              <w:rPr>
+                <w:sz w:val="19"/>
+                <w:szCs w:val="19"/>
+              </w:rPr>
+              <w:t xml:space="preserve">. </w:t>
             </w:r>
             <w:r>
               <w:rPr>
@@ -57348,7 +57614,15 @@
                 <w:sz w:val="19"/>
                 <w:szCs w:val="19"/>
               </w:rPr>
-              <w:t>요청</w:t>
+              <w:t>요</w:t>
+            </w:r>
+            <w:r>
+              <w:rPr>
+                <w:sz w:val="19"/>
+                <w:szCs w:val="19"/>
+              </w:rPr>
+              <w:lastRenderedPageBreak/>
+              <w:t>청</w:t>
             </w:r>
             <w:r>
               <w:rPr>
@@ -58311,10 +58585,10 @@
           <w:noProof/>
         </w:rPr>
         <w:drawing>
-          <wp:inline distT="0" distB="0" distL="0" distR="0" wp14:anchorId="1CF49AAB" wp14:editId="6EDE61C4">
+          <wp:inline distT="0" distB="0" distL="0" distR="0" wp14:anchorId="31A40B3D" wp14:editId="7D4FF487">
             <wp:extent cx="5943600" cy="3638550"/>
             <wp:effectExtent l="0" t="0" r="0" b="0"/>
-            <wp:docPr id="1106072958" name="그림 1106072958"/>
+            <wp:docPr id="1569428490" name="그림 1569428490"/>
             <wp:cNvGraphicFramePr>
               <a:graphicFrameLocks xmlns:a="http://schemas.openxmlformats.org/drawingml/2006/main" noChangeAspect="1"/>
             </wp:cNvGraphicFramePr>
@@ -58603,7 +58877,7 @@
       <w:pPr>
         <w:pStyle w:val="2"/>
       </w:pPr>
-      <w:bookmarkStart w:id="47" w:name="_Toc240675118"/>
+      <w:bookmarkStart w:id="47" w:name="_Toc240675722"/>
       <w:r>
         <w:t xml:space="preserve">D. </w:t>
       </w:r>
@@ -58802,6 +59076,7 @@
         <w:spacing w:after="80" w:line="300" w:lineRule="auto"/>
       </w:pPr>
       <w:r>
+        <w:lastRenderedPageBreak/>
         <w:t>소스</w:t>
       </w:r>
       <w:r>
@@ -59031,118 +59306,10 @@
 <file path=word/numbering.xml><?xml version="1.0" encoding="utf-8"?>
 <w:numbering xmlns:wpc="http://schemas.microsoft.com/office/word/2010/wordprocessingCanvas" xmlns:cx="http://schemas.microsoft.com/office/drawing/2014/chartex" xmlns:cx1="http://schemas.microsoft.com/office/drawing/2015/9/8/chartex" xmlns:cx2="http://schemas.microsoft.com/office/drawing/2015/10/21/chartex" xmlns:cx3="http://schemas.microsoft.com/office/drawing/2016/5/9/chartex" xmlns:cx4="http://schemas.microsoft.com/office/drawing/2016/5/10/chartex" xmlns:cx5="http://schemas.microsoft.com/office/drawing/2016/5/11/chartex" xmlns:cx6="http://schemas.microsoft.com/office/drawing/2016/5/12/chartex" xmlns:cx7="http://schemas.microsoft.com/office/drawing/2016/5/13/chartex" xmlns:cx8="http://schemas.microsoft.com/office/drawing/2016/5/14/chartex" xmlns:mc="http://schemas.openxmlformats.org/markup-compatibility/2006" xmlns:aink="http://schemas.microsoft.com/office/drawing/2016/ink" xmlns:am3d="http://schemas.microsoft.com/office/drawing/2017/model3d" xmlns:o="urn:schemas-microsoft-com:office:office" xmlns:oel="http://schemas.microsoft.com/office/2019/extlst" xmlns:r="http://schemas.openxmlformats.org/officeDocument/2006/relationships" xmlns:m="http://schemas.openxmlformats.org/officeDocument/2006/math" xmlns:v="urn:schemas-microsoft-com:vml" xmlns:wp14="http://schemas.microsoft.com/office/word/2010/wordprocessingDrawing" xmlns:wp="http://schemas.openxmlformats.org/drawingml/2006/wordprocessingDrawing" xmlns:w10="urn:schemas-microsoft-com:office:word" xmlns:w="http://schemas.openxmlformats.org/wordprocessingml/2006/main" xmlns:w14="http://schemas.microsoft.com/office/word/2010/wordml" xmlns:w15="http://schemas.microsoft.com/office/word/2012/wordml" xmlns:w16cex="http://schemas.microsoft.com/office/word/2018/wordml/cex" xmlns:w16cid="http://schemas.microsoft.com/office/word/2016/wordml/cid" xmlns:w16="http://schemas.microsoft.com/office/word/2018/wordml" xmlns:w16du="http://schemas.microsoft.com/office/word/2023/wordml/word16du" xmlns:w16sdtdh="http://schemas.microsoft.com/office/word/2020/wordml/sdtdatahash" xmlns:w16sdtfl="http://schemas.microsoft.com/office/word/2024/wordml/sdtformatlock" xmlns:w16se="http://schemas.microsoft.com/office/word/2015/wordml/symex" xmlns:wpg="http://schemas.microsoft.com/office/word/2010/wordprocessingGroup" xmlns:wpi="http://schemas.microsoft.com/office/word/2010/wordprocessingInk" xmlns:wne="http://schemas.microsoft.com/office/word/2006/wordml" xmlns:wps="http://schemas.microsoft.com/office/word/2010/wordprocessingShape" mc:Ignorable="w14 w15 w16se w16cid w16 w16cex w16sdtdh w16sdtfl w16du wp14">
   <w:abstractNum w:abstractNumId="0" w15:restartNumberingAfterBreak="0">
-    <w:nsid w:val="1D9C31DC"/>
+    <w:nsid w:val="13A5616C"/>
     <w:multiLevelType w:val="hybridMultilevel"/>
-    <w:tmpl w:val="21DEAA50"/>
-    <w:lvl w:ilvl="0" w:tplc="498E4B64">
-      <w:start w:val="1"/>
-      <w:numFmt w:val="bullet"/>
-      <w:lvlText w:val="•"/>
-      <w:lvlJc w:val="left"/>
-      <w:pPr>
-        <w:ind w:left="480" w:hanging="260"/>
-      </w:pPr>
-    </w:lvl>
-    <w:lvl w:ilvl="1" w:tplc="ACF47F12">
-      <w:numFmt w:val="decimal"/>
-      <w:lvlText w:val=""/>
-      <w:lvlJc w:val="left"/>
-    </w:lvl>
-    <w:lvl w:ilvl="2" w:tplc="3D4E47CE">
-      <w:numFmt w:val="decimal"/>
-      <w:lvlText w:val=""/>
-      <w:lvlJc w:val="left"/>
-    </w:lvl>
-    <w:lvl w:ilvl="3" w:tplc="1512AEF2">
-      <w:numFmt w:val="decimal"/>
-      <w:lvlText w:val=""/>
-      <w:lvlJc w:val="left"/>
-    </w:lvl>
-    <w:lvl w:ilvl="4" w:tplc="255A34BA">
-      <w:numFmt w:val="decimal"/>
-      <w:lvlText w:val=""/>
-      <w:lvlJc w:val="left"/>
-    </w:lvl>
-    <w:lvl w:ilvl="5" w:tplc="20ACA674">
-      <w:numFmt w:val="decimal"/>
-      <w:lvlText w:val=""/>
-      <w:lvlJc w:val="left"/>
-    </w:lvl>
-    <w:lvl w:ilvl="6" w:tplc="30D4881A">
-      <w:numFmt w:val="decimal"/>
-      <w:lvlText w:val=""/>
-      <w:lvlJc w:val="left"/>
-    </w:lvl>
-    <w:lvl w:ilvl="7" w:tplc="EDACA7F0">
-      <w:numFmt w:val="decimal"/>
-      <w:lvlText w:val=""/>
-      <w:lvlJc w:val="left"/>
-    </w:lvl>
-    <w:lvl w:ilvl="8" w:tplc="56E27DEA">
-      <w:numFmt w:val="decimal"/>
-      <w:lvlText w:val=""/>
-      <w:lvlJc w:val="left"/>
-    </w:lvl>
-  </w:abstractNum>
-  <w:abstractNum w:abstractNumId="1" w15:restartNumberingAfterBreak="0">
-    <w:nsid w:val="27EF34B2"/>
-    <w:multiLevelType w:val="hybridMultilevel"/>
-    <w:tmpl w:val="88861D0C"/>
-    <w:lvl w:ilvl="0" w:tplc="A3D6C7D0">
-      <w:start w:val="1"/>
-      <w:numFmt w:val="decimal"/>
-      <w:lvlText w:val="%1."/>
-      <w:lvlJc w:val="left"/>
-      <w:pPr>
-        <w:ind w:left="480" w:hanging="300"/>
-      </w:pPr>
-    </w:lvl>
-    <w:lvl w:ilvl="1" w:tplc="EF18EA7A">
-      <w:numFmt w:val="decimal"/>
-      <w:lvlText w:val=""/>
-      <w:lvlJc w:val="left"/>
-    </w:lvl>
-    <w:lvl w:ilvl="2" w:tplc="FA680FFA">
-      <w:numFmt w:val="decimal"/>
-      <w:lvlText w:val=""/>
-      <w:lvlJc w:val="left"/>
-    </w:lvl>
-    <w:lvl w:ilvl="3" w:tplc="61903D2E">
-      <w:numFmt w:val="decimal"/>
-      <w:lvlText w:val=""/>
-      <w:lvlJc w:val="left"/>
-    </w:lvl>
-    <w:lvl w:ilvl="4" w:tplc="977AD0C8">
-      <w:numFmt w:val="decimal"/>
-      <w:lvlText w:val=""/>
-      <w:lvlJc w:val="left"/>
-    </w:lvl>
-    <w:lvl w:ilvl="5" w:tplc="315C2500">
-      <w:numFmt w:val="decimal"/>
-      <w:lvlText w:val=""/>
-      <w:lvlJc w:val="left"/>
-    </w:lvl>
-    <w:lvl w:ilvl="6" w:tplc="F398C09A">
-      <w:numFmt w:val="decimal"/>
-      <w:lvlText w:val=""/>
-      <w:lvlJc w:val="left"/>
-    </w:lvl>
-    <w:lvl w:ilvl="7" w:tplc="7160CEA0">
-      <w:numFmt w:val="decimal"/>
-      <w:lvlText w:val=""/>
-      <w:lvlJc w:val="left"/>
-    </w:lvl>
-    <w:lvl w:ilvl="8" w:tplc="6114D932">
-      <w:numFmt w:val="decimal"/>
-      <w:lvlText w:val=""/>
-      <w:lvlJc w:val="left"/>
-    </w:lvl>
-  </w:abstractNum>
-  <w:abstractNum w:abstractNumId="2" w15:restartNumberingAfterBreak="0">
-    <w:nsid w:val="7DFB62B2"/>
-    <w:multiLevelType w:val="hybridMultilevel"/>
-    <w:tmpl w:val="04F0A300"/>
-    <w:lvl w:ilvl="0" w:tplc="AC500B10">
+    <w:tmpl w:val="229E6104"/>
+    <w:lvl w:ilvl="0" w:tplc="3DCAB816">
       <w:start w:val="1"/>
       <w:numFmt w:val="bullet"/>
       <w:lvlText w:val="●"/>
@@ -59151,7 +59318,7 @@
         <w:ind w:left="720" w:hanging="360"/>
       </w:pPr>
     </w:lvl>
-    <w:lvl w:ilvl="1" w:tplc="ACBC1468">
+    <w:lvl w:ilvl="1" w:tplc="B61A7E44">
       <w:start w:val="1"/>
       <w:numFmt w:val="bullet"/>
       <w:lvlText w:val="○"/>
@@ -59160,7 +59327,7 @@
         <w:ind w:left="1440" w:hanging="360"/>
       </w:pPr>
     </w:lvl>
-    <w:lvl w:ilvl="2" w:tplc="5520FF74">
+    <w:lvl w:ilvl="2" w:tplc="7B107AAC">
       <w:start w:val="1"/>
       <w:numFmt w:val="bullet"/>
       <w:lvlText w:val="■"/>
@@ -59169,7 +59336,7 @@
         <w:ind w:left="2160" w:hanging="360"/>
       </w:pPr>
     </w:lvl>
-    <w:lvl w:ilvl="3" w:tplc="BF3266A4">
+    <w:lvl w:ilvl="3" w:tplc="9ACACE76">
       <w:start w:val="1"/>
       <w:numFmt w:val="bullet"/>
       <w:lvlText w:val="●"/>
@@ -59178,7 +59345,7 @@
         <w:ind w:left="2880" w:hanging="360"/>
       </w:pPr>
     </w:lvl>
-    <w:lvl w:ilvl="4" w:tplc="127ED5D6">
+    <w:lvl w:ilvl="4" w:tplc="33A4635A">
       <w:start w:val="1"/>
       <w:numFmt w:val="bullet"/>
       <w:lvlText w:val="○"/>
@@ -59187,7 +59354,7 @@
         <w:ind w:left="3600" w:hanging="360"/>
       </w:pPr>
     </w:lvl>
-    <w:lvl w:ilvl="5" w:tplc="0AC0A2E0">
+    <w:lvl w:ilvl="5" w:tplc="E0F6C93C">
       <w:start w:val="1"/>
       <w:numFmt w:val="bullet"/>
       <w:lvlText w:val="■"/>
@@ -59196,7 +59363,7 @@
         <w:ind w:left="4320" w:hanging="360"/>
       </w:pPr>
     </w:lvl>
-    <w:lvl w:ilvl="6" w:tplc="FDA436FA">
+    <w:lvl w:ilvl="6" w:tplc="A6A45486">
       <w:start w:val="1"/>
       <w:numFmt w:val="bullet"/>
       <w:lvlText w:val="●"/>
@@ -59205,7 +59372,7 @@
         <w:ind w:left="5040" w:hanging="360"/>
       </w:pPr>
     </w:lvl>
-    <w:lvl w:ilvl="7" w:tplc="803C0CD2">
+    <w:lvl w:ilvl="7" w:tplc="038EBAFA">
       <w:start w:val="1"/>
       <w:numFmt w:val="bullet"/>
       <w:lvlText w:val="●"/>
@@ -59214,7 +59381,7 @@
         <w:ind w:left="5760" w:hanging="360"/>
       </w:pPr>
     </w:lvl>
-    <w:lvl w:ilvl="8" w:tplc="3DD2281C">
+    <w:lvl w:ilvl="8" w:tplc="84343460">
       <w:start w:val="1"/>
       <w:numFmt w:val="bullet"/>
       <w:lvlText w:val="●"/>
@@ -59224,31 +59391,139 @@
       </w:pPr>
     </w:lvl>
   </w:abstractNum>
-  <w:num w:numId="1" w16cid:durableId="1699547413">
+  <w:abstractNum w:abstractNumId="1" w15:restartNumberingAfterBreak="0">
+    <w:nsid w:val="40E66E48"/>
+    <w:multiLevelType w:val="hybridMultilevel"/>
+    <w:tmpl w:val="FFB46532"/>
+    <w:lvl w:ilvl="0" w:tplc="8BB0759A">
+      <w:start w:val="1"/>
+      <w:numFmt w:val="decimal"/>
+      <w:lvlText w:val="%1."/>
+      <w:lvlJc w:val="left"/>
+      <w:pPr>
+        <w:ind w:left="480" w:hanging="300"/>
+      </w:pPr>
+    </w:lvl>
+    <w:lvl w:ilvl="1" w:tplc="04405FF4">
+      <w:numFmt w:val="decimal"/>
+      <w:lvlText w:val=""/>
+      <w:lvlJc w:val="left"/>
+    </w:lvl>
+    <w:lvl w:ilvl="2" w:tplc="7E6C6AF0">
+      <w:numFmt w:val="decimal"/>
+      <w:lvlText w:val=""/>
+      <w:lvlJc w:val="left"/>
+    </w:lvl>
+    <w:lvl w:ilvl="3" w:tplc="0666EC78">
+      <w:numFmt w:val="decimal"/>
+      <w:lvlText w:val=""/>
+      <w:lvlJc w:val="left"/>
+    </w:lvl>
+    <w:lvl w:ilvl="4" w:tplc="5E2403B6">
+      <w:numFmt w:val="decimal"/>
+      <w:lvlText w:val=""/>
+      <w:lvlJc w:val="left"/>
+    </w:lvl>
+    <w:lvl w:ilvl="5" w:tplc="D2F218A4">
+      <w:numFmt w:val="decimal"/>
+      <w:lvlText w:val=""/>
+      <w:lvlJc w:val="left"/>
+    </w:lvl>
+    <w:lvl w:ilvl="6" w:tplc="C5FAAC02">
+      <w:numFmt w:val="decimal"/>
+      <w:lvlText w:val=""/>
+      <w:lvlJc w:val="left"/>
+    </w:lvl>
+    <w:lvl w:ilvl="7" w:tplc="4A6A4A32">
+      <w:numFmt w:val="decimal"/>
+      <w:lvlText w:val=""/>
+      <w:lvlJc w:val="left"/>
+    </w:lvl>
+    <w:lvl w:ilvl="8" w:tplc="E82EAA38">
+      <w:numFmt w:val="decimal"/>
+      <w:lvlText w:val=""/>
+      <w:lvlJc w:val="left"/>
+    </w:lvl>
+  </w:abstractNum>
+  <w:abstractNum w:abstractNumId="2" w15:restartNumberingAfterBreak="0">
+    <w:nsid w:val="76CA01F9"/>
+    <w:multiLevelType w:val="hybridMultilevel"/>
+    <w:tmpl w:val="98EE5042"/>
+    <w:lvl w:ilvl="0" w:tplc="8458A124">
+      <w:start w:val="1"/>
+      <w:numFmt w:val="bullet"/>
+      <w:lvlText w:val="•"/>
+      <w:lvlJc w:val="left"/>
+      <w:pPr>
+        <w:ind w:left="480" w:hanging="260"/>
+      </w:pPr>
+    </w:lvl>
+    <w:lvl w:ilvl="1" w:tplc="8A6AA70E">
+      <w:numFmt w:val="decimal"/>
+      <w:lvlText w:val=""/>
+      <w:lvlJc w:val="left"/>
+    </w:lvl>
+    <w:lvl w:ilvl="2" w:tplc="4A563654">
+      <w:numFmt w:val="decimal"/>
+      <w:lvlText w:val=""/>
+      <w:lvlJc w:val="left"/>
+    </w:lvl>
+    <w:lvl w:ilvl="3" w:tplc="8B385BCA">
+      <w:numFmt w:val="decimal"/>
+      <w:lvlText w:val=""/>
+      <w:lvlJc w:val="left"/>
+    </w:lvl>
+    <w:lvl w:ilvl="4" w:tplc="AA782C8C">
+      <w:numFmt w:val="decimal"/>
+      <w:lvlText w:val=""/>
+      <w:lvlJc w:val="left"/>
+    </w:lvl>
+    <w:lvl w:ilvl="5" w:tplc="6546B366">
+      <w:numFmt w:val="decimal"/>
+      <w:lvlText w:val=""/>
+      <w:lvlJc w:val="left"/>
+    </w:lvl>
+    <w:lvl w:ilvl="6" w:tplc="E53CB58A">
+      <w:numFmt w:val="decimal"/>
+      <w:lvlText w:val=""/>
+      <w:lvlJc w:val="left"/>
+    </w:lvl>
+    <w:lvl w:ilvl="7" w:tplc="1CF8AE68">
+      <w:numFmt w:val="decimal"/>
+      <w:lvlText w:val=""/>
+      <w:lvlJc w:val="left"/>
+    </w:lvl>
+    <w:lvl w:ilvl="8" w:tplc="4DC04CE4">
+      <w:numFmt w:val="decimal"/>
+      <w:lvlText w:val=""/>
+      <w:lvlJc w:val="left"/>
+    </w:lvl>
+  </w:abstractNum>
+  <w:num w:numId="1" w16cid:durableId="467940259">
+    <w:abstractNumId w:val="0"/>
+    <w:lvlOverride w:ilvl="0">
+      <w:startOverride w:val="1"/>
+    </w:lvlOverride>
+  </w:num>
+  <w:num w:numId="2" w16cid:durableId="1487622467">
     <w:abstractNumId w:val="2"/>
     <w:lvlOverride w:ilvl="0">
       <w:startOverride w:val="1"/>
     </w:lvlOverride>
   </w:num>
-  <w:num w:numId="2" w16cid:durableId="591401155">
-    <w:abstractNumId w:val="0"/>
-    <w:lvlOverride w:ilvl="0">
-      <w:startOverride w:val="1"/>
-    </w:lvlOverride>
-  </w:num>
-  <w:num w:numId="3" w16cid:durableId="1623996187">
+  <w:num w:numId="3" w16cid:durableId="292711501">
     <w:abstractNumId w:val="1"/>
     <w:lvlOverride w:ilvl="0">
       <w:startOverride w:val="1"/>
     </w:lvlOverride>
   </w:num>
-  <w:num w:numId="4" w16cid:durableId="926890067">
+  <w:num w:numId="4" w16cid:durableId="2061786326">
     <w:abstractNumId w:val="1"/>
     <w:lvlOverride w:ilvl="0">
       <w:startOverride w:val="1"/>
     </w:lvlOverride>
   </w:num>
-  <w:num w:numId="5" w16cid:durableId="1037656020">
+  <w:num w:numId="5" w16cid:durableId="207300813">
     <w:abstractNumId w:val="1"/>
     <w:lvlOverride w:ilvl="0">
       <w:startOverride w:val="1"/>
@@ -59873,7 +60148,7 @@
     <w:autoRedefine/>
     <w:uiPriority w:val="39"/>
     <w:unhideWhenUsed/>
-    <w:rsid w:val="002D11C0"/>
+    <w:rsid w:val="0050120B"/>
   </w:style>
   <w:style w:type="paragraph" w:styleId="20">
     <w:name w:val="toc 2"/>
@@ -59882,7 +60157,7 @@
     <w:autoRedefine/>
     <w:uiPriority w:val="39"/>
     <w:unhideWhenUsed/>
-    <w:rsid w:val="002D11C0"/>
+    <w:rsid w:val="0050120B"/>
     <w:pPr>
       <w:ind w:leftChars="200" w:left="425"/>
     </w:pPr>
@@ -59893,7 +60168,7 @@
     <w:link w:val="Char1"/>
     <w:uiPriority w:val="99"/>
     <w:unhideWhenUsed/>
-    <w:rsid w:val="002D11C0"/>
+    <w:rsid w:val="0050120B"/>
     <w:pPr>
       <w:tabs>
         <w:tab w:val="center" w:pos="4513"/>
@@ -59907,7 +60182,7 @@
     <w:basedOn w:val="a0"/>
     <w:link w:val="aa"/>
     <w:uiPriority w:val="99"/>
-    <w:rsid w:val="002D11C0"/>
+    <w:rsid w:val="0050120B"/>
   </w:style>
   <w:style w:type="paragraph" w:styleId="ab">
     <w:name w:val="footer"/>
@@ -59915,7 +60190,7 @@
     <w:link w:val="Char2"/>
     <w:uiPriority w:val="99"/>
     <w:unhideWhenUsed/>
-    <w:rsid w:val="002D11C0"/>
+    <w:rsid w:val="0050120B"/>
     <w:pPr>
       <w:tabs>
         <w:tab w:val="center" w:pos="4513"/>
@@ -59929,7 +60204,7 @@
     <w:basedOn w:val="a0"/>
     <w:link w:val="ab"/>
     <w:uiPriority w:val="99"/>
-    <w:rsid w:val="002D11C0"/>
+    <w:rsid w:val="0050120B"/>
   </w:style>
 </w:styles>
 </file>

</xml_diff>

<commit_message>
Setup tool: offer browser-based Vercel login when this PC is not signed in
Co-Authored-By: Claude Fable 5.1 <noreply@anthropic.com>
</commit_message>
<xml_diff>
--- a/docs/manual/RuninqVic_사용설명서.docx
+++ b/docs/manual/RuninqVic_사용설명서.docx
@@ -17,7 +17,7 @@
           <w:noProof/>
         </w:rPr>
         <w:drawing>
-          <wp:inline distT="0" distB="0" distL="0" distR="0" wp14:anchorId="1880753C" wp14:editId="131E36D9">
+          <wp:inline distT="0" distB="0" distL="0" distR="0" wp14:anchorId="6695A16E" wp14:editId="155ED533">
             <wp:extent cx="838200" cy="838200"/>
             <wp:effectExtent l="0" t="0" r="0" b="0"/>
             <wp:docPr id="1" name="그림 1"/>
@@ -396,10 +396,10 @@
             <w:noProof/>
           </w:rPr>
           <w:drawing>
-            <wp:inline distT="0" distB="0" distL="0" distR="0" wp14:anchorId="092AD137" wp14:editId="4AA8EF2A">
+            <wp:inline distT="0" distB="0" distL="0" distR="0" wp14:anchorId="7225D001" wp14:editId="2FA9A555">
               <wp:extent cx="1905000" cy="762000"/>
               <wp:effectExtent l="0" t="0" r="0" b="0"/>
-              <wp:docPr id="338446325" name="그림 338446325">
+              <wp:docPr id="1227349512" name="그림 1227349512">
                 <a:hlinkClick xmlns:a="http://schemas.openxmlformats.org/drawingml/2006/main" r:id="rId9"/>
               </wp:docPr>
               <wp:cNvGraphicFramePr>
@@ -537,7 +537,7 @@
     <w:sdt>
       <w:sdtPr>
         <w:alias w:val="목차"/>
-        <w:id w:val="1453056417"/>
+        <w:id w:val="-1013384997"/>
       </w:sdtPr>
       <w:sdtEndPr/>
       <w:sdtContent>
@@ -565,7 +565,7 @@
           <w:r>
             <w:fldChar w:fldCharType="separate"/>
           </w:r>
-          <w:hyperlink w:anchor="_Toc240675675" w:history="1">
+          <w:hyperlink w:anchor="_Toc240676403" w:history="1">
             <w:r>
               <w:rPr>
                 <w:rStyle w:val="a5"/>
@@ -589,7 +589,7 @@
               <w:rPr>
                 <w:noProof/>
               </w:rPr>
-              <w:instrText xml:space="preserve"> PAGEREF _Toc240675675 \h </w:instrText>
+              <w:instrText xml:space="preserve"> PAGEREF _Toc240676403 \h </w:instrText>
             </w:r>
             <w:r>
               <w:rPr>
@@ -632,7 +632,7 @@
               <w14:ligatures w14:val="standardContextual"/>
             </w:rPr>
           </w:pPr>
-          <w:hyperlink w:anchor="_Toc240675676" w:history="1">
+          <w:hyperlink w:anchor="_Toc240676404" w:history="1">
             <w:r>
               <w:rPr>
                 <w:rStyle w:val="a5"/>
@@ -656,7 +656,7 @@
               <w:rPr>
                 <w:noProof/>
               </w:rPr>
-              <w:instrText xml:space="preserve"> PAGEREF _Toc240675676 \h </w:instrText>
+              <w:instrText xml:space="preserve"> PAGEREF _Toc240676404 \h </w:instrText>
             </w:r>
             <w:r>
               <w:rPr>
@@ -699,7 +699,7 @@
               <w14:ligatures w14:val="standardContextual"/>
             </w:rPr>
           </w:pPr>
-          <w:hyperlink w:anchor="_Toc240675677" w:history="1">
+          <w:hyperlink w:anchor="_Toc240676405" w:history="1">
             <w:r>
               <w:rPr>
                 <w:rStyle w:val="a5"/>
@@ -723,7 +723,7 @@
               <w:rPr>
                 <w:noProof/>
               </w:rPr>
-              <w:instrText xml:space="preserve"> PAGEREF _Toc240675677 \h </w:instrText>
+              <w:instrText xml:space="preserve"> PAGEREF _Toc240676405 \h </w:instrText>
             </w:r>
             <w:r>
               <w:rPr>
@@ -766,7 +766,7 @@
               <w14:ligatures w14:val="standardContextual"/>
             </w:rPr>
           </w:pPr>
-          <w:hyperlink w:anchor="_Toc240675678" w:history="1">
+          <w:hyperlink w:anchor="_Toc240676406" w:history="1">
             <w:r>
               <w:rPr>
                 <w:rStyle w:val="a5"/>
@@ -790,7 +790,7 @@
               <w:rPr>
                 <w:noProof/>
               </w:rPr>
-              <w:instrText xml:space="preserve"> PAGEREF _Toc240675678 \h </w:instrText>
+              <w:instrText xml:space="preserve"> PAGEREF _Toc240676406 \h </w:instrText>
             </w:r>
             <w:r>
               <w:rPr>
@@ -832,7 +832,7 @@
               <w14:ligatures w14:val="standardContextual"/>
             </w:rPr>
           </w:pPr>
-          <w:hyperlink w:anchor="_Toc240675679" w:history="1">
+          <w:hyperlink w:anchor="_Toc240676407" w:history="1">
             <w:r>
               <w:rPr>
                 <w:rStyle w:val="a5"/>
@@ -856,7 +856,7 @@
               <w:rPr>
                 <w:noProof/>
               </w:rPr>
-              <w:instrText xml:space="preserve"> PAGEREF _Toc240675679 \h </w:instrText>
+              <w:instrText xml:space="preserve"> PAGEREF _Toc240676407 \h </w:instrText>
             </w:r>
             <w:r>
               <w:rPr>
@@ -899,7 +899,7 @@
               <w14:ligatures w14:val="standardContextual"/>
             </w:rPr>
           </w:pPr>
-          <w:hyperlink w:anchor="_Toc240675680" w:history="1">
+          <w:hyperlink w:anchor="_Toc240676408" w:history="1">
             <w:r>
               <w:rPr>
                 <w:rStyle w:val="a5"/>
@@ -923,7 +923,7 @@
               <w:rPr>
                 <w:noProof/>
               </w:rPr>
-              <w:instrText xml:space="preserve"> PAGEREF _Toc240675680 \h </w:instrText>
+              <w:instrText xml:space="preserve"> PAGEREF _Toc240676408 \h </w:instrText>
             </w:r>
             <w:r>
               <w:rPr>
@@ -966,7 +966,7 @@
               <w14:ligatures w14:val="standardContextual"/>
             </w:rPr>
           </w:pPr>
-          <w:hyperlink w:anchor="_Toc240675681" w:history="1">
+          <w:hyperlink w:anchor="_Toc240676409" w:history="1">
             <w:r>
               <w:rPr>
                 <w:rStyle w:val="a5"/>
@@ -990,7 +990,7 @@
               <w:rPr>
                 <w:noProof/>
               </w:rPr>
-              <w:instrText xml:space="preserve"> PAGEREF _Toc240675681 \h </w:instrText>
+              <w:instrText xml:space="preserve"> PAGEREF _Toc240676409 \h </w:instrText>
             </w:r>
             <w:r>
               <w:rPr>
@@ -1033,7 +1033,7 @@
               <w14:ligatures w14:val="standardContextual"/>
             </w:rPr>
           </w:pPr>
-          <w:hyperlink w:anchor="_Toc240675682" w:history="1">
+          <w:hyperlink w:anchor="_Toc240676410" w:history="1">
             <w:r>
               <w:rPr>
                 <w:rStyle w:val="a5"/>
@@ -1057,7 +1057,7 @@
               <w:rPr>
                 <w:noProof/>
               </w:rPr>
-              <w:instrText xml:space="preserve"> PAGEREF _Toc240675682 \h </w:instrText>
+              <w:instrText xml:space="preserve"> PAGEREF _Toc240676410 \h </w:instrText>
             </w:r>
             <w:r>
               <w:rPr>
@@ -1100,7 +1100,7 @@
               <w14:ligatures w14:val="standardContextual"/>
             </w:rPr>
           </w:pPr>
-          <w:hyperlink w:anchor="_Toc240675683" w:history="1">
+          <w:hyperlink w:anchor="_Toc240676411" w:history="1">
             <w:r>
               <w:rPr>
                 <w:rStyle w:val="a5"/>
@@ -1124,7 +1124,7 @@
               <w:rPr>
                 <w:noProof/>
               </w:rPr>
-              <w:instrText xml:space="preserve"> PAGEREF _Toc240675683 \h </w:instrText>
+              <w:instrText xml:space="preserve"> PAGEREF _Toc240676411 \h </w:instrText>
             </w:r>
             <w:r>
               <w:rPr>
@@ -1166,7 +1166,7 @@
               <w14:ligatures w14:val="standardContextual"/>
             </w:rPr>
           </w:pPr>
-          <w:hyperlink w:anchor="_Toc240675684" w:history="1">
+          <w:hyperlink w:anchor="_Toc240676412" w:history="1">
             <w:r>
               <w:rPr>
                 <w:rStyle w:val="a5"/>
@@ -1190,7 +1190,7 @@
               <w:rPr>
                 <w:noProof/>
               </w:rPr>
-              <w:instrText xml:space="preserve"> PAGEREF _Toc240675684 \h </w:instrText>
+              <w:instrText xml:space="preserve"> PAGEREF _Toc240676412 \h </w:instrText>
             </w:r>
             <w:r>
               <w:rPr>
@@ -1232,7 +1232,7 @@
               <w14:ligatures w14:val="standardContextual"/>
             </w:rPr>
           </w:pPr>
-          <w:hyperlink w:anchor="_Toc240675685" w:history="1">
+          <w:hyperlink w:anchor="_Toc240676413" w:history="1">
             <w:r>
               <w:rPr>
                 <w:rStyle w:val="a5"/>
@@ -1256,7 +1256,7 @@
               <w:rPr>
                 <w:noProof/>
               </w:rPr>
-              <w:instrText xml:space="preserve"> PAGEREF _Toc240675685 \h </w:instrText>
+              <w:instrText xml:space="preserve"> PAGEREF _Toc240676413 \h </w:instrText>
             </w:r>
             <w:r>
               <w:rPr>
@@ -1299,7 +1299,7 @@
               <w14:ligatures w14:val="standardContextual"/>
             </w:rPr>
           </w:pPr>
-          <w:hyperlink w:anchor="_Toc240675686" w:history="1">
+          <w:hyperlink w:anchor="_Toc240676414" w:history="1">
             <w:r>
               <w:rPr>
                 <w:rStyle w:val="a5"/>
@@ -1323,7 +1323,7 @@
               <w:rPr>
                 <w:noProof/>
               </w:rPr>
-              <w:instrText xml:space="preserve"> PAGEREF _Toc240675686 \h </w:instrText>
+              <w:instrText xml:space="preserve"> PAGEREF _Toc240676414 \h </w:instrText>
             </w:r>
             <w:r>
               <w:rPr>
@@ -1366,7 +1366,7 @@
               <w14:ligatures w14:val="standardContextual"/>
             </w:rPr>
           </w:pPr>
-          <w:hyperlink w:anchor="_Toc240675687" w:history="1">
+          <w:hyperlink w:anchor="_Toc240676415" w:history="1">
             <w:r>
               <w:rPr>
                 <w:rStyle w:val="a5"/>
@@ -1390,7 +1390,7 @@
               <w:rPr>
                 <w:noProof/>
               </w:rPr>
-              <w:instrText xml:space="preserve"> PAGEREF _Toc240675687 \h </w:instrText>
+              <w:instrText xml:space="preserve"> PAGEREF _Toc240676415 \h </w:instrText>
             </w:r>
             <w:r>
               <w:rPr>
@@ -1433,7 +1433,7 @@
               <w14:ligatures w14:val="standardContextual"/>
             </w:rPr>
           </w:pPr>
-          <w:hyperlink w:anchor="_Toc240675688" w:history="1">
+          <w:hyperlink w:anchor="_Toc240676416" w:history="1">
             <w:r>
               <w:rPr>
                 <w:rStyle w:val="a5"/>
@@ -1457,7 +1457,7 @@
               <w:rPr>
                 <w:noProof/>
               </w:rPr>
-              <w:instrText xml:space="preserve"> PAGEREF _Toc240675688 \h </w:instrText>
+              <w:instrText xml:space="preserve"> PAGEREF _Toc240676416 \h </w:instrText>
             </w:r>
             <w:r>
               <w:rPr>
@@ -1500,7 +1500,7 @@
               <w14:ligatures w14:val="standardContextual"/>
             </w:rPr>
           </w:pPr>
-          <w:hyperlink w:anchor="_Toc240675689" w:history="1">
+          <w:hyperlink w:anchor="_Toc240676417" w:history="1">
             <w:r>
               <w:rPr>
                 <w:rStyle w:val="a5"/>
@@ -1524,7 +1524,7 @@
               <w:rPr>
                 <w:noProof/>
               </w:rPr>
-              <w:instrText xml:space="preserve"> PAGEREF _Toc240675689 \h </w:instrText>
+              <w:instrText xml:space="preserve"> PAGEREF _Toc240676417 \h </w:instrText>
             </w:r>
             <w:r>
               <w:rPr>
@@ -1567,7 +1567,7 @@
               <w14:ligatures w14:val="standardContextual"/>
             </w:rPr>
           </w:pPr>
-          <w:hyperlink w:anchor="_Toc240675690" w:history="1">
+          <w:hyperlink w:anchor="_Toc240676418" w:history="1">
             <w:r>
               <w:rPr>
                 <w:rStyle w:val="a5"/>
@@ -1591,7 +1591,7 @@
               <w:rPr>
                 <w:noProof/>
               </w:rPr>
-              <w:instrText xml:space="preserve"> PAGEREF _Toc240675690 \h </w:instrText>
+              <w:instrText xml:space="preserve"> PAGEREF _Toc240676418 \h </w:instrText>
             </w:r>
             <w:r>
               <w:rPr>
@@ -1633,7 +1633,7 @@
               <w14:ligatures w14:val="standardContextual"/>
             </w:rPr>
           </w:pPr>
-          <w:hyperlink w:anchor="_Toc240675691" w:history="1">
+          <w:hyperlink w:anchor="_Toc240676419" w:history="1">
             <w:r>
               <w:rPr>
                 <w:rStyle w:val="a5"/>
@@ -1657,7 +1657,7 @@
               <w:rPr>
                 <w:noProof/>
               </w:rPr>
-              <w:instrText xml:space="preserve"> PAGEREF _Toc240675691 \h </w:instrText>
+              <w:instrText xml:space="preserve"> PAGEREF _Toc240676419 \h </w:instrText>
             </w:r>
             <w:r>
               <w:rPr>
@@ -1700,7 +1700,7 @@
               <w14:ligatures w14:val="standardContextual"/>
             </w:rPr>
           </w:pPr>
-          <w:hyperlink w:anchor="_Toc240675692" w:history="1">
+          <w:hyperlink w:anchor="_Toc240676420" w:history="1">
             <w:r>
               <w:rPr>
                 <w:rStyle w:val="a5"/>
@@ -1724,7 +1724,7 @@
               <w:rPr>
                 <w:noProof/>
               </w:rPr>
-              <w:instrText xml:space="preserve"> PAGEREF _Toc240675692 \h </w:instrText>
+              <w:instrText xml:space="preserve"> PAGEREF _Toc240676420 \h </w:instrText>
             </w:r>
             <w:r>
               <w:rPr>
@@ -1767,7 +1767,7 @@
               <w14:ligatures w14:val="standardContextual"/>
             </w:rPr>
           </w:pPr>
-          <w:hyperlink w:anchor="_Toc240675693" w:history="1">
+          <w:hyperlink w:anchor="_Toc240676421" w:history="1">
             <w:r>
               <w:rPr>
                 <w:rStyle w:val="a5"/>
@@ -1791,7 +1791,7 @@
               <w:rPr>
                 <w:noProof/>
               </w:rPr>
-              <w:instrText xml:space="preserve"> PAGEREF _Toc240675693 \h </w:instrText>
+              <w:instrText xml:space="preserve"> PAGEREF _Toc240676421 \h </w:instrText>
             </w:r>
             <w:r>
               <w:rPr>
@@ -1834,7 +1834,7 @@
               <w14:ligatures w14:val="standardContextual"/>
             </w:rPr>
           </w:pPr>
-          <w:hyperlink w:anchor="_Toc240675694" w:history="1">
+          <w:hyperlink w:anchor="_Toc240676422" w:history="1">
             <w:r>
               <w:rPr>
                 <w:rStyle w:val="a5"/>
@@ -1858,7 +1858,7 @@
               <w:rPr>
                 <w:noProof/>
               </w:rPr>
-              <w:instrText xml:space="preserve"> PAGEREF _Toc240675694 \h </w:instrText>
+              <w:instrText xml:space="preserve"> PAGEREF _Toc240676422 \h </w:instrText>
             </w:r>
             <w:r>
               <w:rPr>
@@ -1901,7 +1901,7 @@
               <w14:ligatures w14:val="standardContextual"/>
             </w:rPr>
           </w:pPr>
-          <w:hyperlink w:anchor="_Toc240675695" w:history="1">
+          <w:hyperlink w:anchor="_Toc240676423" w:history="1">
             <w:r>
               <w:rPr>
                 <w:rStyle w:val="a5"/>
@@ -1925,7 +1925,7 @@
               <w:rPr>
                 <w:noProof/>
               </w:rPr>
-              <w:instrText xml:space="preserve"> PAGEREF _Toc240675695 \h </w:instrText>
+              <w:instrText xml:space="preserve"> PAGEREF _Toc240676423 \h </w:instrText>
             </w:r>
             <w:r>
               <w:rPr>
@@ -1968,7 +1968,7 @@
               <w14:ligatures w14:val="standardContextual"/>
             </w:rPr>
           </w:pPr>
-          <w:hyperlink w:anchor="_Toc240675696" w:history="1">
+          <w:hyperlink w:anchor="_Toc240676424" w:history="1">
             <w:r>
               <w:rPr>
                 <w:rStyle w:val="a5"/>
@@ -1992,7 +1992,7 @@
               <w:rPr>
                 <w:noProof/>
               </w:rPr>
-              <w:instrText xml:space="preserve"> PAGEREF _Toc240675696 \h </w:instrText>
+              <w:instrText xml:space="preserve"> PAGEREF _Toc240676424 \h </w:instrText>
             </w:r>
             <w:r>
               <w:rPr>
@@ -2035,7 +2035,7 @@
               <w14:ligatures w14:val="standardContextual"/>
             </w:rPr>
           </w:pPr>
-          <w:hyperlink w:anchor="_Toc240675697" w:history="1">
+          <w:hyperlink w:anchor="_Toc240676425" w:history="1">
             <w:r>
               <w:rPr>
                 <w:rStyle w:val="a5"/>
@@ -2059,7 +2059,7 @@
               <w:rPr>
                 <w:noProof/>
               </w:rPr>
-              <w:instrText xml:space="preserve"> PAGEREF _Toc240675697 \h </w:instrText>
+              <w:instrText xml:space="preserve"> PAGEREF _Toc240676425 \h </w:instrText>
             </w:r>
             <w:r>
               <w:rPr>
@@ -2101,7 +2101,7 @@
               <w14:ligatures w14:val="standardContextual"/>
             </w:rPr>
           </w:pPr>
-          <w:hyperlink w:anchor="_Toc240675698" w:history="1">
+          <w:hyperlink w:anchor="_Toc240676426" w:history="1">
             <w:r>
               <w:rPr>
                 <w:rStyle w:val="a5"/>
@@ -2125,7 +2125,7 @@
               <w:rPr>
                 <w:noProof/>
               </w:rPr>
-              <w:instrText xml:space="preserve"> PAGEREF _Toc240675698 \h </w:instrText>
+              <w:instrText xml:space="preserve"> PAGEREF _Toc240676426 \h </w:instrText>
             </w:r>
             <w:r>
               <w:rPr>
@@ -2167,7 +2167,7 @@
               <w14:ligatures w14:val="standardContextual"/>
             </w:rPr>
           </w:pPr>
-          <w:hyperlink w:anchor="_Toc240675699" w:history="1">
+          <w:hyperlink w:anchor="_Toc240676427" w:history="1">
             <w:r>
               <w:rPr>
                 <w:rStyle w:val="a5"/>
@@ -2191,7 +2191,7 @@
               <w:rPr>
                 <w:noProof/>
               </w:rPr>
-              <w:instrText xml:space="preserve"> PAGEREF _Toc240675699 \h </w:instrText>
+              <w:instrText xml:space="preserve"> PAGEREF _Toc240676427 \h </w:instrText>
             </w:r>
             <w:r>
               <w:rPr>
@@ -2234,7 +2234,7 @@
               <w14:ligatures w14:val="standardContextual"/>
             </w:rPr>
           </w:pPr>
-          <w:hyperlink w:anchor="_Toc240675700" w:history="1">
+          <w:hyperlink w:anchor="_Toc240676428" w:history="1">
             <w:r>
               <w:rPr>
                 <w:rStyle w:val="a5"/>
@@ -2258,7 +2258,7 @@
               <w:rPr>
                 <w:noProof/>
               </w:rPr>
-              <w:instrText xml:space="preserve"> PAGEREF _Toc240675700 \h </w:instrText>
+              <w:instrText xml:space="preserve"> PAGEREF _Toc240676428 \h </w:instrText>
             </w:r>
             <w:r>
               <w:rPr>
@@ -2300,7 +2300,7 @@
               <w14:ligatures w14:val="standardContextual"/>
             </w:rPr>
           </w:pPr>
-          <w:hyperlink w:anchor="_Toc240675701" w:history="1">
+          <w:hyperlink w:anchor="_Toc240676429" w:history="1">
             <w:r>
               <w:rPr>
                 <w:rStyle w:val="a5"/>
@@ -2324,7 +2324,7 @@
               <w:rPr>
                 <w:noProof/>
               </w:rPr>
-              <w:instrText xml:space="preserve"> PAGEREF _Toc240675701 \h </w:instrText>
+              <w:instrText xml:space="preserve"> PAGEREF _Toc240676429 \h </w:instrText>
             </w:r>
             <w:r>
               <w:rPr>
@@ -2367,7 +2367,7 @@
               <w14:ligatures w14:val="standardContextual"/>
             </w:rPr>
           </w:pPr>
-          <w:hyperlink w:anchor="_Toc240675702" w:history="1">
+          <w:hyperlink w:anchor="_Toc240676430" w:history="1">
             <w:r>
               <w:rPr>
                 <w:rStyle w:val="a5"/>
@@ -2391,7 +2391,7 @@
               <w:rPr>
                 <w:noProof/>
               </w:rPr>
-              <w:instrText xml:space="preserve"> PAGEREF _Toc240675702 \h </w:instrText>
+              <w:instrText xml:space="preserve"> PAGEREF _Toc240676430 \h </w:instrText>
             </w:r>
             <w:r>
               <w:rPr>
@@ -2434,7 +2434,7 @@
               <w14:ligatures w14:val="standardContextual"/>
             </w:rPr>
           </w:pPr>
-          <w:hyperlink w:anchor="_Toc240675703" w:history="1">
+          <w:hyperlink w:anchor="_Toc240676431" w:history="1">
             <w:r>
               <w:rPr>
                 <w:rStyle w:val="a5"/>
@@ -2458,7 +2458,7 @@
               <w:rPr>
                 <w:noProof/>
               </w:rPr>
-              <w:instrText xml:space="preserve"> PAGEREF _Toc240675703 \h </w:instrText>
+              <w:instrText xml:space="preserve"> PAGEREF _Toc240676431 \h </w:instrText>
             </w:r>
             <w:r>
               <w:rPr>
@@ -2501,7 +2501,7 @@
               <w14:ligatures w14:val="standardContextual"/>
             </w:rPr>
           </w:pPr>
-          <w:hyperlink w:anchor="_Toc240675704" w:history="1">
+          <w:hyperlink w:anchor="_Toc240676432" w:history="1">
             <w:r>
               <w:rPr>
                 <w:rStyle w:val="a5"/>
@@ -2525,7 +2525,7 @@
               <w:rPr>
                 <w:noProof/>
               </w:rPr>
-              <w:instrText xml:space="preserve"> PAGEREF _Toc240675704 \h </w:instrText>
+              <w:instrText xml:space="preserve"> PAGEREF _Toc240676432 \h </w:instrText>
             </w:r>
             <w:r>
               <w:rPr>
@@ -2567,7 +2567,7 @@
               <w14:ligatures w14:val="standardContextual"/>
             </w:rPr>
           </w:pPr>
-          <w:hyperlink w:anchor="_Toc240675705" w:history="1">
+          <w:hyperlink w:anchor="_Toc240676433" w:history="1">
             <w:r>
               <w:rPr>
                 <w:rStyle w:val="a5"/>
@@ -2591,7 +2591,7 @@
               <w:rPr>
                 <w:noProof/>
               </w:rPr>
-              <w:instrText xml:space="preserve"> PAGEREF _Toc240675705 \h </w:instrText>
+              <w:instrText xml:space="preserve"> PAGEREF _Toc240676433 \h </w:instrText>
             </w:r>
             <w:r>
               <w:rPr>
@@ -2634,7 +2634,7 @@
               <w14:ligatures w14:val="standardContextual"/>
             </w:rPr>
           </w:pPr>
-          <w:hyperlink w:anchor="_Toc240675706" w:history="1">
+          <w:hyperlink w:anchor="_Toc240676434" w:history="1">
             <w:r>
               <w:rPr>
                 <w:rStyle w:val="a5"/>
@@ -2658,7 +2658,7 @@
               <w:rPr>
                 <w:noProof/>
               </w:rPr>
-              <w:instrText xml:space="preserve"> PAGEREF _Toc240675706 \h </w:instrText>
+              <w:instrText xml:space="preserve"> PAGEREF _Toc240676434 \h </w:instrText>
             </w:r>
             <w:r>
               <w:rPr>
@@ -2701,7 +2701,7 @@
               <w14:ligatures w14:val="standardContextual"/>
             </w:rPr>
           </w:pPr>
-          <w:hyperlink w:anchor="_Toc240675707" w:history="1">
+          <w:hyperlink w:anchor="_Toc240676435" w:history="1">
             <w:r>
               <w:rPr>
                 <w:rStyle w:val="a5"/>
@@ -2725,7 +2725,7 @@
               <w:rPr>
                 <w:noProof/>
               </w:rPr>
-              <w:instrText xml:space="preserve"> PAGEREF _Toc240675707 \h </w:instrText>
+              <w:instrText xml:space="preserve"> PAGEREF _Toc240676435 \h </w:instrText>
             </w:r>
             <w:r>
               <w:rPr>
@@ -2767,7 +2767,7 @@
               <w14:ligatures w14:val="standardContextual"/>
             </w:rPr>
           </w:pPr>
-          <w:hyperlink w:anchor="_Toc240675708" w:history="1">
+          <w:hyperlink w:anchor="_Toc240676436" w:history="1">
             <w:r>
               <w:rPr>
                 <w:rStyle w:val="a5"/>
@@ -2791,7 +2791,7 @@
               <w:rPr>
                 <w:noProof/>
               </w:rPr>
-              <w:instrText xml:space="preserve"> PAGEREF _Toc240675708 \h </w:instrText>
+              <w:instrText xml:space="preserve"> PAGEREF _Toc240676436 \h </w:instrText>
             </w:r>
             <w:r>
               <w:rPr>
@@ -2833,7 +2833,7 @@
               <w14:ligatures w14:val="standardContextual"/>
             </w:rPr>
           </w:pPr>
-          <w:hyperlink w:anchor="_Toc240675709" w:history="1">
+          <w:hyperlink w:anchor="_Toc240676437" w:history="1">
             <w:r>
               <w:rPr>
                 <w:rStyle w:val="a5"/>
@@ -2857,7 +2857,7 @@
               <w:rPr>
                 <w:noProof/>
               </w:rPr>
-              <w:instrText xml:space="preserve"> PAGEREF _Toc240675709 \h </w:instrText>
+              <w:instrText xml:space="preserve"> PAGEREF _Toc240676437 \h </w:instrText>
             </w:r>
             <w:r>
               <w:rPr>
@@ -2900,7 +2900,7 @@
               <w14:ligatures w14:val="standardContextual"/>
             </w:rPr>
           </w:pPr>
-          <w:hyperlink w:anchor="_Toc240675710" w:history="1">
+          <w:hyperlink w:anchor="_Toc240676438" w:history="1">
             <w:r>
               <w:rPr>
                 <w:rStyle w:val="a5"/>
@@ -2924,7 +2924,7 @@
               <w:rPr>
                 <w:noProof/>
               </w:rPr>
-              <w:instrText xml:space="preserve"> PAGEREF _Toc240675710 \h </w:instrText>
+              <w:instrText xml:space="preserve"> PAGEREF _Toc240676438 \h </w:instrText>
             </w:r>
             <w:r>
               <w:rPr>
@@ -2967,7 +2967,7 @@
               <w14:ligatures w14:val="standardContextual"/>
             </w:rPr>
           </w:pPr>
-          <w:hyperlink w:anchor="_Toc240675711" w:history="1">
+          <w:hyperlink w:anchor="_Toc240676439" w:history="1">
             <w:r>
               <w:rPr>
                 <w:rStyle w:val="a5"/>
@@ -2991,7 +2991,7 @@
               <w:rPr>
                 <w:noProof/>
               </w:rPr>
-              <w:instrText xml:space="preserve"> PAGEREF _Toc240675711 \h </w:instrText>
+              <w:instrText xml:space="preserve"> PAGEREF _Toc240676439 \h </w:instrText>
             </w:r>
             <w:r>
               <w:rPr>
@@ -3034,7 +3034,7 @@
               <w14:ligatures w14:val="standardContextual"/>
             </w:rPr>
           </w:pPr>
-          <w:hyperlink w:anchor="_Toc240675712" w:history="1">
+          <w:hyperlink w:anchor="_Toc240676440" w:history="1">
             <w:r>
               <w:rPr>
                 <w:rStyle w:val="a5"/>
@@ -3058,7 +3058,7 @@
               <w:rPr>
                 <w:noProof/>
               </w:rPr>
-              <w:instrText xml:space="preserve"> PAGEREF _Toc240675712 \h </w:instrText>
+              <w:instrText xml:space="preserve"> PAGEREF _Toc240676440 \h </w:instrText>
             </w:r>
             <w:r>
               <w:rPr>
@@ -3101,7 +3101,7 @@
               <w14:ligatures w14:val="standardContextual"/>
             </w:rPr>
           </w:pPr>
-          <w:hyperlink w:anchor="_Toc240675713" w:history="1">
+          <w:hyperlink w:anchor="_Toc240676441" w:history="1">
             <w:r>
               <w:rPr>
                 <w:rStyle w:val="a5"/>
@@ -3125,7 +3125,7 @@
               <w:rPr>
                 <w:noProof/>
               </w:rPr>
-              <w:instrText xml:space="preserve"> PAGEREF _Toc240675713 \h </w:instrText>
+              <w:instrText xml:space="preserve"> PAGEREF _Toc240676441 \h </w:instrText>
             </w:r>
             <w:r>
               <w:rPr>
@@ -3167,7 +3167,7 @@
               <w14:ligatures w14:val="standardContextual"/>
             </w:rPr>
           </w:pPr>
-          <w:hyperlink w:anchor="_Toc240675714" w:history="1">
+          <w:hyperlink w:anchor="_Toc240676442" w:history="1">
             <w:r>
               <w:rPr>
                 <w:rStyle w:val="a5"/>
@@ -3191,7 +3191,7 @@
               <w:rPr>
                 <w:noProof/>
               </w:rPr>
-              <w:instrText xml:space="preserve"> PAGEREF _Toc240675714 \h </w:instrText>
+              <w:instrText xml:space="preserve"> PAGEREF _Toc240676442 \h </w:instrText>
             </w:r>
             <w:r>
               <w:rPr>
@@ -3233,7 +3233,7 @@
               <w14:ligatures w14:val="standardContextual"/>
             </w:rPr>
           </w:pPr>
-          <w:hyperlink w:anchor="_Toc240675715" w:history="1">
+          <w:hyperlink w:anchor="_Toc240676443" w:history="1">
             <w:r>
               <w:rPr>
                 <w:rStyle w:val="a5"/>
@@ -3257,7 +3257,7 @@
               <w:rPr>
                 <w:noProof/>
               </w:rPr>
-              <w:instrText xml:space="preserve"> PAGEREF _Toc240675715 \h </w:instrText>
+              <w:instrText xml:space="preserve"> PAGEREF _Toc240676443 \h </w:instrText>
             </w:r>
             <w:r>
               <w:rPr>
@@ -3299,7 +3299,7 @@
               <w14:ligatures w14:val="standardContextual"/>
             </w:rPr>
           </w:pPr>
-          <w:hyperlink w:anchor="_Toc240675716" w:history="1">
+          <w:hyperlink w:anchor="_Toc240676444" w:history="1">
             <w:r>
               <w:rPr>
                 <w:rStyle w:val="a5"/>
@@ -3323,7 +3323,7 @@
               <w:rPr>
                 <w:noProof/>
               </w:rPr>
-              <w:instrText xml:space="preserve"> PAGEREF _Toc240675716 \h </w:instrText>
+              <w:instrText xml:space="preserve"> PAGEREF _Toc240676444 \h </w:instrText>
             </w:r>
             <w:r>
               <w:rPr>
@@ -3365,7 +3365,7 @@
               <w14:ligatures w14:val="standardContextual"/>
             </w:rPr>
           </w:pPr>
-          <w:hyperlink w:anchor="_Toc240675717" w:history="1">
+          <w:hyperlink w:anchor="_Toc240676445" w:history="1">
             <w:r>
               <w:rPr>
                 <w:rStyle w:val="a5"/>
@@ -3389,7 +3389,7 @@
               <w:rPr>
                 <w:noProof/>
               </w:rPr>
-              <w:instrText xml:space="preserve"> PAGEREF _Toc240675717 \h </w:instrText>
+              <w:instrText xml:space="preserve"> PAGEREF _Toc240676445 \h </w:instrText>
             </w:r>
             <w:r>
               <w:rPr>
@@ -3432,7 +3432,7 @@
               <w14:ligatures w14:val="standardContextual"/>
             </w:rPr>
           </w:pPr>
-          <w:hyperlink w:anchor="_Toc240675718" w:history="1">
+          <w:hyperlink w:anchor="_Toc240676446" w:history="1">
             <w:r>
               <w:rPr>
                 <w:rStyle w:val="a5"/>
@@ -3456,7 +3456,7 @@
               <w:rPr>
                 <w:noProof/>
               </w:rPr>
-              <w:instrText xml:space="preserve"> PAGEREF _Toc240675718 \h </w:instrText>
+              <w:instrText xml:space="preserve"> PAGEREF _Toc240676446 \h </w:instrText>
             </w:r>
             <w:r>
               <w:rPr>
@@ -3499,7 +3499,7 @@
               <w14:ligatures w14:val="standardContextual"/>
             </w:rPr>
           </w:pPr>
-          <w:hyperlink w:anchor="_Toc240675719" w:history="1">
+          <w:hyperlink w:anchor="_Toc240676447" w:history="1">
             <w:r>
               <w:rPr>
                 <w:rStyle w:val="a5"/>
@@ -3523,7 +3523,7 @@
               <w:rPr>
                 <w:noProof/>
               </w:rPr>
-              <w:instrText xml:space="preserve"> PAGEREF _Toc240675719 \h </w:instrText>
+              <w:instrText xml:space="preserve"> PAGEREF _Toc240676447 \h </w:instrText>
             </w:r>
             <w:r>
               <w:rPr>
@@ -3566,7 +3566,7 @@
               <w14:ligatures w14:val="standardContextual"/>
             </w:rPr>
           </w:pPr>
-          <w:hyperlink w:anchor="_Toc240675720" w:history="1">
+          <w:hyperlink w:anchor="_Toc240676448" w:history="1">
             <w:r>
               <w:rPr>
                 <w:rStyle w:val="a5"/>
@@ -3590,7 +3590,7 @@
               <w:rPr>
                 <w:noProof/>
               </w:rPr>
-              <w:instrText xml:space="preserve"> PAGEREF _Toc240675720 \h </w:instrText>
+              <w:instrText xml:space="preserve"> PAGEREF _Toc240676448 \h </w:instrText>
             </w:r>
             <w:r>
               <w:rPr>
@@ -3633,7 +3633,7 @@
               <w14:ligatures w14:val="standardContextual"/>
             </w:rPr>
           </w:pPr>
-          <w:hyperlink w:anchor="_Toc240675721" w:history="1">
+          <w:hyperlink w:anchor="_Toc240676449" w:history="1">
             <w:r>
               <w:rPr>
                 <w:rStyle w:val="a5"/>
@@ -3657,7 +3657,7 @@
               <w:rPr>
                 <w:noProof/>
               </w:rPr>
-              <w:instrText xml:space="preserve"> PAGEREF _Toc240675721 \h </w:instrText>
+              <w:instrText xml:space="preserve"> PAGEREF _Toc240676449 \h </w:instrText>
             </w:r>
             <w:r>
               <w:rPr>
@@ -3700,7 +3700,7 @@
               <w14:ligatures w14:val="standardContextual"/>
             </w:rPr>
           </w:pPr>
-          <w:hyperlink w:anchor="_Toc240675722" w:history="1">
+          <w:hyperlink w:anchor="_Toc240676450" w:history="1">
             <w:r>
               <w:rPr>
                 <w:rStyle w:val="a5"/>
@@ -3724,7 +3724,7 @@
               <w:rPr>
                 <w:noProof/>
               </w:rPr>
-              <w:instrText xml:space="preserve"> PAGEREF _Toc240675722 \h </w:instrText>
+              <w:instrText xml:space="preserve"> PAGEREF _Toc240676450 \h </w:instrText>
             </w:r>
             <w:r>
               <w:rPr>
@@ -3763,7 +3763,7 @@
         <w:pStyle w:val="1"/>
         <w:pageBreakBefore/>
       </w:pPr>
-      <w:bookmarkStart w:id="0" w:name="_Toc240675675"/>
+      <w:bookmarkStart w:id="0" w:name="_Toc240676403"/>
       <w:r>
         <w:lastRenderedPageBreak/>
         <w:t xml:space="preserve">1. </w:t>
@@ -3777,7 +3777,7 @@
       <w:pPr>
         <w:pStyle w:val="2"/>
       </w:pPr>
-      <w:bookmarkStart w:id="1" w:name="_Toc240675676"/>
+      <w:bookmarkStart w:id="1" w:name="_Toc240676404"/>
       <w:r>
         <w:t>1.1 RuninqVic</w:t>
       </w:r>
@@ -4187,7 +4187,7 @@
       <w:pPr>
         <w:pStyle w:val="2"/>
       </w:pPr>
-      <w:bookmarkStart w:id="2" w:name="_Toc240675677"/>
+      <w:bookmarkStart w:id="2" w:name="_Toc240676405"/>
       <w:r>
         <w:t xml:space="preserve">1.2 </w:t>
       </w:r>
@@ -7452,7 +7452,7 @@
       <w:pPr>
         <w:pStyle w:val="2"/>
       </w:pPr>
-      <w:bookmarkStart w:id="3" w:name="_Toc240675678"/>
+      <w:bookmarkStart w:id="3" w:name="_Toc240676406"/>
       <w:r>
         <w:t xml:space="preserve">1.3 </w:t>
       </w:r>
@@ -7684,7 +7684,7 @@
         <w:pStyle w:val="1"/>
         <w:pageBreakBefore/>
       </w:pPr>
-      <w:bookmarkStart w:id="4" w:name="_Toc240675679"/>
+      <w:bookmarkStart w:id="4" w:name="_Toc240676407"/>
       <w:r>
         <w:lastRenderedPageBreak/>
         <w:t xml:space="preserve">2. </w:t>
@@ -7698,7 +7698,7 @@
       <w:pPr>
         <w:pStyle w:val="2"/>
       </w:pPr>
-      <w:bookmarkStart w:id="5" w:name="_Toc240675680"/>
+      <w:bookmarkStart w:id="5" w:name="_Toc240676408"/>
       <w:r>
         <w:t xml:space="preserve">2.1 </w:t>
       </w:r>
@@ -8676,7 +8676,7 @@
       <w:pPr>
         <w:pStyle w:val="2"/>
       </w:pPr>
-      <w:bookmarkStart w:id="6" w:name="_Toc240675681"/>
+      <w:bookmarkStart w:id="6" w:name="_Toc240676409"/>
       <w:r>
         <w:t xml:space="preserve">2.2 </w:t>
       </w:r>
@@ -9030,10 +9030,10 @@
         </w:rPr>
         <w:lastRenderedPageBreak/>
         <w:drawing>
-          <wp:inline distT="0" distB="0" distL="0" distR="0" wp14:anchorId="4DEC0356" wp14:editId="7248D55A">
+          <wp:inline distT="0" distB="0" distL="0" distR="0" wp14:anchorId="1A38882C" wp14:editId="05CCAEBE">
             <wp:extent cx="5943600" cy="3638550"/>
             <wp:effectExtent l="0" t="0" r="0" b="0"/>
-            <wp:docPr id="1627114032" name="그림 1627114032"/>
+            <wp:docPr id="1573582282" name="그림 1573582282"/>
             <wp:cNvGraphicFramePr>
               <a:graphicFrameLocks xmlns:a="http://schemas.openxmlformats.org/drawingml/2006/main" noChangeAspect="1"/>
             </wp:cNvGraphicFramePr>
@@ -9149,7 +9149,7 @@
       <w:pPr>
         <w:pStyle w:val="2"/>
       </w:pPr>
-      <w:bookmarkStart w:id="7" w:name="_Toc240675682"/>
+      <w:bookmarkStart w:id="7" w:name="_Toc240676410"/>
       <w:r>
         <w:t xml:space="preserve">2.3 </w:t>
       </w:r>
@@ -9174,10 +9174,10 @@
           <w:noProof/>
         </w:rPr>
         <w:drawing>
-          <wp:inline distT="0" distB="0" distL="0" distR="0" wp14:anchorId="6F2DD91A" wp14:editId="4CEE9A94">
+          <wp:inline distT="0" distB="0" distL="0" distR="0" wp14:anchorId="18586FB0" wp14:editId="13C1836A">
             <wp:extent cx="5943600" cy="3638550"/>
             <wp:effectExtent l="0" t="0" r="0" b="0"/>
-            <wp:docPr id="1393095884" name="그림 1393095884"/>
+            <wp:docPr id="618026189" name="그림 618026189"/>
             <wp:cNvGraphicFramePr>
               <a:graphicFrameLocks xmlns:a="http://schemas.openxmlformats.org/drawingml/2006/main" noChangeAspect="1"/>
             </wp:cNvGraphicFramePr>
@@ -10607,7 +10607,7 @@
       <w:pPr>
         <w:pStyle w:val="2"/>
       </w:pPr>
-      <w:bookmarkStart w:id="8" w:name="_Toc240675683"/>
+      <w:bookmarkStart w:id="8" w:name="_Toc240676411"/>
       <w:r>
         <w:t xml:space="preserve">2.4 </w:t>
       </w:r>
@@ -10633,10 +10633,10 @@
         </w:rPr>
         <w:lastRenderedPageBreak/>
         <w:drawing>
-          <wp:inline distT="0" distB="0" distL="0" distR="0" wp14:anchorId="78ACFB66" wp14:editId="1F357DE1">
+          <wp:inline distT="0" distB="0" distL="0" distR="0" wp14:anchorId="01DB3022" wp14:editId="50D24BC9">
             <wp:extent cx="5943600" cy="12858750"/>
             <wp:effectExtent l="0" t="0" r="0" b="0"/>
-            <wp:docPr id="543941858" name="그림 543941858"/>
+            <wp:docPr id="1698734778" name="그림 1698734778"/>
             <wp:cNvGraphicFramePr>
               <a:graphicFrameLocks xmlns:a="http://schemas.openxmlformats.org/drawingml/2006/main" noChangeAspect="1"/>
             </wp:cNvGraphicFramePr>
@@ -15460,10 +15460,10 @@
         </w:rPr>
         <w:lastRenderedPageBreak/>
         <w:drawing>
-          <wp:inline distT="0" distB="0" distL="0" distR="0" wp14:anchorId="622AE419" wp14:editId="227D783D">
+          <wp:inline distT="0" distB="0" distL="0" distR="0" wp14:anchorId="2EB24A25" wp14:editId="08D33C0B">
             <wp:extent cx="5943600" cy="12858750"/>
             <wp:effectExtent l="0" t="0" r="0" b="0"/>
-            <wp:docPr id="1156650834" name="그림 1156650834"/>
+            <wp:docPr id="738598875" name="그림 738598875"/>
             <wp:cNvGraphicFramePr>
               <a:graphicFrameLocks xmlns:a="http://schemas.openxmlformats.org/drawingml/2006/main" noChangeAspect="1"/>
             </wp:cNvGraphicFramePr>
@@ -15691,7 +15691,7 @@
         <w:pStyle w:val="1"/>
         <w:pageBreakBefore/>
       </w:pPr>
-      <w:bookmarkStart w:id="9" w:name="_Toc240675684"/>
+      <w:bookmarkStart w:id="9" w:name="_Toc240676412"/>
       <w:r>
         <w:lastRenderedPageBreak/>
         <w:t>3. 5</w:t>
@@ -16395,7 +16395,7 @@
         <w:pStyle w:val="1"/>
         <w:pageBreakBefore/>
       </w:pPr>
-      <w:bookmarkStart w:id="10" w:name="_Toc240675685"/>
+      <w:bookmarkStart w:id="10" w:name="_Toc240676413"/>
       <w:r>
         <w:lastRenderedPageBreak/>
         <w:t xml:space="preserve">4. </w:t>
@@ -16474,7 +16474,7 @@
       <w:pPr>
         <w:pStyle w:val="2"/>
       </w:pPr>
-      <w:bookmarkStart w:id="11" w:name="_Toc240675686"/>
+      <w:bookmarkStart w:id="11" w:name="_Toc240676414"/>
       <w:r>
         <w:t xml:space="preserve">4.1 ① </w:t>
       </w:r>
@@ -17196,7 +17196,7 @@
       <w:pPr>
         <w:pStyle w:val="2"/>
       </w:pPr>
-      <w:bookmarkStart w:id="12" w:name="_Toc240675687"/>
+      <w:bookmarkStart w:id="12" w:name="_Toc240676415"/>
       <w:r>
         <w:t xml:space="preserve">4.2 ② </w:t>
       </w:r>
@@ -17768,7 +17768,7 @@
       <w:pPr>
         <w:pStyle w:val="2"/>
       </w:pPr>
-      <w:bookmarkStart w:id="13" w:name="_Toc240675688"/>
+      <w:bookmarkStart w:id="13" w:name="_Toc240676416"/>
       <w:r>
         <w:t xml:space="preserve">4.2.1 </w:t>
       </w:r>
@@ -17806,10 +17806,10 @@
         </w:rPr>
         <w:lastRenderedPageBreak/>
         <w:drawing>
-          <wp:inline distT="0" distB="0" distL="0" distR="0" wp14:anchorId="427A77E1" wp14:editId="6F55C3A9">
+          <wp:inline distT="0" distB="0" distL="0" distR="0" wp14:anchorId="2AB33A3B" wp14:editId="38CDA0CE">
             <wp:extent cx="5943600" cy="3638550"/>
             <wp:effectExtent l="0" t="0" r="0" b="0"/>
-            <wp:docPr id="929611402" name="그림 929611402"/>
+            <wp:docPr id="1372296469" name="그림 1372296469"/>
             <wp:cNvGraphicFramePr>
               <a:graphicFrameLocks xmlns:a="http://schemas.openxmlformats.org/drawingml/2006/main" noChangeAspect="1"/>
             </wp:cNvGraphicFramePr>
@@ -22734,7 +22734,7 @@
       <w:pPr>
         <w:pStyle w:val="2"/>
       </w:pPr>
-      <w:bookmarkStart w:id="14" w:name="_Toc240675689"/>
+      <w:bookmarkStart w:id="14" w:name="_Toc240676417"/>
       <w:r>
         <w:t xml:space="preserve">4.3 ③ </w:t>
       </w:r>
@@ -24344,7 +24344,7 @@
       <w:pPr>
         <w:pStyle w:val="2"/>
       </w:pPr>
-      <w:bookmarkStart w:id="15" w:name="_Toc240675690"/>
+      <w:bookmarkStart w:id="15" w:name="_Toc240676418"/>
       <w:r>
         <w:t xml:space="preserve">4.4 ④ </w:t>
       </w:r>
@@ -24851,7 +24851,7 @@
         <w:pStyle w:val="1"/>
         <w:pageBreakBefore/>
       </w:pPr>
-      <w:bookmarkStart w:id="16" w:name="_Toc240675691"/>
+      <w:bookmarkStart w:id="16" w:name="_Toc240676419"/>
       <w:r>
         <w:lastRenderedPageBreak/>
         <w:t xml:space="preserve">5. </w:t>
@@ -24877,7 +24877,7 @@
       <w:pPr>
         <w:pStyle w:val="2"/>
       </w:pPr>
-      <w:bookmarkStart w:id="17" w:name="_Toc240675692"/>
+      <w:bookmarkStart w:id="17" w:name="_Toc240676420"/>
       <w:r>
         <w:t xml:space="preserve">5.1 </w:t>
       </w:r>
@@ -25186,7 +25186,7 @@
       <w:pPr>
         <w:pStyle w:val="2"/>
       </w:pPr>
-      <w:bookmarkStart w:id="18" w:name="_Toc240675693"/>
+      <w:bookmarkStart w:id="18" w:name="_Toc240676421"/>
       <w:r>
         <w:t xml:space="preserve">5.2 </w:t>
       </w:r>
@@ -25715,7 +25715,7 @@
       <w:pPr>
         <w:pStyle w:val="2"/>
       </w:pPr>
-      <w:bookmarkStart w:id="19" w:name="_Toc240675694"/>
+      <w:bookmarkStart w:id="19" w:name="_Toc240676422"/>
       <w:r>
         <w:t xml:space="preserve">5.3 </w:t>
       </w:r>
@@ -25986,7 +25986,7 @@
       <w:pPr>
         <w:pStyle w:val="2"/>
       </w:pPr>
-      <w:bookmarkStart w:id="20" w:name="_Toc240675695"/>
+      <w:bookmarkStart w:id="20" w:name="_Toc240676423"/>
       <w:r>
         <w:t xml:space="preserve">5.4 </w:t>
       </w:r>
@@ -26196,7 +26196,7 @@
       <w:pPr>
         <w:pStyle w:val="2"/>
       </w:pPr>
-      <w:bookmarkStart w:id="21" w:name="_Toc240675696"/>
+      <w:bookmarkStart w:id="21" w:name="_Toc240676424"/>
       <w:r>
         <w:t xml:space="preserve">5.5 </w:t>
       </w:r>
@@ -26419,7 +26419,7 @@
       <w:pPr>
         <w:pStyle w:val="2"/>
       </w:pPr>
-      <w:bookmarkStart w:id="22" w:name="_Toc240675697"/>
+      <w:bookmarkStart w:id="22" w:name="_Toc240676425"/>
       <w:r>
         <w:t xml:space="preserve">5.6 </w:t>
       </w:r>
@@ -26540,7 +26540,7 @@
         <w:pStyle w:val="1"/>
         <w:pageBreakBefore/>
       </w:pPr>
-      <w:bookmarkStart w:id="23" w:name="_Toc240675698"/>
+      <w:bookmarkStart w:id="23" w:name="_Toc240676426"/>
       <w:r>
         <w:lastRenderedPageBreak/>
         <w:t xml:space="preserve">6. </w:t>
@@ -28389,7 +28389,7 @@
         <w:pStyle w:val="1"/>
         <w:pageBreakBefore/>
       </w:pPr>
-      <w:bookmarkStart w:id="24" w:name="_Toc240675699"/>
+      <w:bookmarkStart w:id="24" w:name="_Toc240676427"/>
       <w:r>
         <w:lastRenderedPageBreak/>
         <w:t xml:space="preserve">7. </w:t>
@@ -28409,10 +28409,10 @@
           <w:noProof/>
         </w:rPr>
         <w:drawing>
-          <wp:inline distT="0" distB="0" distL="0" distR="0" wp14:anchorId="48400AD4" wp14:editId="5BEC3829">
+          <wp:inline distT="0" distB="0" distL="0" distR="0" wp14:anchorId="439EE197" wp14:editId="41414721">
             <wp:extent cx="5943600" cy="3638550"/>
             <wp:effectExtent l="0" t="0" r="0" b="0"/>
-            <wp:docPr id="153927188" name="그림 153927188"/>
+            <wp:docPr id="1843570969" name="그림 1843570969"/>
             <wp:cNvGraphicFramePr>
               <a:graphicFrameLocks xmlns:a="http://schemas.openxmlformats.org/drawingml/2006/main" noChangeAspect="1"/>
             </wp:cNvGraphicFramePr>
@@ -31218,7 +31218,7 @@
       <w:pPr>
         <w:pStyle w:val="2"/>
       </w:pPr>
-      <w:bookmarkStart w:id="25" w:name="_Toc240675700"/>
+      <w:bookmarkStart w:id="25" w:name="_Toc240676428"/>
       <w:r>
         <w:t xml:space="preserve">7.1 </w:t>
       </w:r>
@@ -31249,10 +31249,10 @@
           <w:noProof/>
         </w:rPr>
         <w:drawing>
-          <wp:inline distT="0" distB="0" distL="0" distR="0" wp14:anchorId="1033723C" wp14:editId="20B22C82">
+          <wp:inline distT="0" distB="0" distL="0" distR="0" wp14:anchorId="00529EB3" wp14:editId="7C9EE71B">
             <wp:extent cx="5943600" cy="3638550"/>
             <wp:effectExtent l="0" t="0" r="0" b="0"/>
-            <wp:docPr id="351554939" name="그림 351554939"/>
+            <wp:docPr id="1146758274" name="그림 1146758274"/>
             <wp:cNvGraphicFramePr>
               <a:graphicFrameLocks xmlns:a="http://schemas.openxmlformats.org/drawingml/2006/main" noChangeAspect="1"/>
             </wp:cNvGraphicFramePr>
@@ -34901,7 +34901,7 @@
         <w:pStyle w:val="1"/>
         <w:pageBreakBefore/>
       </w:pPr>
-      <w:bookmarkStart w:id="26" w:name="_Toc240675701"/>
+      <w:bookmarkStart w:id="26" w:name="_Toc240676429"/>
       <w:r>
         <w:lastRenderedPageBreak/>
         <w:t xml:space="preserve">8. </w:t>
@@ -34921,10 +34921,10 @@
           <w:noProof/>
         </w:rPr>
         <w:drawing>
-          <wp:inline distT="0" distB="0" distL="0" distR="0" wp14:anchorId="6E62405B" wp14:editId="4A4BC7B0">
+          <wp:inline distT="0" distB="0" distL="0" distR="0" wp14:anchorId="7714EBD8" wp14:editId="78A8C16A">
             <wp:extent cx="5943600" cy="3638550"/>
             <wp:effectExtent l="0" t="0" r="0" b="0"/>
-            <wp:docPr id="256382370" name="그림 256382370"/>
+            <wp:docPr id="1586455060" name="그림 1586455060"/>
             <wp:cNvGraphicFramePr>
               <a:graphicFrameLocks xmlns:a="http://schemas.openxmlformats.org/drawingml/2006/main" noChangeAspect="1"/>
             </wp:cNvGraphicFramePr>
@@ -35020,7 +35020,7 @@
       <w:pPr>
         <w:pStyle w:val="2"/>
       </w:pPr>
-      <w:bookmarkStart w:id="27" w:name="_Toc240675702"/>
+      <w:bookmarkStart w:id="27" w:name="_Toc240676430"/>
       <w:r>
         <w:t xml:space="preserve">8.1 </w:t>
       </w:r>
@@ -36108,7 +36108,7 @@
       <w:pPr>
         <w:pStyle w:val="2"/>
       </w:pPr>
-      <w:bookmarkStart w:id="28" w:name="_Toc240675703"/>
+      <w:bookmarkStart w:id="28" w:name="_Toc240676431"/>
       <w:r>
         <w:t xml:space="preserve">8.2 </w:t>
       </w:r>
@@ -37361,7 +37361,7 @@
       <w:pPr>
         <w:pStyle w:val="2"/>
       </w:pPr>
-      <w:bookmarkStart w:id="29" w:name="_Toc240675704"/>
+      <w:bookmarkStart w:id="29" w:name="_Toc240676432"/>
       <w:r>
         <w:t xml:space="preserve">8.3 </w:t>
       </w:r>
@@ -37614,7 +37614,7 @@
         <w:pStyle w:val="1"/>
         <w:pageBreakBefore/>
       </w:pPr>
-      <w:bookmarkStart w:id="30" w:name="_Toc240675705"/>
+      <w:bookmarkStart w:id="30" w:name="_Toc240676433"/>
       <w:r>
         <w:lastRenderedPageBreak/>
         <w:t xml:space="preserve">9. </w:t>
@@ -37634,10 +37634,10 @@
           <w:noProof/>
         </w:rPr>
         <w:drawing>
-          <wp:inline distT="0" distB="0" distL="0" distR="0" wp14:anchorId="583882AD" wp14:editId="0AFA1B97">
+          <wp:inline distT="0" distB="0" distL="0" distR="0" wp14:anchorId="7D10FAC3" wp14:editId="0F710367">
             <wp:extent cx="5943600" cy="3638550"/>
             <wp:effectExtent l="0" t="0" r="0" b="0"/>
-            <wp:docPr id="73941306" name="그림 73941306"/>
+            <wp:docPr id="1461991962" name="그림 1461991962"/>
             <wp:cNvGraphicFramePr>
               <a:graphicFrameLocks xmlns:a="http://schemas.openxmlformats.org/drawingml/2006/main" noChangeAspect="1"/>
             </wp:cNvGraphicFramePr>
@@ -37733,7 +37733,7 @@
       <w:pPr>
         <w:pStyle w:val="2"/>
       </w:pPr>
-      <w:bookmarkStart w:id="31" w:name="_Toc240675706"/>
+      <w:bookmarkStart w:id="31" w:name="_Toc240676434"/>
       <w:r>
         <w:t xml:space="preserve">9.1 </w:t>
       </w:r>
@@ -39109,7 +39109,7 @@
       <w:pPr>
         <w:pStyle w:val="2"/>
       </w:pPr>
-      <w:bookmarkStart w:id="32" w:name="_Toc240675707"/>
+      <w:bookmarkStart w:id="32" w:name="_Toc240676435"/>
       <w:r>
         <w:t xml:space="preserve">9.2 </w:t>
       </w:r>
@@ -39278,7 +39278,7 @@
         <w:pStyle w:val="1"/>
         <w:pageBreakBefore/>
       </w:pPr>
-      <w:bookmarkStart w:id="33" w:name="_Toc240675708"/>
+      <w:bookmarkStart w:id="33" w:name="_Toc240676436"/>
       <w:r>
         <w:lastRenderedPageBreak/>
         <w:t xml:space="preserve">10. </w:t>
@@ -39304,10 +39304,10 @@
           <w:noProof/>
         </w:rPr>
         <w:drawing>
-          <wp:inline distT="0" distB="0" distL="0" distR="0" wp14:anchorId="3801232F" wp14:editId="1EAF85D0">
+          <wp:inline distT="0" distB="0" distL="0" distR="0" wp14:anchorId="7D9C43EE" wp14:editId="6EE70688">
             <wp:extent cx="5943600" cy="3638550"/>
             <wp:effectExtent l="0" t="0" r="0" b="0"/>
-            <wp:docPr id="1157117469" name="그림 1157117469"/>
+            <wp:docPr id="968152485" name="그림 968152485"/>
             <wp:cNvGraphicFramePr>
               <a:graphicFrameLocks xmlns:a="http://schemas.openxmlformats.org/drawingml/2006/main" noChangeAspect="1"/>
             </wp:cNvGraphicFramePr>
@@ -40943,7 +40943,7 @@
         <w:pStyle w:val="1"/>
         <w:pageBreakBefore/>
       </w:pPr>
-      <w:bookmarkStart w:id="34" w:name="_Toc240675709"/>
+      <w:bookmarkStart w:id="34" w:name="_Toc240676437"/>
       <w:r>
         <w:lastRenderedPageBreak/>
         <w:t xml:space="preserve">11. </w:t>
@@ -40969,10 +40969,10 @@
           <w:noProof/>
         </w:rPr>
         <w:drawing>
-          <wp:inline distT="0" distB="0" distL="0" distR="0" wp14:anchorId="4EAD37D5" wp14:editId="6643B3DA">
+          <wp:inline distT="0" distB="0" distL="0" distR="0" wp14:anchorId="2FF28006" wp14:editId="05264053">
             <wp:extent cx="5943600" cy="3638550"/>
             <wp:effectExtent l="0" t="0" r="0" b="0"/>
-            <wp:docPr id="1364601531" name="그림 1364601531"/>
+            <wp:docPr id="1151975590" name="그림 1151975590"/>
             <wp:cNvGraphicFramePr>
               <a:graphicFrameLocks xmlns:a="http://schemas.openxmlformats.org/drawingml/2006/main" noChangeAspect="1"/>
             </wp:cNvGraphicFramePr>
@@ -41088,7 +41088,7 @@
       <w:pPr>
         <w:pStyle w:val="2"/>
       </w:pPr>
-      <w:bookmarkStart w:id="35" w:name="_Toc240675710"/>
+      <w:bookmarkStart w:id="35" w:name="_Toc240676438"/>
       <w:r>
         <w:t xml:space="preserve">11.1 </w:t>
       </w:r>
@@ -42387,7 +42387,7 @@
       <w:pPr>
         <w:pStyle w:val="2"/>
       </w:pPr>
-      <w:bookmarkStart w:id="36" w:name="_Toc240675711"/>
+      <w:bookmarkStart w:id="36" w:name="_Toc240676439"/>
       <w:r>
         <w:t xml:space="preserve">11.2 </w:t>
       </w:r>
@@ -42828,7 +42828,7 @@
       <w:pPr>
         <w:pStyle w:val="2"/>
       </w:pPr>
-      <w:bookmarkStart w:id="37" w:name="_Toc240675712"/>
+      <w:bookmarkStart w:id="37" w:name="_Toc240676440"/>
       <w:r>
         <w:t xml:space="preserve">11.3 </w:t>
       </w:r>
@@ -43368,7 +43368,7 @@
       <w:pPr>
         <w:pStyle w:val="2"/>
       </w:pPr>
-      <w:bookmarkStart w:id="38" w:name="_Toc240675713"/>
+      <w:bookmarkStart w:id="38" w:name="_Toc240676441"/>
       <w:r>
         <w:t xml:space="preserve">11.4 </w:t>
       </w:r>
@@ -43415,10 +43415,10 @@
         </w:rPr>
         <w:lastRenderedPageBreak/>
         <w:drawing>
-          <wp:inline distT="0" distB="0" distL="0" distR="0" wp14:anchorId="4E57AB5B" wp14:editId="145590E3">
+          <wp:inline distT="0" distB="0" distL="0" distR="0" wp14:anchorId="277E50F9" wp14:editId="33F5295D">
             <wp:extent cx="5943600" cy="3752850"/>
             <wp:effectExtent l="0" t="0" r="0" b="0"/>
-            <wp:docPr id="921378267" name="그림 921378267"/>
+            <wp:docPr id="1066998561" name="그림 1066998561"/>
             <wp:cNvGraphicFramePr>
               <a:graphicFrameLocks xmlns:a="http://schemas.openxmlformats.org/drawingml/2006/main" noChangeAspect="1"/>
             </wp:cNvGraphicFramePr>
@@ -45520,7 +45520,7 @@
         <w:pStyle w:val="1"/>
         <w:pageBreakBefore/>
       </w:pPr>
-      <w:bookmarkStart w:id="39" w:name="_Toc240675714"/>
+      <w:bookmarkStart w:id="39" w:name="_Toc240676442"/>
       <w:r>
         <w:lastRenderedPageBreak/>
         <w:t xml:space="preserve">12. </w:t>
@@ -46978,7 +46978,7 @@
         <w:pStyle w:val="1"/>
         <w:pageBreakBefore/>
       </w:pPr>
-      <w:bookmarkStart w:id="40" w:name="_Toc240675715"/>
+      <w:bookmarkStart w:id="40" w:name="_Toc240676443"/>
       <w:r>
         <w:lastRenderedPageBreak/>
         <w:t xml:space="preserve">13. </w:t>
@@ -48059,7 +48059,7 @@
         <w:pStyle w:val="1"/>
         <w:pageBreakBefore/>
       </w:pPr>
-      <w:bookmarkStart w:id="41" w:name="_Toc240675716"/>
+      <w:bookmarkStart w:id="41" w:name="_Toc240676444"/>
       <w:r>
         <w:lastRenderedPageBreak/>
         <w:t xml:space="preserve">14. </w:t>
@@ -51984,7 +51984,7 @@
         <w:pStyle w:val="1"/>
         <w:pageBreakBefore/>
       </w:pPr>
-      <w:bookmarkStart w:id="42" w:name="_Toc240675717"/>
+      <w:bookmarkStart w:id="42" w:name="_Toc240676445"/>
       <w:r>
         <w:lastRenderedPageBreak/>
         <w:t>부록</w:t>
@@ -51995,7 +51995,7 @@
       <w:pPr>
         <w:pStyle w:val="2"/>
       </w:pPr>
-      <w:bookmarkStart w:id="43" w:name="_Toc240675718"/>
+      <w:bookmarkStart w:id="43" w:name="_Toc240676446"/>
       <w:r>
         <w:t xml:space="preserve">A. </w:t>
       </w:r>
@@ -52576,7 +52576,7 @@
       <w:pPr>
         <w:pStyle w:val="2"/>
       </w:pPr>
-      <w:bookmarkStart w:id="44" w:name="_Toc240675719"/>
+      <w:bookmarkStart w:id="44" w:name="_Toc240676447"/>
       <w:r>
         <w:t xml:space="preserve">B. </w:t>
       </w:r>
@@ -52811,7 +52811,7 @@
       <w:pPr>
         <w:pStyle w:val="2"/>
       </w:pPr>
-      <w:bookmarkStart w:id="45" w:name="_Toc240675720"/>
+      <w:bookmarkStart w:id="45" w:name="_Toc240676448"/>
       <w:r>
         <w:t xml:space="preserve">C. </w:t>
       </w:r>
@@ -53886,7 +53886,7 @@
       <w:pPr>
         <w:pStyle w:val="2"/>
       </w:pPr>
-      <w:bookmarkStart w:id="46" w:name="_Toc240675721"/>
+      <w:bookmarkStart w:id="46" w:name="_Toc240676449"/>
       <w:r>
         <w:t xml:space="preserve">E. </w:t>
       </w:r>
@@ -54577,10 +54577,166 @@
         <w:t xml:space="preserve"> </w:t>
       </w:r>
       <w:r>
+        <w:t>누릅니다</w:t>
+      </w:r>
+      <w:r>
+        <w:t xml:space="preserve">. </w:t>
+      </w:r>
+      <w:r>
+        <w:t>이</w:t>
+      </w:r>
+      <w:r>
+        <w:t xml:space="preserve"> PC</w:t>
+      </w:r>
+      <w:r>
+        <w:t>에서</w:t>
+      </w:r>
+      <w:r>
+        <w:t xml:space="preserve"> </w:t>
+      </w:r>
+      <w:r>
+        <w:t>처음</w:t>
+      </w:r>
+      <w:r>
+        <w:t xml:space="preserve"> </w:t>
+      </w:r>
+      <w:r>
+        <w:t>쓰는</w:t>
+      </w:r>
+      <w:r>
+        <w:t xml:space="preserve"> </w:t>
+      </w:r>
+      <w:r>
+        <w:t>경우</w:t>
+      </w:r>
+      <w:r>
+        <w:t xml:space="preserve"> "Vercel </w:t>
+      </w:r>
+      <w:r>
+        <w:t>로그인이</w:t>
+      </w:r>
+      <w:r>
+        <w:t xml:space="preserve"> </w:t>
+      </w:r>
+      <w:r>
+        <w:t>필요합니다</w:t>
+      </w:r>
+      <w:r>
+        <w:t xml:space="preserve">" </w:t>
+      </w:r>
+      <w:r>
+        <w:t>안내가</w:t>
+      </w:r>
+      <w:r>
+        <w:t xml:space="preserve"> </w:t>
+      </w:r>
+      <w:r>
+        <w:t>나오면</w:t>
+      </w:r>
+      <w:r>
+        <w:t xml:space="preserve"> [</w:t>
+      </w:r>
+      <w:r>
+        <w:t>예</w:t>
+      </w:r>
+      <w:r>
+        <w:t>]</w:t>
+      </w:r>
+      <w:r>
+        <w:t>를</w:t>
+      </w:r>
+      <w:r>
+        <w:t xml:space="preserve"> </w:t>
+      </w:r>
+      <w:r>
         <w:t>누르고</w:t>
       </w:r>
       <w:r>
-        <w:t xml:space="preserve"> 1</w:t>
+        <w:t xml:space="preserve">, </w:t>
+      </w:r>
+      <w:r>
+        <w:t>열린</w:t>
+      </w:r>
+      <w:r>
+        <w:t xml:space="preserve"> </w:t>
+      </w:r>
+      <w:r>
+        <w:t>브라우저에서</w:t>
+      </w:r>
+      <w:r>
+        <w:t xml:space="preserve"> RuninqVic</w:t>
+      </w:r>
+      <w:r>
+        <w:t>을</w:t>
+      </w:r>
+      <w:r>
+        <w:t xml:space="preserve"> </w:t>
+      </w:r>
+      <w:r>
+        <w:t>배포한</w:t>
+      </w:r>
+      <w:r>
+        <w:t xml:space="preserve"> Vercel </w:t>
+      </w:r>
+      <w:r>
+        <w:t>계정으로</w:t>
+      </w:r>
+      <w:r>
+        <w:t xml:space="preserve"> </w:t>
+      </w:r>
+      <w:r>
+        <w:t>승인한</w:t>
+      </w:r>
+      <w:r>
+        <w:t xml:space="preserve"> </w:t>
+      </w:r>
+      <w:r>
+        <w:t>뒤</w:t>
+      </w:r>
+      <w:r>
+        <w:t xml:space="preserve"> </w:t>
+      </w:r>
+      <w:r>
+        <w:t>검은</w:t>
+      </w:r>
+      <w:r>
+        <w:t xml:space="preserve"> </w:t>
+      </w:r>
+      <w:r>
+        <w:t>창에서</w:t>
+      </w:r>
+      <w:r>
+        <w:t xml:space="preserve"> </w:t>
+      </w:r>
+      <w:r>
+        <w:t>아무</w:t>
+      </w:r>
+      <w:r>
+        <w:t xml:space="preserve"> </w:t>
+      </w:r>
+      <w:r>
+        <w:t>키나</w:t>
+      </w:r>
+      <w:r>
+        <w:t xml:space="preserve"> </w:t>
+      </w:r>
+      <w:r>
+        <w:t>누르면</w:t>
+      </w:r>
+      <w:r>
+        <w:t xml:space="preserve"> </w:t>
+      </w:r>
+      <w:r>
+        <w:t>이어서</w:t>
+      </w:r>
+      <w:r>
+        <w:t xml:space="preserve"> </w:t>
+      </w:r>
+      <w:r>
+        <w:t>진행됩니다</w:t>
+      </w:r>
+      <w:r>
+        <w:t>. 1</w:t>
       </w:r>
       <w:r>
         <w:t>분쯤</w:t>
@@ -57264,7 +57420,15 @@
                 <w:sz w:val="19"/>
                 <w:szCs w:val="19"/>
               </w:rPr>
-              <w:t>운영자</w:t>
+              <w:t>운영</w:t>
+            </w:r>
+            <w:r>
+              <w:rPr>
+                <w:sz w:val="19"/>
+                <w:szCs w:val="19"/>
+              </w:rPr>
+              <w:lastRenderedPageBreak/>
+              <w:t>자</w:t>
             </w:r>
             <w:r>
               <w:rPr>
@@ -57614,15 +57778,7 @@
                 <w:sz w:val="19"/>
                 <w:szCs w:val="19"/>
               </w:rPr>
-              <w:t>요</w:t>
-            </w:r>
-            <w:r>
-              <w:rPr>
-                <w:sz w:val="19"/>
-                <w:szCs w:val="19"/>
-              </w:rPr>
-              <w:lastRenderedPageBreak/>
-              <w:t>청</w:t>
+              <w:t>요청</w:t>
             </w:r>
             <w:r>
               <w:rPr>
@@ -58585,10 +58741,10 @@
           <w:noProof/>
         </w:rPr>
         <w:drawing>
-          <wp:inline distT="0" distB="0" distL="0" distR="0" wp14:anchorId="31A40B3D" wp14:editId="7D4FF487">
+          <wp:inline distT="0" distB="0" distL="0" distR="0" wp14:anchorId="5F40A482" wp14:editId="4DF3F341">
             <wp:extent cx="5943600" cy="3638550"/>
             <wp:effectExtent l="0" t="0" r="0" b="0"/>
-            <wp:docPr id="1569428490" name="그림 1569428490"/>
+            <wp:docPr id="1486700176" name="그림 1486700176"/>
             <wp:cNvGraphicFramePr>
               <a:graphicFrameLocks xmlns:a="http://schemas.openxmlformats.org/drawingml/2006/main" noChangeAspect="1"/>
             </wp:cNvGraphicFramePr>
@@ -58877,7 +59033,7 @@
       <w:pPr>
         <w:pStyle w:val="2"/>
       </w:pPr>
-      <w:bookmarkStart w:id="47" w:name="_Toc240675722"/>
+      <w:bookmarkStart w:id="47" w:name="_Toc240676450"/>
       <w:r>
         <w:t xml:space="preserve">D. </w:t>
       </w:r>
@@ -58954,6 +59110,7 @@
         <w:spacing w:after="80" w:line="300" w:lineRule="auto"/>
       </w:pPr>
       <w:r>
+        <w:lastRenderedPageBreak/>
         <w:t>동영상</w:t>
       </w:r>
       <w:r>
@@ -59076,7 +59233,6 @@
         <w:spacing w:after="80" w:line="300" w:lineRule="auto"/>
       </w:pPr>
       <w:r>
-        <w:lastRenderedPageBreak/>
         <w:t>소스</w:t>
       </w:r>
       <w:r>
@@ -59306,10 +59462,118 @@
 <file path=word/numbering.xml><?xml version="1.0" encoding="utf-8"?>
 <w:numbering xmlns:wpc="http://schemas.microsoft.com/office/word/2010/wordprocessingCanvas" xmlns:cx="http://schemas.microsoft.com/office/drawing/2014/chartex" xmlns:cx1="http://schemas.microsoft.com/office/drawing/2015/9/8/chartex" xmlns:cx2="http://schemas.microsoft.com/office/drawing/2015/10/21/chartex" xmlns:cx3="http://schemas.microsoft.com/office/drawing/2016/5/9/chartex" xmlns:cx4="http://schemas.microsoft.com/office/drawing/2016/5/10/chartex" xmlns:cx5="http://schemas.microsoft.com/office/drawing/2016/5/11/chartex" xmlns:cx6="http://schemas.microsoft.com/office/drawing/2016/5/12/chartex" xmlns:cx7="http://schemas.microsoft.com/office/drawing/2016/5/13/chartex" xmlns:cx8="http://schemas.microsoft.com/office/drawing/2016/5/14/chartex" xmlns:mc="http://schemas.openxmlformats.org/markup-compatibility/2006" xmlns:aink="http://schemas.microsoft.com/office/drawing/2016/ink" xmlns:am3d="http://schemas.microsoft.com/office/drawing/2017/model3d" xmlns:o="urn:schemas-microsoft-com:office:office" xmlns:oel="http://schemas.microsoft.com/office/2019/extlst" xmlns:r="http://schemas.openxmlformats.org/officeDocument/2006/relationships" xmlns:m="http://schemas.openxmlformats.org/officeDocument/2006/math" xmlns:v="urn:schemas-microsoft-com:vml" xmlns:wp14="http://schemas.microsoft.com/office/word/2010/wordprocessingDrawing" xmlns:wp="http://schemas.openxmlformats.org/drawingml/2006/wordprocessingDrawing" xmlns:w10="urn:schemas-microsoft-com:office:word" xmlns:w="http://schemas.openxmlformats.org/wordprocessingml/2006/main" xmlns:w14="http://schemas.microsoft.com/office/word/2010/wordml" xmlns:w15="http://schemas.microsoft.com/office/word/2012/wordml" xmlns:w16cex="http://schemas.microsoft.com/office/word/2018/wordml/cex" xmlns:w16cid="http://schemas.microsoft.com/office/word/2016/wordml/cid" xmlns:w16="http://schemas.microsoft.com/office/word/2018/wordml" xmlns:w16du="http://schemas.microsoft.com/office/word/2023/wordml/word16du" xmlns:w16sdtdh="http://schemas.microsoft.com/office/word/2020/wordml/sdtdatahash" xmlns:w16sdtfl="http://schemas.microsoft.com/office/word/2024/wordml/sdtformatlock" xmlns:w16se="http://schemas.microsoft.com/office/word/2015/wordml/symex" xmlns:wpg="http://schemas.microsoft.com/office/word/2010/wordprocessingGroup" xmlns:wpi="http://schemas.microsoft.com/office/word/2010/wordprocessingInk" xmlns:wne="http://schemas.microsoft.com/office/word/2006/wordml" xmlns:wps="http://schemas.microsoft.com/office/word/2010/wordprocessingShape" mc:Ignorable="w14 w15 w16se w16cid w16 w16cex w16sdtdh w16sdtfl w16du wp14">
   <w:abstractNum w:abstractNumId="0" w15:restartNumberingAfterBreak="0">
-    <w:nsid w:val="13A5616C"/>
+    <w:nsid w:val="0C8F79D4"/>
     <w:multiLevelType w:val="hybridMultilevel"/>
-    <w:tmpl w:val="229E6104"/>
-    <w:lvl w:ilvl="0" w:tplc="3DCAB816">
+    <w:tmpl w:val="2164464C"/>
+    <w:lvl w:ilvl="0" w:tplc="1D36E186">
+      <w:start w:val="1"/>
+      <w:numFmt w:val="bullet"/>
+      <w:lvlText w:val="•"/>
+      <w:lvlJc w:val="left"/>
+      <w:pPr>
+        <w:ind w:left="480" w:hanging="260"/>
+      </w:pPr>
+    </w:lvl>
+    <w:lvl w:ilvl="1" w:tplc="58C4B2DA">
+      <w:numFmt w:val="decimal"/>
+      <w:lvlText w:val=""/>
+      <w:lvlJc w:val="left"/>
+    </w:lvl>
+    <w:lvl w:ilvl="2" w:tplc="FC805E84">
+      <w:numFmt w:val="decimal"/>
+      <w:lvlText w:val=""/>
+      <w:lvlJc w:val="left"/>
+    </w:lvl>
+    <w:lvl w:ilvl="3" w:tplc="518E28F0">
+      <w:numFmt w:val="decimal"/>
+      <w:lvlText w:val=""/>
+      <w:lvlJc w:val="left"/>
+    </w:lvl>
+    <w:lvl w:ilvl="4" w:tplc="F006E0C8">
+      <w:numFmt w:val="decimal"/>
+      <w:lvlText w:val=""/>
+      <w:lvlJc w:val="left"/>
+    </w:lvl>
+    <w:lvl w:ilvl="5" w:tplc="14324656">
+      <w:numFmt w:val="decimal"/>
+      <w:lvlText w:val=""/>
+      <w:lvlJc w:val="left"/>
+    </w:lvl>
+    <w:lvl w:ilvl="6" w:tplc="C91274E4">
+      <w:numFmt w:val="decimal"/>
+      <w:lvlText w:val=""/>
+      <w:lvlJc w:val="left"/>
+    </w:lvl>
+    <w:lvl w:ilvl="7" w:tplc="C9B811CC">
+      <w:numFmt w:val="decimal"/>
+      <w:lvlText w:val=""/>
+      <w:lvlJc w:val="left"/>
+    </w:lvl>
+    <w:lvl w:ilvl="8" w:tplc="21260026">
+      <w:numFmt w:val="decimal"/>
+      <w:lvlText w:val=""/>
+      <w:lvlJc w:val="left"/>
+    </w:lvl>
+  </w:abstractNum>
+  <w:abstractNum w:abstractNumId="1" w15:restartNumberingAfterBreak="0">
+    <w:nsid w:val="40DB4188"/>
+    <w:multiLevelType w:val="hybridMultilevel"/>
+    <w:tmpl w:val="6194DAF2"/>
+    <w:lvl w:ilvl="0" w:tplc="2D6040E4">
+      <w:start w:val="1"/>
+      <w:numFmt w:val="decimal"/>
+      <w:lvlText w:val="%1."/>
+      <w:lvlJc w:val="left"/>
+      <w:pPr>
+        <w:ind w:left="480" w:hanging="300"/>
+      </w:pPr>
+    </w:lvl>
+    <w:lvl w:ilvl="1" w:tplc="B88413B2">
+      <w:numFmt w:val="decimal"/>
+      <w:lvlText w:val=""/>
+      <w:lvlJc w:val="left"/>
+    </w:lvl>
+    <w:lvl w:ilvl="2" w:tplc="1BF4B544">
+      <w:numFmt w:val="decimal"/>
+      <w:lvlText w:val=""/>
+      <w:lvlJc w:val="left"/>
+    </w:lvl>
+    <w:lvl w:ilvl="3" w:tplc="65C84598">
+      <w:numFmt w:val="decimal"/>
+      <w:lvlText w:val=""/>
+      <w:lvlJc w:val="left"/>
+    </w:lvl>
+    <w:lvl w:ilvl="4" w:tplc="64B6FBFA">
+      <w:numFmt w:val="decimal"/>
+      <w:lvlText w:val=""/>
+      <w:lvlJc w:val="left"/>
+    </w:lvl>
+    <w:lvl w:ilvl="5" w:tplc="4AF29A94">
+      <w:numFmt w:val="decimal"/>
+      <w:lvlText w:val=""/>
+      <w:lvlJc w:val="left"/>
+    </w:lvl>
+    <w:lvl w:ilvl="6" w:tplc="8C74C9BA">
+      <w:numFmt w:val="decimal"/>
+      <w:lvlText w:val=""/>
+      <w:lvlJc w:val="left"/>
+    </w:lvl>
+    <w:lvl w:ilvl="7" w:tplc="7D4AF3A0">
+      <w:numFmt w:val="decimal"/>
+      <w:lvlText w:val=""/>
+      <w:lvlJc w:val="left"/>
+    </w:lvl>
+    <w:lvl w:ilvl="8" w:tplc="06181386">
+      <w:numFmt w:val="decimal"/>
+      <w:lvlText w:val=""/>
+      <w:lvlJc w:val="left"/>
+    </w:lvl>
+  </w:abstractNum>
+  <w:abstractNum w:abstractNumId="2" w15:restartNumberingAfterBreak="0">
+    <w:nsid w:val="518D5E0E"/>
+    <w:multiLevelType w:val="hybridMultilevel"/>
+    <w:tmpl w:val="5F7A5680"/>
+    <w:lvl w:ilvl="0" w:tplc="FC6444FC">
       <w:start w:val="1"/>
       <w:numFmt w:val="bullet"/>
       <w:lvlText w:val="●"/>
@@ -59318,7 +59582,7 @@
         <w:ind w:left="720" w:hanging="360"/>
       </w:pPr>
     </w:lvl>
-    <w:lvl w:ilvl="1" w:tplc="B61A7E44">
+    <w:lvl w:ilvl="1" w:tplc="DB6C7BD0">
       <w:start w:val="1"/>
       <w:numFmt w:val="bullet"/>
       <w:lvlText w:val="○"/>
@@ -59327,7 +59591,7 @@
         <w:ind w:left="1440" w:hanging="360"/>
       </w:pPr>
     </w:lvl>
-    <w:lvl w:ilvl="2" w:tplc="7B107AAC">
+    <w:lvl w:ilvl="2" w:tplc="809082E8">
       <w:start w:val="1"/>
       <w:numFmt w:val="bullet"/>
       <w:lvlText w:val="■"/>
@@ -59336,7 +59600,7 @@
         <w:ind w:left="2160" w:hanging="360"/>
       </w:pPr>
     </w:lvl>
-    <w:lvl w:ilvl="3" w:tplc="9ACACE76">
+    <w:lvl w:ilvl="3" w:tplc="7A4651BE">
       <w:start w:val="1"/>
       <w:numFmt w:val="bullet"/>
       <w:lvlText w:val="●"/>
@@ -59345,7 +59609,7 @@
         <w:ind w:left="2880" w:hanging="360"/>
       </w:pPr>
     </w:lvl>
-    <w:lvl w:ilvl="4" w:tplc="33A4635A">
+    <w:lvl w:ilvl="4" w:tplc="60BA5E06">
       <w:start w:val="1"/>
       <w:numFmt w:val="bullet"/>
       <w:lvlText w:val="○"/>
@@ -59354,7 +59618,7 @@
         <w:ind w:left="3600" w:hanging="360"/>
       </w:pPr>
     </w:lvl>
-    <w:lvl w:ilvl="5" w:tplc="E0F6C93C">
+    <w:lvl w:ilvl="5" w:tplc="7FB017F0">
       <w:start w:val="1"/>
       <w:numFmt w:val="bullet"/>
       <w:lvlText w:val="■"/>
@@ -59363,7 +59627,7 @@
         <w:ind w:left="4320" w:hanging="360"/>
       </w:pPr>
     </w:lvl>
-    <w:lvl w:ilvl="6" w:tplc="A6A45486">
+    <w:lvl w:ilvl="6" w:tplc="A758674E">
       <w:start w:val="1"/>
       <w:numFmt w:val="bullet"/>
       <w:lvlText w:val="●"/>
@@ -59372,7 +59636,7 @@
         <w:ind w:left="5040" w:hanging="360"/>
       </w:pPr>
     </w:lvl>
-    <w:lvl w:ilvl="7" w:tplc="038EBAFA">
+    <w:lvl w:ilvl="7" w:tplc="91FE5336">
       <w:start w:val="1"/>
       <w:numFmt w:val="bullet"/>
       <w:lvlText w:val="●"/>
@@ -59381,7 +59645,7 @@
         <w:ind w:left="5760" w:hanging="360"/>
       </w:pPr>
     </w:lvl>
-    <w:lvl w:ilvl="8" w:tplc="84343460">
+    <w:lvl w:ilvl="8" w:tplc="D90886A2">
       <w:start w:val="1"/>
       <w:numFmt w:val="bullet"/>
       <w:lvlText w:val="●"/>
@@ -59391,139 +59655,31 @@
       </w:pPr>
     </w:lvl>
   </w:abstractNum>
-  <w:abstractNum w:abstractNumId="1" w15:restartNumberingAfterBreak="0">
-    <w:nsid w:val="40E66E48"/>
-    <w:multiLevelType w:val="hybridMultilevel"/>
-    <w:tmpl w:val="FFB46532"/>
-    <w:lvl w:ilvl="0" w:tplc="8BB0759A">
-      <w:start w:val="1"/>
-      <w:numFmt w:val="decimal"/>
-      <w:lvlText w:val="%1."/>
-      <w:lvlJc w:val="left"/>
-      <w:pPr>
-        <w:ind w:left="480" w:hanging="300"/>
-      </w:pPr>
-    </w:lvl>
-    <w:lvl w:ilvl="1" w:tplc="04405FF4">
-      <w:numFmt w:val="decimal"/>
-      <w:lvlText w:val=""/>
-      <w:lvlJc w:val="left"/>
-    </w:lvl>
-    <w:lvl w:ilvl="2" w:tplc="7E6C6AF0">
-      <w:numFmt w:val="decimal"/>
-      <w:lvlText w:val=""/>
-      <w:lvlJc w:val="left"/>
-    </w:lvl>
-    <w:lvl w:ilvl="3" w:tplc="0666EC78">
-      <w:numFmt w:val="decimal"/>
-      <w:lvlText w:val=""/>
-      <w:lvlJc w:val="left"/>
-    </w:lvl>
-    <w:lvl w:ilvl="4" w:tplc="5E2403B6">
-      <w:numFmt w:val="decimal"/>
-      <w:lvlText w:val=""/>
-      <w:lvlJc w:val="left"/>
-    </w:lvl>
-    <w:lvl w:ilvl="5" w:tplc="D2F218A4">
-      <w:numFmt w:val="decimal"/>
-      <w:lvlText w:val=""/>
-      <w:lvlJc w:val="left"/>
-    </w:lvl>
-    <w:lvl w:ilvl="6" w:tplc="C5FAAC02">
-      <w:numFmt w:val="decimal"/>
-      <w:lvlText w:val=""/>
-      <w:lvlJc w:val="left"/>
-    </w:lvl>
-    <w:lvl w:ilvl="7" w:tplc="4A6A4A32">
-      <w:numFmt w:val="decimal"/>
-      <w:lvlText w:val=""/>
-      <w:lvlJc w:val="left"/>
-    </w:lvl>
-    <w:lvl w:ilvl="8" w:tplc="E82EAA38">
-      <w:numFmt w:val="decimal"/>
-      <w:lvlText w:val=""/>
-      <w:lvlJc w:val="left"/>
-    </w:lvl>
-  </w:abstractNum>
-  <w:abstractNum w:abstractNumId="2" w15:restartNumberingAfterBreak="0">
-    <w:nsid w:val="76CA01F9"/>
-    <w:multiLevelType w:val="hybridMultilevel"/>
-    <w:tmpl w:val="98EE5042"/>
-    <w:lvl w:ilvl="0" w:tplc="8458A124">
-      <w:start w:val="1"/>
-      <w:numFmt w:val="bullet"/>
-      <w:lvlText w:val="•"/>
-      <w:lvlJc w:val="left"/>
-      <w:pPr>
-        <w:ind w:left="480" w:hanging="260"/>
-      </w:pPr>
-    </w:lvl>
-    <w:lvl w:ilvl="1" w:tplc="8A6AA70E">
-      <w:numFmt w:val="decimal"/>
-      <w:lvlText w:val=""/>
-      <w:lvlJc w:val="left"/>
-    </w:lvl>
-    <w:lvl w:ilvl="2" w:tplc="4A563654">
-      <w:numFmt w:val="decimal"/>
-      <w:lvlText w:val=""/>
-      <w:lvlJc w:val="left"/>
-    </w:lvl>
-    <w:lvl w:ilvl="3" w:tplc="8B385BCA">
-      <w:numFmt w:val="decimal"/>
-      <w:lvlText w:val=""/>
-      <w:lvlJc w:val="left"/>
-    </w:lvl>
-    <w:lvl w:ilvl="4" w:tplc="AA782C8C">
-      <w:numFmt w:val="decimal"/>
-      <w:lvlText w:val=""/>
-      <w:lvlJc w:val="left"/>
-    </w:lvl>
-    <w:lvl w:ilvl="5" w:tplc="6546B366">
-      <w:numFmt w:val="decimal"/>
-      <w:lvlText w:val=""/>
-      <w:lvlJc w:val="left"/>
-    </w:lvl>
-    <w:lvl w:ilvl="6" w:tplc="E53CB58A">
-      <w:numFmt w:val="decimal"/>
-      <w:lvlText w:val=""/>
-      <w:lvlJc w:val="left"/>
-    </w:lvl>
-    <w:lvl w:ilvl="7" w:tplc="1CF8AE68">
-      <w:numFmt w:val="decimal"/>
-      <w:lvlText w:val=""/>
-      <w:lvlJc w:val="left"/>
-    </w:lvl>
-    <w:lvl w:ilvl="8" w:tplc="4DC04CE4">
-      <w:numFmt w:val="decimal"/>
-      <w:lvlText w:val=""/>
-      <w:lvlJc w:val="left"/>
-    </w:lvl>
-  </w:abstractNum>
-  <w:num w:numId="1" w16cid:durableId="467940259">
+  <w:num w:numId="1" w16cid:durableId="1868984330">
+    <w:abstractNumId w:val="2"/>
+    <w:lvlOverride w:ilvl="0">
+      <w:startOverride w:val="1"/>
+    </w:lvlOverride>
+  </w:num>
+  <w:num w:numId="2" w16cid:durableId="1922906321">
     <w:abstractNumId w:val="0"/>
     <w:lvlOverride w:ilvl="0">
       <w:startOverride w:val="1"/>
     </w:lvlOverride>
   </w:num>
-  <w:num w:numId="2" w16cid:durableId="1487622467">
-    <w:abstractNumId w:val="2"/>
-    <w:lvlOverride w:ilvl="0">
-      <w:startOverride w:val="1"/>
-    </w:lvlOverride>
-  </w:num>
-  <w:num w:numId="3" w16cid:durableId="292711501">
+  <w:num w:numId="3" w16cid:durableId="1227186787">
     <w:abstractNumId w:val="1"/>
     <w:lvlOverride w:ilvl="0">
       <w:startOverride w:val="1"/>
     </w:lvlOverride>
   </w:num>
-  <w:num w:numId="4" w16cid:durableId="2061786326">
+  <w:num w:numId="4" w16cid:durableId="408814474">
     <w:abstractNumId w:val="1"/>
     <w:lvlOverride w:ilvl="0">
       <w:startOverride w:val="1"/>
     </w:lvlOverride>
   </w:num>
-  <w:num w:numId="5" w16cid:durableId="207300813">
+  <w:num w:numId="5" w16cid:durableId="338627315">
     <w:abstractNumId w:val="1"/>
     <w:lvlOverride w:ilvl="0">
       <w:startOverride w:val="1"/>
@@ -60148,7 +60304,7 @@
     <w:autoRedefine/>
     <w:uiPriority w:val="39"/>
     <w:unhideWhenUsed/>
-    <w:rsid w:val="0050120B"/>
+    <w:rsid w:val="00E157C9"/>
   </w:style>
   <w:style w:type="paragraph" w:styleId="20">
     <w:name w:val="toc 2"/>
@@ -60157,7 +60313,7 @@
     <w:autoRedefine/>
     <w:uiPriority w:val="39"/>
     <w:unhideWhenUsed/>
-    <w:rsid w:val="0050120B"/>
+    <w:rsid w:val="00E157C9"/>
     <w:pPr>
       <w:ind w:leftChars="200" w:left="425"/>
     </w:pPr>
@@ -60168,7 +60324,7 @@
     <w:link w:val="Char1"/>
     <w:uiPriority w:val="99"/>
     <w:unhideWhenUsed/>
-    <w:rsid w:val="0050120B"/>
+    <w:rsid w:val="00E157C9"/>
     <w:pPr>
       <w:tabs>
         <w:tab w:val="center" w:pos="4513"/>
@@ -60182,7 +60338,7 @@
     <w:basedOn w:val="a0"/>
     <w:link w:val="aa"/>
     <w:uiPriority w:val="99"/>
-    <w:rsid w:val="0050120B"/>
+    <w:rsid w:val="00E157C9"/>
   </w:style>
   <w:style w:type="paragraph" w:styleId="ab">
     <w:name w:val="footer"/>
@@ -60190,7 +60346,7 @@
     <w:link w:val="Char2"/>
     <w:uiPriority w:val="99"/>
     <w:unhideWhenUsed/>
-    <w:rsid w:val="0050120B"/>
+    <w:rsid w:val="00E157C9"/>
     <w:pPr>
       <w:tabs>
         <w:tab w:val="center" w:pos="4513"/>
@@ -60204,7 +60360,7 @@
     <w:basedOn w:val="a0"/>
     <w:link w:val="ab"/>
     <w:uiPriority w:val="99"/>
-    <w:rsid w:val="0050120B"/>
+    <w:rsid w:val="00E157C9"/>
   </w:style>
 </w:styles>
 </file>

</xml_diff>

<commit_message>
v1.6.2: admin code sent percent-encoded (non-ASCII codes no longer break the request); setup tool shows/validates the admin code
Co-Authored-By: Claude Fable 5.1 <noreply@anthropic.com>
</commit_message>
<xml_diff>
--- a/docs/manual/RuninqVic_사용설명서.docx
+++ b/docs/manual/RuninqVic_사용설명서.docx
@@ -17,7 +17,7 @@
           <w:noProof/>
         </w:rPr>
         <w:drawing>
-          <wp:inline distT="0" distB="0" distL="0" distR="0" wp14:anchorId="6695A16E" wp14:editId="155ED533">
+          <wp:inline distT="0" distB="0" distL="0" distR="0" wp14:anchorId="032C54FC" wp14:editId="56C5001E">
             <wp:extent cx="838200" cy="838200"/>
             <wp:effectExtent l="0" t="0" r="0" b="0"/>
             <wp:docPr id="1" name="그림 1"/>
@@ -396,10 +396,10 @@
             <w:noProof/>
           </w:rPr>
           <w:drawing>
-            <wp:inline distT="0" distB="0" distL="0" distR="0" wp14:anchorId="7225D001" wp14:editId="2FA9A555">
+            <wp:inline distT="0" distB="0" distL="0" distR="0" wp14:anchorId="5EA25E0F" wp14:editId="15FF4A28">
               <wp:extent cx="1905000" cy="762000"/>
               <wp:effectExtent l="0" t="0" r="0" b="0"/>
-              <wp:docPr id="1227349512" name="그림 1227349512">
+              <wp:docPr id="393273595" name="그림 393273595">
                 <a:hlinkClick xmlns:a="http://schemas.openxmlformats.org/drawingml/2006/main" r:id="rId9"/>
               </wp:docPr>
               <wp:cNvGraphicFramePr>
@@ -537,7 +537,7 @@
     <w:sdt>
       <w:sdtPr>
         <w:alias w:val="목차"/>
-        <w:id w:val="-1013384997"/>
+        <w:id w:val="1187943750"/>
       </w:sdtPr>
       <w:sdtEndPr/>
       <w:sdtContent>
@@ -565,7 +565,7 @@
           <w:r>
             <w:fldChar w:fldCharType="separate"/>
           </w:r>
-          <w:hyperlink w:anchor="_Toc240676403" w:history="1">
+          <w:hyperlink w:anchor="_Toc240695479" w:history="1">
             <w:r>
               <w:rPr>
                 <w:rStyle w:val="a5"/>
@@ -589,7 +589,7 @@
               <w:rPr>
                 <w:noProof/>
               </w:rPr>
-              <w:instrText xml:space="preserve"> PAGEREF _Toc240676403 \h </w:instrText>
+              <w:instrText xml:space="preserve"> PAGEREF _Toc240695479 \h </w:instrText>
             </w:r>
             <w:r>
               <w:rPr>
@@ -632,7 +632,7 @@
               <w14:ligatures w14:val="standardContextual"/>
             </w:rPr>
           </w:pPr>
-          <w:hyperlink w:anchor="_Toc240676404" w:history="1">
+          <w:hyperlink w:anchor="_Toc240695480" w:history="1">
             <w:r>
               <w:rPr>
                 <w:rStyle w:val="a5"/>
@@ -656,7 +656,7 @@
               <w:rPr>
                 <w:noProof/>
               </w:rPr>
-              <w:instrText xml:space="preserve"> PAGEREF _Toc240676404 \h </w:instrText>
+              <w:instrText xml:space="preserve"> PAGEREF _Toc240695480 \h </w:instrText>
             </w:r>
             <w:r>
               <w:rPr>
@@ -699,7 +699,7 @@
               <w14:ligatures w14:val="standardContextual"/>
             </w:rPr>
           </w:pPr>
-          <w:hyperlink w:anchor="_Toc240676405" w:history="1">
+          <w:hyperlink w:anchor="_Toc240695481" w:history="1">
             <w:r>
               <w:rPr>
                 <w:rStyle w:val="a5"/>
@@ -723,7 +723,7 @@
               <w:rPr>
                 <w:noProof/>
               </w:rPr>
-              <w:instrText xml:space="preserve"> PAGEREF _Toc240676405 \h </w:instrText>
+              <w:instrText xml:space="preserve"> PAGEREF _Toc240695481 \h </w:instrText>
             </w:r>
             <w:r>
               <w:rPr>
@@ -766,7 +766,7 @@
               <w14:ligatures w14:val="standardContextual"/>
             </w:rPr>
           </w:pPr>
-          <w:hyperlink w:anchor="_Toc240676406" w:history="1">
+          <w:hyperlink w:anchor="_Toc240695482" w:history="1">
             <w:r>
               <w:rPr>
                 <w:rStyle w:val="a5"/>
@@ -790,7 +790,7 @@
               <w:rPr>
                 <w:noProof/>
               </w:rPr>
-              <w:instrText xml:space="preserve"> PAGEREF _Toc240676406 \h </w:instrText>
+              <w:instrText xml:space="preserve"> PAGEREF _Toc240695482 \h </w:instrText>
             </w:r>
             <w:r>
               <w:rPr>
@@ -832,7 +832,7 @@
               <w14:ligatures w14:val="standardContextual"/>
             </w:rPr>
           </w:pPr>
-          <w:hyperlink w:anchor="_Toc240676407" w:history="1">
+          <w:hyperlink w:anchor="_Toc240695483" w:history="1">
             <w:r>
               <w:rPr>
                 <w:rStyle w:val="a5"/>
@@ -856,7 +856,7 @@
               <w:rPr>
                 <w:noProof/>
               </w:rPr>
-              <w:instrText xml:space="preserve"> PAGEREF _Toc240676407 \h </w:instrText>
+              <w:instrText xml:space="preserve"> PAGEREF _Toc240695483 \h </w:instrText>
             </w:r>
             <w:r>
               <w:rPr>
@@ -899,7 +899,7 @@
               <w14:ligatures w14:val="standardContextual"/>
             </w:rPr>
           </w:pPr>
-          <w:hyperlink w:anchor="_Toc240676408" w:history="1">
+          <w:hyperlink w:anchor="_Toc240695484" w:history="1">
             <w:r>
               <w:rPr>
                 <w:rStyle w:val="a5"/>
@@ -923,7 +923,7 @@
               <w:rPr>
                 <w:noProof/>
               </w:rPr>
-              <w:instrText xml:space="preserve"> PAGEREF _Toc240676408 \h </w:instrText>
+              <w:instrText xml:space="preserve"> PAGEREF _Toc240695484 \h </w:instrText>
             </w:r>
             <w:r>
               <w:rPr>
@@ -966,7 +966,7 @@
               <w14:ligatures w14:val="standardContextual"/>
             </w:rPr>
           </w:pPr>
-          <w:hyperlink w:anchor="_Toc240676409" w:history="1">
+          <w:hyperlink w:anchor="_Toc240695485" w:history="1">
             <w:r>
               <w:rPr>
                 <w:rStyle w:val="a5"/>
@@ -990,7 +990,7 @@
               <w:rPr>
                 <w:noProof/>
               </w:rPr>
-              <w:instrText xml:space="preserve"> PAGEREF _Toc240676409 \h </w:instrText>
+              <w:instrText xml:space="preserve"> PAGEREF _Toc240695485 \h </w:instrText>
             </w:r>
             <w:r>
               <w:rPr>
@@ -1033,7 +1033,7 @@
               <w14:ligatures w14:val="standardContextual"/>
             </w:rPr>
           </w:pPr>
-          <w:hyperlink w:anchor="_Toc240676410" w:history="1">
+          <w:hyperlink w:anchor="_Toc240695486" w:history="1">
             <w:r>
               <w:rPr>
                 <w:rStyle w:val="a5"/>
@@ -1057,7 +1057,7 @@
               <w:rPr>
                 <w:noProof/>
               </w:rPr>
-              <w:instrText xml:space="preserve"> PAGEREF _Toc240676410 \h </w:instrText>
+              <w:instrText xml:space="preserve"> PAGEREF _Toc240695486 \h </w:instrText>
             </w:r>
             <w:r>
               <w:rPr>
@@ -1100,7 +1100,7 @@
               <w14:ligatures w14:val="standardContextual"/>
             </w:rPr>
           </w:pPr>
-          <w:hyperlink w:anchor="_Toc240676411" w:history="1">
+          <w:hyperlink w:anchor="_Toc240695487" w:history="1">
             <w:r>
               <w:rPr>
                 <w:rStyle w:val="a5"/>
@@ -1124,7 +1124,7 @@
               <w:rPr>
                 <w:noProof/>
               </w:rPr>
-              <w:instrText xml:space="preserve"> PAGEREF _Toc240676411 \h </w:instrText>
+              <w:instrText xml:space="preserve"> PAGEREF _Toc240695487 \h </w:instrText>
             </w:r>
             <w:r>
               <w:rPr>
@@ -1166,7 +1166,7 @@
               <w14:ligatures w14:val="standardContextual"/>
             </w:rPr>
           </w:pPr>
-          <w:hyperlink w:anchor="_Toc240676412" w:history="1">
+          <w:hyperlink w:anchor="_Toc240695488" w:history="1">
             <w:r>
               <w:rPr>
                 <w:rStyle w:val="a5"/>
@@ -1190,7 +1190,7 @@
               <w:rPr>
                 <w:noProof/>
               </w:rPr>
-              <w:instrText xml:space="preserve"> PAGEREF _Toc240676412 \h </w:instrText>
+              <w:instrText xml:space="preserve"> PAGEREF _Toc240695488 \h </w:instrText>
             </w:r>
             <w:r>
               <w:rPr>
@@ -1232,7 +1232,7 @@
               <w14:ligatures w14:val="standardContextual"/>
             </w:rPr>
           </w:pPr>
-          <w:hyperlink w:anchor="_Toc240676413" w:history="1">
+          <w:hyperlink w:anchor="_Toc240695489" w:history="1">
             <w:r>
               <w:rPr>
                 <w:rStyle w:val="a5"/>
@@ -1256,7 +1256,7 @@
               <w:rPr>
                 <w:noProof/>
               </w:rPr>
-              <w:instrText xml:space="preserve"> PAGEREF _Toc240676413 \h </w:instrText>
+              <w:instrText xml:space="preserve"> PAGEREF _Toc240695489 \h </w:instrText>
             </w:r>
             <w:r>
               <w:rPr>
@@ -1299,7 +1299,7 @@
               <w14:ligatures w14:val="standardContextual"/>
             </w:rPr>
           </w:pPr>
-          <w:hyperlink w:anchor="_Toc240676414" w:history="1">
+          <w:hyperlink w:anchor="_Toc240695490" w:history="1">
             <w:r>
               <w:rPr>
                 <w:rStyle w:val="a5"/>
@@ -1323,7 +1323,7 @@
               <w:rPr>
                 <w:noProof/>
               </w:rPr>
-              <w:instrText xml:space="preserve"> PAGEREF _Toc240676414 \h </w:instrText>
+              <w:instrText xml:space="preserve"> PAGEREF _Toc240695490 \h </w:instrText>
             </w:r>
             <w:r>
               <w:rPr>
@@ -1366,7 +1366,7 @@
               <w14:ligatures w14:val="standardContextual"/>
             </w:rPr>
           </w:pPr>
-          <w:hyperlink w:anchor="_Toc240676415" w:history="1">
+          <w:hyperlink w:anchor="_Toc240695491" w:history="1">
             <w:r>
               <w:rPr>
                 <w:rStyle w:val="a5"/>
@@ -1390,7 +1390,7 @@
               <w:rPr>
                 <w:noProof/>
               </w:rPr>
-              <w:instrText xml:space="preserve"> PAGEREF _Toc240676415 \h </w:instrText>
+              <w:instrText xml:space="preserve"> PAGEREF _Toc240695491 \h </w:instrText>
             </w:r>
             <w:r>
               <w:rPr>
@@ -1433,7 +1433,7 @@
               <w14:ligatures w14:val="standardContextual"/>
             </w:rPr>
           </w:pPr>
-          <w:hyperlink w:anchor="_Toc240676416" w:history="1">
+          <w:hyperlink w:anchor="_Toc240695492" w:history="1">
             <w:r>
               <w:rPr>
                 <w:rStyle w:val="a5"/>
@@ -1457,7 +1457,7 @@
               <w:rPr>
                 <w:noProof/>
               </w:rPr>
-              <w:instrText xml:space="preserve"> PAGEREF _Toc240676416 \h </w:instrText>
+              <w:instrText xml:space="preserve"> PAGEREF _Toc240695492 \h </w:instrText>
             </w:r>
             <w:r>
               <w:rPr>
@@ -1500,7 +1500,7 @@
               <w14:ligatures w14:val="standardContextual"/>
             </w:rPr>
           </w:pPr>
-          <w:hyperlink w:anchor="_Toc240676417" w:history="1">
+          <w:hyperlink w:anchor="_Toc240695493" w:history="1">
             <w:r>
               <w:rPr>
                 <w:rStyle w:val="a5"/>
@@ -1524,7 +1524,7 @@
               <w:rPr>
                 <w:noProof/>
               </w:rPr>
-              <w:instrText xml:space="preserve"> PAGEREF _Toc240676417 \h </w:instrText>
+              <w:instrText xml:space="preserve"> PAGEREF _Toc240695493 \h </w:instrText>
             </w:r>
             <w:r>
               <w:rPr>
@@ -1567,7 +1567,7 @@
               <w14:ligatures w14:val="standardContextual"/>
             </w:rPr>
           </w:pPr>
-          <w:hyperlink w:anchor="_Toc240676418" w:history="1">
+          <w:hyperlink w:anchor="_Toc240695494" w:history="1">
             <w:r>
               <w:rPr>
                 <w:rStyle w:val="a5"/>
@@ -1591,7 +1591,7 @@
               <w:rPr>
                 <w:noProof/>
               </w:rPr>
-              <w:instrText xml:space="preserve"> PAGEREF _Toc240676418 \h </w:instrText>
+              <w:instrText xml:space="preserve"> PAGEREF _Toc240695494 \h </w:instrText>
             </w:r>
             <w:r>
               <w:rPr>
@@ -1633,7 +1633,7 @@
               <w14:ligatures w14:val="standardContextual"/>
             </w:rPr>
           </w:pPr>
-          <w:hyperlink w:anchor="_Toc240676419" w:history="1">
+          <w:hyperlink w:anchor="_Toc240695495" w:history="1">
             <w:r>
               <w:rPr>
                 <w:rStyle w:val="a5"/>
@@ -1657,7 +1657,7 @@
               <w:rPr>
                 <w:noProof/>
               </w:rPr>
-              <w:instrText xml:space="preserve"> PAGEREF _Toc240676419 \h </w:instrText>
+              <w:instrText xml:space="preserve"> PAGEREF _Toc240695495 \h </w:instrText>
             </w:r>
             <w:r>
               <w:rPr>
@@ -1700,7 +1700,7 @@
               <w14:ligatures w14:val="standardContextual"/>
             </w:rPr>
           </w:pPr>
-          <w:hyperlink w:anchor="_Toc240676420" w:history="1">
+          <w:hyperlink w:anchor="_Toc240695496" w:history="1">
             <w:r>
               <w:rPr>
                 <w:rStyle w:val="a5"/>
@@ -1724,7 +1724,7 @@
               <w:rPr>
                 <w:noProof/>
               </w:rPr>
-              <w:instrText xml:space="preserve"> PAGEREF _Toc240676420 \h </w:instrText>
+              <w:instrText xml:space="preserve"> PAGEREF _Toc240695496 \h </w:instrText>
             </w:r>
             <w:r>
               <w:rPr>
@@ -1767,7 +1767,7 @@
               <w14:ligatures w14:val="standardContextual"/>
             </w:rPr>
           </w:pPr>
-          <w:hyperlink w:anchor="_Toc240676421" w:history="1">
+          <w:hyperlink w:anchor="_Toc240695497" w:history="1">
             <w:r>
               <w:rPr>
                 <w:rStyle w:val="a5"/>
@@ -1791,7 +1791,7 @@
               <w:rPr>
                 <w:noProof/>
               </w:rPr>
-              <w:instrText xml:space="preserve"> PAGEREF _Toc240676421 \h </w:instrText>
+              <w:instrText xml:space="preserve"> PAGEREF _Toc240695497 \h </w:instrText>
             </w:r>
             <w:r>
               <w:rPr>
@@ -1834,7 +1834,7 @@
               <w14:ligatures w14:val="standardContextual"/>
             </w:rPr>
           </w:pPr>
-          <w:hyperlink w:anchor="_Toc240676422" w:history="1">
+          <w:hyperlink w:anchor="_Toc240695498" w:history="1">
             <w:r>
               <w:rPr>
                 <w:rStyle w:val="a5"/>
@@ -1858,7 +1858,7 @@
               <w:rPr>
                 <w:noProof/>
               </w:rPr>
-              <w:instrText xml:space="preserve"> PAGEREF _Toc240676422 \h </w:instrText>
+              <w:instrText xml:space="preserve"> PAGEREF _Toc240695498 \h </w:instrText>
             </w:r>
             <w:r>
               <w:rPr>
@@ -1901,7 +1901,7 @@
               <w14:ligatures w14:val="standardContextual"/>
             </w:rPr>
           </w:pPr>
-          <w:hyperlink w:anchor="_Toc240676423" w:history="1">
+          <w:hyperlink w:anchor="_Toc240695499" w:history="1">
             <w:r>
               <w:rPr>
                 <w:rStyle w:val="a5"/>
@@ -1925,7 +1925,7 @@
               <w:rPr>
                 <w:noProof/>
               </w:rPr>
-              <w:instrText xml:space="preserve"> PAGEREF _Toc240676423 \h </w:instrText>
+              <w:instrText xml:space="preserve"> PAGEREF _Toc240695499 \h </w:instrText>
             </w:r>
             <w:r>
               <w:rPr>
@@ -1968,7 +1968,7 @@
               <w14:ligatures w14:val="standardContextual"/>
             </w:rPr>
           </w:pPr>
-          <w:hyperlink w:anchor="_Toc240676424" w:history="1">
+          <w:hyperlink w:anchor="_Toc240695500" w:history="1">
             <w:r>
               <w:rPr>
                 <w:rStyle w:val="a5"/>
@@ -1992,7 +1992,7 @@
               <w:rPr>
                 <w:noProof/>
               </w:rPr>
-              <w:instrText xml:space="preserve"> PAGEREF _Toc240676424 \h </w:instrText>
+              <w:instrText xml:space="preserve"> PAGEREF _Toc240695500 \h </w:instrText>
             </w:r>
             <w:r>
               <w:rPr>
@@ -2035,7 +2035,7 @@
               <w14:ligatures w14:val="standardContextual"/>
             </w:rPr>
           </w:pPr>
-          <w:hyperlink w:anchor="_Toc240676425" w:history="1">
+          <w:hyperlink w:anchor="_Toc240695501" w:history="1">
             <w:r>
               <w:rPr>
                 <w:rStyle w:val="a5"/>
@@ -2059,7 +2059,7 @@
               <w:rPr>
                 <w:noProof/>
               </w:rPr>
-              <w:instrText xml:space="preserve"> PAGEREF _Toc240676425 \h </w:instrText>
+              <w:instrText xml:space="preserve"> PAGEREF _Toc240695501 \h </w:instrText>
             </w:r>
             <w:r>
               <w:rPr>
@@ -2101,7 +2101,7 @@
               <w14:ligatures w14:val="standardContextual"/>
             </w:rPr>
           </w:pPr>
-          <w:hyperlink w:anchor="_Toc240676426" w:history="1">
+          <w:hyperlink w:anchor="_Toc240695502" w:history="1">
             <w:r>
               <w:rPr>
                 <w:rStyle w:val="a5"/>
@@ -2125,7 +2125,7 @@
               <w:rPr>
                 <w:noProof/>
               </w:rPr>
-              <w:instrText xml:space="preserve"> PAGEREF _Toc240676426 \h </w:instrText>
+              <w:instrText xml:space="preserve"> PAGEREF _Toc240695502 \h </w:instrText>
             </w:r>
             <w:r>
               <w:rPr>
@@ -2167,7 +2167,7 @@
               <w14:ligatures w14:val="standardContextual"/>
             </w:rPr>
           </w:pPr>
-          <w:hyperlink w:anchor="_Toc240676427" w:history="1">
+          <w:hyperlink w:anchor="_Toc240695503" w:history="1">
             <w:r>
               <w:rPr>
                 <w:rStyle w:val="a5"/>
@@ -2191,7 +2191,7 @@
               <w:rPr>
                 <w:noProof/>
               </w:rPr>
-              <w:instrText xml:space="preserve"> PAGEREF _Toc240676427 \h </w:instrText>
+              <w:instrText xml:space="preserve"> PAGEREF _Toc240695503 \h </w:instrText>
             </w:r>
             <w:r>
               <w:rPr>
@@ -2234,7 +2234,7 @@
               <w14:ligatures w14:val="standardContextual"/>
             </w:rPr>
           </w:pPr>
-          <w:hyperlink w:anchor="_Toc240676428" w:history="1">
+          <w:hyperlink w:anchor="_Toc240695504" w:history="1">
             <w:r>
               <w:rPr>
                 <w:rStyle w:val="a5"/>
@@ -2258,7 +2258,7 @@
               <w:rPr>
                 <w:noProof/>
               </w:rPr>
-              <w:instrText xml:space="preserve"> PAGEREF _Toc240676428 \h </w:instrText>
+              <w:instrText xml:space="preserve"> PAGEREF _Toc240695504 \h </w:instrText>
             </w:r>
             <w:r>
               <w:rPr>
@@ -2300,7 +2300,7 @@
               <w14:ligatures w14:val="standardContextual"/>
             </w:rPr>
           </w:pPr>
-          <w:hyperlink w:anchor="_Toc240676429" w:history="1">
+          <w:hyperlink w:anchor="_Toc240695505" w:history="1">
             <w:r>
               <w:rPr>
                 <w:rStyle w:val="a5"/>
@@ -2324,7 +2324,7 @@
               <w:rPr>
                 <w:noProof/>
               </w:rPr>
-              <w:instrText xml:space="preserve"> PAGEREF _Toc240676429 \h </w:instrText>
+              <w:instrText xml:space="preserve"> PAGEREF _Toc240695505 \h </w:instrText>
             </w:r>
             <w:r>
               <w:rPr>
@@ -2367,7 +2367,7 @@
               <w14:ligatures w14:val="standardContextual"/>
             </w:rPr>
           </w:pPr>
-          <w:hyperlink w:anchor="_Toc240676430" w:history="1">
+          <w:hyperlink w:anchor="_Toc240695506" w:history="1">
             <w:r>
               <w:rPr>
                 <w:rStyle w:val="a5"/>
@@ -2391,7 +2391,7 @@
               <w:rPr>
                 <w:noProof/>
               </w:rPr>
-              <w:instrText xml:space="preserve"> PAGEREF _Toc240676430 \h </w:instrText>
+              <w:instrText xml:space="preserve"> PAGEREF _Toc240695506 \h </w:instrText>
             </w:r>
             <w:r>
               <w:rPr>
@@ -2434,7 +2434,7 @@
               <w14:ligatures w14:val="standardContextual"/>
             </w:rPr>
           </w:pPr>
-          <w:hyperlink w:anchor="_Toc240676431" w:history="1">
+          <w:hyperlink w:anchor="_Toc240695507" w:history="1">
             <w:r>
               <w:rPr>
                 <w:rStyle w:val="a5"/>
@@ -2458,7 +2458,7 @@
               <w:rPr>
                 <w:noProof/>
               </w:rPr>
-              <w:instrText xml:space="preserve"> PAGEREF _Toc240676431 \h </w:instrText>
+              <w:instrText xml:space="preserve"> PAGEREF _Toc240695507 \h </w:instrText>
             </w:r>
             <w:r>
               <w:rPr>
@@ -2501,7 +2501,7 @@
               <w14:ligatures w14:val="standardContextual"/>
             </w:rPr>
           </w:pPr>
-          <w:hyperlink w:anchor="_Toc240676432" w:history="1">
+          <w:hyperlink w:anchor="_Toc240695508" w:history="1">
             <w:r>
               <w:rPr>
                 <w:rStyle w:val="a5"/>
@@ -2525,7 +2525,7 @@
               <w:rPr>
                 <w:noProof/>
               </w:rPr>
-              <w:instrText xml:space="preserve"> PAGEREF _Toc240676432 \h </w:instrText>
+              <w:instrText xml:space="preserve"> PAGEREF _Toc240695508 \h </w:instrText>
             </w:r>
             <w:r>
               <w:rPr>
@@ -2567,7 +2567,7 @@
               <w14:ligatures w14:val="standardContextual"/>
             </w:rPr>
           </w:pPr>
-          <w:hyperlink w:anchor="_Toc240676433" w:history="1">
+          <w:hyperlink w:anchor="_Toc240695509" w:history="1">
             <w:r>
               <w:rPr>
                 <w:rStyle w:val="a5"/>
@@ -2591,7 +2591,7 @@
               <w:rPr>
                 <w:noProof/>
               </w:rPr>
-              <w:instrText xml:space="preserve"> PAGEREF _Toc240676433 \h </w:instrText>
+              <w:instrText xml:space="preserve"> PAGEREF _Toc240695509 \h </w:instrText>
             </w:r>
             <w:r>
               <w:rPr>
@@ -2634,7 +2634,7 @@
               <w14:ligatures w14:val="standardContextual"/>
             </w:rPr>
           </w:pPr>
-          <w:hyperlink w:anchor="_Toc240676434" w:history="1">
+          <w:hyperlink w:anchor="_Toc240695510" w:history="1">
             <w:r>
               <w:rPr>
                 <w:rStyle w:val="a5"/>
@@ -2658,7 +2658,7 @@
               <w:rPr>
                 <w:noProof/>
               </w:rPr>
-              <w:instrText xml:space="preserve"> PAGEREF _Toc240676434 \h </w:instrText>
+              <w:instrText xml:space="preserve"> PAGEREF _Toc240695510 \h </w:instrText>
             </w:r>
             <w:r>
               <w:rPr>
@@ -2701,7 +2701,7 @@
               <w14:ligatures w14:val="standardContextual"/>
             </w:rPr>
           </w:pPr>
-          <w:hyperlink w:anchor="_Toc240676435" w:history="1">
+          <w:hyperlink w:anchor="_Toc240695511" w:history="1">
             <w:r>
               <w:rPr>
                 <w:rStyle w:val="a5"/>
@@ -2725,7 +2725,7 @@
               <w:rPr>
                 <w:noProof/>
               </w:rPr>
-              <w:instrText xml:space="preserve"> PAGEREF _Toc240676435 \h </w:instrText>
+              <w:instrText xml:space="preserve"> PAGEREF _Toc240695511 \h </w:instrText>
             </w:r>
             <w:r>
               <w:rPr>
@@ -2767,7 +2767,7 @@
               <w14:ligatures w14:val="standardContextual"/>
             </w:rPr>
           </w:pPr>
-          <w:hyperlink w:anchor="_Toc240676436" w:history="1">
+          <w:hyperlink w:anchor="_Toc240695512" w:history="1">
             <w:r>
               <w:rPr>
                 <w:rStyle w:val="a5"/>
@@ -2791,7 +2791,7 @@
               <w:rPr>
                 <w:noProof/>
               </w:rPr>
-              <w:instrText xml:space="preserve"> PAGEREF _Toc240676436 \h </w:instrText>
+              <w:instrText xml:space="preserve"> PAGEREF _Toc240695512 \h </w:instrText>
             </w:r>
             <w:r>
               <w:rPr>
@@ -2833,7 +2833,7 @@
               <w14:ligatures w14:val="standardContextual"/>
             </w:rPr>
           </w:pPr>
-          <w:hyperlink w:anchor="_Toc240676437" w:history="1">
+          <w:hyperlink w:anchor="_Toc240695513" w:history="1">
             <w:r>
               <w:rPr>
                 <w:rStyle w:val="a5"/>
@@ -2857,7 +2857,7 @@
               <w:rPr>
                 <w:noProof/>
               </w:rPr>
-              <w:instrText xml:space="preserve"> PAGEREF _Toc240676437 \h </w:instrText>
+              <w:instrText xml:space="preserve"> PAGEREF _Toc240695513 \h </w:instrText>
             </w:r>
             <w:r>
               <w:rPr>
@@ -2900,7 +2900,7 @@
               <w14:ligatures w14:val="standardContextual"/>
             </w:rPr>
           </w:pPr>
-          <w:hyperlink w:anchor="_Toc240676438" w:history="1">
+          <w:hyperlink w:anchor="_Toc240695514" w:history="1">
             <w:r>
               <w:rPr>
                 <w:rStyle w:val="a5"/>
@@ -2924,7 +2924,7 @@
               <w:rPr>
                 <w:noProof/>
               </w:rPr>
-              <w:instrText xml:space="preserve"> PAGEREF _Toc240676438 \h </w:instrText>
+              <w:instrText xml:space="preserve"> PAGEREF _Toc240695514 \h </w:instrText>
             </w:r>
             <w:r>
               <w:rPr>
@@ -2967,7 +2967,7 @@
               <w14:ligatures w14:val="standardContextual"/>
             </w:rPr>
           </w:pPr>
-          <w:hyperlink w:anchor="_Toc240676439" w:history="1">
+          <w:hyperlink w:anchor="_Toc240695515" w:history="1">
             <w:r>
               <w:rPr>
                 <w:rStyle w:val="a5"/>
@@ -2991,7 +2991,7 @@
               <w:rPr>
                 <w:noProof/>
               </w:rPr>
-              <w:instrText xml:space="preserve"> PAGEREF _Toc240676439 \h </w:instrText>
+              <w:instrText xml:space="preserve"> PAGEREF _Toc240695515 \h </w:instrText>
             </w:r>
             <w:r>
               <w:rPr>
@@ -3034,7 +3034,7 @@
               <w14:ligatures w14:val="standardContextual"/>
             </w:rPr>
           </w:pPr>
-          <w:hyperlink w:anchor="_Toc240676440" w:history="1">
+          <w:hyperlink w:anchor="_Toc240695516" w:history="1">
             <w:r>
               <w:rPr>
                 <w:rStyle w:val="a5"/>
@@ -3058,7 +3058,7 @@
               <w:rPr>
                 <w:noProof/>
               </w:rPr>
-              <w:instrText xml:space="preserve"> PAGEREF _Toc240676440 \h </w:instrText>
+              <w:instrText xml:space="preserve"> PAGEREF _Toc240695516 \h </w:instrText>
             </w:r>
             <w:r>
               <w:rPr>
@@ -3101,7 +3101,7 @@
               <w14:ligatures w14:val="standardContextual"/>
             </w:rPr>
           </w:pPr>
-          <w:hyperlink w:anchor="_Toc240676441" w:history="1">
+          <w:hyperlink w:anchor="_Toc240695517" w:history="1">
             <w:r>
               <w:rPr>
                 <w:rStyle w:val="a5"/>
@@ -3125,7 +3125,7 @@
               <w:rPr>
                 <w:noProof/>
               </w:rPr>
-              <w:instrText xml:space="preserve"> PAGEREF _Toc240676441 \h </w:instrText>
+              <w:instrText xml:space="preserve"> PAGEREF _Toc240695517 \h </w:instrText>
             </w:r>
             <w:r>
               <w:rPr>
@@ -3167,7 +3167,7 @@
               <w14:ligatures w14:val="standardContextual"/>
             </w:rPr>
           </w:pPr>
-          <w:hyperlink w:anchor="_Toc240676442" w:history="1">
+          <w:hyperlink w:anchor="_Toc240695518" w:history="1">
             <w:r>
               <w:rPr>
                 <w:rStyle w:val="a5"/>
@@ -3191,7 +3191,7 @@
               <w:rPr>
                 <w:noProof/>
               </w:rPr>
-              <w:instrText xml:space="preserve"> PAGEREF _Toc240676442 \h </w:instrText>
+              <w:instrText xml:space="preserve"> PAGEREF _Toc240695518 \h </w:instrText>
             </w:r>
             <w:r>
               <w:rPr>
@@ -3233,7 +3233,7 @@
               <w14:ligatures w14:val="standardContextual"/>
             </w:rPr>
           </w:pPr>
-          <w:hyperlink w:anchor="_Toc240676443" w:history="1">
+          <w:hyperlink w:anchor="_Toc240695519" w:history="1">
             <w:r>
               <w:rPr>
                 <w:rStyle w:val="a5"/>
@@ -3257,7 +3257,7 @@
               <w:rPr>
                 <w:noProof/>
               </w:rPr>
-              <w:instrText xml:space="preserve"> PAGEREF _Toc240676443 \h </w:instrText>
+              <w:instrText xml:space="preserve"> PAGEREF _Toc240695519 \h </w:instrText>
             </w:r>
             <w:r>
               <w:rPr>
@@ -3299,7 +3299,7 @@
               <w14:ligatures w14:val="standardContextual"/>
             </w:rPr>
           </w:pPr>
-          <w:hyperlink w:anchor="_Toc240676444" w:history="1">
+          <w:hyperlink w:anchor="_Toc240695520" w:history="1">
             <w:r>
               <w:rPr>
                 <w:rStyle w:val="a5"/>
@@ -3323,7 +3323,7 @@
               <w:rPr>
                 <w:noProof/>
               </w:rPr>
-              <w:instrText xml:space="preserve"> PAGEREF _Toc240676444 \h </w:instrText>
+              <w:instrText xml:space="preserve"> PAGEREF _Toc240695520 \h </w:instrText>
             </w:r>
             <w:r>
               <w:rPr>
@@ -3365,7 +3365,7 @@
               <w14:ligatures w14:val="standardContextual"/>
             </w:rPr>
           </w:pPr>
-          <w:hyperlink w:anchor="_Toc240676445" w:history="1">
+          <w:hyperlink w:anchor="_Toc240695521" w:history="1">
             <w:r>
               <w:rPr>
                 <w:rStyle w:val="a5"/>
@@ -3389,7 +3389,7 @@
               <w:rPr>
                 <w:noProof/>
               </w:rPr>
-              <w:instrText xml:space="preserve"> PAGEREF _Toc240676445 \h </w:instrText>
+              <w:instrText xml:space="preserve"> PAGEREF _Toc240695521 \h </w:instrText>
             </w:r>
             <w:r>
               <w:rPr>
@@ -3432,7 +3432,7 @@
               <w14:ligatures w14:val="standardContextual"/>
             </w:rPr>
           </w:pPr>
-          <w:hyperlink w:anchor="_Toc240676446" w:history="1">
+          <w:hyperlink w:anchor="_Toc240695522" w:history="1">
             <w:r>
               <w:rPr>
                 <w:rStyle w:val="a5"/>
@@ -3456,7 +3456,7 @@
               <w:rPr>
                 <w:noProof/>
               </w:rPr>
-              <w:instrText xml:space="preserve"> PAGEREF _Toc240676446 \h </w:instrText>
+              <w:instrText xml:space="preserve"> PAGEREF _Toc240695522 \h </w:instrText>
             </w:r>
             <w:r>
               <w:rPr>
@@ -3499,7 +3499,7 @@
               <w14:ligatures w14:val="standardContextual"/>
             </w:rPr>
           </w:pPr>
-          <w:hyperlink w:anchor="_Toc240676447" w:history="1">
+          <w:hyperlink w:anchor="_Toc240695523" w:history="1">
             <w:r>
               <w:rPr>
                 <w:rStyle w:val="a5"/>
@@ -3523,7 +3523,7 @@
               <w:rPr>
                 <w:noProof/>
               </w:rPr>
-              <w:instrText xml:space="preserve"> PAGEREF _Toc240676447 \h </w:instrText>
+              <w:instrText xml:space="preserve"> PAGEREF _Toc240695523 \h </w:instrText>
             </w:r>
             <w:r>
               <w:rPr>
@@ -3566,7 +3566,7 @@
               <w14:ligatures w14:val="standardContextual"/>
             </w:rPr>
           </w:pPr>
-          <w:hyperlink w:anchor="_Toc240676448" w:history="1">
+          <w:hyperlink w:anchor="_Toc240695524" w:history="1">
             <w:r>
               <w:rPr>
                 <w:rStyle w:val="a5"/>
@@ -3590,7 +3590,7 @@
               <w:rPr>
                 <w:noProof/>
               </w:rPr>
-              <w:instrText xml:space="preserve"> PAGEREF _Toc240676448 \h </w:instrText>
+              <w:instrText xml:space="preserve"> PAGEREF _Toc240695524 \h </w:instrText>
             </w:r>
             <w:r>
               <w:rPr>
@@ -3633,7 +3633,7 @@
               <w14:ligatures w14:val="standardContextual"/>
             </w:rPr>
           </w:pPr>
-          <w:hyperlink w:anchor="_Toc240676449" w:history="1">
+          <w:hyperlink w:anchor="_Toc240695525" w:history="1">
             <w:r>
               <w:rPr>
                 <w:rStyle w:val="a5"/>
@@ -3657,7 +3657,7 @@
               <w:rPr>
                 <w:noProof/>
               </w:rPr>
-              <w:instrText xml:space="preserve"> PAGEREF _Toc240676449 \h </w:instrText>
+              <w:instrText xml:space="preserve"> PAGEREF _Toc240695525 \h </w:instrText>
             </w:r>
             <w:r>
               <w:rPr>
@@ -3700,7 +3700,7 @@
               <w14:ligatures w14:val="standardContextual"/>
             </w:rPr>
           </w:pPr>
-          <w:hyperlink w:anchor="_Toc240676450" w:history="1">
+          <w:hyperlink w:anchor="_Toc240695526" w:history="1">
             <w:r>
               <w:rPr>
                 <w:rStyle w:val="a5"/>
@@ -3724,7 +3724,7 @@
               <w:rPr>
                 <w:noProof/>
               </w:rPr>
-              <w:instrText xml:space="preserve"> PAGEREF _Toc240676450 \h </w:instrText>
+              <w:instrText xml:space="preserve"> PAGEREF _Toc240695526 \h </w:instrText>
             </w:r>
             <w:r>
               <w:rPr>
@@ -3763,7 +3763,7 @@
         <w:pStyle w:val="1"/>
         <w:pageBreakBefore/>
       </w:pPr>
-      <w:bookmarkStart w:id="0" w:name="_Toc240676403"/>
+      <w:bookmarkStart w:id="0" w:name="_Toc240695479"/>
       <w:r>
         <w:lastRenderedPageBreak/>
         <w:t xml:space="preserve">1. </w:t>
@@ -3777,7 +3777,7 @@
       <w:pPr>
         <w:pStyle w:val="2"/>
       </w:pPr>
-      <w:bookmarkStart w:id="1" w:name="_Toc240676404"/>
+      <w:bookmarkStart w:id="1" w:name="_Toc240695480"/>
       <w:r>
         <w:t>1.1 RuninqVic</w:t>
       </w:r>
@@ -4187,7 +4187,7 @@
       <w:pPr>
         <w:pStyle w:val="2"/>
       </w:pPr>
-      <w:bookmarkStart w:id="2" w:name="_Toc240676405"/>
+      <w:bookmarkStart w:id="2" w:name="_Toc240695481"/>
       <w:r>
         <w:t xml:space="preserve">1.2 </w:t>
       </w:r>
@@ -7452,7 +7452,7 @@
       <w:pPr>
         <w:pStyle w:val="2"/>
       </w:pPr>
-      <w:bookmarkStart w:id="3" w:name="_Toc240676406"/>
+      <w:bookmarkStart w:id="3" w:name="_Toc240695482"/>
       <w:r>
         <w:t xml:space="preserve">1.3 </w:t>
       </w:r>
@@ -7684,7 +7684,7 @@
         <w:pStyle w:val="1"/>
         <w:pageBreakBefore/>
       </w:pPr>
-      <w:bookmarkStart w:id="4" w:name="_Toc240676407"/>
+      <w:bookmarkStart w:id="4" w:name="_Toc240695483"/>
       <w:r>
         <w:lastRenderedPageBreak/>
         <w:t xml:space="preserve">2. </w:t>
@@ -7698,7 +7698,7 @@
       <w:pPr>
         <w:pStyle w:val="2"/>
       </w:pPr>
-      <w:bookmarkStart w:id="5" w:name="_Toc240676408"/>
+      <w:bookmarkStart w:id="5" w:name="_Toc240695484"/>
       <w:r>
         <w:t xml:space="preserve">2.1 </w:t>
       </w:r>
@@ -8676,7 +8676,7 @@
       <w:pPr>
         <w:pStyle w:val="2"/>
       </w:pPr>
-      <w:bookmarkStart w:id="6" w:name="_Toc240676409"/>
+      <w:bookmarkStart w:id="6" w:name="_Toc240695485"/>
       <w:r>
         <w:t xml:space="preserve">2.2 </w:t>
       </w:r>
@@ -9030,10 +9030,10 @@
         </w:rPr>
         <w:lastRenderedPageBreak/>
         <w:drawing>
-          <wp:inline distT="0" distB="0" distL="0" distR="0" wp14:anchorId="1A38882C" wp14:editId="05CCAEBE">
+          <wp:inline distT="0" distB="0" distL="0" distR="0" wp14:anchorId="7DCC98CD" wp14:editId="2D0EDA1F">
             <wp:extent cx="5943600" cy="3638550"/>
             <wp:effectExtent l="0" t="0" r="0" b="0"/>
-            <wp:docPr id="1573582282" name="그림 1573582282"/>
+            <wp:docPr id="1818662760" name="그림 1818662760"/>
             <wp:cNvGraphicFramePr>
               <a:graphicFrameLocks xmlns:a="http://schemas.openxmlformats.org/drawingml/2006/main" noChangeAspect="1"/>
             </wp:cNvGraphicFramePr>
@@ -9149,7 +9149,7 @@
       <w:pPr>
         <w:pStyle w:val="2"/>
       </w:pPr>
-      <w:bookmarkStart w:id="7" w:name="_Toc240676410"/>
+      <w:bookmarkStart w:id="7" w:name="_Toc240695486"/>
       <w:r>
         <w:t xml:space="preserve">2.3 </w:t>
       </w:r>
@@ -9174,10 +9174,10 @@
           <w:noProof/>
         </w:rPr>
         <w:drawing>
-          <wp:inline distT="0" distB="0" distL="0" distR="0" wp14:anchorId="18586FB0" wp14:editId="13C1836A">
+          <wp:inline distT="0" distB="0" distL="0" distR="0" wp14:anchorId="2DD2B599" wp14:editId="078D7C5D">
             <wp:extent cx="5943600" cy="3638550"/>
             <wp:effectExtent l="0" t="0" r="0" b="0"/>
-            <wp:docPr id="618026189" name="그림 618026189"/>
+            <wp:docPr id="776014814" name="그림 776014814"/>
             <wp:cNvGraphicFramePr>
               <a:graphicFrameLocks xmlns:a="http://schemas.openxmlformats.org/drawingml/2006/main" noChangeAspect="1"/>
             </wp:cNvGraphicFramePr>
@@ -10607,7 +10607,7 @@
       <w:pPr>
         <w:pStyle w:val="2"/>
       </w:pPr>
-      <w:bookmarkStart w:id="8" w:name="_Toc240676411"/>
+      <w:bookmarkStart w:id="8" w:name="_Toc240695487"/>
       <w:r>
         <w:t xml:space="preserve">2.4 </w:t>
       </w:r>
@@ -10633,10 +10633,10 @@
         </w:rPr>
         <w:lastRenderedPageBreak/>
         <w:drawing>
-          <wp:inline distT="0" distB="0" distL="0" distR="0" wp14:anchorId="01DB3022" wp14:editId="50D24BC9">
+          <wp:inline distT="0" distB="0" distL="0" distR="0" wp14:anchorId="59E89DBA" wp14:editId="4BF7CD46">
             <wp:extent cx="5943600" cy="12858750"/>
             <wp:effectExtent l="0" t="0" r="0" b="0"/>
-            <wp:docPr id="1698734778" name="그림 1698734778"/>
+            <wp:docPr id="286227311" name="그림 286227311"/>
             <wp:cNvGraphicFramePr>
               <a:graphicFrameLocks xmlns:a="http://schemas.openxmlformats.org/drawingml/2006/main" noChangeAspect="1"/>
             </wp:cNvGraphicFramePr>
@@ -15460,10 +15460,10 @@
         </w:rPr>
         <w:lastRenderedPageBreak/>
         <w:drawing>
-          <wp:inline distT="0" distB="0" distL="0" distR="0" wp14:anchorId="2EB24A25" wp14:editId="08D33C0B">
+          <wp:inline distT="0" distB="0" distL="0" distR="0" wp14:anchorId="7C8AD510" wp14:editId="751CB075">
             <wp:extent cx="5943600" cy="12858750"/>
             <wp:effectExtent l="0" t="0" r="0" b="0"/>
-            <wp:docPr id="738598875" name="그림 738598875"/>
+            <wp:docPr id="92676109" name="그림 92676109"/>
             <wp:cNvGraphicFramePr>
               <a:graphicFrameLocks xmlns:a="http://schemas.openxmlformats.org/drawingml/2006/main" noChangeAspect="1"/>
             </wp:cNvGraphicFramePr>
@@ -15691,7 +15691,7 @@
         <w:pStyle w:val="1"/>
         <w:pageBreakBefore/>
       </w:pPr>
-      <w:bookmarkStart w:id="9" w:name="_Toc240676412"/>
+      <w:bookmarkStart w:id="9" w:name="_Toc240695488"/>
       <w:r>
         <w:lastRenderedPageBreak/>
         <w:t>3. 5</w:t>
@@ -16395,7 +16395,7 @@
         <w:pStyle w:val="1"/>
         <w:pageBreakBefore/>
       </w:pPr>
-      <w:bookmarkStart w:id="10" w:name="_Toc240676413"/>
+      <w:bookmarkStart w:id="10" w:name="_Toc240695489"/>
       <w:r>
         <w:lastRenderedPageBreak/>
         <w:t xml:space="preserve">4. </w:t>
@@ -16474,7 +16474,7 @@
       <w:pPr>
         <w:pStyle w:val="2"/>
       </w:pPr>
-      <w:bookmarkStart w:id="11" w:name="_Toc240676414"/>
+      <w:bookmarkStart w:id="11" w:name="_Toc240695490"/>
       <w:r>
         <w:t xml:space="preserve">4.1 ① </w:t>
       </w:r>
@@ -17196,7 +17196,7 @@
       <w:pPr>
         <w:pStyle w:val="2"/>
       </w:pPr>
-      <w:bookmarkStart w:id="12" w:name="_Toc240676415"/>
+      <w:bookmarkStart w:id="12" w:name="_Toc240695491"/>
       <w:r>
         <w:t xml:space="preserve">4.2 ② </w:t>
       </w:r>
@@ -17768,7 +17768,7 @@
       <w:pPr>
         <w:pStyle w:val="2"/>
       </w:pPr>
-      <w:bookmarkStart w:id="13" w:name="_Toc240676416"/>
+      <w:bookmarkStart w:id="13" w:name="_Toc240695492"/>
       <w:r>
         <w:t xml:space="preserve">4.2.1 </w:t>
       </w:r>
@@ -17806,10 +17806,10 @@
         </w:rPr>
         <w:lastRenderedPageBreak/>
         <w:drawing>
-          <wp:inline distT="0" distB="0" distL="0" distR="0" wp14:anchorId="2AB33A3B" wp14:editId="38CDA0CE">
+          <wp:inline distT="0" distB="0" distL="0" distR="0" wp14:anchorId="68AA7D33" wp14:editId="6F9201BD">
             <wp:extent cx="5943600" cy="3638550"/>
             <wp:effectExtent l="0" t="0" r="0" b="0"/>
-            <wp:docPr id="1372296469" name="그림 1372296469"/>
+            <wp:docPr id="489997642" name="그림 489997642"/>
             <wp:cNvGraphicFramePr>
               <a:graphicFrameLocks xmlns:a="http://schemas.openxmlformats.org/drawingml/2006/main" noChangeAspect="1"/>
             </wp:cNvGraphicFramePr>
@@ -22734,7 +22734,7 @@
       <w:pPr>
         <w:pStyle w:val="2"/>
       </w:pPr>
-      <w:bookmarkStart w:id="14" w:name="_Toc240676417"/>
+      <w:bookmarkStart w:id="14" w:name="_Toc240695493"/>
       <w:r>
         <w:t xml:space="preserve">4.3 ③ </w:t>
       </w:r>
@@ -24344,7 +24344,7 @@
       <w:pPr>
         <w:pStyle w:val="2"/>
       </w:pPr>
-      <w:bookmarkStart w:id="15" w:name="_Toc240676418"/>
+      <w:bookmarkStart w:id="15" w:name="_Toc240695494"/>
       <w:r>
         <w:t xml:space="preserve">4.4 ④ </w:t>
       </w:r>
@@ -24851,7 +24851,7 @@
         <w:pStyle w:val="1"/>
         <w:pageBreakBefore/>
       </w:pPr>
-      <w:bookmarkStart w:id="16" w:name="_Toc240676419"/>
+      <w:bookmarkStart w:id="16" w:name="_Toc240695495"/>
       <w:r>
         <w:lastRenderedPageBreak/>
         <w:t xml:space="preserve">5. </w:t>
@@ -24877,7 +24877,7 @@
       <w:pPr>
         <w:pStyle w:val="2"/>
       </w:pPr>
-      <w:bookmarkStart w:id="17" w:name="_Toc240676420"/>
+      <w:bookmarkStart w:id="17" w:name="_Toc240695496"/>
       <w:r>
         <w:t xml:space="preserve">5.1 </w:t>
       </w:r>
@@ -25186,7 +25186,7 @@
       <w:pPr>
         <w:pStyle w:val="2"/>
       </w:pPr>
-      <w:bookmarkStart w:id="18" w:name="_Toc240676421"/>
+      <w:bookmarkStart w:id="18" w:name="_Toc240695497"/>
       <w:r>
         <w:t xml:space="preserve">5.2 </w:t>
       </w:r>
@@ -25715,7 +25715,7 @@
       <w:pPr>
         <w:pStyle w:val="2"/>
       </w:pPr>
-      <w:bookmarkStart w:id="19" w:name="_Toc240676422"/>
+      <w:bookmarkStart w:id="19" w:name="_Toc240695498"/>
       <w:r>
         <w:t xml:space="preserve">5.3 </w:t>
       </w:r>
@@ -25986,7 +25986,7 @@
       <w:pPr>
         <w:pStyle w:val="2"/>
       </w:pPr>
-      <w:bookmarkStart w:id="20" w:name="_Toc240676423"/>
+      <w:bookmarkStart w:id="20" w:name="_Toc240695499"/>
       <w:r>
         <w:t xml:space="preserve">5.4 </w:t>
       </w:r>
@@ -26196,7 +26196,7 @@
       <w:pPr>
         <w:pStyle w:val="2"/>
       </w:pPr>
-      <w:bookmarkStart w:id="21" w:name="_Toc240676424"/>
+      <w:bookmarkStart w:id="21" w:name="_Toc240695500"/>
       <w:r>
         <w:t xml:space="preserve">5.5 </w:t>
       </w:r>
@@ -26419,7 +26419,7 @@
       <w:pPr>
         <w:pStyle w:val="2"/>
       </w:pPr>
-      <w:bookmarkStart w:id="22" w:name="_Toc240676425"/>
+      <w:bookmarkStart w:id="22" w:name="_Toc240695501"/>
       <w:r>
         <w:t xml:space="preserve">5.6 </w:t>
       </w:r>
@@ -26540,7 +26540,7 @@
         <w:pStyle w:val="1"/>
         <w:pageBreakBefore/>
       </w:pPr>
-      <w:bookmarkStart w:id="23" w:name="_Toc240676426"/>
+      <w:bookmarkStart w:id="23" w:name="_Toc240695502"/>
       <w:r>
         <w:lastRenderedPageBreak/>
         <w:t xml:space="preserve">6. </w:t>
@@ -28389,7 +28389,7 @@
         <w:pStyle w:val="1"/>
         <w:pageBreakBefore/>
       </w:pPr>
-      <w:bookmarkStart w:id="24" w:name="_Toc240676427"/>
+      <w:bookmarkStart w:id="24" w:name="_Toc240695503"/>
       <w:r>
         <w:lastRenderedPageBreak/>
         <w:t xml:space="preserve">7. </w:t>
@@ -28409,10 +28409,10 @@
           <w:noProof/>
         </w:rPr>
         <w:drawing>
-          <wp:inline distT="0" distB="0" distL="0" distR="0" wp14:anchorId="439EE197" wp14:editId="41414721">
+          <wp:inline distT="0" distB="0" distL="0" distR="0" wp14:anchorId="4F59A54C" wp14:editId="3D273558">
             <wp:extent cx="5943600" cy="3638550"/>
             <wp:effectExtent l="0" t="0" r="0" b="0"/>
-            <wp:docPr id="1843570969" name="그림 1843570969"/>
+            <wp:docPr id="1621081773" name="그림 1621081773"/>
             <wp:cNvGraphicFramePr>
               <a:graphicFrameLocks xmlns:a="http://schemas.openxmlformats.org/drawingml/2006/main" noChangeAspect="1"/>
             </wp:cNvGraphicFramePr>
@@ -31218,7 +31218,7 @@
       <w:pPr>
         <w:pStyle w:val="2"/>
       </w:pPr>
-      <w:bookmarkStart w:id="25" w:name="_Toc240676428"/>
+      <w:bookmarkStart w:id="25" w:name="_Toc240695504"/>
       <w:r>
         <w:t xml:space="preserve">7.1 </w:t>
       </w:r>
@@ -31249,10 +31249,10 @@
           <w:noProof/>
         </w:rPr>
         <w:drawing>
-          <wp:inline distT="0" distB="0" distL="0" distR="0" wp14:anchorId="00529EB3" wp14:editId="7C9EE71B">
+          <wp:inline distT="0" distB="0" distL="0" distR="0" wp14:anchorId="2436378E" wp14:editId="4EFDFA1B">
             <wp:extent cx="5943600" cy="3638550"/>
             <wp:effectExtent l="0" t="0" r="0" b="0"/>
-            <wp:docPr id="1146758274" name="그림 1146758274"/>
+            <wp:docPr id="1943874361" name="그림 1943874361"/>
             <wp:cNvGraphicFramePr>
               <a:graphicFrameLocks xmlns:a="http://schemas.openxmlformats.org/drawingml/2006/main" noChangeAspect="1"/>
             </wp:cNvGraphicFramePr>
@@ -34901,7 +34901,7 @@
         <w:pStyle w:val="1"/>
         <w:pageBreakBefore/>
       </w:pPr>
-      <w:bookmarkStart w:id="26" w:name="_Toc240676429"/>
+      <w:bookmarkStart w:id="26" w:name="_Toc240695505"/>
       <w:r>
         <w:lastRenderedPageBreak/>
         <w:t xml:space="preserve">8. </w:t>
@@ -34921,10 +34921,10 @@
           <w:noProof/>
         </w:rPr>
         <w:drawing>
-          <wp:inline distT="0" distB="0" distL="0" distR="0" wp14:anchorId="7714EBD8" wp14:editId="78A8C16A">
+          <wp:inline distT="0" distB="0" distL="0" distR="0" wp14:anchorId="0070CE81" wp14:editId="02AEE589">
             <wp:extent cx="5943600" cy="3638550"/>
             <wp:effectExtent l="0" t="0" r="0" b="0"/>
-            <wp:docPr id="1586455060" name="그림 1586455060"/>
+            <wp:docPr id="1030006409" name="그림 1030006409"/>
             <wp:cNvGraphicFramePr>
               <a:graphicFrameLocks xmlns:a="http://schemas.openxmlformats.org/drawingml/2006/main" noChangeAspect="1"/>
             </wp:cNvGraphicFramePr>
@@ -35020,7 +35020,7 @@
       <w:pPr>
         <w:pStyle w:val="2"/>
       </w:pPr>
-      <w:bookmarkStart w:id="27" w:name="_Toc240676430"/>
+      <w:bookmarkStart w:id="27" w:name="_Toc240695506"/>
       <w:r>
         <w:t xml:space="preserve">8.1 </w:t>
       </w:r>
@@ -36108,7 +36108,7 @@
       <w:pPr>
         <w:pStyle w:val="2"/>
       </w:pPr>
-      <w:bookmarkStart w:id="28" w:name="_Toc240676431"/>
+      <w:bookmarkStart w:id="28" w:name="_Toc240695507"/>
       <w:r>
         <w:t xml:space="preserve">8.2 </w:t>
       </w:r>
@@ -37361,7 +37361,7 @@
       <w:pPr>
         <w:pStyle w:val="2"/>
       </w:pPr>
-      <w:bookmarkStart w:id="29" w:name="_Toc240676432"/>
+      <w:bookmarkStart w:id="29" w:name="_Toc240695508"/>
       <w:r>
         <w:t xml:space="preserve">8.3 </w:t>
       </w:r>
@@ -37614,7 +37614,7 @@
         <w:pStyle w:val="1"/>
         <w:pageBreakBefore/>
       </w:pPr>
-      <w:bookmarkStart w:id="30" w:name="_Toc240676433"/>
+      <w:bookmarkStart w:id="30" w:name="_Toc240695509"/>
       <w:r>
         <w:lastRenderedPageBreak/>
         <w:t xml:space="preserve">9. </w:t>
@@ -37634,10 +37634,10 @@
           <w:noProof/>
         </w:rPr>
         <w:drawing>
-          <wp:inline distT="0" distB="0" distL="0" distR="0" wp14:anchorId="7D10FAC3" wp14:editId="0F710367">
+          <wp:inline distT="0" distB="0" distL="0" distR="0" wp14:anchorId="0AA874DE" wp14:editId="7B981B2F">
             <wp:extent cx="5943600" cy="3638550"/>
             <wp:effectExtent l="0" t="0" r="0" b="0"/>
-            <wp:docPr id="1461991962" name="그림 1461991962"/>
+            <wp:docPr id="29071146" name="그림 29071146"/>
             <wp:cNvGraphicFramePr>
               <a:graphicFrameLocks xmlns:a="http://schemas.openxmlformats.org/drawingml/2006/main" noChangeAspect="1"/>
             </wp:cNvGraphicFramePr>
@@ -37733,7 +37733,7 @@
       <w:pPr>
         <w:pStyle w:val="2"/>
       </w:pPr>
-      <w:bookmarkStart w:id="31" w:name="_Toc240676434"/>
+      <w:bookmarkStart w:id="31" w:name="_Toc240695510"/>
       <w:r>
         <w:t xml:space="preserve">9.1 </w:t>
       </w:r>
@@ -39109,7 +39109,7 @@
       <w:pPr>
         <w:pStyle w:val="2"/>
       </w:pPr>
-      <w:bookmarkStart w:id="32" w:name="_Toc240676435"/>
+      <w:bookmarkStart w:id="32" w:name="_Toc240695511"/>
       <w:r>
         <w:t xml:space="preserve">9.2 </w:t>
       </w:r>
@@ -39278,7 +39278,7 @@
         <w:pStyle w:val="1"/>
         <w:pageBreakBefore/>
       </w:pPr>
-      <w:bookmarkStart w:id="33" w:name="_Toc240676436"/>
+      <w:bookmarkStart w:id="33" w:name="_Toc240695512"/>
       <w:r>
         <w:lastRenderedPageBreak/>
         <w:t xml:space="preserve">10. </w:t>
@@ -39304,10 +39304,10 @@
           <w:noProof/>
         </w:rPr>
         <w:drawing>
-          <wp:inline distT="0" distB="0" distL="0" distR="0" wp14:anchorId="7D9C43EE" wp14:editId="6EE70688">
+          <wp:inline distT="0" distB="0" distL="0" distR="0" wp14:anchorId="1557C3EC" wp14:editId="6303FA31">
             <wp:extent cx="5943600" cy="3638550"/>
             <wp:effectExtent l="0" t="0" r="0" b="0"/>
-            <wp:docPr id="968152485" name="그림 968152485"/>
+            <wp:docPr id="1568502788" name="그림 1568502788"/>
             <wp:cNvGraphicFramePr>
               <a:graphicFrameLocks xmlns:a="http://schemas.openxmlformats.org/drawingml/2006/main" noChangeAspect="1"/>
             </wp:cNvGraphicFramePr>
@@ -40943,7 +40943,7 @@
         <w:pStyle w:val="1"/>
         <w:pageBreakBefore/>
       </w:pPr>
-      <w:bookmarkStart w:id="34" w:name="_Toc240676437"/>
+      <w:bookmarkStart w:id="34" w:name="_Toc240695513"/>
       <w:r>
         <w:lastRenderedPageBreak/>
         <w:t xml:space="preserve">11. </w:t>
@@ -40969,10 +40969,10 @@
           <w:noProof/>
         </w:rPr>
         <w:drawing>
-          <wp:inline distT="0" distB="0" distL="0" distR="0" wp14:anchorId="2FF28006" wp14:editId="05264053">
+          <wp:inline distT="0" distB="0" distL="0" distR="0" wp14:anchorId="2AA21241" wp14:editId="26A30309">
             <wp:extent cx="5943600" cy="3638550"/>
             <wp:effectExtent l="0" t="0" r="0" b="0"/>
-            <wp:docPr id="1151975590" name="그림 1151975590"/>
+            <wp:docPr id="1653896289" name="그림 1653896289"/>
             <wp:cNvGraphicFramePr>
               <a:graphicFrameLocks xmlns:a="http://schemas.openxmlformats.org/drawingml/2006/main" noChangeAspect="1"/>
             </wp:cNvGraphicFramePr>
@@ -41088,7 +41088,7 @@
       <w:pPr>
         <w:pStyle w:val="2"/>
       </w:pPr>
-      <w:bookmarkStart w:id="35" w:name="_Toc240676438"/>
+      <w:bookmarkStart w:id="35" w:name="_Toc240695514"/>
       <w:r>
         <w:t xml:space="preserve">11.1 </w:t>
       </w:r>
@@ -42387,7 +42387,7 @@
       <w:pPr>
         <w:pStyle w:val="2"/>
       </w:pPr>
-      <w:bookmarkStart w:id="36" w:name="_Toc240676439"/>
+      <w:bookmarkStart w:id="36" w:name="_Toc240695515"/>
       <w:r>
         <w:t xml:space="preserve">11.2 </w:t>
       </w:r>
@@ -42828,7 +42828,7 @@
       <w:pPr>
         <w:pStyle w:val="2"/>
       </w:pPr>
-      <w:bookmarkStart w:id="37" w:name="_Toc240676440"/>
+      <w:bookmarkStart w:id="37" w:name="_Toc240695516"/>
       <w:r>
         <w:t xml:space="preserve">11.3 </w:t>
       </w:r>
@@ -43368,7 +43368,7 @@
       <w:pPr>
         <w:pStyle w:val="2"/>
       </w:pPr>
-      <w:bookmarkStart w:id="38" w:name="_Toc240676441"/>
+      <w:bookmarkStart w:id="38" w:name="_Toc240695517"/>
       <w:r>
         <w:t xml:space="preserve">11.4 </w:t>
       </w:r>
@@ -43415,10 +43415,10 @@
         </w:rPr>
         <w:lastRenderedPageBreak/>
         <w:drawing>
-          <wp:inline distT="0" distB="0" distL="0" distR="0" wp14:anchorId="277E50F9" wp14:editId="33F5295D">
+          <wp:inline distT="0" distB="0" distL="0" distR="0" wp14:anchorId="56B82551" wp14:editId="717C8557">
             <wp:extent cx="5943600" cy="3752850"/>
             <wp:effectExtent l="0" t="0" r="0" b="0"/>
-            <wp:docPr id="1066998561" name="그림 1066998561"/>
+            <wp:docPr id="1510730522" name="그림 1510730522"/>
             <wp:cNvGraphicFramePr>
               <a:graphicFrameLocks xmlns:a="http://schemas.openxmlformats.org/drawingml/2006/main" noChangeAspect="1"/>
             </wp:cNvGraphicFramePr>
@@ -45520,7 +45520,7 @@
         <w:pStyle w:val="1"/>
         <w:pageBreakBefore/>
       </w:pPr>
-      <w:bookmarkStart w:id="39" w:name="_Toc240676442"/>
+      <w:bookmarkStart w:id="39" w:name="_Toc240695518"/>
       <w:r>
         <w:lastRenderedPageBreak/>
         <w:t xml:space="preserve">12. </w:t>
@@ -46978,7 +46978,7 @@
         <w:pStyle w:val="1"/>
         <w:pageBreakBefore/>
       </w:pPr>
-      <w:bookmarkStart w:id="40" w:name="_Toc240676443"/>
+      <w:bookmarkStart w:id="40" w:name="_Toc240695519"/>
       <w:r>
         <w:lastRenderedPageBreak/>
         <w:t xml:space="preserve">13. </w:t>
@@ -48059,7 +48059,7 @@
         <w:pStyle w:val="1"/>
         <w:pageBreakBefore/>
       </w:pPr>
-      <w:bookmarkStart w:id="41" w:name="_Toc240676444"/>
+      <w:bookmarkStart w:id="41" w:name="_Toc240695520"/>
       <w:r>
         <w:lastRenderedPageBreak/>
         <w:t xml:space="preserve">14. </w:t>
@@ -51984,7 +51984,7 @@
         <w:pStyle w:val="1"/>
         <w:pageBreakBefore/>
       </w:pPr>
-      <w:bookmarkStart w:id="42" w:name="_Toc240676445"/>
+      <w:bookmarkStart w:id="42" w:name="_Toc240695521"/>
       <w:r>
         <w:lastRenderedPageBreak/>
         <w:t>부록</w:t>
@@ -51995,7 +51995,7 @@
       <w:pPr>
         <w:pStyle w:val="2"/>
       </w:pPr>
-      <w:bookmarkStart w:id="43" w:name="_Toc240676446"/>
+      <w:bookmarkStart w:id="43" w:name="_Toc240695522"/>
       <w:r>
         <w:t xml:space="preserve">A. </w:t>
       </w:r>
@@ -52576,7 +52576,7 @@
       <w:pPr>
         <w:pStyle w:val="2"/>
       </w:pPr>
-      <w:bookmarkStart w:id="44" w:name="_Toc240676447"/>
+      <w:bookmarkStart w:id="44" w:name="_Toc240695523"/>
       <w:r>
         <w:t xml:space="preserve">B. </w:t>
       </w:r>
@@ -52811,7 +52811,7 @@
       <w:pPr>
         <w:pStyle w:val="2"/>
       </w:pPr>
-      <w:bookmarkStart w:id="45" w:name="_Toc240676448"/>
+      <w:bookmarkStart w:id="45" w:name="_Toc240695524"/>
       <w:r>
         <w:t xml:space="preserve">C. </w:t>
       </w:r>
@@ -53886,7 +53886,7 @@
       <w:pPr>
         <w:pStyle w:val="2"/>
       </w:pPr>
-      <w:bookmarkStart w:id="46" w:name="_Toc240676449"/>
+      <w:bookmarkStart w:id="46" w:name="_Toc240695525"/>
       <w:r>
         <w:t xml:space="preserve">E. </w:t>
       </w:r>
@@ -57610,6 +57610,328 @@
                 <w:sz w:val="19"/>
                 <w:szCs w:val="19"/>
               </w:rPr>
+              <w:t>코드는</w:t>
+            </w:r>
+            <w:r>
+              <w:rPr>
+                <w:sz w:val="19"/>
+                <w:szCs w:val="19"/>
+              </w:rPr>
+              <w:t xml:space="preserve"> </w:t>
+            </w:r>
+            <w:r>
+              <w:rPr>
+                <w:sz w:val="19"/>
+                <w:szCs w:val="19"/>
+              </w:rPr>
+              <w:t>강의설정</w:t>
+            </w:r>
+            <w:r>
+              <w:rPr>
+                <w:sz w:val="19"/>
+                <w:szCs w:val="19"/>
+              </w:rPr>
+              <w:t xml:space="preserve"> </w:t>
+            </w:r>
+            <w:r>
+              <w:rPr>
+                <w:sz w:val="19"/>
+                <w:szCs w:val="19"/>
+              </w:rPr>
+              <w:t>창</w:t>
+            </w:r>
+            <w:r>
+              <w:rPr>
+                <w:sz w:val="19"/>
+                <w:szCs w:val="19"/>
+              </w:rPr>
+              <w:t xml:space="preserve"> 3</w:t>
+            </w:r>
+            <w:r>
+              <w:rPr>
+                <w:sz w:val="19"/>
+                <w:szCs w:val="19"/>
+              </w:rPr>
+              <w:t>번</w:t>
+            </w:r>
+            <w:r>
+              <w:rPr>
+                <w:sz w:val="19"/>
+                <w:szCs w:val="19"/>
+              </w:rPr>
+              <w:t xml:space="preserve"> </w:t>
+            </w:r>
+            <w:r>
+              <w:rPr>
+                <w:sz w:val="19"/>
+                <w:szCs w:val="19"/>
+              </w:rPr>
+              <w:t>칸에</w:t>
+            </w:r>
+            <w:r>
+              <w:rPr>
+                <w:sz w:val="19"/>
+                <w:szCs w:val="19"/>
+              </w:rPr>
+              <w:t xml:space="preserve"> </w:t>
+            </w:r>
+            <w:r>
+              <w:rPr>
+                <w:sz w:val="19"/>
+                <w:szCs w:val="19"/>
+              </w:rPr>
+              <w:t>직접</w:t>
+            </w:r>
+            <w:r>
+              <w:rPr>
+                <w:sz w:val="19"/>
+                <w:szCs w:val="19"/>
+              </w:rPr>
+              <w:t xml:space="preserve"> </w:t>
+            </w:r>
+            <w:r>
+              <w:rPr>
+                <w:sz w:val="19"/>
+                <w:szCs w:val="19"/>
+              </w:rPr>
+              <w:t>정해</w:t>
+            </w:r>
+            <w:r>
+              <w:rPr>
+                <w:sz w:val="19"/>
+                <w:szCs w:val="19"/>
+              </w:rPr>
+              <w:t xml:space="preserve"> </w:t>
+            </w:r>
+            <w:r>
+              <w:rPr>
+                <w:sz w:val="19"/>
+                <w:szCs w:val="19"/>
+              </w:rPr>
+              <w:t>넣은</w:t>
+            </w:r>
+            <w:r>
+              <w:rPr>
+                <w:sz w:val="19"/>
+                <w:szCs w:val="19"/>
+              </w:rPr>
+              <w:t xml:space="preserve"> </w:t>
+            </w:r>
+            <w:r>
+              <w:rPr>
+                <w:sz w:val="19"/>
+                <w:szCs w:val="19"/>
+              </w:rPr>
+              <w:t>코드이며</w:t>
+            </w:r>
+            <w:r>
+              <w:rPr>
+                <w:sz w:val="19"/>
+                <w:szCs w:val="19"/>
+              </w:rPr>
+              <w:t>(</w:t>
+            </w:r>
+            <w:r>
+              <w:rPr>
+                <w:sz w:val="19"/>
+                <w:szCs w:val="19"/>
+              </w:rPr>
+              <w:t>강의</w:t>
+            </w:r>
+            <w:r>
+              <w:rPr>
+                <w:sz w:val="19"/>
+                <w:szCs w:val="19"/>
+              </w:rPr>
+              <w:t xml:space="preserve"> </w:t>
+            </w:r>
+            <w:r>
+              <w:rPr>
+                <w:sz w:val="19"/>
+                <w:szCs w:val="19"/>
+              </w:rPr>
+              <w:t>코드와</w:t>
+            </w:r>
+            <w:r>
+              <w:rPr>
+                <w:sz w:val="19"/>
+                <w:szCs w:val="19"/>
+              </w:rPr>
+              <w:t xml:space="preserve"> </w:t>
+            </w:r>
+            <w:r>
+              <w:rPr>
+                <w:sz w:val="19"/>
+                <w:szCs w:val="19"/>
+              </w:rPr>
+              <w:t>다름</w:t>
+            </w:r>
+            <w:r>
+              <w:rPr>
+                <w:sz w:val="19"/>
+                <w:szCs w:val="19"/>
+              </w:rPr>
+              <w:t xml:space="preserve">), </w:t>
+            </w:r>
+            <w:r>
+              <w:rPr>
+                <w:sz w:val="19"/>
+                <w:szCs w:val="19"/>
+              </w:rPr>
+              <w:t>잊었거나</w:t>
+            </w:r>
+            <w:r>
+              <w:rPr>
+                <w:sz w:val="19"/>
+                <w:szCs w:val="19"/>
+              </w:rPr>
+              <w:t xml:space="preserve"> </w:t>
+            </w:r>
+            <w:r>
+              <w:rPr>
+                <w:sz w:val="19"/>
+                <w:szCs w:val="19"/>
+              </w:rPr>
+              <w:t>맞지</w:t>
+            </w:r>
+            <w:r>
+              <w:rPr>
+                <w:sz w:val="19"/>
+                <w:szCs w:val="19"/>
+              </w:rPr>
+              <w:t xml:space="preserve"> </w:t>
+            </w:r>
+            <w:r>
+              <w:rPr>
+                <w:sz w:val="19"/>
+                <w:szCs w:val="19"/>
+              </w:rPr>
+              <w:t>않으면</w:t>
+            </w:r>
+            <w:r>
+              <w:rPr>
+                <w:sz w:val="19"/>
+                <w:szCs w:val="19"/>
+              </w:rPr>
+              <w:t xml:space="preserve"> 3</w:t>
+            </w:r>
+            <w:r>
+              <w:rPr>
+                <w:sz w:val="19"/>
+                <w:szCs w:val="19"/>
+              </w:rPr>
+              <w:t>번</w:t>
+            </w:r>
+            <w:r>
+              <w:rPr>
+                <w:sz w:val="19"/>
+                <w:szCs w:val="19"/>
+              </w:rPr>
+              <w:t xml:space="preserve"> </w:t>
+            </w:r>
+            <w:r>
+              <w:rPr>
+                <w:sz w:val="19"/>
+                <w:szCs w:val="19"/>
+              </w:rPr>
+              <w:t>칸에만</w:t>
+            </w:r>
+            <w:r>
+              <w:rPr>
+                <w:sz w:val="19"/>
+                <w:szCs w:val="19"/>
+              </w:rPr>
+              <w:t xml:space="preserve"> </w:t>
+            </w:r>
+            <w:r>
+              <w:rPr>
+                <w:sz w:val="19"/>
+                <w:szCs w:val="19"/>
+              </w:rPr>
+              <w:t>새</w:t>
+            </w:r>
+            <w:r>
+              <w:rPr>
+                <w:sz w:val="19"/>
+                <w:szCs w:val="19"/>
+              </w:rPr>
+              <w:t xml:space="preserve"> </w:t>
+            </w:r>
+            <w:r>
+              <w:rPr>
+                <w:sz w:val="19"/>
+                <w:szCs w:val="19"/>
+              </w:rPr>
+              <w:t>코드를</w:t>
+            </w:r>
+            <w:r>
+              <w:rPr>
+                <w:sz w:val="19"/>
+                <w:szCs w:val="19"/>
+              </w:rPr>
+              <w:t xml:space="preserve"> </w:t>
+            </w:r>
+            <w:r>
+              <w:rPr>
+                <w:sz w:val="19"/>
+                <w:szCs w:val="19"/>
+              </w:rPr>
+              <w:t>넣고</w:t>
+            </w:r>
+            <w:r>
+              <w:rPr>
+                <w:sz w:val="19"/>
+                <w:szCs w:val="19"/>
+              </w:rPr>
+              <w:t xml:space="preserve"> </w:t>
+            </w:r>
+            <w:r>
+              <w:rPr>
+                <w:sz w:val="19"/>
+                <w:szCs w:val="19"/>
+              </w:rPr>
+              <w:t>다시</w:t>
+            </w:r>
+            <w:r>
+              <w:rPr>
+                <w:sz w:val="19"/>
+                <w:szCs w:val="19"/>
+              </w:rPr>
+              <w:t xml:space="preserve"> </w:t>
+            </w:r>
+            <w:r>
+              <w:rPr>
+                <w:sz w:val="19"/>
+                <w:szCs w:val="19"/>
+              </w:rPr>
+              <w:t>저장하면</w:t>
+            </w:r>
+            <w:r>
+              <w:rPr>
+                <w:sz w:val="19"/>
+                <w:szCs w:val="19"/>
+              </w:rPr>
+              <w:t xml:space="preserve"> </w:t>
+            </w:r>
+            <w:r>
+              <w:rPr>
+                <w:sz w:val="19"/>
+                <w:szCs w:val="19"/>
+              </w:rPr>
+              <w:t>바뀝니다</w:t>
+            </w:r>
+            <w:r>
+              <w:rPr>
+                <w:sz w:val="19"/>
+                <w:szCs w:val="19"/>
+              </w:rPr>
+              <w:t xml:space="preserve">. </w:t>
+            </w:r>
+            <w:r>
+              <w:rPr>
+                <w:sz w:val="19"/>
+                <w:szCs w:val="19"/>
+              </w:rPr>
               <w:t>코드를</w:t>
             </w:r>
             <w:r>
@@ -58741,10 +59063,10 @@
           <w:noProof/>
         </w:rPr>
         <w:drawing>
-          <wp:inline distT="0" distB="0" distL="0" distR="0" wp14:anchorId="5F40A482" wp14:editId="4DF3F341">
+          <wp:inline distT="0" distB="0" distL="0" distR="0" wp14:anchorId="5114508B" wp14:editId="1362BABE">
             <wp:extent cx="5943600" cy="3638550"/>
             <wp:effectExtent l="0" t="0" r="0" b="0"/>
-            <wp:docPr id="1486700176" name="그림 1486700176"/>
+            <wp:docPr id="1621744350" name="그림 1621744350"/>
             <wp:cNvGraphicFramePr>
               <a:graphicFrameLocks xmlns:a="http://schemas.openxmlformats.org/drawingml/2006/main" noChangeAspect="1"/>
             </wp:cNvGraphicFramePr>
@@ -59033,7 +59355,7 @@
       <w:pPr>
         <w:pStyle w:val="2"/>
       </w:pPr>
-      <w:bookmarkStart w:id="47" w:name="_Toc240676450"/>
+      <w:bookmarkStart w:id="47" w:name="_Toc240695526"/>
       <w:r>
         <w:t xml:space="preserve">D. </w:t>
       </w:r>
@@ -59058,6 +59380,7 @@
         <w:spacing w:after="80" w:line="300" w:lineRule="auto"/>
       </w:pPr>
       <w:r>
+        <w:lastRenderedPageBreak/>
         <w:t>순수</w:t>
       </w:r>
       <w:r>
@@ -59110,7 +59433,6 @@
         <w:spacing w:after="80" w:line="300" w:lineRule="auto"/>
       </w:pPr>
       <w:r>
-        <w:lastRenderedPageBreak/>
         <w:t>동영상</w:t>
       </w:r>
       <w:r>
@@ -59462,64 +59784,10 @@
 <file path=word/numbering.xml><?xml version="1.0" encoding="utf-8"?>
 <w:numbering xmlns:wpc="http://schemas.microsoft.com/office/word/2010/wordprocessingCanvas" xmlns:cx="http://schemas.microsoft.com/office/drawing/2014/chartex" xmlns:cx1="http://schemas.microsoft.com/office/drawing/2015/9/8/chartex" xmlns:cx2="http://schemas.microsoft.com/office/drawing/2015/10/21/chartex" xmlns:cx3="http://schemas.microsoft.com/office/drawing/2016/5/9/chartex" xmlns:cx4="http://schemas.microsoft.com/office/drawing/2016/5/10/chartex" xmlns:cx5="http://schemas.microsoft.com/office/drawing/2016/5/11/chartex" xmlns:cx6="http://schemas.microsoft.com/office/drawing/2016/5/12/chartex" xmlns:cx7="http://schemas.microsoft.com/office/drawing/2016/5/13/chartex" xmlns:cx8="http://schemas.microsoft.com/office/drawing/2016/5/14/chartex" xmlns:mc="http://schemas.openxmlformats.org/markup-compatibility/2006" xmlns:aink="http://schemas.microsoft.com/office/drawing/2016/ink" xmlns:am3d="http://schemas.microsoft.com/office/drawing/2017/model3d" xmlns:o="urn:schemas-microsoft-com:office:office" xmlns:oel="http://schemas.microsoft.com/office/2019/extlst" xmlns:r="http://schemas.openxmlformats.org/officeDocument/2006/relationships" xmlns:m="http://schemas.openxmlformats.org/officeDocument/2006/math" xmlns:v="urn:schemas-microsoft-com:vml" xmlns:wp14="http://schemas.microsoft.com/office/word/2010/wordprocessingDrawing" xmlns:wp="http://schemas.openxmlformats.org/drawingml/2006/wordprocessingDrawing" xmlns:w10="urn:schemas-microsoft-com:office:word" xmlns:w="http://schemas.openxmlformats.org/wordprocessingml/2006/main" xmlns:w14="http://schemas.microsoft.com/office/word/2010/wordml" xmlns:w15="http://schemas.microsoft.com/office/word/2012/wordml" xmlns:w16cex="http://schemas.microsoft.com/office/word/2018/wordml/cex" xmlns:w16cid="http://schemas.microsoft.com/office/word/2016/wordml/cid" xmlns:w16="http://schemas.microsoft.com/office/word/2018/wordml" xmlns:w16du="http://schemas.microsoft.com/office/word/2023/wordml/word16du" xmlns:w16sdtdh="http://schemas.microsoft.com/office/word/2020/wordml/sdtdatahash" xmlns:w16sdtfl="http://schemas.microsoft.com/office/word/2024/wordml/sdtformatlock" xmlns:w16se="http://schemas.microsoft.com/office/word/2015/wordml/symex" xmlns:wpg="http://schemas.microsoft.com/office/word/2010/wordprocessingGroup" xmlns:wpi="http://schemas.microsoft.com/office/word/2010/wordprocessingInk" xmlns:wne="http://schemas.microsoft.com/office/word/2006/wordml" xmlns:wps="http://schemas.microsoft.com/office/word/2010/wordprocessingShape" mc:Ignorable="w14 w15 w16se w16cid w16 w16cex w16sdtdh w16sdtfl w16du wp14">
   <w:abstractNum w:abstractNumId="0" w15:restartNumberingAfterBreak="0">
-    <w:nsid w:val="0C8F79D4"/>
+    <w:nsid w:val="041839D5"/>
     <w:multiLevelType w:val="hybridMultilevel"/>
-    <w:tmpl w:val="2164464C"/>
-    <w:lvl w:ilvl="0" w:tplc="1D36E186">
-      <w:start w:val="1"/>
-      <w:numFmt w:val="bullet"/>
-      <w:lvlText w:val="•"/>
-      <w:lvlJc w:val="left"/>
-      <w:pPr>
-        <w:ind w:left="480" w:hanging="260"/>
-      </w:pPr>
-    </w:lvl>
-    <w:lvl w:ilvl="1" w:tplc="58C4B2DA">
-      <w:numFmt w:val="decimal"/>
-      <w:lvlText w:val=""/>
-      <w:lvlJc w:val="left"/>
-    </w:lvl>
-    <w:lvl w:ilvl="2" w:tplc="FC805E84">
-      <w:numFmt w:val="decimal"/>
-      <w:lvlText w:val=""/>
-      <w:lvlJc w:val="left"/>
-    </w:lvl>
-    <w:lvl w:ilvl="3" w:tplc="518E28F0">
-      <w:numFmt w:val="decimal"/>
-      <w:lvlText w:val=""/>
-      <w:lvlJc w:val="left"/>
-    </w:lvl>
-    <w:lvl w:ilvl="4" w:tplc="F006E0C8">
-      <w:numFmt w:val="decimal"/>
-      <w:lvlText w:val=""/>
-      <w:lvlJc w:val="left"/>
-    </w:lvl>
-    <w:lvl w:ilvl="5" w:tplc="14324656">
-      <w:numFmt w:val="decimal"/>
-      <w:lvlText w:val=""/>
-      <w:lvlJc w:val="left"/>
-    </w:lvl>
-    <w:lvl w:ilvl="6" w:tplc="C91274E4">
-      <w:numFmt w:val="decimal"/>
-      <w:lvlText w:val=""/>
-      <w:lvlJc w:val="left"/>
-    </w:lvl>
-    <w:lvl w:ilvl="7" w:tplc="C9B811CC">
-      <w:numFmt w:val="decimal"/>
-      <w:lvlText w:val=""/>
-      <w:lvlJc w:val="left"/>
-    </w:lvl>
-    <w:lvl w:ilvl="8" w:tplc="21260026">
-      <w:numFmt w:val="decimal"/>
-      <w:lvlText w:val=""/>
-      <w:lvlJc w:val="left"/>
-    </w:lvl>
-  </w:abstractNum>
-  <w:abstractNum w:abstractNumId="1" w15:restartNumberingAfterBreak="0">
-    <w:nsid w:val="40DB4188"/>
-    <w:multiLevelType w:val="hybridMultilevel"/>
-    <w:tmpl w:val="6194DAF2"/>
-    <w:lvl w:ilvl="0" w:tplc="2D6040E4">
+    <w:tmpl w:val="A7CCDD6C"/>
+    <w:lvl w:ilvl="0" w:tplc="283A9C64">
       <w:start w:val="1"/>
       <w:numFmt w:val="decimal"/>
       <w:lvlText w:val="%1."/>
@@ -59528,52 +59796,52 @@
         <w:ind w:left="480" w:hanging="300"/>
       </w:pPr>
     </w:lvl>
-    <w:lvl w:ilvl="1" w:tplc="B88413B2">
+    <w:lvl w:ilvl="1" w:tplc="474C86B0">
       <w:numFmt w:val="decimal"/>
       <w:lvlText w:val=""/>
       <w:lvlJc w:val="left"/>
     </w:lvl>
-    <w:lvl w:ilvl="2" w:tplc="1BF4B544">
+    <w:lvl w:ilvl="2" w:tplc="78D87EC0">
       <w:numFmt w:val="decimal"/>
       <w:lvlText w:val=""/>
       <w:lvlJc w:val="left"/>
     </w:lvl>
-    <w:lvl w:ilvl="3" w:tplc="65C84598">
+    <w:lvl w:ilvl="3" w:tplc="2C3E8DDE">
       <w:numFmt w:val="decimal"/>
       <w:lvlText w:val=""/>
       <w:lvlJc w:val="left"/>
     </w:lvl>
-    <w:lvl w:ilvl="4" w:tplc="64B6FBFA">
+    <w:lvl w:ilvl="4" w:tplc="0024A498">
       <w:numFmt w:val="decimal"/>
       <w:lvlText w:val=""/>
       <w:lvlJc w:val="left"/>
     </w:lvl>
-    <w:lvl w:ilvl="5" w:tplc="4AF29A94">
+    <w:lvl w:ilvl="5" w:tplc="CA60819C">
       <w:numFmt w:val="decimal"/>
       <w:lvlText w:val=""/>
       <w:lvlJc w:val="left"/>
     </w:lvl>
-    <w:lvl w:ilvl="6" w:tplc="8C74C9BA">
+    <w:lvl w:ilvl="6" w:tplc="9F667FD8">
       <w:numFmt w:val="decimal"/>
       <w:lvlText w:val=""/>
       <w:lvlJc w:val="left"/>
     </w:lvl>
-    <w:lvl w:ilvl="7" w:tplc="7D4AF3A0">
+    <w:lvl w:ilvl="7" w:tplc="0F3481FC">
       <w:numFmt w:val="decimal"/>
       <w:lvlText w:val=""/>
       <w:lvlJc w:val="left"/>
     </w:lvl>
-    <w:lvl w:ilvl="8" w:tplc="06181386">
+    <w:lvl w:ilvl="8" w:tplc="44A014A6">
       <w:numFmt w:val="decimal"/>
       <w:lvlText w:val=""/>
       <w:lvlJc w:val="left"/>
     </w:lvl>
   </w:abstractNum>
-  <w:abstractNum w:abstractNumId="2" w15:restartNumberingAfterBreak="0">
-    <w:nsid w:val="518D5E0E"/>
+  <w:abstractNum w:abstractNumId="1" w15:restartNumberingAfterBreak="0">
+    <w:nsid w:val="06F0490F"/>
     <w:multiLevelType w:val="hybridMultilevel"/>
-    <w:tmpl w:val="5F7A5680"/>
-    <w:lvl w:ilvl="0" w:tplc="FC6444FC">
+    <w:tmpl w:val="5A2E0F28"/>
+    <w:lvl w:ilvl="0" w:tplc="C7988ACC">
       <w:start w:val="1"/>
       <w:numFmt w:val="bullet"/>
       <w:lvlText w:val="●"/>
@@ -59582,7 +59850,7 @@
         <w:ind w:left="720" w:hanging="360"/>
       </w:pPr>
     </w:lvl>
-    <w:lvl w:ilvl="1" w:tplc="DB6C7BD0">
+    <w:lvl w:ilvl="1" w:tplc="4F84E7E2">
       <w:start w:val="1"/>
       <w:numFmt w:val="bullet"/>
       <w:lvlText w:val="○"/>
@@ -59591,7 +59859,7 @@
         <w:ind w:left="1440" w:hanging="360"/>
       </w:pPr>
     </w:lvl>
-    <w:lvl w:ilvl="2" w:tplc="809082E8">
+    <w:lvl w:ilvl="2" w:tplc="6A76A390">
       <w:start w:val="1"/>
       <w:numFmt w:val="bullet"/>
       <w:lvlText w:val="■"/>
@@ -59600,7 +59868,7 @@
         <w:ind w:left="2160" w:hanging="360"/>
       </w:pPr>
     </w:lvl>
-    <w:lvl w:ilvl="3" w:tplc="7A4651BE">
+    <w:lvl w:ilvl="3" w:tplc="3F947854">
       <w:start w:val="1"/>
       <w:numFmt w:val="bullet"/>
       <w:lvlText w:val="●"/>
@@ -59609,7 +59877,7 @@
         <w:ind w:left="2880" w:hanging="360"/>
       </w:pPr>
     </w:lvl>
-    <w:lvl w:ilvl="4" w:tplc="60BA5E06">
+    <w:lvl w:ilvl="4" w:tplc="94FAD0B4">
       <w:start w:val="1"/>
       <w:numFmt w:val="bullet"/>
       <w:lvlText w:val="○"/>
@@ -59618,7 +59886,7 @@
         <w:ind w:left="3600" w:hanging="360"/>
       </w:pPr>
     </w:lvl>
-    <w:lvl w:ilvl="5" w:tplc="7FB017F0">
+    <w:lvl w:ilvl="5" w:tplc="196A5E82">
       <w:start w:val="1"/>
       <w:numFmt w:val="bullet"/>
       <w:lvlText w:val="■"/>
@@ -59627,7 +59895,7 @@
         <w:ind w:left="4320" w:hanging="360"/>
       </w:pPr>
     </w:lvl>
-    <w:lvl w:ilvl="6" w:tplc="A758674E">
+    <w:lvl w:ilvl="6" w:tplc="0BA076B2">
       <w:start w:val="1"/>
       <w:numFmt w:val="bullet"/>
       <w:lvlText w:val="●"/>
@@ -59636,7 +59904,7 @@
         <w:ind w:left="5040" w:hanging="360"/>
       </w:pPr>
     </w:lvl>
-    <w:lvl w:ilvl="7" w:tplc="91FE5336">
+    <w:lvl w:ilvl="7" w:tplc="25D6C6F6">
       <w:start w:val="1"/>
       <w:numFmt w:val="bullet"/>
       <w:lvlText w:val="●"/>
@@ -59645,7 +59913,7 @@
         <w:ind w:left="5760" w:hanging="360"/>
       </w:pPr>
     </w:lvl>
-    <w:lvl w:ilvl="8" w:tplc="D90886A2">
+    <w:lvl w:ilvl="8" w:tplc="4BCA0C5E">
       <w:start w:val="1"/>
       <w:numFmt w:val="bullet"/>
       <w:lvlText w:val="●"/>
@@ -59655,32 +59923,86 @@
       </w:pPr>
     </w:lvl>
   </w:abstractNum>
-  <w:num w:numId="1" w16cid:durableId="1868984330">
+  <w:abstractNum w:abstractNumId="2" w15:restartNumberingAfterBreak="0">
+    <w:nsid w:val="3CFC475A"/>
+    <w:multiLevelType w:val="hybridMultilevel"/>
+    <w:tmpl w:val="1B6C47C4"/>
+    <w:lvl w:ilvl="0" w:tplc="9640A93E">
+      <w:start w:val="1"/>
+      <w:numFmt w:val="bullet"/>
+      <w:lvlText w:val="•"/>
+      <w:lvlJc w:val="left"/>
+      <w:pPr>
+        <w:ind w:left="480" w:hanging="260"/>
+      </w:pPr>
+    </w:lvl>
+    <w:lvl w:ilvl="1" w:tplc="32928D7C">
+      <w:numFmt w:val="decimal"/>
+      <w:lvlText w:val=""/>
+      <w:lvlJc w:val="left"/>
+    </w:lvl>
+    <w:lvl w:ilvl="2" w:tplc="42DEA6AA">
+      <w:numFmt w:val="decimal"/>
+      <w:lvlText w:val=""/>
+      <w:lvlJc w:val="left"/>
+    </w:lvl>
+    <w:lvl w:ilvl="3" w:tplc="59E2A550">
+      <w:numFmt w:val="decimal"/>
+      <w:lvlText w:val=""/>
+      <w:lvlJc w:val="left"/>
+    </w:lvl>
+    <w:lvl w:ilvl="4" w:tplc="9822FEF8">
+      <w:numFmt w:val="decimal"/>
+      <w:lvlText w:val=""/>
+      <w:lvlJc w:val="left"/>
+    </w:lvl>
+    <w:lvl w:ilvl="5" w:tplc="2AB49BEE">
+      <w:numFmt w:val="decimal"/>
+      <w:lvlText w:val=""/>
+      <w:lvlJc w:val="left"/>
+    </w:lvl>
+    <w:lvl w:ilvl="6" w:tplc="936E8CE0">
+      <w:numFmt w:val="decimal"/>
+      <w:lvlText w:val=""/>
+      <w:lvlJc w:val="left"/>
+    </w:lvl>
+    <w:lvl w:ilvl="7" w:tplc="EEFE1CFE">
+      <w:numFmt w:val="decimal"/>
+      <w:lvlText w:val=""/>
+      <w:lvlJc w:val="left"/>
+    </w:lvl>
+    <w:lvl w:ilvl="8" w:tplc="C644CEEC">
+      <w:numFmt w:val="decimal"/>
+      <w:lvlText w:val=""/>
+      <w:lvlJc w:val="left"/>
+    </w:lvl>
+  </w:abstractNum>
+  <w:num w:numId="1" w16cid:durableId="1335835226">
+    <w:abstractNumId w:val="1"/>
+    <w:lvlOverride w:ilvl="0">
+      <w:startOverride w:val="1"/>
+    </w:lvlOverride>
+  </w:num>
+  <w:num w:numId="2" w16cid:durableId="1998145100">
     <w:abstractNumId w:val="2"/>
     <w:lvlOverride w:ilvl="0">
       <w:startOverride w:val="1"/>
     </w:lvlOverride>
   </w:num>
-  <w:num w:numId="2" w16cid:durableId="1922906321">
+  <w:num w:numId="3" w16cid:durableId="368728792">
     <w:abstractNumId w:val="0"/>
     <w:lvlOverride w:ilvl="0">
       <w:startOverride w:val="1"/>
     </w:lvlOverride>
   </w:num>
-  <w:num w:numId="3" w16cid:durableId="1227186787">
-    <w:abstractNumId w:val="1"/>
+  <w:num w:numId="4" w16cid:durableId="1558710065">
+    <w:abstractNumId w:val="0"/>
     <w:lvlOverride w:ilvl="0">
       <w:startOverride w:val="1"/>
     </w:lvlOverride>
   </w:num>
-  <w:num w:numId="4" w16cid:durableId="408814474">
-    <w:abstractNumId w:val="1"/>
-    <w:lvlOverride w:ilvl="0">
-      <w:startOverride w:val="1"/>
-    </w:lvlOverride>
-  </w:num>
-  <w:num w:numId="5" w16cid:durableId="338627315">
-    <w:abstractNumId w:val="1"/>
+  <w:num w:numId="5" w16cid:durableId="375664830">
+    <w:abstractNumId w:val="0"/>
     <w:lvlOverride w:ilvl="0">
       <w:startOverride w:val="1"/>
     </w:lvlOverride>
@@ -60304,7 +60626,7 @@
     <w:autoRedefine/>
     <w:uiPriority w:val="39"/>
     <w:unhideWhenUsed/>
-    <w:rsid w:val="00E157C9"/>
+    <w:rsid w:val="00FB62E3"/>
   </w:style>
   <w:style w:type="paragraph" w:styleId="20">
     <w:name w:val="toc 2"/>
@@ -60313,7 +60635,7 @@
     <w:autoRedefine/>
     <w:uiPriority w:val="39"/>
     <w:unhideWhenUsed/>
-    <w:rsid w:val="00E157C9"/>
+    <w:rsid w:val="00FB62E3"/>
     <w:pPr>
       <w:ind w:leftChars="200" w:left="425"/>
     </w:pPr>
@@ -60324,7 +60646,7 @@
     <w:link w:val="Char1"/>
     <w:uiPriority w:val="99"/>
     <w:unhideWhenUsed/>
-    <w:rsid w:val="00E157C9"/>
+    <w:rsid w:val="00FB62E3"/>
     <w:pPr>
       <w:tabs>
         <w:tab w:val="center" w:pos="4513"/>
@@ -60338,7 +60660,7 @@
     <w:basedOn w:val="a0"/>
     <w:link w:val="aa"/>
     <w:uiPriority w:val="99"/>
-    <w:rsid w:val="00E157C9"/>
+    <w:rsid w:val="00FB62E3"/>
   </w:style>
   <w:style w:type="paragraph" w:styleId="ab">
     <w:name w:val="footer"/>
@@ -60346,7 +60668,7 @@
     <w:link w:val="Char2"/>
     <w:uiPriority w:val="99"/>
     <w:unhideWhenUsed/>
-    <w:rsid w:val="00E157C9"/>
+    <w:rsid w:val="00FB62E3"/>
     <w:pPr>
       <w:tabs>
         <w:tab w:val="center" w:pos="4513"/>
@@ -60360,7 +60682,7 @@
     <w:basedOn w:val="a0"/>
     <w:link w:val="ab"/>
     <w:uiPriority w:val="99"/>
-    <w:rsid w:val="00E157C9"/>
+    <w:rsid w:val="00FB62E3"/>
   </w:style>
 </w:styles>
 </file>

</xml_diff>